<commit_message>
refactor: improve user prompts and exception handling in Exercise1SafeDivision
</commit_message>
<xml_diff>
--- a/Lab_07/LAB Exercises report  (7).docx
+++ b/Lab_07/LAB Exercises report  (7).docx
@@ -31,14 +31,1508 @@
     </w:p>
     <w:p>
       <w:pPr>
-        <w:spacing w:after="0"/>
+        <w:shd w:val="clear" w:color="auto" w:fill="121314"/>
+        <w:spacing w:after="0" w:line="285" w:lineRule="atLeast"/>
+        <w:rPr>
+          <w:rFonts w:ascii="Consolas" w:eastAsia="Times New Roman" w:hAnsi="Consolas" w:cs="Times New Roman"/>
+          <w:color w:val="BBBEBF"/>
+          <w:sz w:val="21"/>
+          <w:szCs w:val="21"/>
+        </w:rPr>
       </w:pPr>
       <w:r>
         <w:rPr>
-          <w:rFonts w:ascii="Consolas" w:hAnsi="Consolas"/>
-          <w:sz w:val="16"/>
-        </w:rPr>
-        <w:t>import java.util.*;</w:t>
+          <w:rFonts w:ascii="Consolas" w:eastAsia="Times New Roman" w:hAnsi="Consolas" w:cs="Times New Roman"/>
+          <w:color w:val="FF7B72"/>
+          <w:sz w:val="21"/>
+          <w:szCs w:val="21"/>
+        </w:rPr>
+        <w:t>import</w:t>
+      </w:r>
+      <w:r>
+        <w:rPr>
+          <w:rFonts w:ascii="Consolas" w:eastAsia="Times New Roman" w:hAnsi="Consolas" w:cs="Times New Roman"/>
+          <w:color w:val="BBBEBF"/>
+          <w:sz w:val="21"/>
+          <w:szCs w:val="21"/>
+        </w:rPr>
+        <w:t xml:space="preserve"> </w:t>
+      </w:r>
+      <w:proofErr w:type="spellStart"/>
+      <w:r>
+        <w:rPr>
+          <w:rFonts w:ascii="Consolas" w:eastAsia="Times New Roman" w:hAnsi="Consolas" w:cs="Times New Roman"/>
+          <w:color w:val="4EC9B0"/>
+          <w:sz w:val="21"/>
+          <w:szCs w:val="21"/>
+        </w:rPr>
+        <w:t>java</w:t>
+      </w:r>
+      <w:r>
+        <w:rPr>
+          <w:rFonts w:ascii="Consolas" w:eastAsia="Times New Roman" w:hAnsi="Consolas" w:cs="Times New Roman"/>
+          <w:color w:val="D4D4D4"/>
+          <w:sz w:val="21"/>
+          <w:szCs w:val="21"/>
+        </w:rPr>
+        <w:t>.</w:t>
+      </w:r>
+      <w:r>
+        <w:rPr>
+          <w:rFonts w:ascii="Consolas" w:eastAsia="Times New Roman" w:hAnsi="Consolas" w:cs="Times New Roman"/>
+          <w:color w:val="4EC9B0"/>
+          <w:sz w:val="21"/>
+          <w:szCs w:val="21"/>
+        </w:rPr>
+        <w:t>util</w:t>
+      </w:r>
+      <w:proofErr w:type="spellEnd"/>
+      <w:r>
+        <w:rPr>
+          <w:rFonts w:ascii="Consolas" w:eastAsia="Times New Roman" w:hAnsi="Consolas" w:cs="Times New Roman"/>
+          <w:color w:val="D4D4D4"/>
+          <w:sz w:val="21"/>
+          <w:szCs w:val="21"/>
+        </w:rPr>
+        <w:t>.*</w:t>
+      </w:r>
+      <w:r>
+        <w:rPr>
+          <w:rFonts w:ascii="Consolas" w:eastAsia="Times New Roman" w:hAnsi="Consolas" w:cs="Times New Roman"/>
+          <w:color w:val="BBBEBF"/>
+          <w:sz w:val="21"/>
+          <w:szCs w:val="21"/>
+        </w:rPr>
+        <w:t>;</w:t>
+      </w:r>
+    </w:p>
+    <w:p>
+      <w:pPr>
+        <w:shd w:val="clear" w:color="auto" w:fill="121314"/>
+        <w:spacing w:after="0" w:line="285" w:lineRule="atLeast"/>
+        <w:rPr>
+          <w:rFonts w:ascii="Consolas" w:eastAsia="Times New Roman" w:hAnsi="Consolas" w:cs="Times New Roman"/>
+          <w:color w:val="BBBEBF"/>
+          <w:sz w:val="21"/>
+          <w:szCs w:val="21"/>
+        </w:rPr>
+      </w:pPr>
+    </w:p>
+    <w:p>
+      <w:pPr>
+        <w:shd w:val="clear" w:color="auto" w:fill="121314"/>
+        <w:spacing w:after="0" w:line="285" w:lineRule="atLeast"/>
+        <w:rPr>
+          <w:rFonts w:ascii="Consolas" w:eastAsia="Times New Roman" w:hAnsi="Consolas" w:cs="Times New Roman"/>
+          <w:color w:val="BBBEBF"/>
+          <w:sz w:val="21"/>
+          <w:szCs w:val="21"/>
+        </w:rPr>
+      </w:pPr>
+      <w:r>
+        <w:rPr>
+          <w:rFonts w:ascii="Consolas" w:eastAsia="Times New Roman" w:hAnsi="Consolas" w:cs="Times New Roman"/>
+          <w:color w:val="569CD6"/>
+          <w:sz w:val="21"/>
+          <w:szCs w:val="21"/>
+        </w:rPr>
+        <w:t>public</w:t>
+      </w:r>
+      <w:r>
+        <w:rPr>
+          <w:rFonts w:ascii="Consolas" w:eastAsia="Times New Roman" w:hAnsi="Consolas" w:cs="Times New Roman"/>
+          <w:color w:val="BBBEBF"/>
+          <w:sz w:val="21"/>
+          <w:szCs w:val="21"/>
+        </w:rPr>
+        <w:t xml:space="preserve"> </w:t>
+      </w:r>
+      <w:r>
+        <w:rPr>
+          <w:rFonts w:ascii="Consolas" w:eastAsia="Times New Roman" w:hAnsi="Consolas" w:cs="Times New Roman"/>
+          <w:color w:val="569CD6"/>
+          <w:sz w:val="21"/>
+          <w:szCs w:val="21"/>
+        </w:rPr>
+        <w:t>class</w:t>
+      </w:r>
+      <w:r>
+        <w:rPr>
+          <w:rFonts w:ascii="Consolas" w:eastAsia="Times New Roman" w:hAnsi="Consolas" w:cs="Times New Roman"/>
+          <w:color w:val="BBBEBF"/>
+          <w:sz w:val="21"/>
+          <w:szCs w:val="21"/>
+        </w:rPr>
+        <w:t xml:space="preserve"> </w:t>
+      </w:r>
+      <w:r>
+        <w:rPr>
+          <w:rFonts w:ascii="Consolas" w:eastAsia="Times New Roman" w:hAnsi="Consolas" w:cs="Times New Roman"/>
+          <w:color w:val="4EC9B0"/>
+          <w:sz w:val="21"/>
+          <w:szCs w:val="21"/>
+        </w:rPr>
+        <w:t>Exercise1SafeDivision</w:t>
+      </w:r>
+      <w:r>
+        <w:rPr>
+          <w:rFonts w:ascii="Consolas" w:eastAsia="Times New Roman" w:hAnsi="Consolas" w:cs="Times New Roman"/>
+          <w:color w:val="BBBEBF"/>
+          <w:sz w:val="21"/>
+          <w:szCs w:val="21"/>
+        </w:rPr>
+        <w:t xml:space="preserve"> {</w:t>
+      </w:r>
+    </w:p>
+    <w:p>
+      <w:pPr>
+        <w:shd w:val="clear" w:color="auto" w:fill="121314"/>
+        <w:spacing w:after="0" w:line="285" w:lineRule="atLeast"/>
+        <w:rPr>
+          <w:rFonts w:ascii="Consolas" w:eastAsia="Times New Roman" w:hAnsi="Consolas" w:cs="Times New Roman"/>
+          <w:color w:val="BBBEBF"/>
+          <w:sz w:val="21"/>
+          <w:szCs w:val="21"/>
+        </w:rPr>
+      </w:pPr>
+      <w:r>
+        <w:rPr>
+          <w:rFonts w:ascii="Consolas" w:eastAsia="Times New Roman" w:hAnsi="Consolas" w:cs="Times New Roman"/>
+          <w:color w:val="BBBEBF"/>
+          <w:sz w:val="21"/>
+          <w:szCs w:val="21"/>
+        </w:rPr>
+        <w:t xml:space="preserve">    </w:t>
+      </w:r>
+    </w:p>
+    <w:p>
+      <w:pPr>
+        <w:shd w:val="clear" w:color="auto" w:fill="121314"/>
+        <w:spacing w:after="0" w:line="285" w:lineRule="atLeast"/>
+        <w:rPr>
+          <w:rFonts w:ascii="Consolas" w:eastAsia="Times New Roman" w:hAnsi="Consolas" w:cs="Times New Roman"/>
+          <w:color w:val="BBBEBF"/>
+          <w:sz w:val="21"/>
+          <w:szCs w:val="21"/>
+        </w:rPr>
+      </w:pPr>
+      <w:r>
+        <w:rPr>
+          <w:rFonts w:ascii="Consolas" w:eastAsia="Times New Roman" w:hAnsi="Consolas" w:cs="Times New Roman"/>
+          <w:color w:val="BBBEBF"/>
+          <w:sz w:val="21"/>
+          <w:szCs w:val="21"/>
+        </w:rPr>
+        <w:t xml:space="preserve">    </w:t>
+      </w:r>
+      <w:r>
+        <w:rPr>
+          <w:rFonts w:ascii="Consolas" w:eastAsia="Times New Roman" w:hAnsi="Consolas" w:cs="Times New Roman"/>
+          <w:color w:val="569CD6"/>
+          <w:sz w:val="21"/>
+          <w:szCs w:val="21"/>
+        </w:rPr>
+        <w:t>public</w:t>
+      </w:r>
+      <w:r>
+        <w:rPr>
+          <w:rFonts w:ascii="Consolas" w:eastAsia="Times New Roman" w:hAnsi="Consolas" w:cs="Times New Roman"/>
+          <w:color w:val="BBBEBF"/>
+          <w:sz w:val="21"/>
+          <w:szCs w:val="21"/>
+        </w:rPr>
+        <w:t xml:space="preserve"> </w:t>
+      </w:r>
+      <w:r>
+        <w:rPr>
+          <w:rFonts w:ascii="Consolas" w:eastAsia="Times New Roman" w:hAnsi="Consolas" w:cs="Times New Roman"/>
+          <w:color w:val="569CD6"/>
+          <w:sz w:val="21"/>
+          <w:szCs w:val="21"/>
+        </w:rPr>
+        <w:t>static</w:t>
+      </w:r>
+      <w:r>
+        <w:rPr>
+          <w:rFonts w:ascii="Consolas" w:eastAsia="Times New Roman" w:hAnsi="Consolas" w:cs="Times New Roman"/>
+          <w:color w:val="BBBEBF"/>
+          <w:sz w:val="21"/>
+          <w:szCs w:val="21"/>
+        </w:rPr>
+        <w:t xml:space="preserve"> </w:t>
+      </w:r>
+      <w:r>
+        <w:rPr>
+          <w:rFonts w:ascii="Consolas" w:eastAsia="Times New Roman" w:hAnsi="Consolas" w:cs="Times New Roman"/>
+          <w:color w:val="4EC9B0"/>
+          <w:sz w:val="21"/>
+          <w:szCs w:val="21"/>
+        </w:rPr>
+        <w:t>void</w:t>
+      </w:r>
+      <w:r>
+        <w:rPr>
+          <w:rFonts w:ascii="Consolas" w:eastAsia="Times New Roman" w:hAnsi="Consolas" w:cs="Times New Roman"/>
+          <w:color w:val="BBBEBF"/>
+          <w:sz w:val="21"/>
+          <w:szCs w:val="21"/>
+        </w:rPr>
+        <w:t xml:space="preserve"> </w:t>
+      </w:r>
+      <w:r>
+        <w:rPr>
+          <w:rFonts w:ascii="Consolas" w:eastAsia="Times New Roman" w:hAnsi="Consolas" w:cs="Times New Roman"/>
+          <w:color w:val="D2A8FF"/>
+          <w:sz w:val="21"/>
+          <w:szCs w:val="21"/>
+        </w:rPr>
+        <w:t>main</w:t>
+      </w:r>
+      <w:r>
+        <w:rPr>
+          <w:rFonts w:ascii="Consolas" w:eastAsia="Times New Roman" w:hAnsi="Consolas" w:cs="Times New Roman"/>
+          <w:color w:val="BBBEBF"/>
+          <w:sz w:val="21"/>
+          <w:szCs w:val="21"/>
+        </w:rPr>
+        <w:t>(</w:t>
+      </w:r>
+      <w:r>
+        <w:rPr>
+          <w:rFonts w:ascii="Consolas" w:eastAsia="Times New Roman" w:hAnsi="Consolas" w:cs="Times New Roman"/>
+          <w:color w:val="4EC9B0"/>
+          <w:sz w:val="21"/>
+          <w:szCs w:val="21"/>
+        </w:rPr>
+        <w:t>String</w:t>
+      </w:r>
+      <w:r>
+        <w:rPr>
+          <w:rFonts w:ascii="Consolas" w:eastAsia="Times New Roman" w:hAnsi="Consolas" w:cs="Times New Roman"/>
+          <w:color w:val="BBBEBF"/>
+          <w:sz w:val="21"/>
+          <w:szCs w:val="21"/>
+        </w:rPr>
+        <w:t xml:space="preserve">[] </w:t>
+      </w:r>
+      <w:proofErr w:type="spellStart"/>
+      <w:r>
+        <w:rPr>
+          <w:rFonts w:ascii="Consolas" w:eastAsia="Times New Roman" w:hAnsi="Consolas" w:cs="Times New Roman"/>
+          <w:color w:val="FFA657"/>
+          <w:sz w:val="21"/>
+          <w:szCs w:val="21"/>
+        </w:rPr>
+        <w:t>args</w:t>
+      </w:r>
+      <w:proofErr w:type="spellEnd"/>
+      <w:r>
+        <w:rPr>
+          <w:rFonts w:ascii="Consolas" w:eastAsia="Times New Roman" w:hAnsi="Consolas" w:cs="Times New Roman"/>
+          <w:color w:val="BBBEBF"/>
+          <w:sz w:val="21"/>
+          <w:szCs w:val="21"/>
+        </w:rPr>
+        <w:t>) {</w:t>
+      </w:r>
+    </w:p>
+    <w:p>
+      <w:pPr>
+        <w:shd w:val="clear" w:color="auto" w:fill="121314"/>
+        <w:spacing w:after="0" w:line="285" w:lineRule="atLeast"/>
+        <w:rPr>
+          <w:rFonts w:ascii="Consolas" w:eastAsia="Times New Roman" w:hAnsi="Consolas" w:cs="Times New Roman"/>
+          <w:color w:val="BBBEBF"/>
+          <w:sz w:val="21"/>
+          <w:szCs w:val="21"/>
+        </w:rPr>
+      </w:pPr>
+      <w:r>
+        <w:rPr>
+          <w:rFonts w:ascii="Consolas" w:eastAsia="Times New Roman" w:hAnsi="Consolas" w:cs="Times New Roman"/>
+          <w:color w:val="BBBEBF"/>
+          <w:sz w:val="21"/>
+          <w:szCs w:val="21"/>
+        </w:rPr>
+        <w:t xml:space="preserve">        </w:t>
+      </w:r>
+      <w:r>
+        <w:rPr>
+          <w:rFonts w:ascii="Consolas" w:eastAsia="Times New Roman" w:hAnsi="Consolas" w:cs="Times New Roman"/>
+          <w:color w:val="C586C0"/>
+          <w:sz w:val="21"/>
+          <w:szCs w:val="21"/>
+        </w:rPr>
+        <w:t>try</w:t>
+      </w:r>
+      <w:r>
+        <w:rPr>
+          <w:rFonts w:ascii="Consolas" w:eastAsia="Times New Roman" w:hAnsi="Consolas" w:cs="Times New Roman"/>
+          <w:color w:val="BBBEBF"/>
+          <w:sz w:val="21"/>
+          <w:szCs w:val="21"/>
+        </w:rPr>
+        <w:t xml:space="preserve"> (</w:t>
+      </w:r>
+      <w:r>
+        <w:rPr>
+          <w:rFonts w:ascii="Consolas" w:eastAsia="Times New Roman" w:hAnsi="Consolas" w:cs="Times New Roman"/>
+          <w:color w:val="4EC9B0"/>
+          <w:sz w:val="21"/>
+          <w:szCs w:val="21"/>
+        </w:rPr>
+        <w:t>Scanner</w:t>
+      </w:r>
+      <w:r>
+        <w:rPr>
+          <w:rFonts w:ascii="Consolas" w:eastAsia="Times New Roman" w:hAnsi="Consolas" w:cs="Times New Roman"/>
+          <w:color w:val="FFA657"/>
+          <w:sz w:val="21"/>
+          <w:szCs w:val="21"/>
+        </w:rPr>
+        <w:t xml:space="preserve"> </w:t>
+      </w:r>
+      <w:proofErr w:type="spellStart"/>
+      <w:r>
+        <w:rPr>
+          <w:rFonts w:ascii="Consolas" w:eastAsia="Times New Roman" w:hAnsi="Consolas" w:cs="Times New Roman"/>
+          <w:color w:val="79C0FF"/>
+          <w:sz w:val="21"/>
+          <w:szCs w:val="21"/>
+        </w:rPr>
+        <w:t>scanner</w:t>
+      </w:r>
+      <w:proofErr w:type="spellEnd"/>
+      <w:r>
+        <w:rPr>
+          <w:rFonts w:ascii="Consolas" w:eastAsia="Times New Roman" w:hAnsi="Consolas" w:cs="Times New Roman"/>
+          <w:color w:val="FFA657"/>
+          <w:sz w:val="21"/>
+          <w:szCs w:val="21"/>
+        </w:rPr>
+        <w:t xml:space="preserve"> </w:t>
+      </w:r>
+      <w:r>
+        <w:rPr>
+          <w:rFonts w:ascii="Consolas" w:eastAsia="Times New Roman" w:hAnsi="Consolas" w:cs="Times New Roman"/>
+          <w:color w:val="D4D4D4"/>
+          <w:sz w:val="21"/>
+          <w:szCs w:val="21"/>
+        </w:rPr>
+        <w:t>=</w:t>
+      </w:r>
+      <w:r>
+        <w:rPr>
+          <w:rFonts w:ascii="Consolas" w:eastAsia="Times New Roman" w:hAnsi="Consolas" w:cs="Times New Roman"/>
+          <w:color w:val="BBBEBF"/>
+          <w:sz w:val="21"/>
+          <w:szCs w:val="21"/>
+        </w:rPr>
+        <w:t xml:space="preserve"> </w:t>
+      </w:r>
+      <w:r>
+        <w:rPr>
+          <w:rFonts w:ascii="Consolas" w:eastAsia="Times New Roman" w:hAnsi="Consolas" w:cs="Times New Roman"/>
+          <w:color w:val="C586C0"/>
+          <w:sz w:val="21"/>
+          <w:szCs w:val="21"/>
+        </w:rPr>
+        <w:t>new</w:t>
+      </w:r>
+      <w:r>
+        <w:rPr>
+          <w:rFonts w:ascii="Consolas" w:eastAsia="Times New Roman" w:hAnsi="Consolas" w:cs="Times New Roman"/>
+          <w:color w:val="BBBEBF"/>
+          <w:sz w:val="21"/>
+          <w:szCs w:val="21"/>
+        </w:rPr>
+        <w:t xml:space="preserve"> </w:t>
+      </w:r>
+      <w:r>
+        <w:rPr>
+          <w:rFonts w:ascii="Consolas" w:eastAsia="Times New Roman" w:hAnsi="Consolas" w:cs="Times New Roman"/>
+          <w:color w:val="D2A8FF"/>
+          <w:sz w:val="21"/>
+          <w:szCs w:val="21"/>
+        </w:rPr>
+        <w:t>Scanner</w:t>
+      </w:r>
+      <w:r>
+        <w:rPr>
+          <w:rFonts w:ascii="Consolas" w:eastAsia="Times New Roman" w:hAnsi="Consolas" w:cs="Times New Roman"/>
+          <w:color w:val="BBBEBF"/>
+          <w:sz w:val="21"/>
+          <w:szCs w:val="21"/>
+        </w:rPr>
+        <w:t>(</w:t>
+      </w:r>
+      <w:r>
+        <w:rPr>
+          <w:rFonts w:ascii="Consolas" w:eastAsia="Times New Roman" w:hAnsi="Consolas" w:cs="Times New Roman"/>
+          <w:color w:val="4EC9B0"/>
+          <w:sz w:val="21"/>
+          <w:szCs w:val="21"/>
+        </w:rPr>
+        <w:t>System</w:t>
+      </w:r>
+      <w:r>
+        <w:rPr>
+          <w:rFonts w:ascii="Consolas" w:eastAsia="Times New Roman" w:hAnsi="Consolas" w:cs="Times New Roman"/>
+          <w:color w:val="BBBEBF"/>
+          <w:sz w:val="21"/>
+          <w:szCs w:val="21"/>
+        </w:rPr>
+        <w:t>.</w:t>
+      </w:r>
+      <w:r>
+        <w:rPr>
+          <w:rFonts w:ascii="Consolas" w:eastAsia="Times New Roman" w:hAnsi="Consolas" w:cs="Times New Roman"/>
+          <w:color w:val="79C0FF"/>
+          <w:sz w:val="21"/>
+          <w:szCs w:val="21"/>
+        </w:rPr>
+        <w:t>in</w:t>
+      </w:r>
+      <w:r>
+        <w:rPr>
+          <w:rFonts w:ascii="Consolas" w:eastAsia="Times New Roman" w:hAnsi="Consolas" w:cs="Times New Roman"/>
+          <w:color w:val="BBBEBF"/>
+          <w:sz w:val="21"/>
+          <w:szCs w:val="21"/>
+        </w:rPr>
+        <w:t>)) {</w:t>
+      </w:r>
+    </w:p>
+    <w:p>
+      <w:pPr>
+        <w:shd w:val="clear" w:color="auto" w:fill="121314"/>
+        <w:spacing w:after="0" w:line="285" w:lineRule="atLeast"/>
+        <w:rPr>
+          <w:rFonts w:ascii="Consolas" w:eastAsia="Times New Roman" w:hAnsi="Consolas" w:cs="Times New Roman"/>
+          <w:color w:val="BBBEBF"/>
+          <w:sz w:val="21"/>
+          <w:szCs w:val="21"/>
+        </w:rPr>
+      </w:pPr>
+      <w:r>
+        <w:rPr>
+          <w:rFonts w:ascii="Consolas" w:eastAsia="Times New Roman" w:hAnsi="Consolas" w:cs="Times New Roman"/>
+          <w:color w:val="BBBEBF"/>
+          <w:sz w:val="21"/>
+          <w:szCs w:val="21"/>
+        </w:rPr>
+        <w:t xml:space="preserve">            </w:t>
+      </w:r>
+      <w:r>
+        <w:rPr>
+          <w:rFonts w:ascii="Consolas" w:eastAsia="Times New Roman" w:hAnsi="Consolas" w:cs="Times New Roman"/>
+          <w:color w:val="8B949E"/>
+          <w:sz w:val="21"/>
+          <w:szCs w:val="21"/>
+        </w:rPr>
+        <w:t>// Prompt the user for two integers and perform division</w:t>
+      </w:r>
+    </w:p>
+    <w:p>
+      <w:pPr>
+        <w:shd w:val="clear" w:color="auto" w:fill="121314"/>
+        <w:spacing w:after="0" w:line="285" w:lineRule="atLeast"/>
+        <w:rPr>
+          <w:rFonts w:ascii="Consolas" w:eastAsia="Times New Roman" w:hAnsi="Consolas" w:cs="Times New Roman"/>
+          <w:color w:val="BBBEBF"/>
+          <w:sz w:val="21"/>
+          <w:szCs w:val="21"/>
+        </w:rPr>
+      </w:pPr>
+      <w:r>
+        <w:rPr>
+          <w:rFonts w:ascii="Consolas" w:eastAsia="Times New Roman" w:hAnsi="Consolas" w:cs="Times New Roman"/>
+          <w:color w:val="BBBEBF"/>
+          <w:sz w:val="21"/>
+          <w:szCs w:val="21"/>
+        </w:rPr>
+        <w:t xml:space="preserve">            </w:t>
+      </w:r>
+      <w:proofErr w:type="spellStart"/>
+      <w:r>
+        <w:rPr>
+          <w:rFonts w:ascii="Consolas" w:eastAsia="Times New Roman" w:hAnsi="Consolas" w:cs="Times New Roman"/>
+          <w:color w:val="4EC9B0"/>
+          <w:sz w:val="21"/>
+          <w:szCs w:val="21"/>
+        </w:rPr>
+        <w:t>System</w:t>
+      </w:r>
+      <w:r>
+        <w:rPr>
+          <w:rFonts w:ascii="Consolas" w:eastAsia="Times New Roman" w:hAnsi="Consolas" w:cs="Times New Roman"/>
+          <w:color w:val="BBBEBF"/>
+          <w:sz w:val="21"/>
+          <w:szCs w:val="21"/>
+        </w:rPr>
+        <w:t>.</w:t>
+      </w:r>
+      <w:r>
+        <w:rPr>
+          <w:rFonts w:ascii="Consolas" w:eastAsia="Times New Roman" w:hAnsi="Consolas" w:cs="Times New Roman"/>
+          <w:color w:val="79C0FF"/>
+          <w:sz w:val="21"/>
+          <w:szCs w:val="21"/>
+        </w:rPr>
+        <w:t>out</w:t>
+      </w:r>
+      <w:r>
+        <w:rPr>
+          <w:rFonts w:ascii="Consolas" w:eastAsia="Times New Roman" w:hAnsi="Consolas" w:cs="Times New Roman"/>
+          <w:color w:val="BBBEBF"/>
+          <w:sz w:val="21"/>
+          <w:szCs w:val="21"/>
+        </w:rPr>
+        <w:t>.</w:t>
+      </w:r>
+      <w:r>
+        <w:rPr>
+          <w:rFonts w:ascii="Consolas" w:eastAsia="Times New Roman" w:hAnsi="Consolas" w:cs="Times New Roman"/>
+          <w:color w:val="D2A8FF"/>
+          <w:sz w:val="21"/>
+          <w:szCs w:val="21"/>
+        </w:rPr>
+        <w:t>print</w:t>
+      </w:r>
+      <w:proofErr w:type="spellEnd"/>
+      <w:r>
+        <w:rPr>
+          <w:rFonts w:ascii="Consolas" w:eastAsia="Times New Roman" w:hAnsi="Consolas" w:cs="Times New Roman"/>
+          <w:color w:val="BBBEBF"/>
+          <w:sz w:val="21"/>
+          <w:szCs w:val="21"/>
+        </w:rPr>
+        <w:t>(</w:t>
+      </w:r>
+      <w:r>
+        <w:rPr>
+          <w:rFonts w:ascii="Consolas" w:eastAsia="Times New Roman" w:hAnsi="Consolas" w:cs="Times New Roman"/>
+          <w:color w:val="A5D6FF"/>
+          <w:sz w:val="21"/>
+          <w:szCs w:val="21"/>
+        </w:rPr>
+        <w:t>"Enter two integers: "</w:t>
+      </w:r>
+      <w:r>
+        <w:rPr>
+          <w:rFonts w:ascii="Consolas" w:eastAsia="Times New Roman" w:hAnsi="Consolas" w:cs="Times New Roman"/>
+          <w:color w:val="BBBEBF"/>
+          <w:sz w:val="21"/>
+          <w:szCs w:val="21"/>
+        </w:rPr>
+        <w:t>);</w:t>
+      </w:r>
+    </w:p>
+    <w:p>
+      <w:pPr>
+        <w:shd w:val="clear" w:color="auto" w:fill="121314"/>
+        <w:spacing w:after="0" w:line="285" w:lineRule="atLeast"/>
+        <w:rPr>
+          <w:rFonts w:ascii="Consolas" w:eastAsia="Times New Roman" w:hAnsi="Consolas" w:cs="Times New Roman"/>
+          <w:color w:val="BBBEBF"/>
+          <w:sz w:val="21"/>
+          <w:szCs w:val="21"/>
+        </w:rPr>
+      </w:pPr>
+      <w:r>
+        <w:rPr>
+          <w:rFonts w:ascii="Consolas" w:eastAsia="Times New Roman" w:hAnsi="Consolas" w:cs="Times New Roman"/>
+          <w:color w:val="BBBEBF"/>
+          <w:sz w:val="21"/>
+          <w:szCs w:val="21"/>
+        </w:rPr>
+        <w:t xml:space="preserve">            </w:t>
+      </w:r>
+      <w:r>
+        <w:rPr>
+          <w:rFonts w:ascii="Consolas" w:eastAsia="Times New Roman" w:hAnsi="Consolas" w:cs="Times New Roman"/>
+          <w:color w:val="4EC9B0"/>
+          <w:sz w:val="21"/>
+          <w:szCs w:val="21"/>
+        </w:rPr>
+        <w:t>int</w:t>
+      </w:r>
+      <w:r>
+        <w:rPr>
+          <w:rFonts w:ascii="Consolas" w:eastAsia="Times New Roman" w:hAnsi="Consolas" w:cs="Times New Roman"/>
+          <w:color w:val="FFA657"/>
+          <w:sz w:val="21"/>
+          <w:szCs w:val="21"/>
+        </w:rPr>
+        <w:t xml:space="preserve"> </w:t>
+      </w:r>
+      <w:r>
+        <w:rPr>
+          <w:rFonts w:ascii="Consolas" w:eastAsia="Times New Roman" w:hAnsi="Consolas" w:cs="Times New Roman"/>
+          <w:color w:val="C9D1D9"/>
+          <w:sz w:val="21"/>
+          <w:szCs w:val="21"/>
+        </w:rPr>
+        <w:t>dividend</w:t>
+      </w:r>
+      <w:r>
+        <w:rPr>
+          <w:rFonts w:ascii="Consolas" w:eastAsia="Times New Roman" w:hAnsi="Consolas" w:cs="Times New Roman"/>
+          <w:color w:val="FFA657"/>
+          <w:sz w:val="21"/>
+          <w:szCs w:val="21"/>
+        </w:rPr>
+        <w:t xml:space="preserve"> </w:t>
+      </w:r>
+      <w:r>
+        <w:rPr>
+          <w:rFonts w:ascii="Consolas" w:eastAsia="Times New Roman" w:hAnsi="Consolas" w:cs="Times New Roman"/>
+          <w:color w:val="D4D4D4"/>
+          <w:sz w:val="21"/>
+          <w:szCs w:val="21"/>
+        </w:rPr>
+        <w:t>=</w:t>
+      </w:r>
+      <w:r>
+        <w:rPr>
+          <w:rFonts w:ascii="Consolas" w:eastAsia="Times New Roman" w:hAnsi="Consolas" w:cs="Times New Roman"/>
+          <w:color w:val="BBBEBF"/>
+          <w:sz w:val="21"/>
+          <w:szCs w:val="21"/>
+        </w:rPr>
+        <w:t xml:space="preserve"> </w:t>
+      </w:r>
+      <w:proofErr w:type="spellStart"/>
+      <w:r>
+        <w:rPr>
+          <w:rFonts w:ascii="Consolas" w:eastAsia="Times New Roman" w:hAnsi="Consolas" w:cs="Times New Roman"/>
+          <w:color w:val="79C0FF"/>
+          <w:sz w:val="21"/>
+          <w:szCs w:val="21"/>
+        </w:rPr>
+        <w:t>scanner</w:t>
+      </w:r>
+      <w:r>
+        <w:rPr>
+          <w:rFonts w:ascii="Consolas" w:eastAsia="Times New Roman" w:hAnsi="Consolas" w:cs="Times New Roman"/>
+          <w:color w:val="BBBEBF"/>
+          <w:sz w:val="21"/>
+          <w:szCs w:val="21"/>
+        </w:rPr>
+        <w:t>.</w:t>
+      </w:r>
+      <w:r>
+        <w:rPr>
+          <w:rFonts w:ascii="Consolas" w:eastAsia="Times New Roman" w:hAnsi="Consolas" w:cs="Times New Roman"/>
+          <w:color w:val="D2A8FF"/>
+          <w:sz w:val="21"/>
+          <w:szCs w:val="21"/>
+        </w:rPr>
+        <w:t>nextInt</w:t>
+      </w:r>
+      <w:proofErr w:type="spellEnd"/>
+      <w:r>
+        <w:rPr>
+          <w:rFonts w:ascii="Consolas" w:eastAsia="Times New Roman" w:hAnsi="Consolas" w:cs="Times New Roman"/>
+          <w:color w:val="BBBEBF"/>
+          <w:sz w:val="21"/>
+          <w:szCs w:val="21"/>
+        </w:rPr>
+        <w:t>();</w:t>
+      </w:r>
+    </w:p>
+    <w:p>
+      <w:pPr>
+        <w:shd w:val="clear" w:color="auto" w:fill="121314"/>
+        <w:spacing w:after="0" w:line="285" w:lineRule="atLeast"/>
+        <w:rPr>
+          <w:rFonts w:ascii="Consolas" w:eastAsia="Times New Roman" w:hAnsi="Consolas" w:cs="Times New Roman"/>
+          <w:color w:val="BBBEBF"/>
+          <w:sz w:val="21"/>
+          <w:szCs w:val="21"/>
+        </w:rPr>
+      </w:pPr>
+      <w:r>
+        <w:rPr>
+          <w:rFonts w:ascii="Consolas" w:eastAsia="Times New Roman" w:hAnsi="Consolas" w:cs="Times New Roman"/>
+          <w:color w:val="BBBEBF"/>
+          <w:sz w:val="21"/>
+          <w:szCs w:val="21"/>
+        </w:rPr>
+        <w:t xml:space="preserve">            </w:t>
+      </w:r>
+      <w:r>
+        <w:rPr>
+          <w:rFonts w:ascii="Consolas" w:eastAsia="Times New Roman" w:hAnsi="Consolas" w:cs="Times New Roman"/>
+          <w:color w:val="4EC9B0"/>
+          <w:sz w:val="21"/>
+          <w:szCs w:val="21"/>
+        </w:rPr>
+        <w:t>int</w:t>
+      </w:r>
+      <w:r>
+        <w:rPr>
+          <w:rFonts w:ascii="Consolas" w:eastAsia="Times New Roman" w:hAnsi="Consolas" w:cs="Times New Roman"/>
+          <w:color w:val="FFA657"/>
+          <w:sz w:val="21"/>
+          <w:szCs w:val="21"/>
+        </w:rPr>
+        <w:t xml:space="preserve"> </w:t>
+      </w:r>
+      <w:r>
+        <w:rPr>
+          <w:rFonts w:ascii="Consolas" w:eastAsia="Times New Roman" w:hAnsi="Consolas" w:cs="Times New Roman"/>
+          <w:color w:val="C9D1D9"/>
+          <w:sz w:val="21"/>
+          <w:szCs w:val="21"/>
+        </w:rPr>
+        <w:t>divisor</w:t>
+      </w:r>
+      <w:r>
+        <w:rPr>
+          <w:rFonts w:ascii="Consolas" w:eastAsia="Times New Roman" w:hAnsi="Consolas" w:cs="Times New Roman"/>
+          <w:color w:val="FFA657"/>
+          <w:sz w:val="21"/>
+          <w:szCs w:val="21"/>
+        </w:rPr>
+        <w:t xml:space="preserve"> </w:t>
+      </w:r>
+      <w:r>
+        <w:rPr>
+          <w:rFonts w:ascii="Consolas" w:eastAsia="Times New Roman" w:hAnsi="Consolas" w:cs="Times New Roman"/>
+          <w:color w:val="D4D4D4"/>
+          <w:sz w:val="21"/>
+          <w:szCs w:val="21"/>
+        </w:rPr>
+        <w:t>=</w:t>
+      </w:r>
+      <w:r>
+        <w:rPr>
+          <w:rFonts w:ascii="Consolas" w:eastAsia="Times New Roman" w:hAnsi="Consolas" w:cs="Times New Roman"/>
+          <w:color w:val="BBBEBF"/>
+          <w:sz w:val="21"/>
+          <w:szCs w:val="21"/>
+        </w:rPr>
+        <w:t xml:space="preserve"> </w:t>
+      </w:r>
+      <w:proofErr w:type="spellStart"/>
+      <w:r>
+        <w:rPr>
+          <w:rFonts w:ascii="Consolas" w:eastAsia="Times New Roman" w:hAnsi="Consolas" w:cs="Times New Roman"/>
+          <w:color w:val="79C0FF"/>
+          <w:sz w:val="21"/>
+          <w:szCs w:val="21"/>
+        </w:rPr>
+        <w:t>scanner</w:t>
+      </w:r>
+      <w:r>
+        <w:rPr>
+          <w:rFonts w:ascii="Consolas" w:eastAsia="Times New Roman" w:hAnsi="Consolas" w:cs="Times New Roman"/>
+          <w:color w:val="BBBEBF"/>
+          <w:sz w:val="21"/>
+          <w:szCs w:val="21"/>
+        </w:rPr>
+        <w:t>.</w:t>
+      </w:r>
+      <w:r>
+        <w:rPr>
+          <w:rFonts w:ascii="Consolas" w:eastAsia="Times New Roman" w:hAnsi="Consolas" w:cs="Times New Roman"/>
+          <w:color w:val="D2A8FF"/>
+          <w:sz w:val="21"/>
+          <w:szCs w:val="21"/>
+        </w:rPr>
+        <w:t>nextInt</w:t>
+      </w:r>
+      <w:proofErr w:type="spellEnd"/>
+      <w:r>
+        <w:rPr>
+          <w:rFonts w:ascii="Consolas" w:eastAsia="Times New Roman" w:hAnsi="Consolas" w:cs="Times New Roman"/>
+          <w:color w:val="BBBEBF"/>
+          <w:sz w:val="21"/>
+          <w:szCs w:val="21"/>
+        </w:rPr>
+        <w:t>();</w:t>
+      </w:r>
+    </w:p>
+    <w:p>
+      <w:pPr>
+        <w:shd w:val="clear" w:color="auto" w:fill="121314"/>
+        <w:spacing w:after="0" w:line="285" w:lineRule="atLeast"/>
+        <w:rPr>
+          <w:rFonts w:ascii="Consolas" w:eastAsia="Times New Roman" w:hAnsi="Consolas" w:cs="Times New Roman"/>
+          <w:color w:val="BBBEBF"/>
+          <w:sz w:val="21"/>
+          <w:szCs w:val="21"/>
+        </w:rPr>
+      </w:pPr>
+      <w:r>
+        <w:rPr>
+          <w:rFonts w:ascii="Consolas" w:eastAsia="Times New Roman" w:hAnsi="Consolas" w:cs="Times New Roman"/>
+          <w:color w:val="BBBEBF"/>
+          <w:sz w:val="21"/>
+          <w:szCs w:val="21"/>
+        </w:rPr>
+        <w:t xml:space="preserve">            </w:t>
+      </w:r>
+      <w:r>
+        <w:rPr>
+          <w:rFonts w:ascii="Consolas" w:eastAsia="Times New Roman" w:hAnsi="Consolas" w:cs="Times New Roman"/>
+          <w:color w:val="8B949E"/>
+          <w:sz w:val="21"/>
+          <w:szCs w:val="21"/>
+        </w:rPr>
+        <w:t>// Perform the division and print the result</w:t>
+      </w:r>
+    </w:p>
+    <w:p>
+      <w:pPr>
+        <w:shd w:val="clear" w:color="auto" w:fill="121314"/>
+        <w:spacing w:after="0" w:line="285" w:lineRule="atLeast"/>
+        <w:rPr>
+          <w:rFonts w:ascii="Consolas" w:eastAsia="Times New Roman" w:hAnsi="Consolas" w:cs="Times New Roman"/>
+          <w:color w:val="BBBEBF"/>
+          <w:sz w:val="21"/>
+          <w:szCs w:val="21"/>
+        </w:rPr>
+      </w:pPr>
+      <w:r>
+        <w:rPr>
+          <w:rFonts w:ascii="Consolas" w:eastAsia="Times New Roman" w:hAnsi="Consolas" w:cs="Times New Roman"/>
+          <w:color w:val="BBBEBF"/>
+          <w:sz w:val="21"/>
+          <w:szCs w:val="21"/>
+        </w:rPr>
+        <w:t xml:space="preserve">            </w:t>
+      </w:r>
+      <w:proofErr w:type="spellStart"/>
+      <w:r>
+        <w:rPr>
+          <w:rFonts w:ascii="Consolas" w:eastAsia="Times New Roman" w:hAnsi="Consolas" w:cs="Times New Roman"/>
+          <w:color w:val="4EC9B0"/>
+          <w:sz w:val="21"/>
+          <w:szCs w:val="21"/>
+        </w:rPr>
+        <w:t>System</w:t>
+      </w:r>
+      <w:r>
+        <w:rPr>
+          <w:rFonts w:ascii="Consolas" w:eastAsia="Times New Roman" w:hAnsi="Consolas" w:cs="Times New Roman"/>
+          <w:color w:val="BBBEBF"/>
+          <w:sz w:val="21"/>
+          <w:szCs w:val="21"/>
+        </w:rPr>
+        <w:t>.</w:t>
+      </w:r>
+      <w:r>
+        <w:rPr>
+          <w:rFonts w:ascii="Consolas" w:eastAsia="Times New Roman" w:hAnsi="Consolas" w:cs="Times New Roman"/>
+          <w:color w:val="79C0FF"/>
+          <w:sz w:val="21"/>
+          <w:szCs w:val="21"/>
+        </w:rPr>
+        <w:t>out</w:t>
+      </w:r>
+      <w:r>
+        <w:rPr>
+          <w:rFonts w:ascii="Consolas" w:eastAsia="Times New Roman" w:hAnsi="Consolas" w:cs="Times New Roman"/>
+          <w:color w:val="BBBEBF"/>
+          <w:sz w:val="21"/>
+          <w:szCs w:val="21"/>
+        </w:rPr>
+        <w:t>.</w:t>
+      </w:r>
+      <w:r>
+        <w:rPr>
+          <w:rFonts w:ascii="Consolas" w:eastAsia="Times New Roman" w:hAnsi="Consolas" w:cs="Times New Roman"/>
+          <w:color w:val="D2A8FF"/>
+          <w:sz w:val="21"/>
+          <w:szCs w:val="21"/>
+        </w:rPr>
+        <w:t>println</w:t>
+      </w:r>
+      <w:proofErr w:type="spellEnd"/>
+      <w:r>
+        <w:rPr>
+          <w:rFonts w:ascii="Consolas" w:eastAsia="Times New Roman" w:hAnsi="Consolas" w:cs="Times New Roman"/>
+          <w:color w:val="BBBEBF"/>
+          <w:sz w:val="21"/>
+          <w:szCs w:val="21"/>
+        </w:rPr>
+        <w:t>(</w:t>
+      </w:r>
+      <w:r>
+        <w:rPr>
+          <w:rFonts w:ascii="Consolas" w:eastAsia="Times New Roman" w:hAnsi="Consolas" w:cs="Times New Roman"/>
+          <w:color w:val="A5D6FF"/>
+          <w:sz w:val="21"/>
+          <w:szCs w:val="21"/>
+        </w:rPr>
+        <w:t>"Result: "</w:t>
+      </w:r>
+      <w:r>
+        <w:rPr>
+          <w:rFonts w:ascii="Consolas" w:eastAsia="Times New Roman" w:hAnsi="Consolas" w:cs="Times New Roman"/>
+          <w:color w:val="BBBEBF"/>
+          <w:sz w:val="21"/>
+          <w:szCs w:val="21"/>
+        </w:rPr>
+        <w:t xml:space="preserve"> </w:t>
+      </w:r>
+      <w:r>
+        <w:rPr>
+          <w:rFonts w:ascii="Consolas" w:eastAsia="Times New Roman" w:hAnsi="Consolas" w:cs="Times New Roman"/>
+          <w:color w:val="D4D4D4"/>
+          <w:sz w:val="21"/>
+          <w:szCs w:val="21"/>
+        </w:rPr>
+        <w:t>+</w:t>
+      </w:r>
+      <w:r>
+        <w:rPr>
+          <w:rFonts w:ascii="Consolas" w:eastAsia="Times New Roman" w:hAnsi="Consolas" w:cs="Times New Roman"/>
+          <w:color w:val="BBBEBF"/>
+          <w:sz w:val="21"/>
+          <w:szCs w:val="21"/>
+        </w:rPr>
+        <w:t xml:space="preserve"> (</w:t>
+      </w:r>
+      <w:r>
+        <w:rPr>
+          <w:rFonts w:ascii="Consolas" w:eastAsia="Times New Roman" w:hAnsi="Consolas" w:cs="Times New Roman"/>
+          <w:color w:val="C9D1D9"/>
+          <w:sz w:val="21"/>
+          <w:szCs w:val="21"/>
+        </w:rPr>
+        <w:t>dividend</w:t>
+      </w:r>
+      <w:r>
+        <w:rPr>
+          <w:rFonts w:ascii="Consolas" w:eastAsia="Times New Roman" w:hAnsi="Consolas" w:cs="Times New Roman"/>
+          <w:color w:val="BBBEBF"/>
+          <w:sz w:val="21"/>
+          <w:szCs w:val="21"/>
+        </w:rPr>
+        <w:t xml:space="preserve"> </w:t>
+      </w:r>
+      <w:r>
+        <w:rPr>
+          <w:rFonts w:ascii="Consolas" w:eastAsia="Times New Roman" w:hAnsi="Consolas" w:cs="Times New Roman"/>
+          <w:color w:val="D4D4D4"/>
+          <w:sz w:val="21"/>
+          <w:szCs w:val="21"/>
+        </w:rPr>
+        <w:t>/</w:t>
+      </w:r>
+      <w:r>
+        <w:rPr>
+          <w:rFonts w:ascii="Consolas" w:eastAsia="Times New Roman" w:hAnsi="Consolas" w:cs="Times New Roman"/>
+          <w:color w:val="BBBEBF"/>
+          <w:sz w:val="21"/>
+          <w:szCs w:val="21"/>
+        </w:rPr>
+        <w:t xml:space="preserve"> </w:t>
+      </w:r>
+      <w:r>
+        <w:rPr>
+          <w:rFonts w:ascii="Consolas" w:eastAsia="Times New Roman" w:hAnsi="Consolas" w:cs="Times New Roman"/>
+          <w:color w:val="C9D1D9"/>
+          <w:sz w:val="21"/>
+          <w:szCs w:val="21"/>
+        </w:rPr>
+        <w:t>divisor</w:t>
+      </w:r>
+      <w:r>
+        <w:rPr>
+          <w:rFonts w:ascii="Consolas" w:eastAsia="Times New Roman" w:hAnsi="Consolas" w:cs="Times New Roman"/>
+          <w:color w:val="BBBEBF"/>
+          <w:sz w:val="21"/>
+          <w:szCs w:val="21"/>
+        </w:rPr>
+        <w:t>));</w:t>
+      </w:r>
+    </w:p>
+    <w:p>
+      <w:pPr>
+        <w:shd w:val="clear" w:color="auto" w:fill="121314"/>
+        <w:spacing w:after="0" w:line="285" w:lineRule="atLeast"/>
+        <w:rPr>
+          <w:rFonts w:ascii="Consolas" w:eastAsia="Times New Roman" w:hAnsi="Consolas" w:cs="Times New Roman"/>
+          <w:color w:val="BBBEBF"/>
+          <w:sz w:val="21"/>
+          <w:szCs w:val="21"/>
+        </w:rPr>
+      </w:pPr>
+      <w:r>
+        <w:rPr>
+          <w:rFonts w:ascii="Consolas" w:eastAsia="Times New Roman" w:hAnsi="Consolas" w:cs="Times New Roman"/>
+          <w:color w:val="BBBEBF"/>
+          <w:sz w:val="21"/>
+          <w:szCs w:val="21"/>
+        </w:rPr>
+        <w:t xml:space="preserve">            </w:t>
+      </w:r>
+      <w:r>
+        <w:rPr>
+          <w:rFonts w:ascii="Consolas" w:eastAsia="Times New Roman" w:hAnsi="Consolas" w:cs="Times New Roman"/>
+          <w:color w:val="8B949E"/>
+          <w:sz w:val="21"/>
+          <w:szCs w:val="21"/>
+        </w:rPr>
+        <w:t>// Catch exceptions for invalid input and division by zero</w:t>
+      </w:r>
+    </w:p>
+    <w:p>
+      <w:pPr>
+        <w:shd w:val="clear" w:color="auto" w:fill="121314"/>
+        <w:spacing w:after="0" w:line="285" w:lineRule="atLeast"/>
+        <w:rPr>
+          <w:rFonts w:ascii="Consolas" w:eastAsia="Times New Roman" w:hAnsi="Consolas" w:cs="Times New Roman"/>
+          <w:color w:val="BBBEBF"/>
+          <w:sz w:val="21"/>
+          <w:szCs w:val="21"/>
+        </w:rPr>
+      </w:pPr>
+      <w:r>
+        <w:rPr>
+          <w:rFonts w:ascii="Consolas" w:eastAsia="Times New Roman" w:hAnsi="Consolas" w:cs="Times New Roman"/>
+          <w:color w:val="BBBEBF"/>
+          <w:sz w:val="21"/>
+          <w:szCs w:val="21"/>
+        </w:rPr>
+        <w:t xml:space="preserve">        } </w:t>
+      </w:r>
+      <w:r>
+        <w:rPr>
+          <w:rFonts w:ascii="Consolas" w:eastAsia="Times New Roman" w:hAnsi="Consolas" w:cs="Times New Roman"/>
+          <w:color w:val="C586C0"/>
+          <w:sz w:val="21"/>
+          <w:szCs w:val="21"/>
+        </w:rPr>
+        <w:t>catch</w:t>
+      </w:r>
+      <w:r>
+        <w:rPr>
+          <w:rFonts w:ascii="Consolas" w:eastAsia="Times New Roman" w:hAnsi="Consolas" w:cs="Times New Roman"/>
+          <w:color w:val="BBBEBF"/>
+          <w:sz w:val="21"/>
+          <w:szCs w:val="21"/>
+        </w:rPr>
+        <w:t xml:space="preserve"> (</w:t>
+      </w:r>
+      <w:proofErr w:type="spellStart"/>
+      <w:r>
+        <w:rPr>
+          <w:rFonts w:ascii="Consolas" w:eastAsia="Times New Roman" w:hAnsi="Consolas" w:cs="Times New Roman"/>
+          <w:color w:val="4EC9B0"/>
+          <w:sz w:val="21"/>
+          <w:szCs w:val="21"/>
+        </w:rPr>
+        <w:t>InputMismatchException</w:t>
+      </w:r>
+      <w:proofErr w:type="spellEnd"/>
+      <w:r>
+        <w:rPr>
+          <w:rFonts w:ascii="Consolas" w:eastAsia="Times New Roman" w:hAnsi="Consolas" w:cs="Times New Roman"/>
+          <w:color w:val="BBBEBF"/>
+          <w:sz w:val="21"/>
+          <w:szCs w:val="21"/>
+        </w:rPr>
+        <w:t xml:space="preserve"> </w:t>
+      </w:r>
+      <w:r>
+        <w:rPr>
+          <w:rFonts w:ascii="Consolas" w:eastAsia="Times New Roman" w:hAnsi="Consolas" w:cs="Times New Roman"/>
+          <w:color w:val="C9D1D9"/>
+          <w:sz w:val="21"/>
+          <w:szCs w:val="21"/>
+        </w:rPr>
+        <w:t>e</w:t>
+      </w:r>
+      <w:r>
+        <w:rPr>
+          <w:rFonts w:ascii="Consolas" w:eastAsia="Times New Roman" w:hAnsi="Consolas" w:cs="Times New Roman"/>
+          <w:color w:val="BBBEBF"/>
+          <w:sz w:val="21"/>
+          <w:szCs w:val="21"/>
+        </w:rPr>
+        <w:t>) {</w:t>
+      </w:r>
+    </w:p>
+    <w:p>
+      <w:pPr>
+        <w:shd w:val="clear" w:color="auto" w:fill="121314"/>
+        <w:spacing w:after="0" w:line="285" w:lineRule="atLeast"/>
+        <w:rPr>
+          <w:rFonts w:ascii="Consolas" w:eastAsia="Times New Roman" w:hAnsi="Consolas" w:cs="Times New Roman"/>
+          <w:color w:val="BBBEBF"/>
+          <w:sz w:val="21"/>
+          <w:szCs w:val="21"/>
+        </w:rPr>
+      </w:pPr>
+      <w:r>
+        <w:rPr>
+          <w:rFonts w:ascii="Consolas" w:eastAsia="Times New Roman" w:hAnsi="Consolas" w:cs="Times New Roman"/>
+          <w:color w:val="BBBEBF"/>
+          <w:sz w:val="21"/>
+          <w:szCs w:val="21"/>
+        </w:rPr>
+        <w:t xml:space="preserve">            </w:t>
+      </w:r>
+      <w:proofErr w:type="spellStart"/>
+      <w:r>
+        <w:rPr>
+          <w:rFonts w:ascii="Consolas" w:eastAsia="Times New Roman" w:hAnsi="Consolas" w:cs="Times New Roman"/>
+          <w:color w:val="4EC9B0"/>
+          <w:sz w:val="21"/>
+          <w:szCs w:val="21"/>
+        </w:rPr>
+        <w:t>System</w:t>
+      </w:r>
+      <w:r>
+        <w:rPr>
+          <w:rFonts w:ascii="Consolas" w:eastAsia="Times New Roman" w:hAnsi="Consolas" w:cs="Times New Roman"/>
+          <w:color w:val="BBBEBF"/>
+          <w:sz w:val="21"/>
+          <w:szCs w:val="21"/>
+        </w:rPr>
+        <w:t>.</w:t>
+      </w:r>
+      <w:r>
+        <w:rPr>
+          <w:rFonts w:ascii="Consolas" w:eastAsia="Times New Roman" w:hAnsi="Consolas" w:cs="Times New Roman"/>
+          <w:color w:val="79C0FF"/>
+          <w:sz w:val="21"/>
+          <w:szCs w:val="21"/>
+        </w:rPr>
+        <w:t>out</w:t>
+      </w:r>
+      <w:r>
+        <w:rPr>
+          <w:rFonts w:ascii="Consolas" w:eastAsia="Times New Roman" w:hAnsi="Consolas" w:cs="Times New Roman"/>
+          <w:color w:val="BBBEBF"/>
+          <w:sz w:val="21"/>
+          <w:szCs w:val="21"/>
+        </w:rPr>
+        <w:t>.</w:t>
+      </w:r>
+      <w:r>
+        <w:rPr>
+          <w:rFonts w:ascii="Consolas" w:eastAsia="Times New Roman" w:hAnsi="Consolas" w:cs="Times New Roman"/>
+          <w:color w:val="D2A8FF"/>
+          <w:sz w:val="21"/>
+          <w:szCs w:val="21"/>
+        </w:rPr>
+        <w:t>println</w:t>
+      </w:r>
+      <w:proofErr w:type="spellEnd"/>
+      <w:r>
+        <w:rPr>
+          <w:rFonts w:ascii="Consolas" w:eastAsia="Times New Roman" w:hAnsi="Consolas" w:cs="Times New Roman"/>
+          <w:color w:val="BBBEBF"/>
+          <w:sz w:val="21"/>
+          <w:szCs w:val="21"/>
+        </w:rPr>
+        <w:t>(</w:t>
+      </w:r>
+      <w:r>
+        <w:rPr>
+          <w:rFonts w:ascii="Consolas" w:eastAsia="Times New Roman" w:hAnsi="Consolas" w:cs="Times New Roman"/>
+          <w:color w:val="A5D6FF"/>
+          <w:sz w:val="21"/>
+          <w:szCs w:val="21"/>
+        </w:rPr>
+        <w:t>"Please enter integers only"</w:t>
+      </w:r>
+      <w:r>
+        <w:rPr>
+          <w:rFonts w:ascii="Consolas" w:eastAsia="Times New Roman" w:hAnsi="Consolas" w:cs="Times New Roman"/>
+          <w:color w:val="BBBEBF"/>
+          <w:sz w:val="21"/>
+          <w:szCs w:val="21"/>
+        </w:rPr>
+        <w:t>);</w:t>
+      </w:r>
+    </w:p>
+    <w:p>
+      <w:pPr>
+        <w:shd w:val="clear" w:color="auto" w:fill="121314"/>
+        <w:spacing w:after="0" w:line="285" w:lineRule="atLeast"/>
+        <w:rPr>
+          <w:rFonts w:ascii="Consolas" w:eastAsia="Times New Roman" w:hAnsi="Consolas" w:cs="Times New Roman"/>
+          <w:color w:val="BBBEBF"/>
+          <w:sz w:val="21"/>
+          <w:szCs w:val="21"/>
+        </w:rPr>
+      </w:pPr>
+      <w:r>
+        <w:rPr>
+          <w:rFonts w:ascii="Consolas" w:eastAsia="Times New Roman" w:hAnsi="Consolas" w:cs="Times New Roman"/>
+          <w:color w:val="BBBEBF"/>
+          <w:sz w:val="21"/>
+          <w:szCs w:val="21"/>
+        </w:rPr>
+        <w:t xml:space="preserve">        } </w:t>
+      </w:r>
+      <w:r>
+        <w:rPr>
+          <w:rFonts w:ascii="Consolas" w:eastAsia="Times New Roman" w:hAnsi="Consolas" w:cs="Times New Roman"/>
+          <w:color w:val="C586C0"/>
+          <w:sz w:val="21"/>
+          <w:szCs w:val="21"/>
+        </w:rPr>
+        <w:t>catch</w:t>
+      </w:r>
+      <w:r>
+        <w:rPr>
+          <w:rFonts w:ascii="Consolas" w:eastAsia="Times New Roman" w:hAnsi="Consolas" w:cs="Times New Roman"/>
+          <w:color w:val="BBBEBF"/>
+          <w:sz w:val="21"/>
+          <w:szCs w:val="21"/>
+        </w:rPr>
+        <w:t xml:space="preserve"> (</w:t>
+      </w:r>
+      <w:proofErr w:type="spellStart"/>
+      <w:r>
+        <w:rPr>
+          <w:rFonts w:ascii="Consolas" w:eastAsia="Times New Roman" w:hAnsi="Consolas" w:cs="Times New Roman"/>
+          <w:color w:val="4EC9B0"/>
+          <w:sz w:val="21"/>
+          <w:szCs w:val="21"/>
+        </w:rPr>
+        <w:t>ArithmeticException</w:t>
+      </w:r>
+      <w:proofErr w:type="spellEnd"/>
+      <w:r>
+        <w:rPr>
+          <w:rFonts w:ascii="Consolas" w:eastAsia="Times New Roman" w:hAnsi="Consolas" w:cs="Times New Roman"/>
+          <w:color w:val="BBBEBF"/>
+          <w:sz w:val="21"/>
+          <w:szCs w:val="21"/>
+        </w:rPr>
+        <w:t xml:space="preserve"> </w:t>
+      </w:r>
+      <w:r>
+        <w:rPr>
+          <w:rFonts w:ascii="Consolas" w:eastAsia="Times New Roman" w:hAnsi="Consolas" w:cs="Times New Roman"/>
+          <w:color w:val="C9D1D9"/>
+          <w:sz w:val="21"/>
+          <w:szCs w:val="21"/>
+        </w:rPr>
+        <w:t>e</w:t>
+      </w:r>
+      <w:r>
+        <w:rPr>
+          <w:rFonts w:ascii="Consolas" w:eastAsia="Times New Roman" w:hAnsi="Consolas" w:cs="Times New Roman"/>
+          <w:color w:val="BBBEBF"/>
+          <w:sz w:val="21"/>
+          <w:szCs w:val="21"/>
+        </w:rPr>
+        <w:t>) {</w:t>
+      </w:r>
+    </w:p>
+    <w:p>
+      <w:pPr>
+        <w:shd w:val="clear" w:color="auto" w:fill="121314"/>
+        <w:spacing w:after="0" w:line="285" w:lineRule="atLeast"/>
+        <w:rPr>
+          <w:rFonts w:ascii="Consolas" w:eastAsia="Times New Roman" w:hAnsi="Consolas" w:cs="Times New Roman"/>
+          <w:color w:val="BBBEBF"/>
+          <w:sz w:val="21"/>
+          <w:szCs w:val="21"/>
+        </w:rPr>
+      </w:pPr>
+      <w:r>
+        <w:rPr>
+          <w:rFonts w:ascii="Consolas" w:eastAsia="Times New Roman" w:hAnsi="Consolas" w:cs="Times New Roman"/>
+          <w:color w:val="BBBEBF"/>
+          <w:sz w:val="21"/>
+          <w:szCs w:val="21"/>
+        </w:rPr>
+        <w:t xml:space="preserve">            </w:t>
+      </w:r>
+      <w:r>
+        <w:rPr>
+          <w:rFonts w:ascii="Consolas" w:eastAsia="Times New Roman" w:hAnsi="Consolas" w:cs="Times New Roman"/>
+          <w:color w:val="8B949E"/>
+          <w:sz w:val="21"/>
+          <w:szCs w:val="21"/>
+        </w:rPr>
+        <w:t>// Integer division by zero is reported separately from invalid input.</w:t>
+      </w:r>
+    </w:p>
+    <w:p>
+      <w:pPr>
+        <w:shd w:val="clear" w:color="auto" w:fill="121314"/>
+        <w:spacing w:after="0" w:line="285" w:lineRule="atLeast"/>
+        <w:rPr>
+          <w:rFonts w:ascii="Consolas" w:eastAsia="Times New Roman" w:hAnsi="Consolas" w:cs="Times New Roman"/>
+          <w:color w:val="BBBEBF"/>
+          <w:sz w:val="21"/>
+          <w:szCs w:val="21"/>
+        </w:rPr>
+      </w:pPr>
+      <w:r>
+        <w:rPr>
+          <w:rFonts w:ascii="Consolas" w:eastAsia="Times New Roman" w:hAnsi="Consolas" w:cs="Times New Roman"/>
+          <w:color w:val="BBBEBF"/>
+          <w:sz w:val="21"/>
+          <w:szCs w:val="21"/>
+        </w:rPr>
+        <w:t xml:space="preserve">            </w:t>
+      </w:r>
+      <w:proofErr w:type="spellStart"/>
+      <w:r>
+        <w:rPr>
+          <w:rFonts w:ascii="Consolas" w:eastAsia="Times New Roman" w:hAnsi="Consolas" w:cs="Times New Roman"/>
+          <w:color w:val="4EC9B0"/>
+          <w:sz w:val="21"/>
+          <w:szCs w:val="21"/>
+        </w:rPr>
+        <w:t>System</w:t>
+      </w:r>
+      <w:r>
+        <w:rPr>
+          <w:rFonts w:ascii="Consolas" w:eastAsia="Times New Roman" w:hAnsi="Consolas" w:cs="Times New Roman"/>
+          <w:color w:val="BBBEBF"/>
+          <w:sz w:val="21"/>
+          <w:szCs w:val="21"/>
+        </w:rPr>
+        <w:t>.</w:t>
+      </w:r>
+      <w:r>
+        <w:rPr>
+          <w:rFonts w:ascii="Consolas" w:eastAsia="Times New Roman" w:hAnsi="Consolas" w:cs="Times New Roman"/>
+          <w:color w:val="79C0FF"/>
+          <w:sz w:val="21"/>
+          <w:szCs w:val="21"/>
+        </w:rPr>
+        <w:t>out</w:t>
+      </w:r>
+      <w:r>
+        <w:rPr>
+          <w:rFonts w:ascii="Consolas" w:eastAsia="Times New Roman" w:hAnsi="Consolas" w:cs="Times New Roman"/>
+          <w:color w:val="BBBEBF"/>
+          <w:sz w:val="21"/>
+          <w:szCs w:val="21"/>
+        </w:rPr>
+        <w:t>.</w:t>
+      </w:r>
+      <w:r>
+        <w:rPr>
+          <w:rFonts w:ascii="Consolas" w:eastAsia="Times New Roman" w:hAnsi="Consolas" w:cs="Times New Roman"/>
+          <w:color w:val="D2A8FF"/>
+          <w:sz w:val="21"/>
+          <w:szCs w:val="21"/>
+        </w:rPr>
+        <w:t>println</w:t>
+      </w:r>
+      <w:proofErr w:type="spellEnd"/>
+      <w:r>
+        <w:rPr>
+          <w:rFonts w:ascii="Consolas" w:eastAsia="Times New Roman" w:hAnsi="Consolas" w:cs="Times New Roman"/>
+          <w:color w:val="BBBEBF"/>
+          <w:sz w:val="21"/>
+          <w:szCs w:val="21"/>
+        </w:rPr>
+        <w:t>(</w:t>
+      </w:r>
+      <w:r>
+        <w:rPr>
+          <w:rFonts w:ascii="Consolas" w:eastAsia="Times New Roman" w:hAnsi="Consolas" w:cs="Times New Roman"/>
+          <w:color w:val="A5D6FF"/>
+          <w:sz w:val="21"/>
+          <w:szCs w:val="21"/>
+        </w:rPr>
+        <w:t>"Cannot divide by zero"</w:t>
+      </w:r>
+      <w:r>
+        <w:rPr>
+          <w:rFonts w:ascii="Consolas" w:eastAsia="Times New Roman" w:hAnsi="Consolas" w:cs="Times New Roman"/>
+          <w:color w:val="BBBEBF"/>
+          <w:sz w:val="21"/>
+          <w:szCs w:val="21"/>
+        </w:rPr>
+        <w:t>);</w:t>
+      </w:r>
+    </w:p>
+    <w:p>
+      <w:pPr>
+        <w:shd w:val="clear" w:color="auto" w:fill="121314"/>
+        <w:spacing w:after="0" w:line="285" w:lineRule="atLeast"/>
+        <w:rPr>
+          <w:rFonts w:ascii="Consolas" w:eastAsia="Times New Roman" w:hAnsi="Consolas" w:cs="Times New Roman"/>
+          <w:color w:val="BBBEBF"/>
+          <w:sz w:val="21"/>
+          <w:szCs w:val="21"/>
+        </w:rPr>
+      </w:pPr>
+      <w:r>
+        <w:rPr>
+          <w:rFonts w:ascii="Consolas" w:eastAsia="Times New Roman" w:hAnsi="Consolas" w:cs="Times New Roman"/>
+          <w:color w:val="BBBEBF"/>
+          <w:sz w:val="21"/>
+          <w:szCs w:val="21"/>
+        </w:rPr>
+        <w:t>        }</w:t>
+      </w:r>
+    </w:p>
+    <w:p>
+      <w:pPr>
+        <w:shd w:val="clear" w:color="auto" w:fill="121314"/>
+        <w:spacing w:after="0" w:line="285" w:lineRule="atLeast"/>
+        <w:rPr>
+          <w:rFonts w:ascii="Consolas" w:eastAsia="Times New Roman" w:hAnsi="Consolas" w:cs="Times New Roman"/>
+          <w:color w:val="BBBEBF"/>
+          <w:sz w:val="21"/>
+          <w:szCs w:val="21"/>
+        </w:rPr>
+      </w:pPr>
+      <w:r>
+        <w:rPr>
+          <w:rFonts w:ascii="Consolas" w:eastAsia="Times New Roman" w:hAnsi="Consolas" w:cs="Times New Roman"/>
+          <w:color w:val="BBBEBF"/>
+          <w:sz w:val="21"/>
+          <w:szCs w:val="21"/>
+        </w:rPr>
+        <w:t>    }</w:t>
+      </w:r>
+    </w:p>
+    <w:p>
+      <w:pPr>
+        <w:shd w:val="clear" w:color="auto" w:fill="121314"/>
+        <w:spacing w:after="0" w:line="285" w:lineRule="atLeast"/>
+        <w:rPr>
+          <w:rFonts w:ascii="Consolas" w:eastAsia="Times New Roman" w:hAnsi="Consolas" w:cs="Times New Roman"/>
+          <w:color w:val="BBBEBF"/>
+          <w:sz w:val="21"/>
+          <w:szCs w:val="21"/>
+        </w:rPr>
+      </w:pPr>
+      <w:r>
+        <w:rPr>
+          <w:rFonts w:ascii="Consolas" w:eastAsia="Times New Roman" w:hAnsi="Consolas" w:cs="Times New Roman"/>
+          <w:color w:val="BBBEBF"/>
+          <w:sz w:val="21"/>
+          <w:szCs w:val="21"/>
+        </w:rPr>
+        <w:t>}</w:t>
+      </w:r>
+    </w:p>
+    <w:p>
+      <w:pPr>
+        <w:shd w:val="clear" w:color="auto" w:fill="121314"/>
+        <w:spacing w:after="0" w:line="285" w:lineRule="atLeast"/>
+        <w:rPr>
+          <w:rFonts w:ascii="Consolas" w:eastAsia="Times New Roman" w:hAnsi="Consolas" w:cs="Times New Roman"/>
+          <w:color w:val="BBBEBF"/>
+          <w:sz w:val="21"/>
+          <w:szCs w:val="21"/>
+        </w:rPr>
+      </w:pPr>
+    </w:p>
+    <w:p>
+      <w:r>
+        <w:t>Expected output (sample):</w:t>
       </w:r>
     </w:p>
     <w:p>
@@ -50,7 +1544,30 @@
           <w:rFonts w:ascii="Consolas" w:hAnsi="Consolas"/>
           <w:sz w:val="16"/>
         </w:rPr>
-        <w:t>public class Exercise1SafeDivision {</w:t>
+        <w:t>Enter two integers: Please enter integers only</w:t>
+      </w:r>
+    </w:p>
+    <w:p>
+      <w:r>
+        <w:t>Explanation: InputMismatchException handles non-integer input. ArithmeticException handles division by zero.</w:t>
+      </w:r>
+    </w:p>
+    <w:p>
+      <w:pPr>
+        <w:pStyle w:val="Heading1"/>
+      </w:pPr>
+      <w:r>
+        <w:t>Exercise 2</w:t>
+      </w:r>
+    </w:p>
+    <w:p>
+      <w:r>
+        <w:t>Question: Access an array element and catch ArrayIndexOutOfBoundsException.</w:t>
+      </w:r>
+    </w:p>
+    <w:p>
+      <w:r>
+        <w:t>Java source code:</w:t>
       </w:r>
     </w:p>
     <w:p>
@@ -62,7 +1579,7 @@
           <w:rFonts w:ascii="Consolas" w:hAnsi="Consolas"/>
           <w:sz w:val="16"/>
         </w:rPr>
-        <w:t xml:space="preserve">    public static void main(String[] args) {</w:t>
+        <w:t>public class Exercise2ArrayAccess {</w:t>
       </w:r>
     </w:p>
     <w:p>
@@ -74,7 +1591,7 @@
           <w:rFonts w:ascii="Consolas" w:hAnsi="Consolas"/>
           <w:sz w:val="16"/>
         </w:rPr>
-        <w:t xml:space="preserve">        Scanner sc=new Scanner(System.in);</w:t>
+        <w:t xml:space="preserve">    static void printElement(int[] values,int index) { try { System.out.println(values[index]); } catch(ArrayIndexOutOfBoundsException e) { System.out.println("Invalid array index"); } }</w:t>
       </w:r>
     </w:p>
     <w:p>
@@ -86,7 +1603,7 @@
           <w:rFonts w:ascii="Consolas" w:hAnsi="Consolas"/>
           <w:sz w:val="16"/>
         </w:rPr>
-        <w:t xml:space="preserve">        try { System.out.print("Enter two integers: "); int a=sc.nextInt(), b=sc.nextInt(); System.out.println("Result: "+(a/b)); }</w:t>
+        <w:t xml:space="preserve">    public static void main(String[] args) { printElement(new int[]{10,20,30},1); printElement(new int[]{10,20,30},5); }</w:t>
       </w:r>
     </w:p>
     <w:p>
@@ -98,7 +1615,12 @@
           <w:rFonts w:ascii="Consolas" w:hAnsi="Consolas"/>
           <w:sz w:val="16"/>
         </w:rPr>
-        <w:t xml:space="preserve">        catch(InputMismatchException e){System.out.println("Please enter integers only");}</w:t>
+        <w:t>}</w:t>
+      </w:r>
+    </w:p>
+    <w:p>
+      <w:r>
+        <w:t>Expected output (sample):</w:t>
       </w:r>
     </w:p>
     <w:p>
@@ -110,7 +1632,7 @@
           <w:rFonts w:ascii="Consolas" w:hAnsi="Consolas"/>
           <w:sz w:val="16"/>
         </w:rPr>
-        <w:t xml:space="preserve">        catch(ArithmeticException e){System.out.println("Cannot divide by zero");}</w:t>
+        <w:t>20</w:t>
       </w:r>
     </w:p>
     <w:p>
@@ -122,7 +1644,31 @@
           <w:rFonts w:ascii="Consolas" w:hAnsi="Consolas"/>
           <w:sz w:val="16"/>
         </w:rPr>
-        <w:t xml:space="preserve">    }</w:t>
+        <w:t>Invalid array index</w:t>
+      </w:r>
+    </w:p>
+    <w:p>
+      <w:r>
+        <w:lastRenderedPageBreak/>
+        <w:t>Explanation: The try block accesses the requested index. The catch block handles an index outside the array.</w:t>
+      </w:r>
+    </w:p>
+    <w:p>
+      <w:pPr>
+        <w:pStyle w:val="Heading1"/>
+      </w:pPr>
+      <w:r>
+        <w:t>Exercise 3</w:t>
+      </w:r>
+    </w:p>
+    <w:p>
+      <w:r>
+        <w:t>Question: Create checked InvalidAgeException and validate ages 0–120.</w:t>
+      </w:r>
+    </w:p>
+    <w:p>
+      <w:r>
+        <w:t>Java source code:</w:t>
       </w:r>
     </w:p>
     <w:p>
@@ -134,12 +1680,7 @@
           <w:rFonts w:ascii="Consolas" w:hAnsi="Consolas"/>
           <w:sz w:val="16"/>
         </w:rPr>
-        <w:t>}</w:t>
-      </w:r>
-    </w:p>
-    <w:p>
-      <w:r>
-        <w:t>Expected output (sample):</w:t>
+        <w:t>public class Exercise3InvalidAge {</w:t>
       </w:r>
     </w:p>
     <w:p>
@@ -151,12 +1692,65 @@
           <w:rFonts w:ascii="Consolas" w:hAnsi="Consolas"/>
           <w:sz w:val="16"/>
         </w:rPr>
-        <w:t>Enter two integers: Please enter integers only</w:t>
+        <w:t xml:space="preserve">    static class InvalidAgeException extends Exception { InvalidAgeException(String message){super(message);} }</w:t>
       </w:r>
     </w:p>
     <w:p>
-      <w:r>
-        <w:t>Explanation: InputMismatchException handles non-integer input. ArithmeticException handles division by zero.</w:t>
+      <w:pPr>
+        <w:spacing w:after="0"/>
+      </w:pPr>
+      <w:r>
+        <w:rPr>
+          <w:rFonts w:ascii="Consolas" w:hAnsi="Consolas"/>
+          <w:sz w:val="16"/>
+        </w:rPr>
+        <w:t xml:space="preserve">    static void validateAge(int age) throws InvalidAgeException { if(age&lt;0 || age&gt;120) throw new InvalidAgeException("Age must be between 0 and 120"); }</w:t>
+      </w:r>
+    </w:p>
+    <w:p>
+      <w:pPr>
+        <w:spacing w:after="0"/>
+      </w:pPr>
+      <w:r>
+        <w:rPr>
+          <w:rFonts w:ascii="Consolas" w:hAnsi="Consolas"/>
+          <w:sz w:val="16"/>
+        </w:rPr>
+        <w:t xml:space="preserve">    public static void main(String[] args) { try { validateAge(150); } catch(InvalidAgeException e) { System.out.println(e.getMessage()); } }</w:t>
+      </w:r>
+    </w:p>
+    <w:p>
+      <w:pPr>
+        <w:spacing w:after="0"/>
+      </w:pPr>
+      <w:r>
+        <w:rPr>
+          <w:rFonts w:ascii="Consolas" w:hAnsi="Consolas"/>
+          <w:sz w:val="16"/>
+        </w:rPr>
+        <w:t>}</w:t>
+      </w:r>
+    </w:p>
+    <w:p>
+      <w:r>
+        <w:t>Expected output (sample):</w:t>
+      </w:r>
+    </w:p>
+    <w:p>
+      <w:pPr>
+        <w:spacing w:after="0"/>
+      </w:pPr>
+      <w:r>
+        <w:rPr>
+          <w:rFonts w:ascii="Consolas" w:hAnsi="Consolas"/>
+          <w:sz w:val="16"/>
+        </w:rPr>
+        <w:t>Age must be between 0 and 120</w:t>
+      </w:r>
+    </w:p>
+    <w:p>
+      <w:r>
+        <w:t>Explanation: Extending Exception creates a checked exception. The method declares throws and the caller catches it.</w:t>
       </w:r>
     </w:p>
     <w:p>
@@ -164,12 +1758,12 @@
         <w:pStyle w:val="Heading1"/>
       </w:pPr>
       <w:r>
-        <w:t>Exercise 2</w:t>
+        <w:t>Exercise 4</w:t>
       </w:r>
     </w:p>
     <w:p>
       <w:r>
-        <w:t>Question: Access an array element and catch ArrayIndexOutOfBoundsException.</w:t>
+        <w:t>Question: Make withdraw throw InsufficientFundsException rather than return false.</w:t>
       </w:r>
     </w:p>
     <w:p>
@@ -186,7 +1780,7 @@
           <w:rFonts w:ascii="Consolas" w:hAnsi="Consolas"/>
           <w:sz w:val="16"/>
         </w:rPr>
-        <w:t>public class Exercise2ArrayAccess {</w:t>
+        <w:t>public class Exercise4WithdrawException {</w:t>
       </w:r>
     </w:p>
     <w:p>
@@ -198,7 +1792,7 @@
           <w:rFonts w:ascii="Consolas" w:hAnsi="Consolas"/>
           <w:sz w:val="16"/>
         </w:rPr>
-        <w:t xml:space="preserve">    static void printElement(int[] values,int index) { try { System.out.println(values[index]); } catch(ArrayIndexOutOfBoundsException e) { System.out.println("Invalid array index"); } }</w:t>
+        <w:t xml:space="preserve">    static class InsufficientFundsException extends Exception { InsufficientFundsException(String message){super(message);} }</w:t>
       </w:r>
     </w:p>
     <w:p>
@@ -210,7 +1804,7 @@
           <w:rFonts w:ascii="Consolas" w:hAnsi="Consolas"/>
           <w:sz w:val="16"/>
         </w:rPr>
-        <w:t xml:space="preserve">    public static void main(String[] args) { printElement(new int[]{10,20,30},1); printElement(new int[]{10,20,30},5); }</w:t>
+        <w:t xml:space="preserve">    static class BankAccount { double balance; BankAccount(double b){balance=b;} void withdraw(double amount) throws InsufficientFundsException { if(amount&gt;balance) throw new InsufficientFundsException("Insufficient funds"); balance-=amount; } }</w:t>
       </w:r>
     </w:p>
     <w:p>
@@ -222,12 +1816,7 @@
           <w:rFonts w:ascii="Consolas" w:hAnsi="Consolas"/>
           <w:sz w:val="16"/>
         </w:rPr>
-        <w:t>}</w:t>
-      </w:r>
-    </w:p>
-    <w:p>
-      <w:r>
-        <w:t>Expected output (sample):</w:t>
+        <w:t xml:space="preserve">    public static void main(String[] args) { BankAccount a=new BankAccount(100); try { a.withdraw(150); } catch(InsufficientFundsException e) { System.out.println(e.getMessage()); } System.out.println("Balance: "+a.balance); }</w:t>
       </w:r>
     </w:p>
     <w:p>
@@ -239,7 +1828,12 @@
           <w:rFonts w:ascii="Consolas" w:hAnsi="Consolas"/>
           <w:sz w:val="16"/>
         </w:rPr>
-        <w:t>20</w:t>
+        <w:t>}</w:t>
+      </w:r>
+    </w:p>
+    <w:p>
+      <w:r>
+        <w:t>Expected output (sample):</w:t>
       </w:r>
     </w:p>
     <w:p>
@@ -251,12 +1845,24 @@
           <w:rFonts w:ascii="Consolas" w:hAnsi="Consolas"/>
           <w:sz w:val="16"/>
         </w:rPr>
-        <w:t>Invalid array index</w:t>
+        <w:t>Insufficient funds</w:t>
       </w:r>
     </w:p>
     <w:p>
-      <w:r>
-        <w:t>Explanation: The try block accesses the requested index. The catch block handles an index outside the array.</w:t>
+      <w:pPr>
+        <w:spacing w:after="0"/>
+      </w:pPr>
+      <w:r>
+        <w:rPr>
+          <w:rFonts w:ascii="Consolas" w:hAnsi="Consolas"/>
+          <w:sz w:val="16"/>
+        </w:rPr>
+        <w:t>Balance: 100.0</w:t>
+      </w:r>
+    </w:p>
+    <w:p>
+      <w:r>
+        <w:t>Explanation: An exception gives the caller a clear reason for failure. A boolean return is simpler but carries less detail.</w:t>
       </w:r>
     </w:p>
     <w:p>
@@ -264,12 +1870,12 @@
         <w:pStyle w:val="Heading1"/>
       </w:pPr>
       <w:r>
-        <w:t>Exercise 3</w:t>
+        <w:t>Exercise 5</w:t>
       </w:r>
     </w:p>
     <w:p>
       <w:r>
-        <w:t>Question: Create checked InvalidAgeException and validate ages 0–120.</w:t>
+        <w:t>Question: Predict a return in try with a print statement in finally.</w:t>
       </w:r>
     </w:p>
     <w:p>
@@ -286,7 +1892,7 @@
           <w:rFonts w:ascii="Consolas" w:hAnsi="Consolas"/>
           <w:sz w:val="16"/>
         </w:rPr>
-        <w:t>public class Exercise3InvalidAge {</w:t>
+        <w:t>public class Exercise5FinallyReturn {</w:t>
       </w:r>
     </w:p>
     <w:p>
@@ -298,7 +1904,7 @@
           <w:rFonts w:ascii="Consolas" w:hAnsi="Consolas"/>
           <w:sz w:val="16"/>
         </w:rPr>
-        <w:t xml:space="preserve">    static class InvalidAgeException extends Exception { InvalidAgeException(String message){super(message);} }</w:t>
+        <w:t xml:space="preserve">    static int example() { try { System.out.println("Inside try"); return 5; } finally { System.out.println("Inside finally"); } }</w:t>
       </w:r>
     </w:p>
     <w:p>
@@ -310,7 +1916,7 @@
           <w:rFonts w:ascii="Consolas" w:hAnsi="Consolas"/>
           <w:sz w:val="16"/>
         </w:rPr>
-        <w:t xml:space="preserve">    static void validateAge(int age) throws InvalidAgeException { if(age&lt;0 || age&gt;120) throw new InvalidAgeException("Age must be between 0 and 120"); }</w:t>
+        <w:t xml:space="preserve">    public static void main(String[] args) { System.out.println("Returned: "+example()); }</w:t>
       </w:r>
     </w:p>
     <w:p>
@@ -322,7 +1928,12 @@
           <w:rFonts w:ascii="Consolas" w:hAnsi="Consolas"/>
           <w:sz w:val="16"/>
         </w:rPr>
-        <w:t xml:space="preserve">    public static void main(String[] args) { try { validateAge(150); } catch(InvalidAgeException e) { System.out.println(e.getMessage()); } }</w:t>
+        <w:t>}</w:t>
+      </w:r>
+    </w:p>
+    <w:p>
+      <w:r>
+        <w:t>Expected output (sample):</w:t>
       </w:r>
     </w:p>
     <w:p>
@@ -334,224 +1945,7 @@
           <w:rFonts w:ascii="Consolas" w:hAnsi="Consolas"/>
           <w:sz w:val="16"/>
         </w:rPr>
-        <w:t>}</w:t>
-      </w:r>
-    </w:p>
-    <w:p>
-      <w:r>
-        <w:t>Expected output (sample):</w:t>
-      </w:r>
-    </w:p>
-    <w:p>
-      <w:pPr>
-        <w:spacing w:after="0"/>
-      </w:pPr>
-      <w:r>
-        <w:rPr>
-          <w:rFonts w:ascii="Consolas" w:hAnsi="Consolas"/>
-          <w:sz w:val="16"/>
-        </w:rPr>
         <w:lastRenderedPageBreak/>
-        <w:t>Age must be between 0 and 120</w:t>
-      </w:r>
-    </w:p>
-    <w:p>
-      <w:r>
-        <w:t>Explanation: Extending Exception creates a checked exception. The method declares throws and the caller catches it.</w:t>
-      </w:r>
-    </w:p>
-    <w:p>
-      <w:pPr>
-        <w:pStyle w:val="Heading1"/>
-      </w:pPr>
-      <w:r>
-        <w:t>Exercise 4</w:t>
-      </w:r>
-    </w:p>
-    <w:p>
-      <w:r>
-        <w:t>Question: Make withdraw throw InsufficientFundsException rather than return false.</w:t>
-      </w:r>
-    </w:p>
-    <w:p>
-      <w:r>
-        <w:t>Java source code:</w:t>
-      </w:r>
-    </w:p>
-    <w:p>
-      <w:pPr>
-        <w:spacing w:after="0"/>
-      </w:pPr>
-      <w:r>
-        <w:rPr>
-          <w:rFonts w:ascii="Consolas" w:hAnsi="Consolas"/>
-          <w:sz w:val="16"/>
-        </w:rPr>
-        <w:t>public class Exercise4WithdrawException {</w:t>
-      </w:r>
-    </w:p>
-    <w:p>
-      <w:pPr>
-        <w:spacing w:after="0"/>
-      </w:pPr>
-      <w:r>
-        <w:rPr>
-          <w:rFonts w:ascii="Consolas" w:hAnsi="Consolas"/>
-          <w:sz w:val="16"/>
-        </w:rPr>
-        <w:t xml:space="preserve">    static class InsufficientFundsException extends Exception { InsufficientFundsException(String message){super(message);} }</w:t>
-      </w:r>
-    </w:p>
-    <w:p>
-      <w:pPr>
-        <w:spacing w:after="0"/>
-      </w:pPr>
-      <w:r>
-        <w:rPr>
-          <w:rFonts w:ascii="Consolas" w:hAnsi="Consolas"/>
-          <w:sz w:val="16"/>
-        </w:rPr>
-        <w:t xml:space="preserve">    static class BankAccount { double balance; BankAccount(double b){balance=b;} void withdraw(double amount) throws InsufficientFundsException { if(amount&gt;balance) throw new InsufficientFundsException("Insufficient funds"); balance-=amount; } }</w:t>
-      </w:r>
-    </w:p>
-    <w:p>
-      <w:pPr>
-        <w:spacing w:after="0"/>
-      </w:pPr>
-      <w:r>
-        <w:rPr>
-          <w:rFonts w:ascii="Consolas" w:hAnsi="Consolas"/>
-          <w:sz w:val="16"/>
-        </w:rPr>
-        <w:t xml:space="preserve">    public static void main(String[] args) { BankAccount a=new BankAccount(100); try { a.withdraw(150); } catch(InsufficientFundsException e) { System.out.println(e.getMessage()); } System.out.println("Balance: "+a.balance); }</w:t>
-      </w:r>
-    </w:p>
-    <w:p>
-      <w:pPr>
-        <w:spacing w:after="0"/>
-      </w:pPr>
-      <w:r>
-        <w:rPr>
-          <w:rFonts w:ascii="Consolas" w:hAnsi="Consolas"/>
-          <w:sz w:val="16"/>
-        </w:rPr>
-        <w:t>}</w:t>
-      </w:r>
-    </w:p>
-    <w:p>
-      <w:r>
-        <w:t>Expected output (sample):</w:t>
-      </w:r>
-    </w:p>
-    <w:p>
-      <w:pPr>
-        <w:spacing w:after="0"/>
-      </w:pPr>
-      <w:r>
-        <w:rPr>
-          <w:rFonts w:ascii="Consolas" w:hAnsi="Consolas"/>
-          <w:sz w:val="16"/>
-        </w:rPr>
-        <w:t>Insufficient funds</w:t>
-      </w:r>
-    </w:p>
-    <w:p>
-      <w:pPr>
-        <w:spacing w:after="0"/>
-      </w:pPr>
-      <w:r>
-        <w:rPr>
-          <w:rFonts w:ascii="Consolas" w:hAnsi="Consolas"/>
-          <w:sz w:val="16"/>
-        </w:rPr>
-        <w:t>Balance: 100.0</w:t>
-      </w:r>
-    </w:p>
-    <w:p>
-      <w:r>
-        <w:t>Explanation: An exception gives the caller a clear reason for failure. A boolean return is simpler but carries less detail.</w:t>
-      </w:r>
-    </w:p>
-    <w:p>
-      <w:pPr>
-        <w:pStyle w:val="Heading1"/>
-      </w:pPr>
-      <w:r>
-        <w:t>Exercise 5</w:t>
-      </w:r>
-    </w:p>
-    <w:p>
-      <w:r>
-        <w:t>Question: Predict a return in try with a print statement in finally.</w:t>
-      </w:r>
-    </w:p>
-    <w:p>
-      <w:r>
-        <w:t>Java source code:</w:t>
-      </w:r>
-    </w:p>
-    <w:p>
-      <w:pPr>
-        <w:spacing w:after="0"/>
-      </w:pPr>
-      <w:r>
-        <w:rPr>
-          <w:rFonts w:ascii="Consolas" w:hAnsi="Consolas"/>
-          <w:sz w:val="16"/>
-        </w:rPr>
-        <w:t>public class Exercise5FinallyReturn {</w:t>
-      </w:r>
-    </w:p>
-    <w:p>
-      <w:pPr>
-        <w:spacing w:after="0"/>
-      </w:pPr>
-      <w:r>
-        <w:rPr>
-          <w:rFonts w:ascii="Consolas" w:hAnsi="Consolas"/>
-          <w:sz w:val="16"/>
-        </w:rPr>
-        <w:t xml:space="preserve">    static int example() { try { System.out.println("Inside try"); return 5; } finally { System.out.println("Inside finally"); } }</w:t>
-      </w:r>
-    </w:p>
-    <w:p>
-      <w:pPr>
-        <w:spacing w:after="0"/>
-      </w:pPr>
-      <w:r>
-        <w:rPr>
-          <w:rFonts w:ascii="Consolas" w:hAnsi="Consolas"/>
-          <w:sz w:val="16"/>
-        </w:rPr>
-        <w:t xml:space="preserve">    public static void main(String[] args) { System.out.println("Returned: "+example()); }</w:t>
-      </w:r>
-    </w:p>
-    <w:p>
-      <w:pPr>
-        <w:spacing w:after="0"/>
-      </w:pPr>
-      <w:r>
-        <w:rPr>
-          <w:rFonts w:ascii="Consolas" w:hAnsi="Consolas"/>
-          <w:sz w:val="16"/>
-        </w:rPr>
-        <w:t>}</w:t>
-      </w:r>
-    </w:p>
-    <w:p>
-      <w:r>
-        <w:t>Expected output (sample):</w:t>
-      </w:r>
-    </w:p>
-    <w:p>
-      <w:pPr>
-        <w:spacing w:after="0"/>
-      </w:pPr>
-      <w:r>
-        <w:rPr>
-          <w:rFonts w:ascii="Consolas" w:hAnsi="Consolas"/>
-          <w:sz w:val="16"/>
-        </w:rPr>
         <w:t>Inside try</w:t>
       </w:r>
     </w:p>
@@ -1415,7 +2809,6 @@
   <w:style w:type="character" w:default="1" w:styleId="DefaultParagraphFont">
     <w:name w:val="Default Paragraph Font"/>
     <w:uiPriority w:val="1"/>
-    <w:semiHidden/>
     <w:unhideWhenUsed/>
   </w:style>
   <w:style w:type="table" w:default="1" w:styleId="TableNormal">

</xml_diff>

<commit_message>
refactor: add comment to clarify array access in printElement method
</commit_message>
<xml_diff>
--- a/Lab_07/LAB Exercises report  (7).docx
+++ b/Lab_07/LAB Exercises report  (7).docx
@@ -616,7 +616,7 @@
           <w:sz w:val="21"/>
           <w:szCs w:val="21"/>
         </w:rPr>
-        <w:t>"Enter two integers: "</w:t>
+        <w:t>"Enter  the dividend: "</w:t>
       </w:r>
       <w:r>
         <w:rPr>
@@ -761,6 +761,7 @@
         </w:rPr>
         <w:t xml:space="preserve">            </w:t>
       </w:r>
+      <w:proofErr w:type="spellStart"/>
       <w:r>
         <w:rPr>
           <w:rFonts w:ascii="Consolas" w:eastAsia="Times New Roman" w:hAnsi="Consolas" w:cs="Times New Roman"/>
@@ -768,54 +769,17 @@
           <w:sz w:val="21"/>
           <w:szCs w:val="21"/>
         </w:rPr>
-        <w:t>int</w:t>
-      </w:r>
-      <w:r>
-        <w:rPr>
-          <w:rFonts w:ascii="Consolas" w:eastAsia="Times New Roman" w:hAnsi="Consolas" w:cs="Times New Roman"/>
-          <w:color w:val="FFA657"/>
-          <w:sz w:val="21"/>
-          <w:szCs w:val="21"/>
-        </w:rPr>
-        <w:t xml:space="preserve"> </w:t>
-      </w:r>
-      <w:r>
-        <w:rPr>
-          <w:rFonts w:ascii="Consolas" w:eastAsia="Times New Roman" w:hAnsi="Consolas" w:cs="Times New Roman"/>
-          <w:color w:val="C9D1D9"/>
-          <w:sz w:val="21"/>
-          <w:szCs w:val="21"/>
-        </w:rPr>
-        <w:t>divisor</w:t>
-      </w:r>
-      <w:r>
-        <w:rPr>
-          <w:rFonts w:ascii="Consolas" w:eastAsia="Times New Roman" w:hAnsi="Consolas" w:cs="Times New Roman"/>
-          <w:color w:val="FFA657"/>
-          <w:sz w:val="21"/>
-          <w:szCs w:val="21"/>
-        </w:rPr>
-        <w:t xml:space="preserve"> </w:t>
-      </w:r>
-      <w:r>
-        <w:rPr>
-          <w:rFonts w:ascii="Consolas" w:eastAsia="Times New Roman" w:hAnsi="Consolas" w:cs="Times New Roman"/>
-          <w:color w:val="D4D4D4"/>
-          <w:sz w:val="21"/>
-          <w:szCs w:val="21"/>
-        </w:rPr>
-        <w:t>=</w:t>
-      </w:r>
-      <w:r>
-        <w:rPr>
-          <w:rFonts w:ascii="Consolas" w:eastAsia="Times New Roman" w:hAnsi="Consolas" w:cs="Times New Roman"/>
-          <w:color w:val="BBBEBF"/>
-          <w:sz w:val="21"/>
-          <w:szCs w:val="21"/>
-        </w:rPr>
-        <w:t xml:space="preserve"> </w:t>
-      </w:r>
-      <w:proofErr w:type="spellStart"/>
+        <w:t>System</w:t>
+      </w:r>
+      <w:r>
+        <w:rPr>
+          <w:rFonts w:ascii="Consolas" w:eastAsia="Times New Roman" w:hAnsi="Consolas" w:cs="Times New Roman"/>
+          <w:color w:val="BBBEBF"/>
+          <w:sz w:val="21"/>
+          <w:szCs w:val="21"/>
+        </w:rPr>
+        <w:t>.</w:t>
+      </w:r>
       <w:r>
         <w:rPr>
           <w:rFonts w:ascii="Consolas" w:eastAsia="Times New Roman" w:hAnsi="Consolas" w:cs="Times New Roman"/>
@@ -823,7 +787,7 @@
           <w:sz w:val="21"/>
           <w:szCs w:val="21"/>
         </w:rPr>
-        <w:t>scanner</w:t>
+        <w:t>out</w:t>
       </w:r>
       <w:r>
         <w:rPr>
@@ -841,7 +805,7 @@
           <w:sz w:val="21"/>
           <w:szCs w:val="21"/>
         </w:rPr>
-        <w:t>nextInt</w:t>
+        <w:t>print</w:t>
       </w:r>
       <w:proofErr w:type="spellEnd"/>
       <w:r>
@@ -851,7 +815,25 @@
           <w:sz w:val="21"/>
           <w:szCs w:val="21"/>
         </w:rPr>
-        <w:t>();</w:t>
+        <w:t>(</w:t>
+      </w:r>
+      <w:r>
+        <w:rPr>
+          <w:rFonts w:ascii="Consolas" w:eastAsia="Times New Roman" w:hAnsi="Consolas" w:cs="Times New Roman"/>
+          <w:color w:val="A5D6FF"/>
+          <w:sz w:val="21"/>
+          <w:szCs w:val="21"/>
+        </w:rPr>
+        <w:t>"Enter  the divisor: "</w:t>
+      </w:r>
+      <w:r>
+        <w:rPr>
+          <w:rFonts w:ascii="Consolas" w:eastAsia="Times New Roman" w:hAnsi="Consolas" w:cs="Times New Roman"/>
+          <w:color w:val="BBBEBF"/>
+          <w:sz w:val="21"/>
+          <w:szCs w:val="21"/>
+        </w:rPr>
+        <w:t>);</w:t>
       </w:r>
     </w:p>
     <w:p>
@@ -877,11 +859,94 @@
       <w:r>
         <w:rPr>
           <w:rFonts w:ascii="Consolas" w:eastAsia="Times New Roman" w:hAnsi="Consolas" w:cs="Times New Roman"/>
-          <w:color w:val="8B949E"/>
-          <w:sz w:val="21"/>
-          <w:szCs w:val="21"/>
-        </w:rPr>
-        <w:t>// Perform the division and print the result</w:t>
+          <w:color w:val="4EC9B0"/>
+          <w:sz w:val="21"/>
+          <w:szCs w:val="21"/>
+        </w:rPr>
+        <w:t>int</w:t>
+      </w:r>
+      <w:r>
+        <w:rPr>
+          <w:rFonts w:ascii="Consolas" w:eastAsia="Times New Roman" w:hAnsi="Consolas" w:cs="Times New Roman"/>
+          <w:color w:val="FFA657"/>
+          <w:sz w:val="21"/>
+          <w:szCs w:val="21"/>
+        </w:rPr>
+        <w:t xml:space="preserve"> </w:t>
+      </w:r>
+      <w:r>
+        <w:rPr>
+          <w:rFonts w:ascii="Consolas" w:eastAsia="Times New Roman" w:hAnsi="Consolas" w:cs="Times New Roman"/>
+          <w:color w:val="C9D1D9"/>
+          <w:sz w:val="21"/>
+          <w:szCs w:val="21"/>
+        </w:rPr>
+        <w:t>divisor</w:t>
+      </w:r>
+      <w:r>
+        <w:rPr>
+          <w:rFonts w:ascii="Consolas" w:eastAsia="Times New Roman" w:hAnsi="Consolas" w:cs="Times New Roman"/>
+          <w:color w:val="FFA657"/>
+          <w:sz w:val="21"/>
+          <w:szCs w:val="21"/>
+        </w:rPr>
+        <w:t xml:space="preserve"> </w:t>
+      </w:r>
+      <w:r>
+        <w:rPr>
+          <w:rFonts w:ascii="Consolas" w:eastAsia="Times New Roman" w:hAnsi="Consolas" w:cs="Times New Roman"/>
+          <w:color w:val="D4D4D4"/>
+          <w:sz w:val="21"/>
+          <w:szCs w:val="21"/>
+        </w:rPr>
+        <w:t>=</w:t>
+      </w:r>
+      <w:r>
+        <w:rPr>
+          <w:rFonts w:ascii="Consolas" w:eastAsia="Times New Roman" w:hAnsi="Consolas" w:cs="Times New Roman"/>
+          <w:color w:val="BBBEBF"/>
+          <w:sz w:val="21"/>
+          <w:szCs w:val="21"/>
+        </w:rPr>
+        <w:t xml:space="preserve"> </w:t>
+      </w:r>
+      <w:proofErr w:type="spellStart"/>
+      <w:r>
+        <w:rPr>
+          <w:rFonts w:ascii="Consolas" w:eastAsia="Times New Roman" w:hAnsi="Consolas" w:cs="Times New Roman"/>
+          <w:color w:val="79C0FF"/>
+          <w:sz w:val="21"/>
+          <w:szCs w:val="21"/>
+        </w:rPr>
+        <w:t>scanner</w:t>
+      </w:r>
+      <w:r>
+        <w:rPr>
+          <w:rFonts w:ascii="Consolas" w:eastAsia="Times New Roman" w:hAnsi="Consolas" w:cs="Times New Roman"/>
+          <w:color w:val="BBBEBF"/>
+          <w:sz w:val="21"/>
+          <w:szCs w:val="21"/>
+        </w:rPr>
+        <w:t>.</w:t>
+      </w:r>
+      <w:r>
+        <w:rPr>
+          <w:rFonts w:ascii="Consolas" w:eastAsia="Times New Roman" w:hAnsi="Consolas" w:cs="Times New Roman"/>
+          <w:color w:val="D2A8FF"/>
+          <w:sz w:val="21"/>
+          <w:szCs w:val="21"/>
+        </w:rPr>
+        <w:t>nextInt</w:t>
+      </w:r>
+      <w:proofErr w:type="spellEnd"/>
+      <w:r>
+        <w:rPr>
+          <w:rFonts w:ascii="Consolas" w:eastAsia="Times New Roman" w:hAnsi="Consolas" w:cs="Times New Roman"/>
+          <w:color w:val="BBBEBF"/>
+          <w:sz w:val="21"/>
+          <w:szCs w:val="21"/>
+        </w:rPr>
+        <w:t>();</w:t>
       </w:r>
     </w:p>
     <w:p>
@@ -904,151 +969,14 @@
         </w:rPr>
         <w:t xml:space="preserve">            </w:t>
       </w:r>
-      <w:proofErr w:type="spellStart"/>
-      <w:r>
-        <w:rPr>
-          <w:rFonts w:ascii="Consolas" w:eastAsia="Times New Roman" w:hAnsi="Consolas" w:cs="Times New Roman"/>
-          <w:color w:val="4EC9B0"/>
-          <w:sz w:val="21"/>
-          <w:szCs w:val="21"/>
-        </w:rPr>
-        <w:t>System</w:t>
-      </w:r>
-      <w:r>
-        <w:rPr>
-          <w:rFonts w:ascii="Consolas" w:eastAsia="Times New Roman" w:hAnsi="Consolas" w:cs="Times New Roman"/>
-          <w:color w:val="BBBEBF"/>
-          <w:sz w:val="21"/>
-          <w:szCs w:val="21"/>
-        </w:rPr>
-        <w:t>.</w:t>
-      </w:r>
-      <w:r>
-        <w:rPr>
-          <w:rFonts w:ascii="Consolas" w:eastAsia="Times New Roman" w:hAnsi="Consolas" w:cs="Times New Roman"/>
-          <w:color w:val="79C0FF"/>
-          <w:sz w:val="21"/>
-          <w:szCs w:val="21"/>
-        </w:rPr>
-        <w:t>out</w:t>
-      </w:r>
-      <w:r>
-        <w:rPr>
-          <w:rFonts w:ascii="Consolas" w:eastAsia="Times New Roman" w:hAnsi="Consolas" w:cs="Times New Roman"/>
-          <w:color w:val="BBBEBF"/>
-          <w:sz w:val="21"/>
-          <w:szCs w:val="21"/>
-        </w:rPr>
-        <w:t>.</w:t>
-      </w:r>
-      <w:r>
-        <w:rPr>
-          <w:rFonts w:ascii="Consolas" w:eastAsia="Times New Roman" w:hAnsi="Consolas" w:cs="Times New Roman"/>
-          <w:color w:val="D2A8FF"/>
-          <w:sz w:val="21"/>
-          <w:szCs w:val="21"/>
-        </w:rPr>
-        <w:t>println</w:t>
-      </w:r>
-      <w:proofErr w:type="spellEnd"/>
-      <w:r>
-        <w:rPr>
-          <w:rFonts w:ascii="Consolas" w:eastAsia="Times New Roman" w:hAnsi="Consolas" w:cs="Times New Roman"/>
-          <w:color w:val="BBBEBF"/>
-          <w:sz w:val="21"/>
-          <w:szCs w:val="21"/>
-        </w:rPr>
-        <w:t>(</w:t>
-      </w:r>
-      <w:r>
-        <w:rPr>
-          <w:rFonts w:ascii="Consolas" w:eastAsia="Times New Roman" w:hAnsi="Consolas" w:cs="Times New Roman"/>
-          <w:color w:val="A5D6FF"/>
-          <w:sz w:val="21"/>
-          <w:szCs w:val="21"/>
-        </w:rPr>
-        <w:t>"Result: "</w:t>
-      </w:r>
-      <w:r>
-        <w:rPr>
-          <w:rFonts w:ascii="Consolas" w:eastAsia="Times New Roman" w:hAnsi="Consolas" w:cs="Times New Roman"/>
-          <w:color w:val="BBBEBF"/>
-          <w:sz w:val="21"/>
-          <w:szCs w:val="21"/>
-        </w:rPr>
-        <w:t xml:space="preserve"> </w:t>
-      </w:r>
-      <w:r>
-        <w:rPr>
-          <w:rFonts w:ascii="Consolas" w:eastAsia="Times New Roman" w:hAnsi="Consolas" w:cs="Times New Roman"/>
-          <w:color w:val="D4D4D4"/>
-          <w:sz w:val="21"/>
-          <w:szCs w:val="21"/>
-        </w:rPr>
-        <w:t>+</w:t>
-      </w:r>
-      <w:r>
-        <w:rPr>
-          <w:rFonts w:ascii="Consolas" w:eastAsia="Times New Roman" w:hAnsi="Consolas" w:cs="Times New Roman"/>
-          <w:color w:val="BBBEBF"/>
-          <w:sz w:val="21"/>
-          <w:szCs w:val="21"/>
-        </w:rPr>
-        <w:t xml:space="preserve"> (</w:t>
-      </w:r>
-      <w:r>
-        <w:rPr>
-          <w:rFonts w:ascii="Consolas" w:eastAsia="Times New Roman" w:hAnsi="Consolas" w:cs="Times New Roman"/>
-          <w:color w:val="C9D1D9"/>
-          <w:sz w:val="21"/>
-          <w:szCs w:val="21"/>
-        </w:rPr>
-        <w:t>dividend</w:t>
-      </w:r>
-      <w:r>
-        <w:rPr>
-          <w:rFonts w:ascii="Consolas" w:eastAsia="Times New Roman" w:hAnsi="Consolas" w:cs="Times New Roman"/>
-          <w:color w:val="BBBEBF"/>
-          <w:sz w:val="21"/>
-          <w:szCs w:val="21"/>
-        </w:rPr>
-        <w:t xml:space="preserve"> </w:t>
-      </w:r>
-      <w:r>
-        <w:rPr>
-          <w:rFonts w:ascii="Consolas" w:eastAsia="Times New Roman" w:hAnsi="Consolas" w:cs="Times New Roman"/>
-          <w:color w:val="D4D4D4"/>
-          <w:sz w:val="21"/>
-          <w:szCs w:val="21"/>
-        </w:rPr>
-        <w:t>/</w:t>
-      </w:r>
-      <w:r>
-        <w:rPr>
-          <w:rFonts w:ascii="Consolas" w:eastAsia="Times New Roman" w:hAnsi="Consolas" w:cs="Times New Roman"/>
-          <w:color w:val="BBBEBF"/>
-          <w:sz w:val="21"/>
-          <w:szCs w:val="21"/>
-        </w:rPr>
-        <w:t xml:space="preserve"> </w:t>
-      </w:r>
-      <w:r>
-        <w:rPr>
-          <w:rFonts w:ascii="Consolas" w:eastAsia="Times New Roman" w:hAnsi="Consolas" w:cs="Times New Roman"/>
-          <w:color w:val="C9D1D9"/>
-          <w:sz w:val="21"/>
-          <w:szCs w:val="21"/>
-        </w:rPr>
-        <w:t>divisor</w:t>
-      </w:r>
-      <w:r>
-        <w:rPr>
-          <w:rFonts w:ascii="Consolas" w:eastAsia="Times New Roman" w:hAnsi="Consolas" w:cs="Times New Roman"/>
-          <w:color w:val="BBBEBF"/>
-          <w:sz w:val="21"/>
-          <w:szCs w:val="21"/>
-        </w:rPr>
-        <w:t>));</w:t>
+      <w:r>
+        <w:rPr>
+          <w:rFonts w:ascii="Consolas" w:eastAsia="Times New Roman" w:hAnsi="Consolas" w:cs="Times New Roman"/>
+          <w:color w:val="8B949E"/>
+          <w:sz w:val="21"/>
+          <w:szCs w:val="21"/>
+        </w:rPr>
+        <w:t>// Perform the division and print the result</w:t>
       </w:r>
     </w:p>
     <w:p>
@@ -1071,14 +999,151 @@
         </w:rPr>
         <w:t xml:space="preserve">            </w:t>
       </w:r>
-      <w:r>
-        <w:rPr>
-          <w:rFonts w:ascii="Consolas" w:eastAsia="Times New Roman" w:hAnsi="Consolas" w:cs="Times New Roman"/>
-          <w:color w:val="8B949E"/>
-          <w:sz w:val="21"/>
-          <w:szCs w:val="21"/>
-        </w:rPr>
-        <w:t>// Catch exceptions for invalid input and division by zero</w:t>
+      <w:proofErr w:type="spellStart"/>
+      <w:r>
+        <w:rPr>
+          <w:rFonts w:ascii="Consolas" w:eastAsia="Times New Roman" w:hAnsi="Consolas" w:cs="Times New Roman"/>
+          <w:color w:val="4EC9B0"/>
+          <w:sz w:val="21"/>
+          <w:szCs w:val="21"/>
+        </w:rPr>
+        <w:t>System</w:t>
+      </w:r>
+      <w:r>
+        <w:rPr>
+          <w:rFonts w:ascii="Consolas" w:eastAsia="Times New Roman" w:hAnsi="Consolas" w:cs="Times New Roman"/>
+          <w:color w:val="BBBEBF"/>
+          <w:sz w:val="21"/>
+          <w:szCs w:val="21"/>
+        </w:rPr>
+        <w:t>.</w:t>
+      </w:r>
+      <w:r>
+        <w:rPr>
+          <w:rFonts w:ascii="Consolas" w:eastAsia="Times New Roman" w:hAnsi="Consolas" w:cs="Times New Roman"/>
+          <w:color w:val="79C0FF"/>
+          <w:sz w:val="21"/>
+          <w:szCs w:val="21"/>
+        </w:rPr>
+        <w:t>out</w:t>
+      </w:r>
+      <w:r>
+        <w:rPr>
+          <w:rFonts w:ascii="Consolas" w:eastAsia="Times New Roman" w:hAnsi="Consolas" w:cs="Times New Roman"/>
+          <w:color w:val="BBBEBF"/>
+          <w:sz w:val="21"/>
+          <w:szCs w:val="21"/>
+        </w:rPr>
+        <w:t>.</w:t>
+      </w:r>
+      <w:r>
+        <w:rPr>
+          <w:rFonts w:ascii="Consolas" w:eastAsia="Times New Roman" w:hAnsi="Consolas" w:cs="Times New Roman"/>
+          <w:color w:val="D2A8FF"/>
+          <w:sz w:val="21"/>
+          <w:szCs w:val="21"/>
+        </w:rPr>
+        <w:t>println</w:t>
+      </w:r>
+      <w:proofErr w:type="spellEnd"/>
+      <w:r>
+        <w:rPr>
+          <w:rFonts w:ascii="Consolas" w:eastAsia="Times New Roman" w:hAnsi="Consolas" w:cs="Times New Roman"/>
+          <w:color w:val="BBBEBF"/>
+          <w:sz w:val="21"/>
+          <w:szCs w:val="21"/>
+        </w:rPr>
+        <w:t>(</w:t>
+      </w:r>
+      <w:r>
+        <w:rPr>
+          <w:rFonts w:ascii="Consolas" w:eastAsia="Times New Roman" w:hAnsi="Consolas" w:cs="Times New Roman"/>
+          <w:color w:val="A5D6FF"/>
+          <w:sz w:val="21"/>
+          <w:szCs w:val="21"/>
+        </w:rPr>
+        <w:t>"Result: "</w:t>
+      </w:r>
+      <w:r>
+        <w:rPr>
+          <w:rFonts w:ascii="Consolas" w:eastAsia="Times New Roman" w:hAnsi="Consolas" w:cs="Times New Roman"/>
+          <w:color w:val="BBBEBF"/>
+          <w:sz w:val="21"/>
+          <w:szCs w:val="21"/>
+        </w:rPr>
+        <w:t xml:space="preserve"> </w:t>
+      </w:r>
+      <w:r>
+        <w:rPr>
+          <w:rFonts w:ascii="Consolas" w:eastAsia="Times New Roman" w:hAnsi="Consolas" w:cs="Times New Roman"/>
+          <w:color w:val="D4D4D4"/>
+          <w:sz w:val="21"/>
+          <w:szCs w:val="21"/>
+        </w:rPr>
+        <w:t>+</w:t>
+      </w:r>
+      <w:r>
+        <w:rPr>
+          <w:rFonts w:ascii="Consolas" w:eastAsia="Times New Roman" w:hAnsi="Consolas" w:cs="Times New Roman"/>
+          <w:color w:val="BBBEBF"/>
+          <w:sz w:val="21"/>
+          <w:szCs w:val="21"/>
+        </w:rPr>
+        <w:t xml:space="preserve"> (</w:t>
+      </w:r>
+      <w:r>
+        <w:rPr>
+          <w:rFonts w:ascii="Consolas" w:eastAsia="Times New Roman" w:hAnsi="Consolas" w:cs="Times New Roman"/>
+          <w:color w:val="C9D1D9"/>
+          <w:sz w:val="21"/>
+          <w:szCs w:val="21"/>
+        </w:rPr>
+        <w:t>dividend</w:t>
+      </w:r>
+      <w:r>
+        <w:rPr>
+          <w:rFonts w:ascii="Consolas" w:eastAsia="Times New Roman" w:hAnsi="Consolas" w:cs="Times New Roman"/>
+          <w:color w:val="BBBEBF"/>
+          <w:sz w:val="21"/>
+          <w:szCs w:val="21"/>
+        </w:rPr>
+        <w:t xml:space="preserve"> </w:t>
+      </w:r>
+      <w:r>
+        <w:rPr>
+          <w:rFonts w:ascii="Consolas" w:eastAsia="Times New Roman" w:hAnsi="Consolas" w:cs="Times New Roman"/>
+          <w:color w:val="D4D4D4"/>
+          <w:sz w:val="21"/>
+          <w:szCs w:val="21"/>
+        </w:rPr>
+        <w:t>/</w:t>
+      </w:r>
+      <w:r>
+        <w:rPr>
+          <w:rFonts w:ascii="Consolas" w:eastAsia="Times New Roman" w:hAnsi="Consolas" w:cs="Times New Roman"/>
+          <w:color w:val="BBBEBF"/>
+          <w:sz w:val="21"/>
+          <w:szCs w:val="21"/>
+        </w:rPr>
+        <w:t xml:space="preserve"> </w:t>
+      </w:r>
+      <w:r>
+        <w:rPr>
+          <w:rFonts w:ascii="Consolas" w:eastAsia="Times New Roman" w:hAnsi="Consolas" w:cs="Times New Roman"/>
+          <w:color w:val="C9D1D9"/>
+          <w:sz w:val="21"/>
+          <w:szCs w:val="21"/>
+        </w:rPr>
+        <w:t>divisor</w:t>
+      </w:r>
+      <w:r>
+        <w:rPr>
+          <w:rFonts w:ascii="Consolas" w:eastAsia="Times New Roman" w:hAnsi="Consolas" w:cs="Times New Roman"/>
+          <w:color w:val="BBBEBF"/>
+          <w:sz w:val="21"/>
+          <w:szCs w:val="21"/>
+        </w:rPr>
+        <w:t>));</w:t>
       </w:r>
     </w:p>
     <w:p>
@@ -1099,63 +1164,16 @@
           <w:sz w:val="21"/>
           <w:szCs w:val="21"/>
         </w:rPr>
-        <w:t xml:space="preserve">        } </w:t>
-      </w:r>
-      <w:r>
-        <w:rPr>
-          <w:rFonts w:ascii="Consolas" w:eastAsia="Times New Roman" w:hAnsi="Consolas" w:cs="Times New Roman"/>
-          <w:color w:val="C586C0"/>
-          <w:sz w:val="21"/>
-          <w:szCs w:val="21"/>
-        </w:rPr>
-        <w:t>catch</w:t>
-      </w:r>
-      <w:r>
-        <w:rPr>
-          <w:rFonts w:ascii="Consolas" w:eastAsia="Times New Roman" w:hAnsi="Consolas" w:cs="Times New Roman"/>
-          <w:color w:val="BBBEBF"/>
-          <w:sz w:val="21"/>
-          <w:szCs w:val="21"/>
-        </w:rPr>
-        <w:t xml:space="preserve"> (</w:t>
-      </w:r>
-      <w:proofErr w:type="spellStart"/>
-      <w:r>
-        <w:rPr>
-          <w:rFonts w:ascii="Consolas" w:eastAsia="Times New Roman" w:hAnsi="Consolas" w:cs="Times New Roman"/>
-          <w:color w:val="4EC9B0"/>
-          <w:sz w:val="21"/>
-          <w:szCs w:val="21"/>
-        </w:rPr>
-        <w:t>InputMismatchException</w:t>
-      </w:r>
-      <w:proofErr w:type="spellEnd"/>
-      <w:r>
-        <w:rPr>
-          <w:rFonts w:ascii="Consolas" w:eastAsia="Times New Roman" w:hAnsi="Consolas" w:cs="Times New Roman"/>
-          <w:color w:val="BBBEBF"/>
-          <w:sz w:val="21"/>
-          <w:szCs w:val="21"/>
-        </w:rPr>
-        <w:t xml:space="preserve"> </w:t>
-      </w:r>
-      <w:r>
-        <w:rPr>
-          <w:rFonts w:ascii="Consolas" w:eastAsia="Times New Roman" w:hAnsi="Consolas" w:cs="Times New Roman"/>
-          <w:color w:val="C9D1D9"/>
-          <w:sz w:val="21"/>
-          <w:szCs w:val="21"/>
-        </w:rPr>
-        <w:t>e</w:t>
-      </w:r>
-      <w:r>
-        <w:rPr>
-          <w:rFonts w:ascii="Consolas" w:eastAsia="Times New Roman" w:hAnsi="Consolas" w:cs="Times New Roman"/>
-          <w:color w:val="BBBEBF"/>
-          <w:sz w:val="21"/>
-          <w:szCs w:val="21"/>
-        </w:rPr>
-        <w:t>) {</w:t>
+        <w:t xml:space="preserve">            </w:t>
+      </w:r>
+      <w:r>
+        <w:rPr>
+          <w:rFonts w:ascii="Consolas" w:eastAsia="Times New Roman" w:hAnsi="Consolas" w:cs="Times New Roman"/>
+          <w:color w:val="8B949E"/>
+          <w:sz w:val="21"/>
+          <w:szCs w:val="21"/>
+        </w:rPr>
+        <w:t>// Catch exceptions for invalid input and division by zero</w:t>
       </w:r>
     </w:p>
     <w:p>
@@ -1176,7 +1194,25 @@
           <w:sz w:val="21"/>
           <w:szCs w:val="21"/>
         </w:rPr>
-        <w:t xml:space="preserve">            </w:t>
+        <w:t xml:space="preserve">        } </w:t>
+      </w:r>
+      <w:r>
+        <w:rPr>
+          <w:rFonts w:ascii="Consolas" w:eastAsia="Times New Roman" w:hAnsi="Consolas" w:cs="Times New Roman"/>
+          <w:color w:val="C586C0"/>
+          <w:sz w:val="21"/>
+          <w:szCs w:val="21"/>
+        </w:rPr>
+        <w:t>catch</w:t>
+      </w:r>
+      <w:r>
+        <w:rPr>
+          <w:rFonts w:ascii="Consolas" w:eastAsia="Times New Roman" w:hAnsi="Consolas" w:cs="Times New Roman"/>
+          <w:color w:val="BBBEBF"/>
+          <w:sz w:val="21"/>
+          <w:szCs w:val="21"/>
+        </w:rPr>
+        <w:t xml:space="preserve"> (</w:t>
       </w:r>
       <w:proofErr w:type="spellStart"/>
       <w:r>
@@ -1186,43 +1222,7 @@
           <w:sz w:val="21"/>
           <w:szCs w:val="21"/>
         </w:rPr>
-        <w:t>System</w:t>
-      </w:r>
-      <w:r>
-        <w:rPr>
-          <w:rFonts w:ascii="Consolas" w:eastAsia="Times New Roman" w:hAnsi="Consolas" w:cs="Times New Roman"/>
-          <w:color w:val="BBBEBF"/>
-          <w:sz w:val="21"/>
-          <w:szCs w:val="21"/>
-        </w:rPr>
-        <w:t>.</w:t>
-      </w:r>
-      <w:r>
-        <w:rPr>
-          <w:rFonts w:ascii="Consolas" w:eastAsia="Times New Roman" w:hAnsi="Consolas" w:cs="Times New Roman"/>
-          <w:color w:val="79C0FF"/>
-          <w:sz w:val="21"/>
-          <w:szCs w:val="21"/>
-        </w:rPr>
-        <w:t>out</w:t>
-      </w:r>
-      <w:r>
-        <w:rPr>
-          <w:rFonts w:ascii="Consolas" w:eastAsia="Times New Roman" w:hAnsi="Consolas" w:cs="Times New Roman"/>
-          <w:color w:val="BBBEBF"/>
-          <w:sz w:val="21"/>
-          <w:szCs w:val="21"/>
-        </w:rPr>
-        <w:t>.</w:t>
-      </w:r>
-      <w:r>
-        <w:rPr>
-          <w:rFonts w:ascii="Consolas" w:eastAsia="Times New Roman" w:hAnsi="Consolas" w:cs="Times New Roman"/>
-          <w:color w:val="D2A8FF"/>
-          <w:sz w:val="21"/>
-          <w:szCs w:val="21"/>
-        </w:rPr>
-        <w:t>println</w:t>
+        <w:t>InputMismatchException</w:t>
       </w:r>
       <w:proofErr w:type="spellEnd"/>
       <w:r>
@@ -1232,25 +1232,25 @@
           <w:sz w:val="21"/>
           <w:szCs w:val="21"/>
         </w:rPr>
-        <w:t>(</w:t>
-      </w:r>
-      <w:r>
-        <w:rPr>
-          <w:rFonts w:ascii="Consolas" w:eastAsia="Times New Roman" w:hAnsi="Consolas" w:cs="Times New Roman"/>
-          <w:color w:val="A5D6FF"/>
-          <w:sz w:val="21"/>
-          <w:szCs w:val="21"/>
-        </w:rPr>
-        <w:t>"Please enter integers only"</w:t>
-      </w:r>
-      <w:r>
-        <w:rPr>
-          <w:rFonts w:ascii="Consolas" w:eastAsia="Times New Roman" w:hAnsi="Consolas" w:cs="Times New Roman"/>
-          <w:color w:val="BBBEBF"/>
-          <w:sz w:val="21"/>
-          <w:szCs w:val="21"/>
-        </w:rPr>
-        <w:t>);</w:t>
+        <w:t xml:space="preserve"> </w:t>
+      </w:r>
+      <w:r>
+        <w:rPr>
+          <w:rFonts w:ascii="Consolas" w:eastAsia="Times New Roman" w:hAnsi="Consolas" w:cs="Times New Roman"/>
+          <w:color w:val="C9D1D9"/>
+          <w:sz w:val="21"/>
+          <w:szCs w:val="21"/>
+        </w:rPr>
+        <w:t>e</w:t>
+      </w:r>
+      <w:r>
+        <w:rPr>
+          <w:rFonts w:ascii="Consolas" w:eastAsia="Times New Roman" w:hAnsi="Consolas" w:cs="Times New Roman"/>
+          <w:color w:val="BBBEBF"/>
+          <w:sz w:val="21"/>
+          <w:szCs w:val="21"/>
+        </w:rPr>
+        <w:t>) {</w:t>
       </w:r>
     </w:p>
     <w:p>
@@ -1271,25 +1271,7 @@
           <w:sz w:val="21"/>
           <w:szCs w:val="21"/>
         </w:rPr>
-        <w:t xml:space="preserve">        } </w:t>
-      </w:r>
-      <w:r>
-        <w:rPr>
-          <w:rFonts w:ascii="Consolas" w:eastAsia="Times New Roman" w:hAnsi="Consolas" w:cs="Times New Roman"/>
-          <w:color w:val="C586C0"/>
-          <w:sz w:val="21"/>
-          <w:szCs w:val="21"/>
-        </w:rPr>
-        <w:t>catch</w:t>
-      </w:r>
-      <w:r>
-        <w:rPr>
-          <w:rFonts w:ascii="Consolas" w:eastAsia="Times New Roman" w:hAnsi="Consolas" w:cs="Times New Roman"/>
-          <w:color w:val="BBBEBF"/>
-          <w:sz w:val="21"/>
-          <w:szCs w:val="21"/>
-        </w:rPr>
-        <w:t xml:space="preserve"> (</w:t>
+        <w:t xml:space="preserve">            </w:t>
       </w:r>
       <w:proofErr w:type="spellStart"/>
       <w:r>
@@ -1299,7 +1281,43 @@
           <w:sz w:val="21"/>
           <w:szCs w:val="21"/>
         </w:rPr>
-        <w:t>ArithmeticException</w:t>
+        <w:t>System</w:t>
+      </w:r>
+      <w:r>
+        <w:rPr>
+          <w:rFonts w:ascii="Consolas" w:eastAsia="Times New Roman" w:hAnsi="Consolas" w:cs="Times New Roman"/>
+          <w:color w:val="BBBEBF"/>
+          <w:sz w:val="21"/>
+          <w:szCs w:val="21"/>
+        </w:rPr>
+        <w:t>.</w:t>
+      </w:r>
+      <w:r>
+        <w:rPr>
+          <w:rFonts w:ascii="Consolas" w:eastAsia="Times New Roman" w:hAnsi="Consolas" w:cs="Times New Roman"/>
+          <w:color w:val="79C0FF"/>
+          <w:sz w:val="21"/>
+          <w:szCs w:val="21"/>
+        </w:rPr>
+        <w:t>out</w:t>
+      </w:r>
+      <w:r>
+        <w:rPr>
+          <w:rFonts w:ascii="Consolas" w:eastAsia="Times New Roman" w:hAnsi="Consolas" w:cs="Times New Roman"/>
+          <w:color w:val="BBBEBF"/>
+          <w:sz w:val="21"/>
+          <w:szCs w:val="21"/>
+        </w:rPr>
+        <w:t>.</w:t>
+      </w:r>
+      <w:r>
+        <w:rPr>
+          <w:rFonts w:ascii="Consolas" w:eastAsia="Times New Roman" w:hAnsi="Consolas" w:cs="Times New Roman"/>
+          <w:color w:val="D2A8FF"/>
+          <w:sz w:val="21"/>
+          <w:szCs w:val="21"/>
+        </w:rPr>
+        <w:t>println</w:t>
       </w:r>
       <w:proofErr w:type="spellEnd"/>
       <w:r>
@@ -1309,25 +1327,25 @@
           <w:sz w:val="21"/>
           <w:szCs w:val="21"/>
         </w:rPr>
-        <w:t xml:space="preserve"> </w:t>
-      </w:r>
-      <w:r>
-        <w:rPr>
-          <w:rFonts w:ascii="Consolas" w:eastAsia="Times New Roman" w:hAnsi="Consolas" w:cs="Times New Roman"/>
-          <w:color w:val="C9D1D9"/>
-          <w:sz w:val="21"/>
-          <w:szCs w:val="21"/>
-        </w:rPr>
-        <w:t>e</w:t>
-      </w:r>
-      <w:r>
-        <w:rPr>
-          <w:rFonts w:ascii="Consolas" w:eastAsia="Times New Roman" w:hAnsi="Consolas" w:cs="Times New Roman"/>
-          <w:color w:val="BBBEBF"/>
-          <w:sz w:val="21"/>
-          <w:szCs w:val="21"/>
-        </w:rPr>
-        <w:t>) {</w:t>
+        <w:t>(</w:t>
+      </w:r>
+      <w:r>
+        <w:rPr>
+          <w:rFonts w:ascii="Consolas" w:eastAsia="Times New Roman" w:hAnsi="Consolas" w:cs="Times New Roman"/>
+          <w:color w:val="A5D6FF"/>
+          <w:sz w:val="21"/>
+          <w:szCs w:val="21"/>
+        </w:rPr>
+        <w:t>"Please enter integers only"</w:t>
+      </w:r>
+      <w:r>
+        <w:rPr>
+          <w:rFonts w:ascii="Consolas" w:eastAsia="Times New Roman" w:hAnsi="Consolas" w:cs="Times New Roman"/>
+          <w:color w:val="BBBEBF"/>
+          <w:sz w:val="21"/>
+          <w:szCs w:val="21"/>
+        </w:rPr>
+        <w:t>);</w:t>
       </w:r>
     </w:p>
     <w:p>
@@ -1348,16 +1366,63 @@
           <w:sz w:val="21"/>
           <w:szCs w:val="21"/>
         </w:rPr>
-        <w:t xml:space="preserve">            </w:t>
-      </w:r>
-      <w:r>
-        <w:rPr>
-          <w:rFonts w:ascii="Consolas" w:eastAsia="Times New Roman" w:hAnsi="Consolas" w:cs="Times New Roman"/>
-          <w:color w:val="8B949E"/>
-          <w:sz w:val="21"/>
-          <w:szCs w:val="21"/>
-        </w:rPr>
-        <w:t>// Integer division by zero is reported separately from invalid input.</w:t>
+        <w:t xml:space="preserve">        } </w:t>
+      </w:r>
+      <w:r>
+        <w:rPr>
+          <w:rFonts w:ascii="Consolas" w:eastAsia="Times New Roman" w:hAnsi="Consolas" w:cs="Times New Roman"/>
+          <w:color w:val="C586C0"/>
+          <w:sz w:val="21"/>
+          <w:szCs w:val="21"/>
+        </w:rPr>
+        <w:t>catch</w:t>
+      </w:r>
+      <w:r>
+        <w:rPr>
+          <w:rFonts w:ascii="Consolas" w:eastAsia="Times New Roman" w:hAnsi="Consolas" w:cs="Times New Roman"/>
+          <w:color w:val="BBBEBF"/>
+          <w:sz w:val="21"/>
+          <w:szCs w:val="21"/>
+        </w:rPr>
+        <w:t xml:space="preserve"> (</w:t>
+      </w:r>
+      <w:proofErr w:type="spellStart"/>
+      <w:r>
+        <w:rPr>
+          <w:rFonts w:ascii="Consolas" w:eastAsia="Times New Roman" w:hAnsi="Consolas" w:cs="Times New Roman"/>
+          <w:color w:val="4EC9B0"/>
+          <w:sz w:val="21"/>
+          <w:szCs w:val="21"/>
+        </w:rPr>
+        <w:t>ArithmeticException</w:t>
+      </w:r>
+      <w:proofErr w:type="spellEnd"/>
+      <w:r>
+        <w:rPr>
+          <w:rFonts w:ascii="Consolas" w:eastAsia="Times New Roman" w:hAnsi="Consolas" w:cs="Times New Roman"/>
+          <w:color w:val="BBBEBF"/>
+          <w:sz w:val="21"/>
+          <w:szCs w:val="21"/>
+        </w:rPr>
+        <w:t xml:space="preserve"> </w:t>
+      </w:r>
+      <w:r>
+        <w:rPr>
+          <w:rFonts w:ascii="Consolas" w:eastAsia="Times New Roman" w:hAnsi="Consolas" w:cs="Times New Roman"/>
+          <w:color w:val="C9D1D9"/>
+          <w:sz w:val="21"/>
+          <w:szCs w:val="21"/>
+        </w:rPr>
+        <w:t>e</w:t>
+      </w:r>
+      <w:r>
+        <w:rPr>
+          <w:rFonts w:ascii="Consolas" w:eastAsia="Times New Roman" w:hAnsi="Consolas" w:cs="Times New Roman"/>
+          <w:color w:val="BBBEBF"/>
+          <w:sz w:val="21"/>
+          <w:szCs w:val="21"/>
+        </w:rPr>
+        <w:t>) {</w:t>
       </w:r>
     </w:p>
     <w:p>
@@ -1380,79 +1445,14 @@
         </w:rPr>
         <w:t xml:space="preserve">            </w:t>
       </w:r>
-      <w:proofErr w:type="spellStart"/>
-      <w:r>
-        <w:rPr>
-          <w:rFonts w:ascii="Consolas" w:eastAsia="Times New Roman" w:hAnsi="Consolas" w:cs="Times New Roman"/>
-          <w:color w:val="4EC9B0"/>
-          <w:sz w:val="21"/>
-          <w:szCs w:val="21"/>
-        </w:rPr>
-        <w:t>System</w:t>
-      </w:r>
-      <w:r>
-        <w:rPr>
-          <w:rFonts w:ascii="Consolas" w:eastAsia="Times New Roman" w:hAnsi="Consolas" w:cs="Times New Roman"/>
-          <w:color w:val="BBBEBF"/>
-          <w:sz w:val="21"/>
-          <w:szCs w:val="21"/>
-        </w:rPr>
-        <w:t>.</w:t>
-      </w:r>
-      <w:r>
-        <w:rPr>
-          <w:rFonts w:ascii="Consolas" w:eastAsia="Times New Roman" w:hAnsi="Consolas" w:cs="Times New Roman"/>
-          <w:color w:val="79C0FF"/>
-          <w:sz w:val="21"/>
-          <w:szCs w:val="21"/>
-        </w:rPr>
-        <w:t>out</w:t>
-      </w:r>
-      <w:r>
-        <w:rPr>
-          <w:rFonts w:ascii="Consolas" w:eastAsia="Times New Roman" w:hAnsi="Consolas" w:cs="Times New Roman"/>
-          <w:color w:val="BBBEBF"/>
-          <w:sz w:val="21"/>
-          <w:szCs w:val="21"/>
-        </w:rPr>
-        <w:t>.</w:t>
-      </w:r>
-      <w:r>
-        <w:rPr>
-          <w:rFonts w:ascii="Consolas" w:eastAsia="Times New Roman" w:hAnsi="Consolas" w:cs="Times New Roman"/>
-          <w:color w:val="D2A8FF"/>
-          <w:sz w:val="21"/>
-          <w:szCs w:val="21"/>
-        </w:rPr>
-        <w:t>println</w:t>
-      </w:r>
-      <w:proofErr w:type="spellEnd"/>
-      <w:r>
-        <w:rPr>
-          <w:rFonts w:ascii="Consolas" w:eastAsia="Times New Roman" w:hAnsi="Consolas" w:cs="Times New Roman"/>
-          <w:color w:val="BBBEBF"/>
-          <w:sz w:val="21"/>
-          <w:szCs w:val="21"/>
-        </w:rPr>
-        <w:t>(</w:t>
-      </w:r>
-      <w:r>
-        <w:rPr>
-          <w:rFonts w:ascii="Consolas" w:eastAsia="Times New Roman" w:hAnsi="Consolas" w:cs="Times New Roman"/>
-          <w:color w:val="A5D6FF"/>
-          <w:sz w:val="21"/>
-          <w:szCs w:val="21"/>
-        </w:rPr>
-        <w:t>"Cannot divide by zero"</w:t>
-      </w:r>
-      <w:r>
-        <w:rPr>
-          <w:rFonts w:ascii="Consolas" w:eastAsia="Times New Roman" w:hAnsi="Consolas" w:cs="Times New Roman"/>
-          <w:color w:val="BBBEBF"/>
-          <w:sz w:val="21"/>
-          <w:szCs w:val="21"/>
-        </w:rPr>
-        <w:t>);</w:t>
+      <w:r>
+        <w:rPr>
+          <w:rFonts w:ascii="Consolas" w:eastAsia="Times New Roman" w:hAnsi="Consolas" w:cs="Times New Roman"/>
+          <w:color w:val="8B949E"/>
+          <w:sz w:val="21"/>
+          <w:szCs w:val="21"/>
+        </w:rPr>
+        <w:t>// Integer division by zero is reported separately from invalid input.</w:t>
       </w:r>
     </w:p>
     <w:p>
@@ -1473,7 +1473,81 @@
           <w:sz w:val="21"/>
           <w:szCs w:val="21"/>
         </w:rPr>
-        <w:t>        }</w:t>
+        <w:t xml:space="preserve">            </w:t>
+      </w:r>
+      <w:proofErr w:type="spellStart"/>
+      <w:r>
+        <w:rPr>
+          <w:rFonts w:ascii="Consolas" w:eastAsia="Times New Roman" w:hAnsi="Consolas" w:cs="Times New Roman"/>
+          <w:color w:val="4EC9B0"/>
+          <w:sz w:val="21"/>
+          <w:szCs w:val="21"/>
+        </w:rPr>
+        <w:t>System</w:t>
+      </w:r>
+      <w:r>
+        <w:rPr>
+          <w:rFonts w:ascii="Consolas" w:eastAsia="Times New Roman" w:hAnsi="Consolas" w:cs="Times New Roman"/>
+          <w:color w:val="BBBEBF"/>
+          <w:sz w:val="21"/>
+          <w:szCs w:val="21"/>
+        </w:rPr>
+        <w:t>.</w:t>
+      </w:r>
+      <w:r>
+        <w:rPr>
+          <w:rFonts w:ascii="Consolas" w:eastAsia="Times New Roman" w:hAnsi="Consolas" w:cs="Times New Roman"/>
+          <w:color w:val="79C0FF"/>
+          <w:sz w:val="21"/>
+          <w:szCs w:val="21"/>
+        </w:rPr>
+        <w:t>out</w:t>
+      </w:r>
+      <w:r>
+        <w:rPr>
+          <w:rFonts w:ascii="Consolas" w:eastAsia="Times New Roman" w:hAnsi="Consolas" w:cs="Times New Roman"/>
+          <w:color w:val="BBBEBF"/>
+          <w:sz w:val="21"/>
+          <w:szCs w:val="21"/>
+        </w:rPr>
+        <w:t>.</w:t>
+      </w:r>
+      <w:r>
+        <w:rPr>
+          <w:rFonts w:ascii="Consolas" w:eastAsia="Times New Roman" w:hAnsi="Consolas" w:cs="Times New Roman"/>
+          <w:color w:val="D2A8FF"/>
+          <w:sz w:val="21"/>
+          <w:szCs w:val="21"/>
+        </w:rPr>
+        <w:t>println</w:t>
+      </w:r>
+      <w:proofErr w:type="spellEnd"/>
+      <w:r>
+        <w:rPr>
+          <w:rFonts w:ascii="Consolas" w:eastAsia="Times New Roman" w:hAnsi="Consolas" w:cs="Times New Roman"/>
+          <w:color w:val="BBBEBF"/>
+          <w:sz w:val="21"/>
+          <w:szCs w:val="21"/>
+        </w:rPr>
+        <w:t>(</w:t>
+      </w:r>
+      <w:r>
+        <w:rPr>
+          <w:rFonts w:ascii="Consolas" w:eastAsia="Times New Roman" w:hAnsi="Consolas" w:cs="Times New Roman"/>
+          <w:color w:val="A5D6FF"/>
+          <w:sz w:val="21"/>
+          <w:szCs w:val="21"/>
+        </w:rPr>
+        <w:t>"Cannot divide by zero"</w:t>
+      </w:r>
+      <w:r>
+        <w:rPr>
+          <w:rFonts w:ascii="Consolas" w:eastAsia="Times New Roman" w:hAnsi="Consolas" w:cs="Times New Roman"/>
+          <w:color w:val="BBBEBF"/>
+          <w:sz w:val="21"/>
+          <w:szCs w:val="21"/>
+        </w:rPr>
+        <w:t>);</w:t>
       </w:r>
     </w:p>
     <w:p>
@@ -1494,7 +1568,7 @@
           <w:sz w:val="21"/>
           <w:szCs w:val="21"/>
         </w:rPr>
-        <w:t>    }</w:t>
+        <w:t>        }</w:t>
       </w:r>
     </w:p>
     <w:p>
@@ -1515,7 +1589,7 @@
           <w:sz w:val="21"/>
           <w:szCs w:val="21"/>
         </w:rPr>
-        <w:t>}</w:t>
+        <w:t>    }</w:t>
       </w:r>
     </w:p>
     <w:p>
@@ -1529,10 +1603,82 @@
           <w:szCs w:val="21"/>
         </w:rPr>
       </w:pPr>
+      <w:r>
+        <w:rPr>
+          <w:rFonts w:ascii="Consolas" w:eastAsia="Times New Roman" w:hAnsi="Consolas" w:cs="Times New Roman"/>
+          <w:color w:val="BBBEBF"/>
+          <w:sz w:val="21"/>
+          <w:szCs w:val="21"/>
+        </w:rPr>
+        <w:t>}</w:t>
+      </w:r>
     </w:p>
     <w:p>
+      <w:pPr>
+        <w:shd w:val="clear" w:color="auto" w:fill="121314"/>
+        <w:spacing w:after="0" w:line="285" w:lineRule="atLeast"/>
+        <w:rPr>
+          <w:rFonts w:ascii="Consolas" w:eastAsia="Times New Roman" w:hAnsi="Consolas" w:cs="Times New Roman"/>
+          <w:color w:val="BBBEBF"/>
+          <w:sz w:val="21"/>
+          <w:szCs w:val="21"/>
+        </w:rPr>
+      </w:pPr>
+    </w:p>
+    <w:p>
+      <w:pPr>
+        <w:shd w:val="clear" w:color="auto" w:fill="121314"/>
+        <w:spacing w:after="0" w:line="285" w:lineRule="atLeast"/>
+        <w:rPr>
+          <w:rFonts w:ascii="Consolas" w:eastAsia="Times New Roman" w:hAnsi="Consolas" w:cs="Times New Roman"/>
+          <w:color w:val="BBBEBF"/>
+          <w:sz w:val="21"/>
+          <w:szCs w:val="21"/>
+        </w:rPr>
+      </w:pPr>
+    </w:p>
+    <w:p>
       <w:r>
         <w:t>Expected output (sample):</w:t>
+      </w:r>
+    </w:p>
+    <w:p>
+      <w:r>
+        <w:drawing>
+          <wp:inline distT="0" distB="0" distL="0" distR="0" wp14:anchorId="7BD79381" wp14:editId="1B9E7641">
+            <wp:extent cx="5486400" cy="1174115"/>
+            <wp:effectExtent l="0" t="0" r="0" b="6985"/>
+            <wp:docPr id="1467019973" name="Picture 1"/>
+            <wp:cNvGraphicFramePr>
+              <a:graphicFrameLocks xmlns:a="http://schemas.openxmlformats.org/drawingml/2006/main" noChangeAspect="1"/>
+            </wp:cNvGraphicFramePr>
+            <a:graphic xmlns:a="http://schemas.openxmlformats.org/drawingml/2006/main">
+              <a:graphicData uri="http://schemas.openxmlformats.org/drawingml/2006/picture">
+                <pic:pic xmlns:pic="http://schemas.openxmlformats.org/drawingml/2006/picture">
+                  <pic:nvPicPr>
+                    <pic:cNvPr id="1467019973" name=""/>
+                    <pic:cNvPicPr/>
+                  </pic:nvPicPr>
+                  <pic:blipFill>
+                    <a:blip r:embed="rId6"/>
+                    <a:stretch>
+                      <a:fillRect/>
+                    </a:stretch>
+                  </pic:blipFill>
+                  <pic:spPr>
+                    <a:xfrm>
+                      <a:off x="0" y="0"/>
+                      <a:ext cx="5486400" cy="1174115"/>
+                    </a:xfrm>
+                    <a:prstGeom prst="rect">
+                      <a:avLst/>
+                    </a:prstGeom>
+                  </pic:spPr>
+                </pic:pic>
+              </a:graphicData>
+            </a:graphic>
+          </wp:inline>
+        </w:drawing>
       </w:r>
     </w:p>
     <w:p>
@@ -1567,6 +1713,1197 @@
     </w:p>
     <w:p>
       <w:r>
+        <w:lastRenderedPageBreak/>
+        <w:t>Java source code:</w:t>
+      </w:r>
+    </w:p>
+    <w:p>
+      <w:pPr>
+        <w:shd w:val="clear" w:color="auto" w:fill="121314"/>
+        <w:spacing w:after="0" w:line="285" w:lineRule="atLeast"/>
+        <w:rPr>
+          <w:rFonts w:ascii="Consolas" w:eastAsia="Times New Roman" w:hAnsi="Consolas" w:cs="Times New Roman"/>
+          <w:color w:val="BBBEBF"/>
+          <w:sz w:val="21"/>
+          <w:szCs w:val="21"/>
+        </w:rPr>
+      </w:pPr>
+      <w:r>
+        <w:rPr>
+          <w:rFonts w:ascii="Consolas" w:eastAsia="Times New Roman" w:hAnsi="Consolas" w:cs="Times New Roman"/>
+          <w:color w:val="569CD6"/>
+          <w:sz w:val="21"/>
+          <w:szCs w:val="21"/>
+        </w:rPr>
+        <w:t>public</w:t>
+      </w:r>
+      <w:r>
+        <w:rPr>
+          <w:rFonts w:ascii="Consolas" w:eastAsia="Times New Roman" w:hAnsi="Consolas" w:cs="Times New Roman"/>
+          <w:color w:val="BBBEBF"/>
+          <w:sz w:val="21"/>
+          <w:szCs w:val="21"/>
+        </w:rPr>
+        <w:t xml:space="preserve"> </w:t>
+      </w:r>
+      <w:r>
+        <w:rPr>
+          <w:rFonts w:ascii="Consolas" w:eastAsia="Times New Roman" w:hAnsi="Consolas" w:cs="Times New Roman"/>
+          <w:color w:val="569CD6"/>
+          <w:sz w:val="21"/>
+          <w:szCs w:val="21"/>
+        </w:rPr>
+        <w:t>class</w:t>
+      </w:r>
+      <w:r>
+        <w:rPr>
+          <w:rFonts w:ascii="Consolas" w:eastAsia="Times New Roman" w:hAnsi="Consolas" w:cs="Times New Roman"/>
+          <w:color w:val="BBBEBF"/>
+          <w:sz w:val="21"/>
+          <w:szCs w:val="21"/>
+        </w:rPr>
+        <w:t xml:space="preserve"> </w:t>
+      </w:r>
+      <w:r>
+        <w:rPr>
+          <w:rFonts w:ascii="Consolas" w:eastAsia="Times New Roman" w:hAnsi="Consolas" w:cs="Times New Roman"/>
+          <w:color w:val="4EC9B0"/>
+          <w:sz w:val="21"/>
+          <w:szCs w:val="21"/>
+        </w:rPr>
+        <w:t>Exercise2ArrayAccess</w:t>
+      </w:r>
+      <w:r>
+        <w:rPr>
+          <w:rFonts w:ascii="Consolas" w:eastAsia="Times New Roman" w:hAnsi="Consolas" w:cs="Times New Roman"/>
+          <w:color w:val="BBBEBF"/>
+          <w:sz w:val="21"/>
+          <w:szCs w:val="21"/>
+        </w:rPr>
+        <w:t xml:space="preserve"> {</w:t>
+      </w:r>
+    </w:p>
+    <w:p>
+      <w:pPr>
+        <w:shd w:val="clear" w:color="auto" w:fill="121314"/>
+        <w:spacing w:after="0" w:line="285" w:lineRule="atLeast"/>
+        <w:rPr>
+          <w:rFonts w:ascii="Consolas" w:eastAsia="Times New Roman" w:hAnsi="Consolas" w:cs="Times New Roman"/>
+          <w:color w:val="BBBEBF"/>
+          <w:sz w:val="21"/>
+          <w:szCs w:val="21"/>
+        </w:rPr>
+      </w:pPr>
+      <w:r>
+        <w:rPr>
+          <w:rFonts w:ascii="Consolas" w:eastAsia="Times New Roman" w:hAnsi="Consolas" w:cs="Times New Roman"/>
+          <w:color w:val="BBBEBF"/>
+          <w:sz w:val="21"/>
+          <w:szCs w:val="21"/>
+        </w:rPr>
+        <w:t xml:space="preserve">    </w:t>
+      </w:r>
+      <w:r>
+        <w:rPr>
+          <w:rFonts w:ascii="Consolas" w:eastAsia="Times New Roman" w:hAnsi="Consolas" w:cs="Times New Roman"/>
+          <w:color w:val="569CD6"/>
+          <w:sz w:val="21"/>
+          <w:szCs w:val="21"/>
+        </w:rPr>
+        <w:t>static</w:t>
+      </w:r>
+      <w:r>
+        <w:rPr>
+          <w:rFonts w:ascii="Consolas" w:eastAsia="Times New Roman" w:hAnsi="Consolas" w:cs="Times New Roman"/>
+          <w:color w:val="BBBEBF"/>
+          <w:sz w:val="21"/>
+          <w:szCs w:val="21"/>
+        </w:rPr>
+        <w:t xml:space="preserve"> </w:t>
+      </w:r>
+      <w:r>
+        <w:rPr>
+          <w:rFonts w:ascii="Consolas" w:eastAsia="Times New Roman" w:hAnsi="Consolas" w:cs="Times New Roman"/>
+          <w:color w:val="4EC9B0"/>
+          <w:sz w:val="21"/>
+          <w:szCs w:val="21"/>
+        </w:rPr>
+        <w:t>void</w:t>
+      </w:r>
+      <w:r>
+        <w:rPr>
+          <w:rFonts w:ascii="Consolas" w:eastAsia="Times New Roman" w:hAnsi="Consolas" w:cs="Times New Roman"/>
+          <w:color w:val="BBBEBF"/>
+          <w:sz w:val="21"/>
+          <w:szCs w:val="21"/>
+        </w:rPr>
+        <w:t xml:space="preserve"> </w:t>
+      </w:r>
+      <w:proofErr w:type="spellStart"/>
+      <w:r>
+        <w:rPr>
+          <w:rFonts w:ascii="Consolas" w:eastAsia="Times New Roman" w:hAnsi="Consolas" w:cs="Times New Roman"/>
+          <w:color w:val="D2A8FF"/>
+          <w:sz w:val="21"/>
+          <w:szCs w:val="21"/>
+        </w:rPr>
+        <w:t>printElement</w:t>
+      </w:r>
+      <w:proofErr w:type="spellEnd"/>
+      <w:r>
+        <w:rPr>
+          <w:rFonts w:ascii="Consolas" w:eastAsia="Times New Roman" w:hAnsi="Consolas" w:cs="Times New Roman"/>
+          <w:color w:val="BBBEBF"/>
+          <w:sz w:val="21"/>
+          <w:szCs w:val="21"/>
+        </w:rPr>
+        <w:t>(</w:t>
+      </w:r>
+      <w:r>
+        <w:rPr>
+          <w:rFonts w:ascii="Consolas" w:eastAsia="Times New Roman" w:hAnsi="Consolas" w:cs="Times New Roman"/>
+          <w:color w:val="4EC9B0"/>
+          <w:sz w:val="21"/>
+          <w:szCs w:val="21"/>
+        </w:rPr>
+        <w:t>int</w:t>
+      </w:r>
+      <w:r>
+        <w:rPr>
+          <w:rFonts w:ascii="Consolas" w:eastAsia="Times New Roman" w:hAnsi="Consolas" w:cs="Times New Roman"/>
+          <w:color w:val="BBBEBF"/>
+          <w:sz w:val="21"/>
+          <w:szCs w:val="21"/>
+        </w:rPr>
+        <w:t xml:space="preserve">[] </w:t>
+      </w:r>
+      <w:r>
+        <w:rPr>
+          <w:rFonts w:ascii="Consolas" w:eastAsia="Times New Roman" w:hAnsi="Consolas" w:cs="Times New Roman"/>
+          <w:color w:val="FFA657"/>
+          <w:sz w:val="21"/>
+          <w:szCs w:val="21"/>
+        </w:rPr>
+        <w:t>values</w:t>
+      </w:r>
+      <w:r>
+        <w:rPr>
+          <w:rFonts w:ascii="Consolas" w:eastAsia="Times New Roman" w:hAnsi="Consolas" w:cs="Times New Roman"/>
+          <w:color w:val="BBBEBF"/>
+          <w:sz w:val="21"/>
+          <w:szCs w:val="21"/>
+        </w:rPr>
+        <w:t xml:space="preserve">, </w:t>
+      </w:r>
+      <w:r>
+        <w:rPr>
+          <w:rFonts w:ascii="Consolas" w:eastAsia="Times New Roman" w:hAnsi="Consolas" w:cs="Times New Roman"/>
+          <w:color w:val="4EC9B0"/>
+          <w:sz w:val="21"/>
+          <w:szCs w:val="21"/>
+        </w:rPr>
+        <w:t>int</w:t>
+      </w:r>
+      <w:r>
+        <w:rPr>
+          <w:rFonts w:ascii="Consolas" w:eastAsia="Times New Roman" w:hAnsi="Consolas" w:cs="Times New Roman"/>
+          <w:color w:val="BBBEBF"/>
+          <w:sz w:val="21"/>
+          <w:szCs w:val="21"/>
+        </w:rPr>
+        <w:t xml:space="preserve"> </w:t>
+      </w:r>
+      <w:r>
+        <w:rPr>
+          <w:rFonts w:ascii="Consolas" w:eastAsia="Times New Roman" w:hAnsi="Consolas" w:cs="Times New Roman"/>
+          <w:color w:val="FFA657"/>
+          <w:sz w:val="21"/>
+          <w:szCs w:val="21"/>
+        </w:rPr>
+        <w:t>index</w:t>
+      </w:r>
+      <w:r>
+        <w:rPr>
+          <w:rFonts w:ascii="Consolas" w:eastAsia="Times New Roman" w:hAnsi="Consolas" w:cs="Times New Roman"/>
+          <w:color w:val="BBBEBF"/>
+          <w:sz w:val="21"/>
+          <w:szCs w:val="21"/>
+        </w:rPr>
+        <w:t>) {</w:t>
+      </w:r>
+    </w:p>
+    <w:p>
+      <w:pPr>
+        <w:shd w:val="clear" w:color="auto" w:fill="121314"/>
+        <w:spacing w:after="0" w:line="285" w:lineRule="atLeast"/>
+        <w:rPr>
+          <w:rFonts w:ascii="Consolas" w:eastAsia="Times New Roman" w:hAnsi="Consolas" w:cs="Times New Roman"/>
+          <w:color w:val="BBBEBF"/>
+          <w:sz w:val="21"/>
+          <w:szCs w:val="21"/>
+        </w:rPr>
+      </w:pPr>
+      <w:r>
+        <w:rPr>
+          <w:rFonts w:ascii="Consolas" w:eastAsia="Times New Roman" w:hAnsi="Consolas" w:cs="Times New Roman"/>
+          <w:color w:val="BBBEBF"/>
+          <w:sz w:val="21"/>
+          <w:szCs w:val="21"/>
+        </w:rPr>
+        <w:t xml:space="preserve">        </w:t>
+      </w:r>
+      <w:r>
+        <w:rPr>
+          <w:rFonts w:ascii="Consolas" w:eastAsia="Times New Roman" w:hAnsi="Consolas" w:cs="Times New Roman"/>
+          <w:color w:val="C586C0"/>
+          <w:sz w:val="21"/>
+          <w:szCs w:val="21"/>
+        </w:rPr>
+        <w:t>try</w:t>
+      </w:r>
+      <w:r>
+        <w:rPr>
+          <w:rFonts w:ascii="Consolas" w:eastAsia="Times New Roman" w:hAnsi="Consolas" w:cs="Times New Roman"/>
+          <w:color w:val="BBBEBF"/>
+          <w:sz w:val="21"/>
+          <w:szCs w:val="21"/>
+        </w:rPr>
+        <w:t xml:space="preserve"> {</w:t>
+      </w:r>
+    </w:p>
+    <w:p>
+      <w:pPr>
+        <w:shd w:val="clear" w:color="auto" w:fill="121314"/>
+        <w:spacing w:after="0" w:line="285" w:lineRule="atLeast"/>
+        <w:rPr>
+          <w:rFonts w:ascii="Consolas" w:eastAsia="Times New Roman" w:hAnsi="Consolas" w:cs="Times New Roman"/>
+          <w:color w:val="BBBEBF"/>
+          <w:sz w:val="21"/>
+          <w:szCs w:val="21"/>
+        </w:rPr>
+      </w:pPr>
+      <w:r>
+        <w:rPr>
+          <w:rFonts w:ascii="Consolas" w:eastAsia="Times New Roman" w:hAnsi="Consolas" w:cs="Times New Roman"/>
+          <w:color w:val="BBBEBF"/>
+          <w:sz w:val="21"/>
+          <w:szCs w:val="21"/>
+        </w:rPr>
+        <w:t xml:space="preserve">            </w:t>
+      </w:r>
+      <w:r>
+        <w:rPr>
+          <w:rFonts w:ascii="Consolas" w:eastAsia="Times New Roman" w:hAnsi="Consolas" w:cs="Times New Roman"/>
+          <w:color w:val="8B949E"/>
+          <w:sz w:val="21"/>
+          <w:szCs w:val="21"/>
+        </w:rPr>
+        <w:t>// Attempt to access the array element at the specified index</w:t>
+      </w:r>
+    </w:p>
+    <w:p>
+      <w:pPr>
+        <w:shd w:val="clear" w:color="auto" w:fill="121314"/>
+        <w:spacing w:after="0" w:line="285" w:lineRule="atLeast"/>
+        <w:rPr>
+          <w:rFonts w:ascii="Consolas" w:eastAsia="Times New Roman" w:hAnsi="Consolas" w:cs="Times New Roman"/>
+          <w:color w:val="BBBEBF"/>
+          <w:sz w:val="21"/>
+          <w:szCs w:val="21"/>
+        </w:rPr>
+      </w:pPr>
+      <w:r>
+        <w:rPr>
+          <w:rFonts w:ascii="Consolas" w:eastAsia="Times New Roman" w:hAnsi="Consolas" w:cs="Times New Roman"/>
+          <w:color w:val="BBBEBF"/>
+          <w:sz w:val="21"/>
+          <w:szCs w:val="21"/>
+        </w:rPr>
+        <w:t xml:space="preserve">            </w:t>
+      </w:r>
+      <w:proofErr w:type="spellStart"/>
+      <w:r>
+        <w:rPr>
+          <w:rFonts w:ascii="Consolas" w:eastAsia="Times New Roman" w:hAnsi="Consolas" w:cs="Times New Roman"/>
+          <w:color w:val="4EC9B0"/>
+          <w:sz w:val="21"/>
+          <w:szCs w:val="21"/>
+        </w:rPr>
+        <w:t>System</w:t>
+      </w:r>
+      <w:r>
+        <w:rPr>
+          <w:rFonts w:ascii="Consolas" w:eastAsia="Times New Roman" w:hAnsi="Consolas" w:cs="Times New Roman"/>
+          <w:color w:val="BBBEBF"/>
+          <w:sz w:val="21"/>
+          <w:szCs w:val="21"/>
+        </w:rPr>
+        <w:t>.</w:t>
+      </w:r>
+      <w:r>
+        <w:rPr>
+          <w:rFonts w:ascii="Consolas" w:eastAsia="Times New Roman" w:hAnsi="Consolas" w:cs="Times New Roman"/>
+          <w:color w:val="79C0FF"/>
+          <w:sz w:val="21"/>
+          <w:szCs w:val="21"/>
+        </w:rPr>
+        <w:t>out</w:t>
+      </w:r>
+      <w:r>
+        <w:rPr>
+          <w:rFonts w:ascii="Consolas" w:eastAsia="Times New Roman" w:hAnsi="Consolas" w:cs="Times New Roman"/>
+          <w:color w:val="BBBEBF"/>
+          <w:sz w:val="21"/>
+          <w:szCs w:val="21"/>
+        </w:rPr>
+        <w:t>.</w:t>
+      </w:r>
+      <w:r>
+        <w:rPr>
+          <w:rFonts w:ascii="Consolas" w:eastAsia="Times New Roman" w:hAnsi="Consolas" w:cs="Times New Roman"/>
+          <w:color w:val="D2A8FF"/>
+          <w:sz w:val="21"/>
+          <w:szCs w:val="21"/>
+        </w:rPr>
+        <w:t>println</w:t>
+      </w:r>
+      <w:proofErr w:type="spellEnd"/>
+      <w:r>
+        <w:rPr>
+          <w:rFonts w:ascii="Consolas" w:eastAsia="Times New Roman" w:hAnsi="Consolas" w:cs="Times New Roman"/>
+          <w:color w:val="BBBEBF"/>
+          <w:sz w:val="21"/>
+          <w:szCs w:val="21"/>
+        </w:rPr>
+        <w:t>(</w:t>
+      </w:r>
+      <w:r>
+        <w:rPr>
+          <w:rFonts w:ascii="Consolas" w:eastAsia="Times New Roman" w:hAnsi="Consolas" w:cs="Times New Roman"/>
+          <w:color w:val="FFA657"/>
+          <w:sz w:val="21"/>
+          <w:szCs w:val="21"/>
+        </w:rPr>
+        <w:t>values</w:t>
+      </w:r>
+      <w:r>
+        <w:rPr>
+          <w:rFonts w:ascii="Consolas" w:eastAsia="Times New Roman" w:hAnsi="Consolas" w:cs="Times New Roman"/>
+          <w:color w:val="BBBEBF"/>
+          <w:sz w:val="21"/>
+          <w:szCs w:val="21"/>
+        </w:rPr>
+        <w:t>[</w:t>
+      </w:r>
+      <w:r>
+        <w:rPr>
+          <w:rFonts w:ascii="Consolas" w:eastAsia="Times New Roman" w:hAnsi="Consolas" w:cs="Times New Roman"/>
+          <w:color w:val="FFA657"/>
+          <w:sz w:val="21"/>
+          <w:szCs w:val="21"/>
+        </w:rPr>
+        <w:t>index</w:t>
+      </w:r>
+      <w:r>
+        <w:rPr>
+          <w:rFonts w:ascii="Consolas" w:eastAsia="Times New Roman" w:hAnsi="Consolas" w:cs="Times New Roman"/>
+          <w:color w:val="BBBEBF"/>
+          <w:sz w:val="21"/>
+          <w:szCs w:val="21"/>
+        </w:rPr>
+        <w:t>]);</w:t>
+      </w:r>
+    </w:p>
+    <w:p>
+      <w:pPr>
+        <w:shd w:val="clear" w:color="auto" w:fill="121314"/>
+        <w:spacing w:after="0" w:line="285" w:lineRule="atLeast"/>
+        <w:rPr>
+          <w:rFonts w:ascii="Consolas" w:eastAsia="Times New Roman" w:hAnsi="Consolas" w:cs="Times New Roman"/>
+          <w:color w:val="BBBEBF"/>
+          <w:sz w:val="21"/>
+          <w:szCs w:val="21"/>
+        </w:rPr>
+      </w:pPr>
+      <w:r>
+        <w:rPr>
+          <w:rFonts w:ascii="Consolas" w:eastAsia="Times New Roman" w:hAnsi="Consolas" w:cs="Times New Roman"/>
+          <w:color w:val="BBBEBF"/>
+          <w:sz w:val="21"/>
+          <w:szCs w:val="21"/>
+        </w:rPr>
+        <w:t xml:space="preserve">        } </w:t>
+      </w:r>
+      <w:r>
+        <w:rPr>
+          <w:rFonts w:ascii="Consolas" w:eastAsia="Times New Roman" w:hAnsi="Consolas" w:cs="Times New Roman"/>
+          <w:color w:val="C586C0"/>
+          <w:sz w:val="21"/>
+          <w:szCs w:val="21"/>
+        </w:rPr>
+        <w:t>catch</w:t>
+      </w:r>
+      <w:r>
+        <w:rPr>
+          <w:rFonts w:ascii="Consolas" w:eastAsia="Times New Roman" w:hAnsi="Consolas" w:cs="Times New Roman"/>
+          <w:color w:val="BBBEBF"/>
+          <w:sz w:val="21"/>
+          <w:szCs w:val="21"/>
+        </w:rPr>
+        <w:t xml:space="preserve"> (</w:t>
+      </w:r>
+      <w:proofErr w:type="spellStart"/>
+      <w:r>
+        <w:rPr>
+          <w:rFonts w:ascii="Consolas" w:eastAsia="Times New Roman" w:hAnsi="Consolas" w:cs="Times New Roman"/>
+          <w:color w:val="4EC9B0"/>
+          <w:sz w:val="21"/>
+          <w:szCs w:val="21"/>
+        </w:rPr>
+        <w:t>ArrayIndexOutOfBoundsException</w:t>
+      </w:r>
+      <w:proofErr w:type="spellEnd"/>
+      <w:r>
+        <w:rPr>
+          <w:rFonts w:ascii="Consolas" w:eastAsia="Times New Roman" w:hAnsi="Consolas" w:cs="Times New Roman"/>
+          <w:color w:val="BBBEBF"/>
+          <w:sz w:val="21"/>
+          <w:szCs w:val="21"/>
+        </w:rPr>
+        <w:t xml:space="preserve"> </w:t>
+      </w:r>
+      <w:r>
+        <w:rPr>
+          <w:rFonts w:ascii="Consolas" w:eastAsia="Times New Roman" w:hAnsi="Consolas" w:cs="Times New Roman"/>
+          <w:color w:val="C9D1D9"/>
+          <w:sz w:val="21"/>
+          <w:szCs w:val="21"/>
+        </w:rPr>
+        <w:t>e</w:t>
+      </w:r>
+      <w:r>
+        <w:rPr>
+          <w:rFonts w:ascii="Consolas" w:eastAsia="Times New Roman" w:hAnsi="Consolas" w:cs="Times New Roman"/>
+          <w:color w:val="BBBEBF"/>
+          <w:sz w:val="21"/>
+          <w:szCs w:val="21"/>
+        </w:rPr>
+        <w:t>) {</w:t>
+      </w:r>
+    </w:p>
+    <w:p>
+      <w:pPr>
+        <w:shd w:val="clear" w:color="auto" w:fill="121314"/>
+        <w:spacing w:after="0" w:line="285" w:lineRule="atLeast"/>
+        <w:rPr>
+          <w:rFonts w:ascii="Consolas" w:eastAsia="Times New Roman" w:hAnsi="Consolas" w:cs="Times New Roman"/>
+          <w:color w:val="BBBEBF"/>
+          <w:sz w:val="21"/>
+          <w:szCs w:val="21"/>
+        </w:rPr>
+      </w:pPr>
+      <w:r>
+        <w:rPr>
+          <w:rFonts w:ascii="Consolas" w:eastAsia="Times New Roman" w:hAnsi="Consolas" w:cs="Times New Roman"/>
+          <w:color w:val="BBBEBF"/>
+          <w:sz w:val="21"/>
+          <w:szCs w:val="21"/>
+        </w:rPr>
+        <w:t xml:space="preserve">            </w:t>
+      </w:r>
+      <w:proofErr w:type="spellStart"/>
+      <w:r>
+        <w:rPr>
+          <w:rFonts w:ascii="Consolas" w:eastAsia="Times New Roman" w:hAnsi="Consolas" w:cs="Times New Roman"/>
+          <w:color w:val="4EC9B0"/>
+          <w:sz w:val="21"/>
+          <w:szCs w:val="21"/>
+        </w:rPr>
+        <w:t>System</w:t>
+      </w:r>
+      <w:r>
+        <w:rPr>
+          <w:rFonts w:ascii="Consolas" w:eastAsia="Times New Roman" w:hAnsi="Consolas" w:cs="Times New Roman"/>
+          <w:color w:val="BBBEBF"/>
+          <w:sz w:val="21"/>
+          <w:szCs w:val="21"/>
+        </w:rPr>
+        <w:t>.</w:t>
+      </w:r>
+      <w:r>
+        <w:rPr>
+          <w:rFonts w:ascii="Consolas" w:eastAsia="Times New Roman" w:hAnsi="Consolas" w:cs="Times New Roman"/>
+          <w:color w:val="79C0FF"/>
+          <w:sz w:val="21"/>
+          <w:szCs w:val="21"/>
+        </w:rPr>
+        <w:t>out</w:t>
+      </w:r>
+      <w:r>
+        <w:rPr>
+          <w:rFonts w:ascii="Consolas" w:eastAsia="Times New Roman" w:hAnsi="Consolas" w:cs="Times New Roman"/>
+          <w:color w:val="BBBEBF"/>
+          <w:sz w:val="21"/>
+          <w:szCs w:val="21"/>
+        </w:rPr>
+        <w:t>.</w:t>
+      </w:r>
+      <w:r>
+        <w:rPr>
+          <w:rFonts w:ascii="Consolas" w:eastAsia="Times New Roman" w:hAnsi="Consolas" w:cs="Times New Roman"/>
+          <w:color w:val="D2A8FF"/>
+          <w:sz w:val="21"/>
+          <w:szCs w:val="21"/>
+        </w:rPr>
+        <w:t>println</w:t>
+      </w:r>
+      <w:proofErr w:type="spellEnd"/>
+      <w:r>
+        <w:rPr>
+          <w:rFonts w:ascii="Consolas" w:eastAsia="Times New Roman" w:hAnsi="Consolas" w:cs="Times New Roman"/>
+          <w:color w:val="BBBEBF"/>
+          <w:sz w:val="21"/>
+          <w:szCs w:val="21"/>
+        </w:rPr>
+        <w:t>(</w:t>
+      </w:r>
+      <w:r>
+        <w:rPr>
+          <w:rFonts w:ascii="Consolas" w:eastAsia="Times New Roman" w:hAnsi="Consolas" w:cs="Times New Roman"/>
+          <w:color w:val="A5D6FF"/>
+          <w:sz w:val="21"/>
+          <w:szCs w:val="21"/>
+        </w:rPr>
+        <w:t>"Invalid array index"</w:t>
+      </w:r>
+      <w:r>
+        <w:rPr>
+          <w:rFonts w:ascii="Consolas" w:eastAsia="Times New Roman" w:hAnsi="Consolas" w:cs="Times New Roman"/>
+          <w:color w:val="BBBEBF"/>
+          <w:sz w:val="21"/>
+          <w:szCs w:val="21"/>
+        </w:rPr>
+        <w:t>);</w:t>
+      </w:r>
+    </w:p>
+    <w:p>
+      <w:pPr>
+        <w:shd w:val="clear" w:color="auto" w:fill="121314"/>
+        <w:spacing w:after="0" w:line="285" w:lineRule="atLeast"/>
+        <w:rPr>
+          <w:rFonts w:ascii="Consolas" w:eastAsia="Times New Roman" w:hAnsi="Consolas" w:cs="Times New Roman"/>
+          <w:color w:val="BBBEBF"/>
+          <w:sz w:val="21"/>
+          <w:szCs w:val="21"/>
+        </w:rPr>
+      </w:pPr>
+      <w:r>
+        <w:rPr>
+          <w:rFonts w:ascii="Consolas" w:eastAsia="Times New Roman" w:hAnsi="Consolas" w:cs="Times New Roman"/>
+          <w:color w:val="BBBEBF"/>
+          <w:sz w:val="21"/>
+          <w:szCs w:val="21"/>
+        </w:rPr>
+        <w:t>        }</w:t>
+      </w:r>
+    </w:p>
+    <w:p>
+      <w:pPr>
+        <w:shd w:val="clear" w:color="auto" w:fill="121314"/>
+        <w:spacing w:after="0" w:line="285" w:lineRule="atLeast"/>
+        <w:rPr>
+          <w:rFonts w:ascii="Consolas" w:eastAsia="Times New Roman" w:hAnsi="Consolas" w:cs="Times New Roman"/>
+          <w:color w:val="BBBEBF"/>
+          <w:sz w:val="21"/>
+          <w:szCs w:val="21"/>
+        </w:rPr>
+      </w:pPr>
+      <w:r>
+        <w:rPr>
+          <w:rFonts w:ascii="Consolas" w:eastAsia="Times New Roman" w:hAnsi="Consolas" w:cs="Times New Roman"/>
+          <w:color w:val="BBBEBF"/>
+          <w:sz w:val="21"/>
+          <w:szCs w:val="21"/>
+        </w:rPr>
+        <w:t>    }</w:t>
+      </w:r>
+    </w:p>
+    <w:p>
+      <w:pPr>
+        <w:shd w:val="clear" w:color="auto" w:fill="121314"/>
+        <w:spacing w:after="0" w:line="285" w:lineRule="atLeast"/>
+        <w:rPr>
+          <w:rFonts w:ascii="Consolas" w:eastAsia="Times New Roman" w:hAnsi="Consolas" w:cs="Times New Roman"/>
+          <w:color w:val="BBBEBF"/>
+          <w:sz w:val="21"/>
+          <w:szCs w:val="21"/>
+        </w:rPr>
+      </w:pPr>
+    </w:p>
+    <w:p>
+      <w:pPr>
+        <w:shd w:val="clear" w:color="auto" w:fill="121314"/>
+        <w:spacing w:after="0" w:line="285" w:lineRule="atLeast"/>
+        <w:rPr>
+          <w:rFonts w:ascii="Consolas" w:eastAsia="Times New Roman" w:hAnsi="Consolas" w:cs="Times New Roman"/>
+          <w:color w:val="BBBEBF"/>
+          <w:sz w:val="21"/>
+          <w:szCs w:val="21"/>
+        </w:rPr>
+      </w:pPr>
+      <w:r>
+        <w:rPr>
+          <w:rFonts w:ascii="Consolas" w:eastAsia="Times New Roman" w:hAnsi="Consolas" w:cs="Times New Roman"/>
+          <w:color w:val="BBBEBF"/>
+          <w:sz w:val="21"/>
+          <w:szCs w:val="21"/>
+        </w:rPr>
+        <w:t xml:space="preserve">    </w:t>
+      </w:r>
+      <w:r>
+        <w:rPr>
+          <w:rFonts w:ascii="Consolas" w:eastAsia="Times New Roman" w:hAnsi="Consolas" w:cs="Times New Roman"/>
+          <w:color w:val="569CD6"/>
+          <w:sz w:val="21"/>
+          <w:szCs w:val="21"/>
+        </w:rPr>
+        <w:t>public</w:t>
+      </w:r>
+      <w:r>
+        <w:rPr>
+          <w:rFonts w:ascii="Consolas" w:eastAsia="Times New Roman" w:hAnsi="Consolas" w:cs="Times New Roman"/>
+          <w:color w:val="BBBEBF"/>
+          <w:sz w:val="21"/>
+          <w:szCs w:val="21"/>
+        </w:rPr>
+        <w:t xml:space="preserve"> </w:t>
+      </w:r>
+      <w:r>
+        <w:rPr>
+          <w:rFonts w:ascii="Consolas" w:eastAsia="Times New Roman" w:hAnsi="Consolas" w:cs="Times New Roman"/>
+          <w:color w:val="569CD6"/>
+          <w:sz w:val="21"/>
+          <w:szCs w:val="21"/>
+        </w:rPr>
+        <w:t>static</w:t>
+      </w:r>
+      <w:r>
+        <w:rPr>
+          <w:rFonts w:ascii="Consolas" w:eastAsia="Times New Roman" w:hAnsi="Consolas" w:cs="Times New Roman"/>
+          <w:color w:val="BBBEBF"/>
+          <w:sz w:val="21"/>
+          <w:szCs w:val="21"/>
+        </w:rPr>
+        <w:t xml:space="preserve"> </w:t>
+      </w:r>
+      <w:r>
+        <w:rPr>
+          <w:rFonts w:ascii="Consolas" w:eastAsia="Times New Roman" w:hAnsi="Consolas" w:cs="Times New Roman"/>
+          <w:color w:val="4EC9B0"/>
+          <w:sz w:val="21"/>
+          <w:szCs w:val="21"/>
+        </w:rPr>
+        <w:t>void</w:t>
+      </w:r>
+      <w:r>
+        <w:rPr>
+          <w:rFonts w:ascii="Consolas" w:eastAsia="Times New Roman" w:hAnsi="Consolas" w:cs="Times New Roman"/>
+          <w:color w:val="BBBEBF"/>
+          <w:sz w:val="21"/>
+          <w:szCs w:val="21"/>
+        </w:rPr>
+        <w:t xml:space="preserve"> </w:t>
+      </w:r>
+      <w:r>
+        <w:rPr>
+          <w:rFonts w:ascii="Consolas" w:eastAsia="Times New Roman" w:hAnsi="Consolas" w:cs="Times New Roman"/>
+          <w:color w:val="D2A8FF"/>
+          <w:sz w:val="21"/>
+          <w:szCs w:val="21"/>
+        </w:rPr>
+        <w:t>main</w:t>
+      </w:r>
+      <w:r>
+        <w:rPr>
+          <w:rFonts w:ascii="Consolas" w:eastAsia="Times New Roman" w:hAnsi="Consolas" w:cs="Times New Roman"/>
+          <w:color w:val="BBBEBF"/>
+          <w:sz w:val="21"/>
+          <w:szCs w:val="21"/>
+        </w:rPr>
+        <w:t>(</w:t>
+      </w:r>
+      <w:r>
+        <w:rPr>
+          <w:rFonts w:ascii="Consolas" w:eastAsia="Times New Roman" w:hAnsi="Consolas" w:cs="Times New Roman"/>
+          <w:color w:val="4EC9B0"/>
+          <w:sz w:val="21"/>
+          <w:szCs w:val="21"/>
+        </w:rPr>
+        <w:t>String</w:t>
+      </w:r>
+      <w:r>
+        <w:rPr>
+          <w:rFonts w:ascii="Consolas" w:eastAsia="Times New Roman" w:hAnsi="Consolas" w:cs="Times New Roman"/>
+          <w:color w:val="BBBEBF"/>
+          <w:sz w:val="21"/>
+          <w:szCs w:val="21"/>
+        </w:rPr>
+        <w:t xml:space="preserve">[] </w:t>
+      </w:r>
+      <w:proofErr w:type="spellStart"/>
+      <w:r>
+        <w:rPr>
+          <w:rFonts w:ascii="Consolas" w:eastAsia="Times New Roman" w:hAnsi="Consolas" w:cs="Times New Roman"/>
+          <w:color w:val="FFA657"/>
+          <w:sz w:val="21"/>
+          <w:szCs w:val="21"/>
+        </w:rPr>
+        <w:t>args</w:t>
+      </w:r>
+      <w:proofErr w:type="spellEnd"/>
+      <w:r>
+        <w:rPr>
+          <w:rFonts w:ascii="Consolas" w:eastAsia="Times New Roman" w:hAnsi="Consolas" w:cs="Times New Roman"/>
+          <w:color w:val="BBBEBF"/>
+          <w:sz w:val="21"/>
+          <w:szCs w:val="21"/>
+        </w:rPr>
+        <w:t>) {</w:t>
+      </w:r>
+    </w:p>
+    <w:p>
+      <w:pPr>
+        <w:shd w:val="clear" w:color="auto" w:fill="121314"/>
+        <w:spacing w:after="0" w:line="285" w:lineRule="atLeast"/>
+        <w:rPr>
+          <w:rFonts w:ascii="Consolas" w:eastAsia="Times New Roman" w:hAnsi="Consolas" w:cs="Times New Roman"/>
+          <w:color w:val="BBBEBF"/>
+          <w:sz w:val="21"/>
+          <w:szCs w:val="21"/>
+        </w:rPr>
+      </w:pPr>
+      <w:r>
+        <w:rPr>
+          <w:rFonts w:ascii="Consolas" w:eastAsia="Times New Roman" w:hAnsi="Consolas" w:cs="Times New Roman"/>
+          <w:color w:val="BBBEBF"/>
+          <w:sz w:val="21"/>
+          <w:szCs w:val="21"/>
+        </w:rPr>
+        <w:t xml:space="preserve">        </w:t>
+      </w:r>
+      <w:r>
+        <w:rPr>
+          <w:rFonts w:ascii="Consolas" w:eastAsia="Times New Roman" w:hAnsi="Consolas" w:cs="Times New Roman"/>
+          <w:color w:val="4EC9B0"/>
+          <w:sz w:val="21"/>
+          <w:szCs w:val="21"/>
+        </w:rPr>
+        <w:t>int</w:t>
+      </w:r>
+      <w:r>
+        <w:rPr>
+          <w:rFonts w:ascii="Consolas" w:eastAsia="Times New Roman" w:hAnsi="Consolas" w:cs="Times New Roman"/>
+          <w:color w:val="FFA657"/>
+          <w:sz w:val="21"/>
+          <w:szCs w:val="21"/>
+        </w:rPr>
+        <w:t xml:space="preserve">[] </w:t>
+      </w:r>
+      <w:r>
+        <w:rPr>
+          <w:rFonts w:ascii="Consolas" w:eastAsia="Times New Roman" w:hAnsi="Consolas" w:cs="Times New Roman"/>
+          <w:color w:val="C9D1D9"/>
+          <w:sz w:val="21"/>
+          <w:szCs w:val="21"/>
+        </w:rPr>
+        <w:t>values</w:t>
+      </w:r>
+      <w:r>
+        <w:rPr>
+          <w:rFonts w:ascii="Consolas" w:eastAsia="Times New Roman" w:hAnsi="Consolas" w:cs="Times New Roman"/>
+          <w:color w:val="FFA657"/>
+          <w:sz w:val="21"/>
+          <w:szCs w:val="21"/>
+        </w:rPr>
+        <w:t xml:space="preserve"> </w:t>
+      </w:r>
+      <w:r>
+        <w:rPr>
+          <w:rFonts w:ascii="Consolas" w:eastAsia="Times New Roman" w:hAnsi="Consolas" w:cs="Times New Roman"/>
+          <w:color w:val="D4D4D4"/>
+          <w:sz w:val="21"/>
+          <w:szCs w:val="21"/>
+        </w:rPr>
+        <w:t>=</w:t>
+      </w:r>
+      <w:r>
+        <w:rPr>
+          <w:rFonts w:ascii="Consolas" w:eastAsia="Times New Roman" w:hAnsi="Consolas" w:cs="Times New Roman"/>
+          <w:color w:val="BBBEBF"/>
+          <w:sz w:val="21"/>
+          <w:szCs w:val="21"/>
+        </w:rPr>
+        <w:t xml:space="preserve"> {</w:t>
+      </w:r>
+      <w:r>
+        <w:rPr>
+          <w:rFonts w:ascii="Consolas" w:eastAsia="Times New Roman" w:hAnsi="Consolas" w:cs="Times New Roman"/>
+          <w:color w:val="B5CEA8"/>
+          <w:sz w:val="21"/>
+          <w:szCs w:val="21"/>
+        </w:rPr>
+        <w:t>10</w:t>
+      </w:r>
+      <w:r>
+        <w:rPr>
+          <w:rFonts w:ascii="Consolas" w:eastAsia="Times New Roman" w:hAnsi="Consolas" w:cs="Times New Roman"/>
+          <w:color w:val="BBBEBF"/>
+          <w:sz w:val="21"/>
+          <w:szCs w:val="21"/>
+        </w:rPr>
+        <w:t xml:space="preserve">, </w:t>
+      </w:r>
+      <w:r>
+        <w:rPr>
+          <w:rFonts w:ascii="Consolas" w:eastAsia="Times New Roman" w:hAnsi="Consolas" w:cs="Times New Roman"/>
+          <w:color w:val="B5CEA8"/>
+          <w:sz w:val="21"/>
+          <w:szCs w:val="21"/>
+        </w:rPr>
+        <w:t>20</w:t>
+      </w:r>
+      <w:r>
+        <w:rPr>
+          <w:rFonts w:ascii="Consolas" w:eastAsia="Times New Roman" w:hAnsi="Consolas" w:cs="Times New Roman"/>
+          <w:color w:val="BBBEBF"/>
+          <w:sz w:val="21"/>
+          <w:szCs w:val="21"/>
+        </w:rPr>
+        <w:t xml:space="preserve">, </w:t>
+      </w:r>
+      <w:r>
+        <w:rPr>
+          <w:rFonts w:ascii="Consolas" w:eastAsia="Times New Roman" w:hAnsi="Consolas" w:cs="Times New Roman"/>
+          <w:color w:val="B5CEA8"/>
+          <w:sz w:val="21"/>
+          <w:szCs w:val="21"/>
+        </w:rPr>
+        <w:t>30</w:t>
+      </w:r>
+      <w:r>
+        <w:rPr>
+          <w:rFonts w:ascii="Consolas" w:eastAsia="Times New Roman" w:hAnsi="Consolas" w:cs="Times New Roman"/>
+          <w:color w:val="BBBEBF"/>
+          <w:sz w:val="21"/>
+          <w:szCs w:val="21"/>
+        </w:rPr>
+        <w:t>};</w:t>
+      </w:r>
+    </w:p>
+    <w:p>
+      <w:pPr>
+        <w:shd w:val="clear" w:color="auto" w:fill="121314"/>
+        <w:spacing w:after="0" w:line="285" w:lineRule="atLeast"/>
+        <w:rPr>
+          <w:rFonts w:ascii="Consolas" w:eastAsia="Times New Roman" w:hAnsi="Consolas" w:cs="Times New Roman"/>
+          <w:color w:val="BBBEBF"/>
+          <w:sz w:val="21"/>
+          <w:szCs w:val="21"/>
+        </w:rPr>
+      </w:pPr>
+      <w:r>
+        <w:rPr>
+          <w:rFonts w:ascii="Consolas" w:eastAsia="Times New Roman" w:hAnsi="Consolas" w:cs="Times New Roman"/>
+          <w:color w:val="BBBEBF"/>
+          <w:sz w:val="21"/>
+          <w:szCs w:val="21"/>
+        </w:rPr>
+        <w:t xml:space="preserve">        </w:t>
+      </w:r>
+      <w:r>
+        <w:rPr>
+          <w:rFonts w:ascii="Consolas" w:eastAsia="Times New Roman" w:hAnsi="Consolas" w:cs="Times New Roman"/>
+          <w:color w:val="8B949E"/>
+          <w:sz w:val="21"/>
+          <w:szCs w:val="21"/>
+        </w:rPr>
+        <w:t>// The second call demonstrates how an invalid index is handled.</w:t>
+      </w:r>
+    </w:p>
+    <w:p>
+      <w:pPr>
+        <w:shd w:val="clear" w:color="auto" w:fill="121314"/>
+        <w:spacing w:after="0" w:line="285" w:lineRule="atLeast"/>
+        <w:rPr>
+          <w:rFonts w:ascii="Consolas" w:eastAsia="Times New Roman" w:hAnsi="Consolas" w:cs="Times New Roman"/>
+          <w:color w:val="BBBEBF"/>
+          <w:sz w:val="21"/>
+          <w:szCs w:val="21"/>
+        </w:rPr>
+      </w:pPr>
+      <w:r>
+        <w:rPr>
+          <w:rFonts w:ascii="Consolas" w:eastAsia="Times New Roman" w:hAnsi="Consolas" w:cs="Times New Roman"/>
+          <w:color w:val="BBBEBF"/>
+          <w:sz w:val="21"/>
+          <w:szCs w:val="21"/>
+        </w:rPr>
+        <w:t xml:space="preserve">        </w:t>
+      </w:r>
+      <w:proofErr w:type="spellStart"/>
+      <w:r>
+        <w:rPr>
+          <w:rFonts w:ascii="Consolas" w:eastAsia="Times New Roman" w:hAnsi="Consolas" w:cs="Times New Roman"/>
+          <w:color w:val="D2A8FF"/>
+          <w:sz w:val="21"/>
+          <w:szCs w:val="21"/>
+        </w:rPr>
+        <w:t>printElement</w:t>
+      </w:r>
+      <w:proofErr w:type="spellEnd"/>
+      <w:r>
+        <w:rPr>
+          <w:rFonts w:ascii="Consolas" w:eastAsia="Times New Roman" w:hAnsi="Consolas" w:cs="Times New Roman"/>
+          <w:color w:val="BBBEBF"/>
+          <w:sz w:val="21"/>
+          <w:szCs w:val="21"/>
+        </w:rPr>
+        <w:t>(</w:t>
+      </w:r>
+      <w:r>
+        <w:rPr>
+          <w:rFonts w:ascii="Consolas" w:eastAsia="Times New Roman" w:hAnsi="Consolas" w:cs="Times New Roman"/>
+          <w:color w:val="C9D1D9"/>
+          <w:sz w:val="21"/>
+          <w:szCs w:val="21"/>
+        </w:rPr>
+        <w:t>values</w:t>
+      </w:r>
+      <w:r>
+        <w:rPr>
+          <w:rFonts w:ascii="Consolas" w:eastAsia="Times New Roman" w:hAnsi="Consolas" w:cs="Times New Roman"/>
+          <w:color w:val="BBBEBF"/>
+          <w:sz w:val="21"/>
+          <w:szCs w:val="21"/>
+        </w:rPr>
+        <w:t xml:space="preserve">, </w:t>
+      </w:r>
+      <w:r>
+        <w:rPr>
+          <w:rFonts w:ascii="Consolas" w:eastAsia="Times New Roman" w:hAnsi="Consolas" w:cs="Times New Roman"/>
+          <w:color w:val="B5CEA8"/>
+          <w:sz w:val="21"/>
+          <w:szCs w:val="21"/>
+        </w:rPr>
+        <w:t>1</w:t>
+      </w:r>
+      <w:r>
+        <w:rPr>
+          <w:rFonts w:ascii="Consolas" w:eastAsia="Times New Roman" w:hAnsi="Consolas" w:cs="Times New Roman"/>
+          <w:color w:val="BBBEBF"/>
+          <w:sz w:val="21"/>
+          <w:szCs w:val="21"/>
+        </w:rPr>
+        <w:t>);</w:t>
+      </w:r>
+    </w:p>
+    <w:p>
+      <w:pPr>
+        <w:shd w:val="clear" w:color="auto" w:fill="121314"/>
+        <w:spacing w:after="0" w:line="285" w:lineRule="atLeast"/>
+        <w:rPr>
+          <w:rFonts w:ascii="Consolas" w:eastAsia="Times New Roman" w:hAnsi="Consolas" w:cs="Times New Roman"/>
+          <w:color w:val="BBBEBF"/>
+          <w:sz w:val="21"/>
+          <w:szCs w:val="21"/>
+        </w:rPr>
+      </w:pPr>
+      <w:r>
+        <w:rPr>
+          <w:rFonts w:ascii="Consolas" w:eastAsia="Times New Roman" w:hAnsi="Consolas" w:cs="Times New Roman"/>
+          <w:color w:val="BBBEBF"/>
+          <w:sz w:val="21"/>
+          <w:szCs w:val="21"/>
+        </w:rPr>
+        <w:t xml:space="preserve">        </w:t>
+      </w:r>
+      <w:proofErr w:type="spellStart"/>
+      <w:r>
+        <w:rPr>
+          <w:rFonts w:ascii="Consolas" w:eastAsia="Times New Roman" w:hAnsi="Consolas" w:cs="Times New Roman"/>
+          <w:color w:val="D2A8FF"/>
+          <w:sz w:val="21"/>
+          <w:szCs w:val="21"/>
+        </w:rPr>
+        <w:t>printElement</w:t>
+      </w:r>
+      <w:proofErr w:type="spellEnd"/>
+      <w:r>
+        <w:rPr>
+          <w:rFonts w:ascii="Consolas" w:eastAsia="Times New Roman" w:hAnsi="Consolas" w:cs="Times New Roman"/>
+          <w:color w:val="BBBEBF"/>
+          <w:sz w:val="21"/>
+          <w:szCs w:val="21"/>
+        </w:rPr>
+        <w:t>(</w:t>
+      </w:r>
+      <w:r>
+        <w:rPr>
+          <w:rFonts w:ascii="Consolas" w:eastAsia="Times New Roman" w:hAnsi="Consolas" w:cs="Times New Roman"/>
+          <w:color w:val="C9D1D9"/>
+          <w:sz w:val="21"/>
+          <w:szCs w:val="21"/>
+        </w:rPr>
+        <w:t>values</w:t>
+      </w:r>
+      <w:r>
+        <w:rPr>
+          <w:rFonts w:ascii="Consolas" w:eastAsia="Times New Roman" w:hAnsi="Consolas" w:cs="Times New Roman"/>
+          <w:color w:val="BBBEBF"/>
+          <w:sz w:val="21"/>
+          <w:szCs w:val="21"/>
+        </w:rPr>
+        <w:t xml:space="preserve">, </w:t>
+      </w:r>
+      <w:r>
+        <w:rPr>
+          <w:rFonts w:ascii="Consolas" w:eastAsia="Times New Roman" w:hAnsi="Consolas" w:cs="Times New Roman"/>
+          <w:color w:val="B5CEA8"/>
+          <w:sz w:val="21"/>
+          <w:szCs w:val="21"/>
+        </w:rPr>
+        <w:t>5</w:t>
+      </w:r>
+      <w:r>
+        <w:rPr>
+          <w:rFonts w:ascii="Consolas" w:eastAsia="Times New Roman" w:hAnsi="Consolas" w:cs="Times New Roman"/>
+          <w:color w:val="BBBEBF"/>
+          <w:sz w:val="21"/>
+          <w:szCs w:val="21"/>
+        </w:rPr>
+        <w:t>);</w:t>
+      </w:r>
+    </w:p>
+    <w:p>
+      <w:pPr>
+        <w:shd w:val="clear" w:color="auto" w:fill="121314"/>
+        <w:spacing w:after="0" w:line="285" w:lineRule="atLeast"/>
+        <w:rPr>
+          <w:rFonts w:ascii="Consolas" w:eastAsia="Times New Roman" w:hAnsi="Consolas" w:cs="Times New Roman"/>
+          <w:color w:val="BBBEBF"/>
+          <w:sz w:val="21"/>
+          <w:szCs w:val="21"/>
+        </w:rPr>
+      </w:pPr>
+      <w:r>
+        <w:rPr>
+          <w:rFonts w:ascii="Consolas" w:eastAsia="Times New Roman" w:hAnsi="Consolas" w:cs="Times New Roman"/>
+          <w:color w:val="BBBEBF"/>
+          <w:sz w:val="21"/>
+          <w:szCs w:val="21"/>
+        </w:rPr>
+        <w:t>    }</w:t>
+      </w:r>
+    </w:p>
+    <w:p>
+      <w:pPr>
+        <w:shd w:val="clear" w:color="auto" w:fill="121314"/>
+        <w:spacing w:after="0" w:line="285" w:lineRule="atLeast"/>
+        <w:rPr>
+          <w:rFonts w:ascii="Consolas" w:eastAsia="Times New Roman" w:hAnsi="Consolas" w:cs="Times New Roman"/>
+          <w:color w:val="BBBEBF"/>
+          <w:sz w:val="21"/>
+          <w:szCs w:val="21"/>
+        </w:rPr>
+      </w:pPr>
+      <w:r>
+        <w:rPr>
+          <w:rFonts w:ascii="Consolas" w:eastAsia="Times New Roman" w:hAnsi="Consolas" w:cs="Times New Roman"/>
+          <w:color w:val="BBBEBF"/>
+          <w:sz w:val="21"/>
+          <w:szCs w:val="21"/>
+        </w:rPr>
+        <w:t>}</w:t>
+      </w:r>
+    </w:p>
+    <w:p>
+      <w:pPr>
+        <w:shd w:val="clear" w:color="auto" w:fill="121314"/>
+        <w:spacing w:after="0" w:line="285" w:lineRule="atLeast"/>
+        <w:rPr>
+          <w:rFonts w:ascii="Consolas" w:eastAsia="Times New Roman" w:hAnsi="Consolas" w:cs="Times New Roman"/>
+          <w:color w:val="BBBEBF"/>
+          <w:sz w:val="21"/>
+          <w:szCs w:val="21"/>
+        </w:rPr>
+      </w:pPr>
+    </w:p>
+    <w:p>
+      <w:r>
+        <w:t>Expected output (sample):</w:t>
+      </w:r>
+    </w:p>
+    <w:p>
+      <w:r>
+        <w:rPr>
+          <w:rFonts w:ascii="Consolas" w:hAnsi="Consolas"/>
+          <w:sz w:val="16"/>
+        </w:rPr>
+        <w:drawing>
+          <wp:inline distT="0" distB="0" distL="0" distR="0" wp14:anchorId="28CCE603" wp14:editId="048B3237">
+            <wp:extent cx="5486400" cy="1296035"/>
+            <wp:effectExtent l="0" t="0" r="0" b="0"/>
+            <wp:docPr id="182994176" name="Picture 1"/>
+            <wp:cNvGraphicFramePr>
+              <a:graphicFrameLocks xmlns:a="http://schemas.openxmlformats.org/drawingml/2006/main" noChangeAspect="1"/>
+            </wp:cNvGraphicFramePr>
+            <a:graphic xmlns:a="http://schemas.openxmlformats.org/drawingml/2006/main">
+              <a:graphicData uri="http://schemas.openxmlformats.org/drawingml/2006/picture">
+                <pic:pic xmlns:pic="http://schemas.openxmlformats.org/drawingml/2006/picture">
+                  <pic:nvPicPr>
+                    <pic:cNvPr id="182994176" name=""/>
+                    <pic:cNvPicPr/>
+                  </pic:nvPicPr>
+                  <pic:blipFill>
+                    <a:blip r:embed="rId7"/>
+                    <a:stretch>
+                      <a:fillRect/>
+                    </a:stretch>
+                  </pic:blipFill>
+                  <pic:spPr>
+                    <a:xfrm>
+                      <a:off x="0" y="0"/>
+                      <a:ext cx="5486400" cy="1296035"/>
+                    </a:xfrm>
+                    <a:prstGeom prst="rect">
+                      <a:avLst/>
+                    </a:prstGeom>
+                  </pic:spPr>
+                </pic:pic>
+              </a:graphicData>
+            </a:graphic>
+          </wp:inline>
+        </w:drawing>
+      </w:r>
+      <w:r>
+        <w:t>Explanation: The try block accesses the requested index. The catch block handles an index outside the array.</w:t>
+      </w:r>
+    </w:p>
+    <w:p>
+      <w:pPr>
+        <w:pStyle w:val="Heading1"/>
+      </w:pPr>
+      <w:r>
+        <w:t>Exercise 3</w:t>
+      </w:r>
+    </w:p>
+    <w:p>
+      <w:r>
+        <w:t>Question: Create checked InvalidAgeException and validate ages 0–120.</w:t>
+      </w:r>
+    </w:p>
+    <w:p>
+      <w:r>
         <w:t>Java source code:</w:t>
       </w:r>
     </w:p>
@@ -1579,7 +2916,7 @@
           <w:rFonts w:ascii="Consolas" w:hAnsi="Consolas"/>
           <w:sz w:val="16"/>
         </w:rPr>
-        <w:t>public class Exercise2ArrayAccess {</w:t>
+        <w:t>public class Exercise3InvalidAge {</w:t>
       </w:r>
     </w:p>
     <w:p>
@@ -1591,7 +2928,7 @@
           <w:rFonts w:ascii="Consolas" w:hAnsi="Consolas"/>
           <w:sz w:val="16"/>
         </w:rPr>
-        <w:t xml:space="preserve">    static void printElement(int[] values,int index) { try { System.out.println(values[index]); } catch(ArrayIndexOutOfBoundsException e) { System.out.println("Invalid array index"); } }</w:t>
+        <w:t xml:space="preserve">    static class InvalidAgeException extends Exception { InvalidAgeException(String message){super(message);} }</w:t>
       </w:r>
     </w:p>
     <w:p>
@@ -1603,7 +2940,7 @@
           <w:rFonts w:ascii="Consolas" w:hAnsi="Consolas"/>
           <w:sz w:val="16"/>
         </w:rPr>
-        <w:t xml:space="preserve">    public static void main(String[] args) { printElement(new int[]{10,20,30},1); printElement(new int[]{10,20,30},5); }</w:t>
+        <w:t xml:space="preserve">    static void validateAge(int age) throws InvalidAgeException { if(age&lt;0 || age&gt;120) throw new InvalidAgeException("Age must be between 0 and 120"); }</w:t>
       </w:r>
     </w:p>
     <w:p>
@@ -1615,12 +2952,7 @@
           <w:rFonts w:ascii="Consolas" w:hAnsi="Consolas"/>
           <w:sz w:val="16"/>
         </w:rPr>
-        <w:t>}</w:t>
-      </w:r>
-    </w:p>
-    <w:p>
-      <w:r>
-        <w:t>Expected output (sample):</w:t>
+        <w:t xml:space="preserve">    public static void main(String[] args) { try { validateAge(150); } catch(InvalidAgeException e) { System.out.println(e.getMessage()); } }</w:t>
       </w:r>
     </w:p>
     <w:p>
@@ -1632,7 +2964,12 @@
           <w:rFonts w:ascii="Consolas" w:hAnsi="Consolas"/>
           <w:sz w:val="16"/>
         </w:rPr>
-        <w:t>20</w:t>
+        <w:t>}</w:t>
+      </w:r>
+    </w:p>
+    <w:p>
+      <w:r>
+        <w:t>Expected output (sample):</w:t>
       </w:r>
     </w:p>
     <w:p>
@@ -1644,13 +2981,12 @@
           <w:rFonts w:ascii="Consolas" w:hAnsi="Consolas"/>
           <w:sz w:val="16"/>
         </w:rPr>
-        <w:t>Invalid array index</w:t>
+        <w:t>Age must be between 0 and 120</w:t>
       </w:r>
     </w:p>
     <w:p>
       <w:r>
-        <w:lastRenderedPageBreak/>
-        <w:t>Explanation: The try block accesses the requested index. The catch block handles an index outside the array.</w:t>
+        <w:t>Explanation: Extending Exception creates a checked exception. The method declares throws and the caller catches it.</w:t>
       </w:r>
     </w:p>
     <w:p>
@@ -1658,12 +2994,13 @@
         <w:pStyle w:val="Heading1"/>
       </w:pPr>
       <w:r>
-        <w:t>Exercise 3</w:t>
+        <w:lastRenderedPageBreak/>
+        <w:t>Exercise 4</w:t>
       </w:r>
     </w:p>
     <w:p>
       <w:r>
-        <w:t>Question: Create checked InvalidAgeException and validate ages 0–120.</w:t>
+        <w:t>Question: Make withdraw throw InsufficientFundsException rather than return false.</w:t>
       </w:r>
     </w:p>
     <w:p>
@@ -1680,7 +3017,7 @@
           <w:rFonts w:ascii="Consolas" w:hAnsi="Consolas"/>
           <w:sz w:val="16"/>
         </w:rPr>
-        <w:t>public class Exercise3InvalidAge {</w:t>
+        <w:t>public class Exercise4WithdrawException {</w:t>
       </w:r>
     </w:p>
     <w:p>
@@ -1692,7 +3029,7 @@
           <w:rFonts w:ascii="Consolas" w:hAnsi="Consolas"/>
           <w:sz w:val="16"/>
         </w:rPr>
-        <w:t xml:space="preserve">    static class InvalidAgeException extends Exception { InvalidAgeException(String message){super(message);} }</w:t>
+        <w:t xml:space="preserve">    static class InsufficientFundsException extends Exception { InsufficientFundsException(String message){super(message);} }</w:t>
       </w:r>
     </w:p>
     <w:p>
@@ -1704,7 +3041,7 @@
           <w:rFonts w:ascii="Consolas" w:hAnsi="Consolas"/>
           <w:sz w:val="16"/>
         </w:rPr>
-        <w:t xml:space="preserve">    static void validateAge(int age) throws InvalidAgeException { if(age&lt;0 || age&gt;120) throw new InvalidAgeException("Age must be between 0 and 120"); }</w:t>
+        <w:t xml:space="preserve">    static class BankAccount { double balance; BankAccount(double b){balance=b;} void withdraw(double amount) throws InsufficientFundsException { if(amount&gt;balance) throw new InsufficientFundsException("Insufficient funds"); balance-=amount; } }</w:t>
       </w:r>
     </w:p>
     <w:p>
@@ -1716,7 +3053,7 @@
           <w:rFonts w:ascii="Consolas" w:hAnsi="Consolas"/>
           <w:sz w:val="16"/>
         </w:rPr>
-        <w:t xml:space="preserve">    public static void main(String[] args) { try { validateAge(150); } catch(InvalidAgeException e) { System.out.println(e.getMessage()); } }</w:t>
+        <w:t xml:space="preserve">    public static void main(String[] args) { BankAccount a=new BankAccount(100); try { a.withdraw(150); } catch(InsufficientFundsException e) { System.out.println(e.getMessage()); } System.out.println("Balance: "+a.balance); }</w:t>
       </w:r>
     </w:p>
     <w:p>
@@ -1745,12 +3082,24 @@
           <w:rFonts w:ascii="Consolas" w:hAnsi="Consolas"/>
           <w:sz w:val="16"/>
         </w:rPr>
-        <w:t>Age must be between 0 and 120</w:t>
+        <w:t>Insufficient funds</w:t>
       </w:r>
     </w:p>
     <w:p>
-      <w:r>
-        <w:t>Explanation: Extending Exception creates a checked exception. The method declares throws and the caller catches it.</w:t>
+      <w:pPr>
+        <w:spacing w:after="0"/>
+      </w:pPr>
+      <w:r>
+        <w:rPr>
+          <w:rFonts w:ascii="Consolas" w:hAnsi="Consolas"/>
+          <w:sz w:val="16"/>
+        </w:rPr>
+        <w:t>Balance: 100.0</w:t>
+      </w:r>
+    </w:p>
+    <w:p>
+      <w:r>
+        <w:t>Explanation: An exception gives the caller a clear reason for failure. A boolean return is simpler but carries less detail.</w:t>
       </w:r>
     </w:p>
     <w:p>
@@ -1758,12 +3107,12 @@
         <w:pStyle w:val="Heading1"/>
       </w:pPr>
       <w:r>
-        <w:t>Exercise 4</w:t>
+        <w:t>Exercise 5</w:t>
       </w:r>
     </w:p>
     <w:p>
       <w:r>
-        <w:t>Question: Make withdraw throw InsufficientFundsException rather than return false.</w:t>
+        <w:t>Question: Predict a return in try with a print statement in finally.</w:t>
       </w:r>
     </w:p>
     <w:p>
@@ -1780,7 +3129,7 @@
           <w:rFonts w:ascii="Consolas" w:hAnsi="Consolas"/>
           <w:sz w:val="16"/>
         </w:rPr>
-        <w:t>public class Exercise4WithdrawException {</w:t>
+        <w:t>public class Exercise5FinallyReturn {</w:t>
       </w:r>
     </w:p>
     <w:p>
@@ -1792,7 +3141,7 @@
           <w:rFonts w:ascii="Consolas" w:hAnsi="Consolas"/>
           <w:sz w:val="16"/>
         </w:rPr>
-        <w:t xml:space="preserve">    static class InsufficientFundsException extends Exception { InsufficientFundsException(String message){super(message);} }</w:t>
+        <w:t xml:space="preserve">    static int example() { try { System.out.println("Inside try"); return 5; } finally { System.out.println("Inside finally"); } }</w:t>
       </w:r>
     </w:p>
     <w:p>
@@ -1804,7 +3153,7 @@
           <w:rFonts w:ascii="Consolas" w:hAnsi="Consolas"/>
           <w:sz w:val="16"/>
         </w:rPr>
-        <w:t xml:space="preserve">    static class BankAccount { double balance; BankAccount(double b){balance=b;} void withdraw(double amount) throws InsufficientFundsException { if(amount&gt;balance) throw new InsufficientFundsException("Insufficient funds"); balance-=amount; } }</w:t>
+        <w:t xml:space="preserve">    public static void main(String[] args) { System.out.println("Returned: "+example()); }</w:t>
       </w:r>
     </w:p>
     <w:p>
@@ -1816,7 +3165,12 @@
           <w:rFonts w:ascii="Consolas" w:hAnsi="Consolas"/>
           <w:sz w:val="16"/>
         </w:rPr>
-        <w:t xml:space="preserve">    public static void main(String[] args) { BankAccount a=new BankAccount(100); try { a.withdraw(150); } catch(InsufficientFundsException e) { System.out.println(e.getMessage()); } System.out.println("Balance: "+a.balance); }</w:t>
+        <w:t>}</w:t>
+      </w:r>
+    </w:p>
+    <w:p>
+      <w:r>
+        <w:t>Expected output (sample):</w:t>
       </w:r>
     </w:p>
     <w:p>
@@ -1828,124 +3182,6 @@
           <w:rFonts w:ascii="Consolas" w:hAnsi="Consolas"/>
           <w:sz w:val="16"/>
         </w:rPr>
-        <w:t>}</w:t>
-      </w:r>
-    </w:p>
-    <w:p>
-      <w:r>
-        <w:t>Expected output (sample):</w:t>
-      </w:r>
-    </w:p>
-    <w:p>
-      <w:pPr>
-        <w:spacing w:after="0"/>
-      </w:pPr>
-      <w:r>
-        <w:rPr>
-          <w:rFonts w:ascii="Consolas" w:hAnsi="Consolas"/>
-          <w:sz w:val="16"/>
-        </w:rPr>
-        <w:t>Insufficient funds</w:t>
-      </w:r>
-    </w:p>
-    <w:p>
-      <w:pPr>
-        <w:spacing w:after="0"/>
-      </w:pPr>
-      <w:r>
-        <w:rPr>
-          <w:rFonts w:ascii="Consolas" w:hAnsi="Consolas"/>
-          <w:sz w:val="16"/>
-        </w:rPr>
-        <w:t>Balance: 100.0</w:t>
-      </w:r>
-    </w:p>
-    <w:p>
-      <w:r>
-        <w:t>Explanation: An exception gives the caller a clear reason for failure. A boolean return is simpler but carries less detail.</w:t>
-      </w:r>
-    </w:p>
-    <w:p>
-      <w:pPr>
-        <w:pStyle w:val="Heading1"/>
-      </w:pPr>
-      <w:r>
-        <w:t>Exercise 5</w:t>
-      </w:r>
-    </w:p>
-    <w:p>
-      <w:r>
-        <w:t>Question: Predict a return in try with a print statement in finally.</w:t>
-      </w:r>
-    </w:p>
-    <w:p>
-      <w:r>
-        <w:t>Java source code:</w:t>
-      </w:r>
-    </w:p>
-    <w:p>
-      <w:pPr>
-        <w:spacing w:after="0"/>
-      </w:pPr>
-      <w:r>
-        <w:rPr>
-          <w:rFonts w:ascii="Consolas" w:hAnsi="Consolas"/>
-          <w:sz w:val="16"/>
-        </w:rPr>
-        <w:t>public class Exercise5FinallyReturn {</w:t>
-      </w:r>
-    </w:p>
-    <w:p>
-      <w:pPr>
-        <w:spacing w:after="0"/>
-      </w:pPr>
-      <w:r>
-        <w:rPr>
-          <w:rFonts w:ascii="Consolas" w:hAnsi="Consolas"/>
-          <w:sz w:val="16"/>
-        </w:rPr>
-        <w:t xml:space="preserve">    static int example() { try { System.out.println("Inside try"); return 5; } finally { System.out.println("Inside finally"); } }</w:t>
-      </w:r>
-    </w:p>
-    <w:p>
-      <w:pPr>
-        <w:spacing w:after="0"/>
-      </w:pPr>
-      <w:r>
-        <w:rPr>
-          <w:rFonts w:ascii="Consolas" w:hAnsi="Consolas"/>
-          <w:sz w:val="16"/>
-        </w:rPr>
-        <w:t xml:space="preserve">    public static void main(String[] args) { System.out.println("Returned: "+example()); }</w:t>
-      </w:r>
-    </w:p>
-    <w:p>
-      <w:pPr>
-        <w:spacing w:after="0"/>
-      </w:pPr>
-      <w:r>
-        <w:rPr>
-          <w:rFonts w:ascii="Consolas" w:hAnsi="Consolas"/>
-          <w:sz w:val="16"/>
-        </w:rPr>
-        <w:t>}</w:t>
-      </w:r>
-    </w:p>
-    <w:p>
-      <w:r>
-        <w:t>Expected output (sample):</w:t>
-      </w:r>
-    </w:p>
-    <w:p>
-      <w:pPr>
-        <w:spacing w:after="0"/>
-      </w:pPr>
-      <w:r>
-        <w:rPr>
-          <w:rFonts w:ascii="Consolas" w:hAnsi="Consolas"/>
-          <w:sz w:val="16"/>
-        </w:rPr>
-        <w:lastRenderedPageBreak/>
         <w:t>Inside try</w:t>
       </w:r>
     </w:p>

</xml_diff>

<commit_message>
refactor: improve code structure and add comments for age validation in Exercise3InvalidAge
</commit_message>
<xml_diff>
--- a/Lab_07/LAB Exercises report  (7).docx
+++ b/Lab_07/LAB Exercises report  (7).docx
@@ -2909,18 +2909,1437 @@
     </w:p>
     <w:p>
       <w:pPr>
-        <w:spacing w:after="0"/>
-      </w:pPr>
+        <w:shd w:val="clear" w:color="auto" w:fill="121314"/>
+        <w:spacing w:after="0" w:line="285" w:lineRule="atLeast"/>
+        <w:rPr>
+          <w:rFonts w:ascii="Consolas" w:eastAsia="Times New Roman" w:hAnsi="Consolas" w:cs="Times New Roman"/>
+          <w:color w:val="BBBEBF"/>
+          <w:sz w:val="21"/>
+          <w:szCs w:val="21"/>
+        </w:rPr>
+      </w:pPr>
+      <w:r>
+        <w:rPr>
+          <w:rFonts w:ascii="Consolas" w:eastAsia="Times New Roman" w:hAnsi="Consolas" w:cs="Times New Roman"/>
+          <w:color w:val="569CD6"/>
+          <w:sz w:val="21"/>
+          <w:szCs w:val="21"/>
+        </w:rPr>
+        <w:t>class</w:t>
+      </w:r>
+      <w:r>
+        <w:rPr>
+          <w:rFonts w:ascii="Consolas" w:eastAsia="Times New Roman" w:hAnsi="Consolas" w:cs="Times New Roman"/>
+          <w:color w:val="BBBEBF"/>
+          <w:sz w:val="21"/>
+          <w:szCs w:val="21"/>
+        </w:rPr>
+        <w:t xml:space="preserve"> </w:t>
+      </w:r>
+      <w:proofErr w:type="spellStart"/>
+      <w:r>
+        <w:rPr>
+          <w:rFonts w:ascii="Consolas" w:eastAsia="Times New Roman" w:hAnsi="Consolas" w:cs="Times New Roman"/>
+          <w:color w:val="4EC9B0"/>
+          <w:sz w:val="21"/>
+          <w:szCs w:val="21"/>
+        </w:rPr>
+        <w:t>InvalidAgeException</w:t>
+      </w:r>
+      <w:proofErr w:type="spellEnd"/>
+      <w:r>
+        <w:rPr>
+          <w:rFonts w:ascii="Consolas" w:eastAsia="Times New Roman" w:hAnsi="Consolas" w:cs="Times New Roman"/>
+          <w:color w:val="BBBEBF"/>
+          <w:sz w:val="21"/>
+          <w:szCs w:val="21"/>
+        </w:rPr>
+        <w:t xml:space="preserve"> </w:t>
+      </w:r>
+      <w:r>
+        <w:rPr>
+          <w:rFonts w:ascii="Consolas" w:eastAsia="Times New Roman" w:hAnsi="Consolas" w:cs="Times New Roman"/>
+          <w:color w:val="569CD6"/>
+          <w:sz w:val="21"/>
+          <w:szCs w:val="21"/>
+        </w:rPr>
+        <w:t>extends</w:t>
+      </w:r>
+      <w:r>
+        <w:rPr>
+          <w:rFonts w:ascii="Consolas" w:eastAsia="Times New Roman" w:hAnsi="Consolas" w:cs="Times New Roman"/>
+          <w:color w:val="BBBEBF"/>
+          <w:sz w:val="21"/>
+          <w:szCs w:val="21"/>
+        </w:rPr>
+        <w:t xml:space="preserve"> </w:t>
+      </w:r>
+      <w:r>
+        <w:rPr>
+          <w:rFonts w:ascii="Consolas" w:eastAsia="Times New Roman" w:hAnsi="Consolas" w:cs="Times New Roman"/>
+          <w:color w:val="4EC9B0"/>
+          <w:sz w:val="21"/>
+          <w:szCs w:val="21"/>
+        </w:rPr>
+        <w:t>Exception</w:t>
+      </w:r>
+      <w:r>
+        <w:rPr>
+          <w:rFonts w:ascii="Consolas" w:eastAsia="Times New Roman" w:hAnsi="Consolas" w:cs="Times New Roman"/>
+          <w:color w:val="BBBEBF"/>
+          <w:sz w:val="21"/>
+          <w:szCs w:val="21"/>
+        </w:rPr>
+        <w:t xml:space="preserve"> {</w:t>
+      </w:r>
+    </w:p>
+    <w:p>
+      <w:pPr>
+        <w:shd w:val="clear" w:color="auto" w:fill="121314"/>
+        <w:spacing w:after="0" w:line="285" w:lineRule="atLeast"/>
+        <w:rPr>
+          <w:rFonts w:ascii="Consolas" w:eastAsia="Times New Roman" w:hAnsi="Consolas" w:cs="Times New Roman"/>
+          <w:color w:val="BBBEBF"/>
+          <w:sz w:val="21"/>
+          <w:szCs w:val="21"/>
+        </w:rPr>
+      </w:pPr>
+      <w:r>
+        <w:rPr>
+          <w:rFonts w:ascii="Consolas" w:eastAsia="Times New Roman" w:hAnsi="Consolas" w:cs="Times New Roman"/>
+          <w:color w:val="BBBEBF"/>
+          <w:sz w:val="21"/>
+          <w:szCs w:val="21"/>
+        </w:rPr>
+        <w:t xml:space="preserve">    </w:t>
+      </w:r>
+      <w:proofErr w:type="spellStart"/>
+      <w:r>
+        <w:rPr>
+          <w:rFonts w:ascii="Consolas" w:eastAsia="Times New Roman" w:hAnsi="Consolas" w:cs="Times New Roman"/>
+          <w:color w:val="D2A8FF"/>
+          <w:sz w:val="21"/>
+          <w:szCs w:val="21"/>
+        </w:rPr>
+        <w:t>InvalidAgeException</w:t>
+      </w:r>
+      <w:proofErr w:type="spellEnd"/>
+      <w:r>
+        <w:rPr>
+          <w:rFonts w:ascii="Consolas" w:eastAsia="Times New Roman" w:hAnsi="Consolas" w:cs="Times New Roman"/>
+          <w:color w:val="BBBEBF"/>
+          <w:sz w:val="21"/>
+          <w:szCs w:val="21"/>
+        </w:rPr>
+        <w:t>(</w:t>
+      </w:r>
+      <w:r>
+        <w:rPr>
+          <w:rFonts w:ascii="Consolas" w:eastAsia="Times New Roman" w:hAnsi="Consolas" w:cs="Times New Roman"/>
+          <w:color w:val="4EC9B0"/>
+          <w:sz w:val="21"/>
+          <w:szCs w:val="21"/>
+        </w:rPr>
+        <w:t>String</w:t>
+      </w:r>
+      <w:r>
+        <w:rPr>
+          <w:rFonts w:ascii="Consolas" w:eastAsia="Times New Roman" w:hAnsi="Consolas" w:cs="Times New Roman"/>
+          <w:color w:val="BBBEBF"/>
+          <w:sz w:val="21"/>
+          <w:szCs w:val="21"/>
+        </w:rPr>
+        <w:t xml:space="preserve"> </w:t>
+      </w:r>
+      <w:r>
+        <w:rPr>
+          <w:rFonts w:ascii="Consolas" w:eastAsia="Times New Roman" w:hAnsi="Consolas" w:cs="Times New Roman"/>
+          <w:color w:val="FFA657"/>
+          <w:sz w:val="21"/>
+          <w:szCs w:val="21"/>
+        </w:rPr>
+        <w:t>message</w:t>
+      </w:r>
+      <w:r>
+        <w:rPr>
+          <w:rFonts w:ascii="Consolas" w:eastAsia="Times New Roman" w:hAnsi="Consolas" w:cs="Times New Roman"/>
+          <w:color w:val="BBBEBF"/>
+          <w:sz w:val="21"/>
+          <w:szCs w:val="21"/>
+        </w:rPr>
+        <w:t>) {</w:t>
+      </w:r>
+    </w:p>
+    <w:p>
+      <w:pPr>
+        <w:shd w:val="clear" w:color="auto" w:fill="121314"/>
+        <w:spacing w:after="0" w:line="285" w:lineRule="atLeast"/>
+        <w:rPr>
+          <w:rFonts w:ascii="Consolas" w:eastAsia="Times New Roman" w:hAnsi="Consolas" w:cs="Times New Roman"/>
+          <w:color w:val="BBBEBF"/>
+          <w:sz w:val="21"/>
+          <w:szCs w:val="21"/>
+        </w:rPr>
+      </w:pPr>
+      <w:r>
+        <w:rPr>
+          <w:rFonts w:ascii="Consolas" w:eastAsia="Times New Roman" w:hAnsi="Consolas" w:cs="Times New Roman"/>
+          <w:color w:val="BBBEBF"/>
+          <w:sz w:val="21"/>
+          <w:szCs w:val="21"/>
+        </w:rPr>
+        <w:t xml:space="preserve">        </w:t>
+      </w:r>
+      <w:r>
+        <w:rPr>
+          <w:rFonts w:ascii="Consolas" w:eastAsia="Times New Roman" w:hAnsi="Consolas" w:cs="Times New Roman"/>
+          <w:color w:val="79C0FF"/>
+          <w:sz w:val="21"/>
+          <w:szCs w:val="21"/>
+        </w:rPr>
+        <w:t>super</w:t>
+      </w:r>
+      <w:r>
+        <w:rPr>
+          <w:rFonts w:ascii="Consolas" w:eastAsia="Times New Roman" w:hAnsi="Consolas" w:cs="Times New Roman"/>
+          <w:color w:val="BBBEBF"/>
+          <w:sz w:val="21"/>
+          <w:szCs w:val="21"/>
+        </w:rPr>
+        <w:t>(</w:t>
+      </w:r>
+      <w:r>
+        <w:rPr>
+          <w:rFonts w:ascii="Consolas" w:eastAsia="Times New Roman" w:hAnsi="Consolas" w:cs="Times New Roman"/>
+          <w:color w:val="FFA657"/>
+          <w:sz w:val="21"/>
+          <w:szCs w:val="21"/>
+        </w:rPr>
+        <w:t>message</w:t>
+      </w:r>
+      <w:r>
+        <w:rPr>
+          <w:rFonts w:ascii="Consolas" w:eastAsia="Times New Roman" w:hAnsi="Consolas" w:cs="Times New Roman"/>
+          <w:color w:val="BBBEBF"/>
+          <w:sz w:val="21"/>
+          <w:szCs w:val="21"/>
+        </w:rPr>
+        <w:t>);</w:t>
+      </w:r>
+    </w:p>
+    <w:p>
+      <w:pPr>
+        <w:shd w:val="clear" w:color="auto" w:fill="121314"/>
+        <w:spacing w:after="0" w:line="285" w:lineRule="atLeast"/>
+        <w:rPr>
+          <w:rFonts w:ascii="Consolas" w:eastAsia="Times New Roman" w:hAnsi="Consolas" w:cs="Times New Roman"/>
+          <w:color w:val="BBBEBF"/>
+          <w:sz w:val="21"/>
+          <w:szCs w:val="21"/>
+        </w:rPr>
+      </w:pPr>
+      <w:r>
+        <w:rPr>
+          <w:rFonts w:ascii="Consolas" w:eastAsia="Times New Roman" w:hAnsi="Consolas" w:cs="Times New Roman"/>
+          <w:color w:val="BBBEBF"/>
+          <w:sz w:val="21"/>
+          <w:szCs w:val="21"/>
+        </w:rPr>
+        <w:t>    }</w:t>
+      </w:r>
+    </w:p>
+    <w:p>
+      <w:pPr>
+        <w:shd w:val="clear" w:color="auto" w:fill="121314"/>
+        <w:spacing w:after="0" w:line="285" w:lineRule="atLeast"/>
+        <w:rPr>
+          <w:rFonts w:ascii="Consolas" w:eastAsia="Times New Roman" w:hAnsi="Consolas" w:cs="Times New Roman"/>
+          <w:color w:val="BBBEBF"/>
+          <w:sz w:val="21"/>
+          <w:szCs w:val="21"/>
+        </w:rPr>
+      </w:pPr>
+      <w:r>
+        <w:rPr>
+          <w:rFonts w:ascii="Consolas" w:eastAsia="Times New Roman" w:hAnsi="Consolas" w:cs="Times New Roman"/>
+          <w:color w:val="BBBEBF"/>
+          <w:sz w:val="21"/>
+          <w:szCs w:val="21"/>
+        </w:rPr>
+        <w:t>}</w:t>
+      </w:r>
+    </w:p>
+    <w:p>
+      <w:pPr>
+        <w:shd w:val="clear" w:color="auto" w:fill="121314"/>
+        <w:spacing w:after="0" w:line="285" w:lineRule="atLeast"/>
+        <w:rPr>
+          <w:rFonts w:ascii="Consolas" w:eastAsia="Times New Roman" w:hAnsi="Consolas" w:cs="Times New Roman"/>
+          <w:color w:val="BBBEBF"/>
+          <w:sz w:val="21"/>
+          <w:szCs w:val="21"/>
+        </w:rPr>
+      </w:pPr>
+    </w:p>
+    <w:p>
+      <w:pPr>
+        <w:shd w:val="clear" w:color="auto" w:fill="121314"/>
+        <w:spacing w:after="0" w:line="285" w:lineRule="atLeast"/>
+        <w:rPr>
+          <w:rFonts w:ascii="Consolas" w:eastAsia="Times New Roman" w:hAnsi="Consolas" w:cs="Times New Roman"/>
+          <w:color w:val="BBBEBF"/>
+          <w:sz w:val="21"/>
+          <w:szCs w:val="21"/>
+        </w:rPr>
+      </w:pPr>
+      <w:r>
+        <w:rPr>
+          <w:rFonts w:ascii="Consolas" w:eastAsia="Times New Roman" w:hAnsi="Consolas" w:cs="Times New Roman"/>
+          <w:color w:val="569CD6"/>
+          <w:sz w:val="21"/>
+          <w:szCs w:val="21"/>
+        </w:rPr>
+        <w:t>public</w:t>
+      </w:r>
+      <w:r>
+        <w:rPr>
+          <w:rFonts w:ascii="Consolas" w:eastAsia="Times New Roman" w:hAnsi="Consolas" w:cs="Times New Roman"/>
+          <w:color w:val="BBBEBF"/>
+          <w:sz w:val="21"/>
+          <w:szCs w:val="21"/>
+        </w:rPr>
+        <w:t xml:space="preserve"> </w:t>
+      </w:r>
+      <w:r>
+        <w:rPr>
+          <w:rFonts w:ascii="Consolas" w:eastAsia="Times New Roman" w:hAnsi="Consolas" w:cs="Times New Roman"/>
+          <w:color w:val="569CD6"/>
+          <w:sz w:val="21"/>
+          <w:szCs w:val="21"/>
+        </w:rPr>
+        <w:t>class</w:t>
+      </w:r>
+      <w:r>
+        <w:rPr>
+          <w:rFonts w:ascii="Consolas" w:eastAsia="Times New Roman" w:hAnsi="Consolas" w:cs="Times New Roman"/>
+          <w:color w:val="BBBEBF"/>
+          <w:sz w:val="21"/>
+          <w:szCs w:val="21"/>
+        </w:rPr>
+        <w:t xml:space="preserve"> </w:t>
+      </w:r>
+      <w:r>
+        <w:rPr>
+          <w:rFonts w:ascii="Consolas" w:eastAsia="Times New Roman" w:hAnsi="Consolas" w:cs="Times New Roman"/>
+          <w:color w:val="4EC9B0"/>
+          <w:sz w:val="21"/>
+          <w:szCs w:val="21"/>
+        </w:rPr>
+        <w:t>Exercise3InvalidAge</w:t>
+      </w:r>
+      <w:r>
+        <w:rPr>
+          <w:rFonts w:ascii="Consolas" w:eastAsia="Times New Roman" w:hAnsi="Consolas" w:cs="Times New Roman"/>
+          <w:color w:val="BBBEBF"/>
+          <w:sz w:val="21"/>
+          <w:szCs w:val="21"/>
+        </w:rPr>
+        <w:t xml:space="preserve"> {</w:t>
+      </w:r>
+    </w:p>
+    <w:p>
+      <w:pPr>
+        <w:shd w:val="clear" w:color="auto" w:fill="121314"/>
+        <w:spacing w:after="0" w:line="285" w:lineRule="atLeast"/>
+        <w:rPr>
+          <w:rFonts w:ascii="Consolas" w:eastAsia="Times New Roman" w:hAnsi="Consolas" w:cs="Times New Roman"/>
+          <w:color w:val="BBBEBF"/>
+          <w:sz w:val="21"/>
+          <w:szCs w:val="21"/>
+        </w:rPr>
+      </w:pPr>
+      <w:r>
+        <w:rPr>
+          <w:rFonts w:ascii="Consolas" w:eastAsia="Times New Roman" w:hAnsi="Consolas" w:cs="Times New Roman"/>
+          <w:color w:val="BBBEBF"/>
+          <w:sz w:val="21"/>
+          <w:szCs w:val="21"/>
+        </w:rPr>
+        <w:t xml:space="preserve">    </w:t>
+      </w:r>
+      <w:r>
+        <w:rPr>
+          <w:rFonts w:ascii="Consolas" w:eastAsia="Times New Roman" w:hAnsi="Consolas" w:cs="Times New Roman"/>
+          <w:color w:val="569CD6"/>
+          <w:sz w:val="21"/>
+          <w:szCs w:val="21"/>
+        </w:rPr>
+        <w:t>static</w:t>
+      </w:r>
+      <w:r>
+        <w:rPr>
+          <w:rFonts w:ascii="Consolas" w:eastAsia="Times New Roman" w:hAnsi="Consolas" w:cs="Times New Roman"/>
+          <w:color w:val="BBBEBF"/>
+          <w:sz w:val="21"/>
+          <w:szCs w:val="21"/>
+        </w:rPr>
+        <w:t xml:space="preserve"> </w:t>
+      </w:r>
+      <w:r>
+        <w:rPr>
+          <w:rFonts w:ascii="Consolas" w:eastAsia="Times New Roman" w:hAnsi="Consolas" w:cs="Times New Roman"/>
+          <w:color w:val="4EC9B0"/>
+          <w:sz w:val="21"/>
+          <w:szCs w:val="21"/>
+        </w:rPr>
+        <w:t>void</w:t>
+      </w:r>
+      <w:r>
+        <w:rPr>
+          <w:rFonts w:ascii="Consolas" w:eastAsia="Times New Roman" w:hAnsi="Consolas" w:cs="Times New Roman"/>
+          <w:color w:val="BBBEBF"/>
+          <w:sz w:val="21"/>
+          <w:szCs w:val="21"/>
+        </w:rPr>
+        <w:t xml:space="preserve"> </w:t>
+      </w:r>
+      <w:proofErr w:type="spellStart"/>
+      <w:r>
+        <w:rPr>
+          <w:rFonts w:ascii="Consolas" w:eastAsia="Times New Roman" w:hAnsi="Consolas" w:cs="Times New Roman"/>
+          <w:color w:val="D2A8FF"/>
+          <w:sz w:val="21"/>
+          <w:szCs w:val="21"/>
+        </w:rPr>
+        <w:t>validateAge</w:t>
+      </w:r>
+      <w:proofErr w:type="spellEnd"/>
+      <w:r>
+        <w:rPr>
+          <w:rFonts w:ascii="Consolas" w:eastAsia="Times New Roman" w:hAnsi="Consolas" w:cs="Times New Roman"/>
+          <w:color w:val="BBBEBF"/>
+          <w:sz w:val="21"/>
+          <w:szCs w:val="21"/>
+        </w:rPr>
+        <w:t>(</w:t>
+      </w:r>
+      <w:r>
+        <w:rPr>
+          <w:rFonts w:ascii="Consolas" w:eastAsia="Times New Roman" w:hAnsi="Consolas" w:cs="Times New Roman"/>
+          <w:color w:val="4EC9B0"/>
+          <w:sz w:val="21"/>
+          <w:szCs w:val="21"/>
+        </w:rPr>
+        <w:t>int</w:t>
+      </w:r>
+      <w:r>
+        <w:rPr>
+          <w:rFonts w:ascii="Consolas" w:eastAsia="Times New Roman" w:hAnsi="Consolas" w:cs="Times New Roman"/>
+          <w:color w:val="BBBEBF"/>
+          <w:sz w:val="21"/>
+          <w:szCs w:val="21"/>
+        </w:rPr>
+        <w:t xml:space="preserve"> </w:t>
+      </w:r>
+      <w:r>
+        <w:rPr>
+          <w:rFonts w:ascii="Consolas" w:eastAsia="Times New Roman" w:hAnsi="Consolas" w:cs="Times New Roman"/>
+          <w:color w:val="FFA657"/>
+          <w:sz w:val="21"/>
+          <w:szCs w:val="21"/>
+        </w:rPr>
+        <w:t>age</w:t>
+      </w:r>
+      <w:r>
+        <w:rPr>
+          <w:rFonts w:ascii="Consolas" w:eastAsia="Times New Roman" w:hAnsi="Consolas" w:cs="Times New Roman"/>
+          <w:color w:val="BBBEBF"/>
+          <w:sz w:val="21"/>
+          <w:szCs w:val="21"/>
+        </w:rPr>
+        <w:t xml:space="preserve">) </w:t>
+      </w:r>
+      <w:r>
+        <w:rPr>
+          <w:rFonts w:ascii="Consolas" w:eastAsia="Times New Roman" w:hAnsi="Consolas" w:cs="Times New Roman"/>
+          <w:color w:val="569CD6"/>
+          <w:sz w:val="21"/>
+          <w:szCs w:val="21"/>
+        </w:rPr>
+        <w:t>throws</w:t>
+      </w:r>
+      <w:r>
+        <w:rPr>
+          <w:rFonts w:ascii="Consolas" w:eastAsia="Times New Roman" w:hAnsi="Consolas" w:cs="Times New Roman"/>
+          <w:color w:val="BBBEBF"/>
+          <w:sz w:val="21"/>
+          <w:szCs w:val="21"/>
+        </w:rPr>
+        <w:t xml:space="preserve"> </w:t>
+      </w:r>
+      <w:proofErr w:type="spellStart"/>
+      <w:r>
+        <w:rPr>
+          <w:rFonts w:ascii="Consolas" w:eastAsia="Times New Roman" w:hAnsi="Consolas" w:cs="Times New Roman"/>
+          <w:color w:val="4EC9B0"/>
+          <w:sz w:val="21"/>
+          <w:szCs w:val="21"/>
+        </w:rPr>
+        <w:t>InvalidAgeException</w:t>
+      </w:r>
+      <w:proofErr w:type="spellEnd"/>
+      <w:r>
+        <w:rPr>
+          <w:rFonts w:ascii="Consolas" w:eastAsia="Times New Roman" w:hAnsi="Consolas" w:cs="Times New Roman"/>
+          <w:color w:val="BBBEBF"/>
+          <w:sz w:val="21"/>
+          <w:szCs w:val="21"/>
+        </w:rPr>
+        <w:t xml:space="preserve"> {</w:t>
+      </w:r>
+    </w:p>
+    <w:p>
+      <w:pPr>
+        <w:shd w:val="clear" w:color="auto" w:fill="121314"/>
+        <w:spacing w:after="0" w:line="285" w:lineRule="atLeast"/>
+        <w:rPr>
+          <w:rFonts w:ascii="Consolas" w:eastAsia="Times New Roman" w:hAnsi="Consolas" w:cs="Times New Roman"/>
+          <w:color w:val="BBBEBF"/>
+          <w:sz w:val="21"/>
+          <w:szCs w:val="21"/>
+        </w:rPr>
+      </w:pPr>
+      <w:r>
+        <w:rPr>
+          <w:rFonts w:ascii="Consolas" w:eastAsia="Times New Roman" w:hAnsi="Consolas" w:cs="Times New Roman"/>
+          <w:color w:val="BBBEBF"/>
+          <w:sz w:val="21"/>
+          <w:szCs w:val="21"/>
+        </w:rPr>
+        <w:t xml:space="preserve">        </w:t>
+      </w:r>
+      <w:r>
+        <w:rPr>
+          <w:rFonts w:ascii="Consolas" w:eastAsia="Times New Roman" w:hAnsi="Consolas" w:cs="Times New Roman"/>
+          <w:color w:val="8B949E"/>
+          <w:sz w:val="21"/>
+          <w:szCs w:val="21"/>
+        </w:rPr>
+        <w:t>// Check if the age is within the valid range</w:t>
+      </w:r>
+    </w:p>
+    <w:p>
+      <w:pPr>
+        <w:shd w:val="clear" w:color="auto" w:fill="121314"/>
+        <w:spacing w:after="0" w:line="285" w:lineRule="atLeast"/>
+        <w:rPr>
+          <w:rFonts w:ascii="Consolas" w:eastAsia="Times New Roman" w:hAnsi="Consolas" w:cs="Times New Roman"/>
+          <w:color w:val="BBBEBF"/>
+          <w:sz w:val="21"/>
+          <w:szCs w:val="21"/>
+        </w:rPr>
+      </w:pPr>
+      <w:r>
+        <w:rPr>
+          <w:rFonts w:ascii="Consolas" w:eastAsia="Times New Roman" w:hAnsi="Consolas" w:cs="Times New Roman"/>
+          <w:color w:val="BBBEBF"/>
+          <w:sz w:val="21"/>
+          <w:szCs w:val="21"/>
+        </w:rPr>
+        <w:t xml:space="preserve">        </w:t>
+      </w:r>
+      <w:r>
+        <w:rPr>
+          <w:rFonts w:ascii="Consolas" w:eastAsia="Times New Roman" w:hAnsi="Consolas" w:cs="Times New Roman"/>
+          <w:color w:val="C586C0"/>
+          <w:sz w:val="21"/>
+          <w:szCs w:val="21"/>
+        </w:rPr>
+        <w:t>if</w:t>
+      </w:r>
+      <w:r>
+        <w:rPr>
+          <w:rFonts w:ascii="Consolas" w:eastAsia="Times New Roman" w:hAnsi="Consolas" w:cs="Times New Roman"/>
+          <w:color w:val="BBBEBF"/>
+          <w:sz w:val="21"/>
+          <w:szCs w:val="21"/>
+        </w:rPr>
+        <w:t xml:space="preserve"> (</w:t>
+      </w:r>
+      <w:r>
+        <w:rPr>
+          <w:rFonts w:ascii="Consolas" w:eastAsia="Times New Roman" w:hAnsi="Consolas" w:cs="Times New Roman"/>
+          <w:color w:val="FFA657"/>
+          <w:sz w:val="21"/>
+          <w:szCs w:val="21"/>
+        </w:rPr>
+        <w:t>age</w:t>
+      </w:r>
+      <w:r>
+        <w:rPr>
+          <w:rFonts w:ascii="Consolas" w:eastAsia="Times New Roman" w:hAnsi="Consolas" w:cs="Times New Roman"/>
+          <w:color w:val="BBBEBF"/>
+          <w:sz w:val="21"/>
+          <w:szCs w:val="21"/>
+        </w:rPr>
+        <w:t xml:space="preserve"> </w:t>
+      </w:r>
+      <w:r>
+        <w:rPr>
+          <w:rFonts w:ascii="Consolas" w:eastAsia="Times New Roman" w:hAnsi="Consolas" w:cs="Times New Roman"/>
+          <w:color w:val="D4D4D4"/>
+          <w:sz w:val="21"/>
+          <w:szCs w:val="21"/>
+        </w:rPr>
+        <w:t>&lt;</w:t>
+      </w:r>
+      <w:r>
+        <w:rPr>
+          <w:rFonts w:ascii="Consolas" w:eastAsia="Times New Roman" w:hAnsi="Consolas" w:cs="Times New Roman"/>
+          <w:color w:val="BBBEBF"/>
+          <w:sz w:val="21"/>
+          <w:szCs w:val="21"/>
+        </w:rPr>
+        <w:t xml:space="preserve"> </w:t>
+      </w:r>
+      <w:r>
+        <w:rPr>
+          <w:rFonts w:ascii="Consolas" w:eastAsia="Times New Roman" w:hAnsi="Consolas" w:cs="Times New Roman"/>
+          <w:color w:val="B5CEA8"/>
+          <w:sz w:val="21"/>
+          <w:szCs w:val="21"/>
+        </w:rPr>
+        <w:t>0</w:t>
+      </w:r>
+      <w:r>
+        <w:rPr>
+          <w:rFonts w:ascii="Consolas" w:eastAsia="Times New Roman" w:hAnsi="Consolas" w:cs="Times New Roman"/>
+          <w:color w:val="BBBEBF"/>
+          <w:sz w:val="21"/>
+          <w:szCs w:val="21"/>
+        </w:rPr>
+        <w:t xml:space="preserve"> </w:t>
+      </w:r>
+      <w:r>
+        <w:rPr>
+          <w:rFonts w:ascii="Consolas" w:eastAsia="Times New Roman" w:hAnsi="Consolas" w:cs="Times New Roman"/>
+          <w:color w:val="D4D4D4"/>
+          <w:sz w:val="21"/>
+          <w:szCs w:val="21"/>
+        </w:rPr>
+        <w:t>||</w:t>
+      </w:r>
+      <w:r>
+        <w:rPr>
+          <w:rFonts w:ascii="Consolas" w:eastAsia="Times New Roman" w:hAnsi="Consolas" w:cs="Times New Roman"/>
+          <w:color w:val="BBBEBF"/>
+          <w:sz w:val="21"/>
+          <w:szCs w:val="21"/>
+        </w:rPr>
+        <w:t xml:space="preserve"> </w:t>
+      </w:r>
+      <w:r>
+        <w:rPr>
+          <w:rFonts w:ascii="Consolas" w:eastAsia="Times New Roman" w:hAnsi="Consolas" w:cs="Times New Roman"/>
+          <w:color w:val="FFA657"/>
+          <w:sz w:val="21"/>
+          <w:szCs w:val="21"/>
+        </w:rPr>
+        <w:t>age</w:t>
+      </w:r>
+      <w:r>
+        <w:rPr>
+          <w:rFonts w:ascii="Consolas" w:eastAsia="Times New Roman" w:hAnsi="Consolas" w:cs="Times New Roman"/>
+          <w:color w:val="BBBEBF"/>
+          <w:sz w:val="21"/>
+          <w:szCs w:val="21"/>
+        </w:rPr>
+        <w:t xml:space="preserve"> </w:t>
+      </w:r>
+      <w:r>
+        <w:rPr>
+          <w:rFonts w:ascii="Consolas" w:eastAsia="Times New Roman" w:hAnsi="Consolas" w:cs="Times New Roman"/>
+          <w:color w:val="D4D4D4"/>
+          <w:sz w:val="21"/>
+          <w:szCs w:val="21"/>
+        </w:rPr>
+        <w:t>&gt;</w:t>
+      </w:r>
+      <w:r>
+        <w:rPr>
+          <w:rFonts w:ascii="Consolas" w:eastAsia="Times New Roman" w:hAnsi="Consolas" w:cs="Times New Roman"/>
+          <w:color w:val="BBBEBF"/>
+          <w:sz w:val="21"/>
+          <w:szCs w:val="21"/>
+        </w:rPr>
+        <w:t xml:space="preserve"> </w:t>
+      </w:r>
+      <w:r>
+        <w:rPr>
+          <w:rFonts w:ascii="Consolas" w:eastAsia="Times New Roman" w:hAnsi="Consolas" w:cs="Times New Roman"/>
+          <w:color w:val="B5CEA8"/>
+          <w:sz w:val="21"/>
+          <w:szCs w:val="21"/>
+        </w:rPr>
+        <w:t>120</w:t>
+      </w:r>
+      <w:r>
+        <w:rPr>
+          <w:rFonts w:ascii="Consolas" w:eastAsia="Times New Roman" w:hAnsi="Consolas" w:cs="Times New Roman"/>
+          <w:color w:val="BBBEBF"/>
+          <w:sz w:val="21"/>
+          <w:szCs w:val="21"/>
+        </w:rPr>
+        <w:t>) {</w:t>
+      </w:r>
+    </w:p>
+    <w:p>
+      <w:pPr>
+        <w:shd w:val="clear" w:color="auto" w:fill="121314"/>
+        <w:spacing w:after="0" w:line="285" w:lineRule="atLeast"/>
+        <w:rPr>
+          <w:rFonts w:ascii="Consolas" w:eastAsia="Times New Roman" w:hAnsi="Consolas" w:cs="Times New Roman"/>
+          <w:color w:val="BBBEBF"/>
+          <w:sz w:val="21"/>
+          <w:szCs w:val="21"/>
+        </w:rPr>
+      </w:pPr>
+      <w:r>
+        <w:rPr>
+          <w:rFonts w:ascii="Consolas" w:eastAsia="Times New Roman" w:hAnsi="Consolas" w:cs="Times New Roman"/>
+          <w:color w:val="BBBEBF"/>
+          <w:sz w:val="21"/>
+          <w:szCs w:val="21"/>
+        </w:rPr>
+        <w:t xml:space="preserve">            </w:t>
+      </w:r>
+      <w:r>
+        <w:rPr>
+          <w:rFonts w:ascii="Consolas" w:eastAsia="Times New Roman" w:hAnsi="Consolas" w:cs="Times New Roman"/>
+          <w:color w:val="C586C0"/>
+          <w:sz w:val="21"/>
+          <w:szCs w:val="21"/>
+        </w:rPr>
+        <w:t>throw</w:t>
+      </w:r>
+      <w:r>
+        <w:rPr>
+          <w:rFonts w:ascii="Consolas" w:eastAsia="Times New Roman" w:hAnsi="Consolas" w:cs="Times New Roman"/>
+          <w:color w:val="BBBEBF"/>
+          <w:sz w:val="21"/>
+          <w:szCs w:val="21"/>
+        </w:rPr>
+        <w:t xml:space="preserve"> </w:t>
+      </w:r>
+      <w:r>
+        <w:rPr>
+          <w:rFonts w:ascii="Consolas" w:eastAsia="Times New Roman" w:hAnsi="Consolas" w:cs="Times New Roman"/>
+          <w:color w:val="C586C0"/>
+          <w:sz w:val="21"/>
+          <w:szCs w:val="21"/>
+        </w:rPr>
+        <w:t>new</w:t>
+      </w:r>
+      <w:r>
+        <w:rPr>
+          <w:rFonts w:ascii="Consolas" w:eastAsia="Times New Roman" w:hAnsi="Consolas" w:cs="Times New Roman"/>
+          <w:color w:val="BBBEBF"/>
+          <w:sz w:val="21"/>
+          <w:szCs w:val="21"/>
+        </w:rPr>
+        <w:t xml:space="preserve"> </w:t>
+      </w:r>
+      <w:proofErr w:type="spellStart"/>
+      <w:r>
+        <w:rPr>
+          <w:rFonts w:ascii="Consolas" w:eastAsia="Times New Roman" w:hAnsi="Consolas" w:cs="Times New Roman"/>
+          <w:color w:val="D2A8FF"/>
+          <w:sz w:val="21"/>
+          <w:szCs w:val="21"/>
+        </w:rPr>
+        <w:t>InvalidAgeException</w:t>
+      </w:r>
+      <w:proofErr w:type="spellEnd"/>
+      <w:r>
+        <w:rPr>
+          <w:rFonts w:ascii="Consolas" w:eastAsia="Times New Roman" w:hAnsi="Consolas" w:cs="Times New Roman"/>
+          <w:color w:val="BBBEBF"/>
+          <w:sz w:val="21"/>
+          <w:szCs w:val="21"/>
+        </w:rPr>
+        <w:t>(</w:t>
+      </w:r>
+      <w:r>
+        <w:rPr>
+          <w:rFonts w:ascii="Consolas" w:eastAsia="Times New Roman" w:hAnsi="Consolas" w:cs="Times New Roman"/>
+          <w:color w:val="A5D6FF"/>
+          <w:sz w:val="21"/>
+          <w:szCs w:val="21"/>
+        </w:rPr>
+        <w:t>"Age must be between 0 and 120"</w:t>
+      </w:r>
+      <w:r>
+        <w:rPr>
+          <w:rFonts w:ascii="Consolas" w:eastAsia="Times New Roman" w:hAnsi="Consolas" w:cs="Times New Roman"/>
+          <w:color w:val="BBBEBF"/>
+          <w:sz w:val="21"/>
+          <w:szCs w:val="21"/>
+        </w:rPr>
+        <w:t>);</w:t>
+      </w:r>
+    </w:p>
+    <w:p>
+      <w:pPr>
+        <w:shd w:val="clear" w:color="auto" w:fill="121314"/>
+        <w:spacing w:after="0" w:line="285" w:lineRule="atLeast"/>
+        <w:rPr>
+          <w:rFonts w:ascii="Consolas" w:eastAsia="Times New Roman" w:hAnsi="Consolas" w:cs="Times New Roman"/>
+          <w:color w:val="BBBEBF"/>
+          <w:sz w:val="21"/>
+          <w:szCs w:val="21"/>
+        </w:rPr>
+      </w:pPr>
+      <w:r>
+        <w:rPr>
+          <w:rFonts w:ascii="Consolas" w:eastAsia="Times New Roman" w:hAnsi="Consolas" w:cs="Times New Roman"/>
+          <w:color w:val="BBBEBF"/>
+          <w:sz w:val="21"/>
+          <w:szCs w:val="21"/>
+        </w:rPr>
+        <w:lastRenderedPageBreak/>
+        <w:t>        }</w:t>
+      </w:r>
+    </w:p>
+    <w:p>
+      <w:pPr>
+        <w:shd w:val="clear" w:color="auto" w:fill="121314"/>
+        <w:spacing w:after="0" w:line="285" w:lineRule="atLeast"/>
+        <w:rPr>
+          <w:rFonts w:ascii="Consolas" w:eastAsia="Times New Roman" w:hAnsi="Consolas" w:cs="Times New Roman"/>
+          <w:color w:val="BBBEBF"/>
+          <w:sz w:val="21"/>
+          <w:szCs w:val="21"/>
+        </w:rPr>
+      </w:pPr>
+      <w:r>
+        <w:rPr>
+          <w:rFonts w:ascii="Consolas" w:eastAsia="Times New Roman" w:hAnsi="Consolas" w:cs="Times New Roman"/>
+          <w:color w:val="BBBEBF"/>
+          <w:sz w:val="21"/>
+          <w:szCs w:val="21"/>
+        </w:rPr>
+        <w:t>    }</w:t>
+      </w:r>
+    </w:p>
+    <w:p>
+      <w:pPr>
+        <w:shd w:val="clear" w:color="auto" w:fill="121314"/>
+        <w:spacing w:after="0" w:line="285" w:lineRule="atLeast"/>
+        <w:rPr>
+          <w:rFonts w:ascii="Consolas" w:eastAsia="Times New Roman" w:hAnsi="Consolas" w:cs="Times New Roman"/>
+          <w:color w:val="BBBEBF"/>
+          <w:sz w:val="21"/>
+          <w:szCs w:val="21"/>
+        </w:rPr>
+      </w:pPr>
+    </w:p>
+    <w:p>
+      <w:pPr>
+        <w:shd w:val="clear" w:color="auto" w:fill="121314"/>
+        <w:spacing w:after="0" w:line="285" w:lineRule="atLeast"/>
+        <w:rPr>
+          <w:rFonts w:ascii="Consolas" w:eastAsia="Times New Roman" w:hAnsi="Consolas" w:cs="Times New Roman"/>
+          <w:color w:val="BBBEBF"/>
+          <w:sz w:val="21"/>
+          <w:szCs w:val="21"/>
+        </w:rPr>
+      </w:pPr>
+      <w:r>
+        <w:rPr>
+          <w:rFonts w:ascii="Consolas" w:eastAsia="Times New Roman" w:hAnsi="Consolas" w:cs="Times New Roman"/>
+          <w:color w:val="BBBEBF"/>
+          <w:sz w:val="21"/>
+          <w:szCs w:val="21"/>
+        </w:rPr>
+        <w:t xml:space="preserve">    </w:t>
+      </w:r>
+      <w:r>
+        <w:rPr>
+          <w:rFonts w:ascii="Consolas" w:eastAsia="Times New Roman" w:hAnsi="Consolas" w:cs="Times New Roman"/>
+          <w:color w:val="569CD6"/>
+          <w:sz w:val="21"/>
+          <w:szCs w:val="21"/>
+        </w:rPr>
+        <w:t>public</w:t>
+      </w:r>
+      <w:r>
+        <w:rPr>
+          <w:rFonts w:ascii="Consolas" w:eastAsia="Times New Roman" w:hAnsi="Consolas" w:cs="Times New Roman"/>
+          <w:color w:val="BBBEBF"/>
+          <w:sz w:val="21"/>
+          <w:szCs w:val="21"/>
+        </w:rPr>
+        <w:t xml:space="preserve"> </w:t>
+      </w:r>
+      <w:r>
+        <w:rPr>
+          <w:rFonts w:ascii="Consolas" w:eastAsia="Times New Roman" w:hAnsi="Consolas" w:cs="Times New Roman"/>
+          <w:color w:val="569CD6"/>
+          <w:sz w:val="21"/>
+          <w:szCs w:val="21"/>
+        </w:rPr>
+        <w:t>static</w:t>
+      </w:r>
+      <w:r>
+        <w:rPr>
+          <w:rFonts w:ascii="Consolas" w:eastAsia="Times New Roman" w:hAnsi="Consolas" w:cs="Times New Roman"/>
+          <w:color w:val="BBBEBF"/>
+          <w:sz w:val="21"/>
+          <w:szCs w:val="21"/>
+        </w:rPr>
+        <w:t xml:space="preserve"> </w:t>
+      </w:r>
+      <w:r>
+        <w:rPr>
+          <w:rFonts w:ascii="Consolas" w:eastAsia="Times New Roman" w:hAnsi="Consolas" w:cs="Times New Roman"/>
+          <w:color w:val="4EC9B0"/>
+          <w:sz w:val="21"/>
+          <w:szCs w:val="21"/>
+        </w:rPr>
+        <w:t>void</w:t>
+      </w:r>
+      <w:r>
+        <w:rPr>
+          <w:rFonts w:ascii="Consolas" w:eastAsia="Times New Roman" w:hAnsi="Consolas" w:cs="Times New Roman"/>
+          <w:color w:val="BBBEBF"/>
+          <w:sz w:val="21"/>
+          <w:szCs w:val="21"/>
+        </w:rPr>
+        <w:t xml:space="preserve"> </w:t>
+      </w:r>
+      <w:r>
+        <w:rPr>
+          <w:rFonts w:ascii="Consolas" w:eastAsia="Times New Roman" w:hAnsi="Consolas" w:cs="Times New Roman"/>
+          <w:color w:val="D2A8FF"/>
+          <w:sz w:val="21"/>
+          <w:szCs w:val="21"/>
+        </w:rPr>
+        <w:t>main</w:t>
+      </w:r>
+      <w:r>
+        <w:rPr>
+          <w:rFonts w:ascii="Consolas" w:eastAsia="Times New Roman" w:hAnsi="Consolas" w:cs="Times New Roman"/>
+          <w:color w:val="BBBEBF"/>
+          <w:sz w:val="21"/>
+          <w:szCs w:val="21"/>
+        </w:rPr>
+        <w:t>(</w:t>
+      </w:r>
+      <w:r>
+        <w:rPr>
+          <w:rFonts w:ascii="Consolas" w:eastAsia="Times New Roman" w:hAnsi="Consolas" w:cs="Times New Roman"/>
+          <w:color w:val="4EC9B0"/>
+          <w:sz w:val="21"/>
+          <w:szCs w:val="21"/>
+        </w:rPr>
+        <w:t>String</w:t>
+      </w:r>
+      <w:r>
+        <w:rPr>
+          <w:rFonts w:ascii="Consolas" w:eastAsia="Times New Roman" w:hAnsi="Consolas" w:cs="Times New Roman"/>
+          <w:color w:val="BBBEBF"/>
+          <w:sz w:val="21"/>
+          <w:szCs w:val="21"/>
+        </w:rPr>
+        <w:t xml:space="preserve">[] </w:t>
+      </w:r>
+      <w:proofErr w:type="spellStart"/>
+      <w:r>
+        <w:rPr>
+          <w:rFonts w:ascii="Consolas" w:eastAsia="Times New Roman" w:hAnsi="Consolas" w:cs="Times New Roman"/>
+          <w:color w:val="FFA657"/>
+          <w:sz w:val="21"/>
+          <w:szCs w:val="21"/>
+        </w:rPr>
+        <w:t>args</w:t>
+      </w:r>
+      <w:proofErr w:type="spellEnd"/>
+      <w:r>
+        <w:rPr>
+          <w:rFonts w:ascii="Consolas" w:eastAsia="Times New Roman" w:hAnsi="Consolas" w:cs="Times New Roman"/>
+          <w:color w:val="BBBEBF"/>
+          <w:sz w:val="21"/>
+          <w:szCs w:val="21"/>
+        </w:rPr>
+        <w:t>) {</w:t>
+      </w:r>
+    </w:p>
+    <w:p>
+      <w:pPr>
+        <w:shd w:val="clear" w:color="auto" w:fill="121314"/>
+        <w:spacing w:after="0" w:line="285" w:lineRule="atLeast"/>
+        <w:rPr>
+          <w:rFonts w:ascii="Consolas" w:eastAsia="Times New Roman" w:hAnsi="Consolas" w:cs="Times New Roman"/>
+          <w:color w:val="BBBEBF"/>
+          <w:sz w:val="21"/>
+          <w:szCs w:val="21"/>
+        </w:rPr>
+      </w:pPr>
+      <w:r>
+        <w:rPr>
+          <w:rFonts w:ascii="Consolas" w:eastAsia="Times New Roman" w:hAnsi="Consolas" w:cs="Times New Roman"/>
+          <w:color w:val="BBBEBF"/>
+          <w:sz w:val="21"/>
+          <w:szCs w:val="21"/>
+        </w:rPr>
+        <w:t xml:space="preserve">        </w:t>
+      </w:r>
+      <w:r>
+        <w:rPr>
+          <w:rFonts w:ascii="Consolas" w:eastAsia="Times New Roman" w:hAnsi="Consolas" w:cs="Times New Roman"/>
+          <w:color w:val="C586C0"/>
+          <w:sz w:val="21"/>
+          <w:szCs w:val="21"/>
+        </w:rPr>
+        <w:t>try</w:t>
+      </w:r>
+      <w:r>
+        <w:rPr>
+          <w:rFonts w:ascii="Consolas" w:eastAsia="Times New Roman" w:hAnsi="Consolas" w:cs="Times New Roman"/>
+          <w:color w:val="BBBEBF"/>
+          <w:sz w:val="21"/>
+          <w:szCs w:val="21"/>
+        </w:rPr>
+        <w:t xml:space="preserve"> {</w:t>
+      </w:r>
+    </w:p>
+    <w:p>
+      <w:pPr>
+        <w:shd w:val="clear" w:color="auto" w:fill="121314"/>
+        <w:spacing w:after="0" w:line="285" w:lineRule="atLeast"/>
+        <w:rPr>
+          <w:rFonts w:ascii="Consolas" w:eastAsia="Times New Roman" w:hAnsi="Consolas" w:cs="Times New Roman"/>
+          <w:color w:val="BBBEBF"/>
+          <w:sz w:val="21"/>
+          <w:szCs w:val="21"/>
+        </w:rPr>
+      </w:pPr>
+      <w:r>
+        <w:rPr>
+          <w:rFonts w:ascii="Consolas" w:eastAsia="Times New Roman" w:hAnsi="Consolas" w:cs="Times New Roman"/>
+          <w:color w:val="BBBEBF"/>
+          <w:sz w:val="21"/>
+          <w:szCs w:val="21"/>
+        </w:rPr>
+        <w:t xml:space="preserve">            </w:t>
+      </w:r>
+      <w:proofErr w:type="spellStart"/>
+      <w:r>
+        <w:rPr>
+          <w:rFonts w:ascii="Consolas" w:eastAsia="Times New Roman" w:hAnsi="Consolas" w:cs="Times New Roman"/>
+          <w:color w:val="D2A8FF"/>
+          <w:sz w:val="21"/>
+          <w:szCs w:val="21"/>
+        </w:rPr>
+        <w:t>validateAge</w:t>
+      </w:r>
+      <w:proofErr w:type="spellEnd"/>
+      <w:r>
+        <w:rPr>
+          <w:rFonts w:ascii="Consolas" w:eastAsia="Times New Roman" w:hAnsi="Consolas" w:cs="Times New Roman"/>
+          <w:color w:val="BBBEBF"/>
+          <w:sz w:val="21"/>
+          <w:szCs w:val="21"/>
+        </w:rPr>
+        <w:t>(</w:t>
+      </w:r>
+      <w:r>
+        <w:rPr>
+          <w:rFonts w:ascii="Consolas" w:eastAsia="Times New Roman" w:hAnsi="Consolas" w:cs="Times New Roman"/>
+          <w:color w:val="B5CEA8"/>
+          <w:sz w:val="21"/>
+          <w:szCs w:val="21"/>
+        </w:rPr>
+        <w:t>150</w:t>
+      </w:r>
+      <w:r>
+        <w:rPr>
+          <w:rFonts w:ascii="Consolas" w:eastAsia="Times New Roman" w:hAnsi="Consolas" w:cs="Times New Roman"/>
+          <w:color w:val="BBBEBF"/>
+          <w:sz w:val="21"/>
+          <w:szCs w:val="21"/>
+        </w:rPr>
+        <w:t>);</w:t>
+      </w:r>
+    </w:p>
+    <w:p>
+      <w:pPr>
+        <w:shd w:val="clear" w:color="auto" w:fill="121314"/>
+        <w:spacing w:after="0" w:line="285" w:lineRule="atLeast"/>
+        <w:rPr>
+          <w:rFonts w:ascii="Consolas" w:eastAsia="Times New Roman" w:hAnsi="Consolas" w:cs="Times New Roman"/>
+          <w:color w:val="BBBEBF"/>
+          <w:sz w:val="21"/>
+          <w:szCs w:val="21"/>
+        </w:rPr>
+      </w:pPr>
+      <w:r>
+        <w:rPr>
+          <w:rFonts w:ascii="Consolas" w:eastAsia="Times New Roman" w:hAnsi="Consolas" w:cs="Times New Roman"/>
+          <w:color w:val="BBBEBF"/>
+          <w:sz w:val="21"/>
+          <w:szCs w:val="21"/>
+        </w:rPr>
+        <w:t xml:space="preserve">        } </w:t>
+      </w:r>
+      <w:r>
+        <w:rPr>
+          <w:rFonts w:ascii="Consolas" w:eastAsia="Times New Roman" w:hAnsi="Consolas" w:cs="Times New Roman"/>
+          <w:color w:val="C586C0"/>
+          <w:sz w:val="21"/>
+          <w:szCs w:val="21"/>
+        </w:rPr>
+        <w:t>catch</w:t>
+      </w:r>
+      <w:r>
+        <w:rPr>
+          <w:rFonts w:ascii="Consolas" w:eastAsia="Times New Roman" w:hAnsi="Consolas" w:cs="Times New Roman"/>
+          <w:color w:val="BBBEBF"/>
+          <w:sz w:val="21"/>
+          <w:szCs w:val="21"/>
+        </w:rPr>
+        <w:t xml:space="preserve"> (</w:t>
+      </w:r>
+      <w:proofErr w:type="spellStart"/>
+      <w:r>
+        <w:rPr>
+          <w:rFonts w:ascii="Consolas" w:eastAsia="Times New Roman" w:hAnsi="Consolas" w:cs="Times New Roman"/>
+          <w:color w:val="4EC9B0"/>
+          <w:sz w:val="21"/>
+          <w:szCs w:val="21"/>
+        </w:rPr>
+        <w:t>InvalidAgeException</w:t>
+      </w:r>
+      <w:proofErr w:type="spellEnd"/>
+      <w:r>
+        <w:rPr>
+          <w:rFonts w:ascii="Consolas" w:eastAsia="Times New Roman" w:hAnsi="Consolas" w:cs="Times New Roman"/>
+          <w:color w:val="BBBEBF"/>
+          <w:sz w:val="21"/>
+          <w:szCs w:val="21"/>
+        </w:rPr>
+        <w:t xml:space="preserve"> </w:t>
+      </w:r>
+      <w:r>
+        <w:rPr>
+          <w:rFonts w:ascii="Consolas" w:eastAsia="Times New Roman" w:hAnsi="Consolas" w:cs="Times New Roman"/>
+          <w:color w:val="C9D1D9"/>
+          <w:sz w:val="21"/>
+          <w:szCs w:val="21"/>
+        </w:rPr>
+        <w:t>e</w:t>
+      </w:r>
+      <w:r>
+        <w:rPr>
+          <w:rFonts w:ascii="Consolas" w:eastAsia="Times New Roman" w:hAnsi="Consolas" w:cs="Times New Roman"/>
+          <w:color w:val="BBBEBF"/>
+          <w:sz w:val="21"/>
+          <w:szCs w:val="21"/>
+        </w:rPr>
+        <w:t>) {</w:t>
+      </w:r>
+    </w:p>
+    <w:p>
+      <w:pPr>
+        <w:shd w:val="clear" w:color="auto" w:fill="121314"/>
+        <w:spacing w:after="0" w:line="285" w:lineRule="atLeast"/>
+        <w:rPr>
+          <w:rFonts w:ascii="Consolas" w:eastAsia="Times New Roman" w:hAnsi="Consolas" w:cs="Times New Roman"/>
+          <w:color w:val="BBBEBF"/>
+          <w:sz w:val="21"/>
+          <w:szCs w:val="21"/>
+        </w:rPr>
+      </w:pPr>
+      <w:r>
+        <w:rPr>
+          <w:rFonts w:ascii="Consolas" w:eastAsia="Times New Roman" w:hAnsi="Consolas" w:cs="Times New Roman"/>
+          <w:color w:val="BBBEBF"/>
+          <w:sz w:val="21"/>
+          <w:szCs w:val="21"/>
+        </w:rPr>
+        <w:t xml:space="preserve">            </w:t>
+      </w:r>
+      <w:r>
+        <w:rPr>
+          <w:rFonts w:ascii="Consolas" w:eastAsia="Times New Roman" w:hAnsi="Consolas" w:cs="Times New Roman"/>
+          <w:color w:val="8B949E"/>
+          <w:sz w:val="21"/>
+          <w:szCs w:val="21"/>
+        </w:rPr>
+        <w:t>// The custom exception carries the validation message.</w:t>
+      </w:r>
+    </w:p>
+    <w:p>
+      <w:pPr>
+        <w:shd w:val="clear" w:color="auto" w:fill="121314"/>
+        <w:spacing w:after="0" w:line="285" w:lineRule="atLeast"/>
+        <w:rPr>
+          <w:rFonts w:ascii="Consolas" w:eastAsia="Times New Roman" w:hAnsi="Consolas" w:cs="Times New Roman"/>
+          <w:color w:val="BBBEBF"/>
+          <w:sz w:val="21"/>
+          <w:szCs w:val="21"/>
+        </w:rPr>
+      </w:pPr>
+      <w:r>
+        <w:rPr>
+          <w:rFonts w:ascii="Consolas" w:eastAsia="Times New Roman" w:hAnsi="Consolas" w:cs="Times New Roman"/>
+          <w:color w:val="BBBEBF"/>
+          <w:sz w:val="21"/>
+          <w:szCs w:val="21"/>
+        </w:rPr>
+        <w:t xml:space="preserve">            </w:t>
+      </w:r>
+      <w:proofErr w:type="spellStart"/>
+      <w:r>
+        <w:rPr>
+          <w:rFonts w:ascii="Consolas" w:eastAsia="Times New Roman" w:hAnsi="Consolas" w:cs="Times New Roman"/>
+          <w:color w:val="4EC9B0"/>
+          <w:sz w:val="21"/>
+          <w:szCs w:val="21"/>
+        </w:rPr>
+        <w:t>System</w:t>
+      </w:r>
+      <w:r>
+        <w:rPr>
+          <w:rFonts w:ascii="Consolas" w:eastAsia="Times New Roman" w:hAnsi="Consolas" w:cs="Times New Roman"/>
+          <w:color w:val="BBBEBF"/>
+          <w:sz w:val="21"/>
+          <w:szCs w:val="21"/>
+        </w:rPr>
+        <w:t>.</w:t>
+      </w:r>
+      <w:r>
+        <w:rPr>
+          <w:rFonts w:ascii="Consolas" w:eastAsia="Times New Roman" w:hAnsi="Consolas" w:cs="Times New Roman"/>
+          <w:color w:val="79C0FF"/>
+          <w:sz w:val="21"/>
+          <w:szCs w:val="21"/>
+        </w:rPr>
+        <w:t>out</w:t>
+      </w:r>
+      <w:r>
+        <w:rPr>
+          <w:rFonts w:ascii="Consolas" w:eastAsia="Times New Roman" w:hAnsi="Consolas" w:cs="Times New Roman"/>
+          <w:color w:val="BBBEBF"/>
+          <w:sz w:val="21"/>
+          <w:szCs w:val="21"/>
+        </w:rPr>
+        <w:t>.</w:t>
+      </w:r>
+      <w:r>
+        <w:rPr>
+          <w:rFonts w:ascii="Consolas" w:eastAsia="Times New Roman" w:hAnsi="Consolas" w:cs="Times New Roman"/>
+          <w:color w:val="D2A8FF"/>
+          <w:sz w:val="21"/>
+          <w:szCs w:val="21"/>
+        </w:rPr>
+        <w:t>println</w:t>
+      </w:r>
+      <w:proofErr w:type="spellEnd"/>
+      <w:r>
+        <w:rPr>
+          <w:rFonts w:ascii="Consolas" w:eastAsia="Times New Roman" w:hAnsi="Consolas" w:cs="Times New Roman"/>
+          <w:color w:val="BBBEBF"/>
+          <w:sz w:val="21"/>
+          <w:szCs w:val="21"/>
+        </w:rPr>
+        <w:t>(</w:t>
+      </w:r>
+      <w:proofErr w:type="spellStart"/>
+      <w:r>
+        <w:rPr>
+          <w:rFonts w:ascii="Consolas" w:eastAsia="Times New Roman" w:hAnsi="Consolas" w:cs="Times New Roman"/>
+          <w:color w:val="C9D1D9"/>
+          <w:sz w:val="21"/>
+          <w:szCs w:val="21"/>
+        </w:rPr>
+        <w:t>e</w:t>
+      </w:r>
+      <w:r>
+        <w:rPr>
+          <w:rFonts w:ascii="Consolas" w:eastAsia="Times New Roman" w:hAnsi="Consolas" w:cs="Times New Roman"/>
+          <w:color w:val="BBBEBF"/>
+          <w:sz w:val="21"/>
+          <w:szCs w:val="21"/>
+        </w:rPr>
+        <w:t>.</w:t>
+      </w:r>
+      <w:r>
+        <w:rPr>
+          <w:rFonts w:ascii="Consolas" w:eastAsia="Times New Roman" w:hAnsi="Consolas" w:cs="Times New Roman"/>
+          <w:color w:val="D2A8FF"/>
+          <w:sz w:val="21"/>
+          <w:szCs w:val="21"/>
+        </w:rPr>
+        <w:t>getMessage</w:t>
+      </w:r>
+      <w:proofErr w:type="spellEnd"/>
+      <w:r>
+        <w:rPr>
+          <w:rFonts w:ascii="Consolas" w:eastAsia="Times New Roman" w:hAnsi="Consolas" w:cs="Times New Roman"/>
+          <w:color w:val="BBBEBF"/>
+          <w:sz w:val="21"/>
+          <w:szCs w:val="21"/>
+        </w:rPr>
+        <w:t>());</w:t>
+      </w:r>
+    </w:p>
+    <w:p>
+      <w:pPr>
+        <w:shd w:val="clear" w:color="auto" w:fill="121314"/>
+        <w:spacing w:after="0" w:line="285" w:lineRule="atLeast"/>
+        <w:rPr>
+          <w:rFonts w:ascii="Consolas" w:eastAsia="Times New Roman" w:hAnsi="Consolas" w:cs="Times New Roman"/>
+          <w:color w:val="BBBEBF"/>
+          <w:sz w:val="21"/>
+          <w:szCs w:val="21"/>
+        </w:rPr>
+      </w:pPr>
+      <w:r>
+        <w:rPr>
+          <w:rFonts w:ascii="Consolas" w:eastAsia="Times New Roman" w:hAnsi="Consolas" w:cs="Times New Roman"/>
+          <w:color w:val="BBBEBF"/>
+          <w:sz w:val="21"/>
+          <w:szCs w:val="21"/>
+        </w:rPr>
+        <w:t>        }</w:t>
+      </w:r>
+    </w:p>
+    <w:p>
+      <w:pPr>
+        <w:shd w:val="clear" w:color="auto" w:fill="121314"/>
+        <w:spacing w:after="0" w:line="285" w:lineRule="atLeast"/>
+        <w:rPr>
+          <w:rFonts w:ascii="Consolas" w:eastAsia="Times New Roman" w:hAnsi="Consolas" w:cs="Times New Roman"/>
+          <w:color w:val="BBBEBF"/>
+          <w:sz w:val="21"/>
+          <w:szCs w:val="21"/>
+        </w:rPr>
+      </w:pPr>
+      <w:r>
+        <w:rPr>
+          <w:rFonts w:ascii="Consolas" w:eastAsia="Times New Roman" w:hAnsi="Consolas" w:cs="Times New Roman"/>
+          <w:color w:val="BBBEBF"/>
+          <w:sz w:val="21"/>
+          <w:szCs w:val="21"/>
+        </w:rPr>
+        <w:t>    }</w:t>
+      </w:r>
+    </w:p>
+    <w:p>
+      <w:pPr>
+        <w:shd w:val="clear" w:color="auto" w:fill="121314"/>
+        <w:spacing w:after="0" w:line="285" w:lineRule="atLeast"/>
+        <w:rPr>
+          <w:rFonts w:ascii="Consolas" w:eastAsia="Times New Roman" w:hAnsi="Consolas" w:cs="Times New Roman"/>
+          <w:color w:val="BBBEBF"/>
+          <w:sz w:val="21"/>
+          <w:szCs w:val="21"/>
+        </w:rPr>
+      </w:pPr>
+      <w:r>
+        <w:rPr>
+          <w:rFonts w:ascii="Consolas" w:eastAsia="Times New Roman" w:hAnsi="Consolas" w:cs="Times New Roman"/>
+          <w:color w:val="BBBEBF"/>
+          <w:sz w:val="21"/>
+          <w:szCs w:val="21"/>
+        </w:rPr>
+        <w:t>}</w:t>
+      </w:r>
+    </w:p>
+    <w:p>
+      <w:pPr>
+        <w:shd w:val="clear" w:color="auto" w:fill="121314"/>
+        <w:spacing w:after="0" w:line="285" w:lineRule="atLeast"/>
+        <w:rPr>
+          <w:rFonts w:ascii="Consolas" w:eastAsia="Times New Roman" w:hAnsi="Consolas" w:cs="Times New Roman"/>
+          <w:color w:val="BBBEBF"/>
+          <w:sz w:val="21"/>
+          <w:szCs w:val="21"/>
+        </w:rPr>
+      </w:pPr>
+    </w:p>
+    <w:p>
+      <w:r>
+        <w:t>Expected output (sample):</w:t>
+      </w:r>
+    </w:p>
+    <w:p>
       <w:r>
         <w:rPr>
           <w:rFonts w:ascii="Consolas" w:hAnsi="Consolas"/>
           <w:sz w:val="16"/>
         </w:rPr>
-        <w:t>public class Exercise3InvalidAge {</w:t>
+        <w:drawing>
+          <wp:inline distT="0" distB="0" distL="0" distR="0" wp14:anchorId="39E4D8D6" wp14:editId="04F18562">
+            <wp:extent cx="5486400" cy="923290"/>
+            <wp:effectExtent l="0" t="0" r="0" b="0"/>
+            <wp:docPr id="130878726" name="Picture 1"/>
+            <wp:cNvGraphicFramePr>
+              <a:graphicFrameLocks xmlns:a="http://schemas.openxmlformats.org/drawingml/2006/main" noChangeAspect="1"/>
+            </wp:cNvGraphicFramePr>
+            <a:graphic xmlns:a="http://schemas.openxmlformats.org/drawingml/2006/main">
+              <a:graphicData uri="http://schemas.openxmlformats.org/drawingml/2006/picture">
+                <pic:pic xmlns:pic="http://schemas.openxmlformats.org/drawingml/2006/picture">
+                  <pic:nvPicPr>
+                    <pic:cNvPr id="130878726" name=""/>
+                    <pic:cNvPicPr/>
+                  </pic:nvPicPr>
+                  <pic:blipFill>
+                    <a:blip r:embed="rId8"/>
+                    <a:stretch>
+                      <a:fillRect/>
+                    </a:stretch>
+                  </pic:blipFill>
+                  <pic:spPr>
+                    <a:xfrm>
+                      <a:off x="0" y="0"/>
+                      <a:ext cx="5486400" cy="923290"/>
+                    </a:xfrm>
+                    <a:prstGeom prst="rect">
+                      <a:avLst/>
+                    </a:prstGeom>
+                  </pic:spPr>
+                </pic:pic>
+              </a:graphicData>
+            </a:graphic>
+          </wp:inline>
+        </w:drawing>
+      </w:r>
+      <w:r>
+        <w:t>Explanation: Extending Exception creates a checked exception. The method declares throws and the caller catches it.</w:t>
       </w:r>
     </w:p>
     <w:p>
       <w:pPr>
+        <w:pStyle w:val="Heading1"/>
+      </w:pPr>
+      <w:r>
+        <w:t>Exercise 4</w:t>
+      </w:r>
+    </w:p>
+    <w:p>
+      <w:r>
+        <w:t>Question: Make withdraw throw InsufficientFundsException rather than return false.</w:t>
+      </w:r>
+    </w:p>
+    <w:p>
+      <w:r>
+        <w:t>Java source code:</w:t>
+      </w:r>
+    </w:p>
+    <w:p>
+      <w:pPr>
         <w:spacing w:after="0"/>
       </w:pPr>
       <w:r>
@@ -2928,7 +4347,7 @@
           <w:rFonts w:ascii="Consolas" w:hAnsi="Consolas"/>
           <w:sz w:val="16"/>
         </w:rPr>
-        <w:t xml:space="preserve">    static class InvalidAgeException extends Exception { InvalidAgeException(String message){super(message);} }</w:t>
+        <w:t>public class Exercise4WithdrawException {</w:t>
       </w:r>
     </w:p>
     <w:p>
@@ -2940,7 +4359,7 @@
           <w:rFonts w:ascii="Consolas" w:hAnsi="Consolas"/>
           <w:sz w:val="16"/>
         </w:rPr>
-        <w:t xml:space="preserve">    static void validateAge(int age) throws InvalidAgeException { if(age&lt;0 || age&gt;120) throw new InvalidAgeException("Age must be between 0 and 120"); }</w:t>
+        <w:t xml:space="preserve">    static class InsufficientFundsException extends Exception { InsufficientFundsException(String message){super(message);} }</w:t>
       </w:r>
     </w:p>
     <w:p>
@@ -2952,7 +4371,7 @@
           <w:rFonts w:ascii="Consolas" w:hAnsi="Consolas"/>
           <w:sz w:val="16"/>
         </w:rPr>
-        <w:t xml:space="preserve">    public static void main(String[] args) { try { validateAge(150); } catch(InvalidAgeException e) { System.out.println(e.getMessage()); } }</w:t>
+        <w:t xml:space="preserve">    static class BankAccount { double balance; BankAccount(double b){balance=b;} void withdraw(double amount) throws InsufficientFundsException { if(amount&gt;balance) throw new InsufficientFundsException("Insufficient funds"); balance-=amount; } }</w:t>
       </w:r>
     </w:p>
     <w:p>
@@ -2964,15 +4383,27 @@
           <w:rFonts w:ascii="Consolas" w:hAnsi="Consolas"/>
           <w:sz w:val="16"/>
         </w:rPr>
-        <w:t>}</w:t>
+        <w:t xml:space="preserve">    public static void main(String[] args) { BankAccount a=new BankAccount(100); try { a.withdraw(150); } catch(InsufficientFundsException e) { System.out.println(e.getMessage()); } System.out.println("Balance: "+a.balance); }</w:t>
       </w:r>
     </w:p>
     <w:p>
-      <w:r>
-        <w:t>Expected output (sample):</w:t>
+      <w:pPr>
+        <w:spacing w:after="0"/>
+      </w:pPr>
+      <w:r>
+        <w:rPr>
+          <w:rFonts w:ascii="Consolas" w:hAnsi="Consolas"/>
+          <w:sz w:val="16"/>
+        </w:rPr>
+        <w:t>}</w:t>
       </w:r>
     </w:p>
     <w:p>
+      <w:r>
+        <w:t>Expected output (sample):</w:t>
+      </w:r>
+    </w:p>
+    <w:p>
       <w:pPr>
         <w:spacing w:after="0"/>
       </w:pPr>
@@ -2981,34 +4412,45 @@
           <w:rFonts w:ascii="Consolas" w:hAnsi="Consolas"/>
           <w:sz w:val="16"/>
         </w:rPr>
-        <w:t>Age must be between 0 and 120</w:t>
+        <w:t>Insufficient funds</w:t>
       </w:r>
     </w:p>
     <w:p>
-      <w:r>
-        <w:t>Explanation: Extending Exception creates a checked exception. The method declares throws and the caller catches it.</w:t>
+      <w:pPr>
+        <w:spacing w:after="0"/>
+      </w:pPr>
+      <w:r>
+        <w:rPr>
+          <w:rFonts w:ascii="Consolas" w:hAnsi="Consolas"/>
+          <w:sz w:val="16"/>
+        </w:rPr>
+        <w:t>Balance: 100.0</w:t>
       </w:r>
     </w:p>
     <w:p>
-      <w:pPr>
-        <w:pStyle w:val="Heading1"/>
-      </w:pPr>
-      <w:r>
-        <w:lastRenderedPageBreak/>
-        <w:t>Exercise 4</w:t>
+      <w:r>
+        <w:t>Explanation: An exception gives the caller a clear reason for failure. A boolean return is simpler but carries less detail.</w:t>
       </w:r>
     </w:p>
     <w:p>
-      <w:r>
-        <w:t>Question: Make withdraw throw InsufficientFundsException rather than return false.</w:t>
+      <w:pPr>
+        <w:pStyle w:val="Heading1"/>
+      </w:pPr>
+      <w:r>
+        <w:t>Exercise 5</w:t>
       </w:r>
     </w:p>
     <w:p>
       <w:r>
-        <w:t>Java source code:</w:t>
+        <w:t>Question: Predict a return in try with a print statement in finally.</w:t>
       </w:r>
     </w:p>
     <w:p>
+      <w:r>
+        <w:t>Java source code:</w:t>
+      </w:r>
+    </w:p>
+    <w:p>
       <w:pPr>
         <w:spacing w:after="0"/>
       </w:pPr>
@@ -3017,7 +4459,7 @@
           <w:rFonts w:ascii="Consolas" w:hAnsi="Consolas"/>
           <w:sz w:val="16"/>
         </w:rPr>
-        <w:t>public class Exercise4WithdrawException {</w:t>
+        <w:t>public class Exercise5FinallyReturn {</w:t>
       </w:r>
     </w:p>
     <w:p>
@@ -3029,7 +4471,7 @@
           <w:rFonts w:ascii="Consolas" w:hAnsi="Consolas"/>
           <w:sz w:val="16"/>
         </w:rPr>
-        <w:t xml:space="preserve">    static class InsufficientFundsException extends Exception { InsufficientFundsException(String message){super(message);} }</w:t>
+        <w:t xml:space="preserve">    static int example() { try { System.out.println("Inside try"); return 5; } finally { System.out.println("Inside finally"); } }</w:t>
       </w:r>
     </w:p>
     <w:p>
@@ -3041,118 +4483,7 @@
           <w:rFonts w:ascii="Consolas" w:hAnsi="Consolas"/>
           <w:sz w:val="16"/>
         </w:rPr>
-        <w:t xml:space="preserve">    static class BankAccount { double balance; BankAccount(double b){balance=b;} void withdraw(double amount) throws InsufficientFundsException { if(amount&gt;balance) throw new InsufficientFundsException("Insufficient funds"); balance-=amount; } }</w:t>
-      </w:r>
-    </w:p>
-    <w:p>
-      <w:pPr>
-        <w:spacing w:after="0"/>
-      </w:pPr>
-      <w:r>
-        <w:rPr>
-          <w:rFonts w:ascii="Consolas" w:hAnsi="Consolas"/>
-          <w:sz w:val="16"/>
-        </w:rPr>
-        <w:t xml:space="preserve">    public static void main(String[] args) { BankAccount a=new BankAccount(100); try { a.withdraw(150); } catch(InsufficientFundsException e) { System.out.println(e.getMessage()); } System.out.println("Balance: "+a.balance); }</w:t>
-      </w:r>
-    </w:p>
-    <w:p>
-      <w:pPr>
-        <w:spacing w:after="0"/>
-      </w:pPr>
-      <w:r>
-        <w:rPr>
-          <w:rFonts w:ascii="Consolas" w:hAnsi="Consolas"/>
-          <w:sz w:val="16"/>
-        </w:rPr>
-        <w:t>}</w:t>
-      </w:r>
-    </w:p>
-    <w:p>
-      <w:r>
-        <w:t>Expected output (sample):</w:t>
-      </w:r>
-    </w:p>
-    <w:p>
-      <w:pPr>
-        <w:spacing w:after="0"/>
-      </w:pPr>
-      <w:r>
-        <w:rPr>
-          <w:rFonts w:ascii="Consolas" w:hAnsi="Consolas"/>
-          <w:sz w:val="16"/>
-        </w:rPr>
-        <w:t>Insufficient funds</w:t>
-      </w:r>
-    </w:p>
-    <w:p>
-      <w:pPr>
-        <w:spacing w:after="0"/>
-      </w:pPr>
-      <w:r>
-        <w:rPr>
-          <w:rFonts w:ascii="Consolas" w:hAnsi="Consolas"/>
-          <w:sz w:val="16"/>
-        </w:rPr>
-        <w:t>Balance: 100.0</w:t>
-      </w:r>
-    </w:p>
-    <w:p>
-      <w:r>
-        <w:t>Explanation: An exception gives the caller a clear reason for failure. A boolean return is simpler but carries less detail.</w:t>
-      </w:r>
-    </w:p>
-    <w:p>
-      <w:pPr>
-        <w:pStyle w:val="Heading1"/>
-      </w:pPr>
-      <w:r>
-        <w:t>Exercise 5</w:t>
-      </w:r>
-    </w:p>
-    <w:p>
-      <w:r>
-        <w:t>Question: Predict a return in try with a print statement in finally.</w:t>
-      </w:r>
-    </w:p>
-    <w:p>
-      <w:r>
-        <w:t>Java source code:</w:t>
-      </w:r>
-    </w:p>
-    <w:p>
-      <w:pPr>
-        <w:spacing w:after="0"/>
-      </w:pPr>
-      <w:r>
-        <w:rPr>
-          <w:rFonts w:ascii="Consolas" w:hAnsi="Consolas"/>
-          <w:sz w:val="16"/>
-        </w:rPr>
-        <w:t>public class Exercise5FinallyReturn {</w:t>
-      </w:r>
-    </w:p>
-    <w:p>
-      <w:pPr>
-        <w:spacing w:after="0"/>
-      </w:pPr>
-      <w:r>
-        <w:rPr>
-          <w:rFonts w:ascii="Consolas" w:hAnsi="Consolas"/>
-          <w:sz w:val="16"/>
-        </w:rPr>
-        <w:t xml:space="preserve">    static int example() { try { System.out.println("Inside try"); return 5; } finally { System.out.println("Inside finally"); } }</w:t>
-      </w:r>
-    </w:p>
-    <w:p>
-      <w:pPr>
-        <w:spacing w:after="0"/>
-      </w:pPr>
-      <w:r>
-        <w:rPr>
-          <w:rFonts w:ascii="Consolas" w:hAnsi="Consolas"/>
-          <w:sz w:val="16"/>
-        </w:rPr>
+        <w:lastRenderedPageBreak/>
         <w:t xml:space="preserve">    public static void main(String[] args) { System.out.println("Returned: "+example()); }</w:t>
       </w:r>
     </w:p>

</xml_diff>

<commit_message>
refactor: enhance withdrawal logic and exception handling in Exercise4WithdrawException
</commit_message>
<xml_diff>
--- a/Lab_07/LAB Exercises report  (7).docx
+++ b/Lab_07/LAB Exercises report  (7).docx
@@ -4340,18 +4340,2066 @@
     </w:p>
     <w:p>
       <w:pPr>
-        <w:spacing w:after="0"/>
-      </w:pPr>
+        <w:shd w:val="clear" w:color="auto" w:fill="121314"/>
+        <w:spacing w:after="0" w:line="285" w:lineRule="atLeast"/>
+        <w:rPr>
+          <w:rFonts w:ascii="Consolas" w:eastAsia="Times New Roman" w:hAnsi="Consolas" w:cs="Times New Roman"/>
+          <w:color w:val="BBBEBF"/>
+          <w:sz w:val="21"/>
+          <w:szCs w:val="21"/>
+        </w:rPr>
+      </w:pPr>
+      <w:r>
+        <w:rPr>
+          <w:rFonts w:ascii="Consolas" w:eastAsia="Times New Roman" w:hAnsi="Consolas" w:cs="Times New Roman"/>
+          <w:color w:val="569CD6"/>
+          <w:sz w:val="21"/>
+          <w:szCs w:val="21"/>
+        </w:rPr>
+        <w:t>class</w:t>
+      </w:r>
+      <w:r>
+        <w:rPr>
+          <w:rFonts w:ascii="Consolas" w:eastAsia="Times New Roman" w:hAnsi="Consolas" w:cs="Times New Roman"/>
+          <w:color w:val="BBBEBF"/>
+          <w:sz w:val="21"/>
+          <w:szCs w:val="21"/>
+        </w:rPr>
+        <w:t xml:space="preserve"> </w:t>
+      </w:r>
+      <w:proofErr w:type="spellStart"/>
+      <w:r>
+        <w:rPr>
+          <w:rFonts w:ascii="Consolas" w:eastAsia="Times New Roman" w:hAnsi="Consolas" w:cs="Times New Roman"/>
+          <w:color w:val="4EC9B0"/>
+          <w:sz w:val="21"/>
+          <w:szCs w:val="21"/>
+        </w:rPr>
+        <w:t>InsufficientFundsException</w:t>
+      </w:r>
+      <w:proofErr w:type="spellEnd"/>
+      <w:r>
+        <w:rPr>
+          <w:rFonts w:ascii="Consolas" w:eastAsia="Times New Roman" w:hAnsi="Consolas" w:cs="Times New Roman"/>
+          <w:color w:val="BBBEBF"/>
+          <w:sz w:val="21"/>
+          <w:szCs w:val="21"/>
+        </w:rPr>
+        <w:t xml:space="preserve"> </w:t>
+      </w:r>
+      <w:r>
+        <w:rPr>
+          <w:rFonts w:ascii="Consolas" w:eastAsia="Times New Roman" w:hAnsi="Consolas" w:cs="Times New Roman"/>
+          <w:color w:val="569CD6"/>
+          <w:sz w:val="21"/>
+          <w:szCs w:val="21"/>
+        </w:rPr>
+        <w:t>extends</w:t>
+      </w:r>
+      <w:r>
+        <w:rPr>
+          <w:rFonts w:ascii="Consolas" w:eastAsia="Times New Roman" w:hAnsi="Consolas" w:cs="Times New Roman"/>
+          <w:color w:val="BBBEBF"/>
+          <w:sz w:val="21"/>
+          <w:szCs w:val="21"/>
+        </w:rPr>
+        <w:t xml:space="preserve"> </w:t>
+      </w:r>
+      <w:r>
+        <w:rPr>
+          <w:rFonts w:ascii="Consolas" w:eastAsia="Times New Roman" w:hAnsi="Consolas" w:cs="Times New Roman"/>
+          <w:color w:val="4EC9B0"/>
+          <w:sz w:val="21"/>
+          <w:szCs w:val="21"/>
+        </w:rPr>
+        <w:t>Exception</w:t>
+      </w:r>
+      <w:r>
+        <w:rPr>
+          <w:rFonts w:ascii="Consolas" w:eastAsia="Times New Roman" w:hAnsi="Consolas" w:cs="Times New Roman"/>
+          <w:color w:val="BBBEBF"/>
+          <w:sz w:val="21"/>
+          <w:szCs w:val="21"/>
+        </w:rPr>
+        <w:t xml:space="preserve"> {</w:t>
+      </w:r>
+    </w:p>
+    <w:p>
+      <w:pPr>
+        <w:shd w:val="clear" w:color="auto" w:fill="121314"/>
+        <w:spacing w:after="0" w:line="285" w:lineRule="atLeast"/>
+        <w:rPr>
+          <w:rFonts w:ascii="Consolas" w:eastAsia="Times New Roman" w:hAnsi="Consolas" w:cs="Times New Roman"/>
+          <w:color w:val="BBBEBF"/>
+          <w:sz w:val="21"/>
+          <w:szCs w:val="21"/>
+        </w:rPr>
+      </w:pPr>
+      <w:r>
+        <w:rPr>
+          <w:rFonts w:ascii="Consolas" w:eastAsia="Times New Roman" w:hAnsi="Consolas" w:cs="Times New Roman"/>
+          <w:color w:val="BBBEBF"/>
+          <w:sz w:val="21"/>
+          <w:szCs w:val="21"/>
+        </w:rPr>
+        <w:t xml:space="preserve">    </w:t>
+      </w:r>
+      <w:proofErr w:type="spellStart"/>
+      <w:r>
+        <w:rPr>
+          <w:rFonts w:ascii="Consolas" w:eastAsia="Times New Roman" w:hAnsi="Consolas" w:cs="Times New Roman"/>
+          <w:color w:val="D2A8FF"/>
+          <w:sz w:val="21"/>
+          <w:szCs w:val="21"/>
+        </w:rPr>
+        <w:t>InsufficientFundsException</w:t>
+      </w:r>
+      <w:proofErr w:type="spellEnd"/>
+      <w:r>
+        <w:rPr>
+          <w:rFonts w:ascii="Consolas" w:eastAsia="Times New Roman" w:hAnsi="Consolas" w:cs="Times New Roman"/>
+          <w:color w:val="BBBEBF"/>
+          <w:sz w:val="21"/>
+          <w:szCs w:val="21"/>
+        </w:rPr>
+        <w:t>(</w:t>
+      </w:r>
+      <w:r>
+        <w:rPr>
+          <w:rFonts w:ascii="Consolas" w:eastAsia="Times New Roman" w:hAnsi="Consolas" w:cs="Times New Roman"/>
+          <w:color w:val="4EC9B0"/>
+          <w:sz w:val="21"/>
+          <w:szCs w:val="21"/>
+        </w:rPr>
+        <w:t>String</w:t>
+      </w:r>
+      <w:r>
+        <w:rPr>
+          <w:rFonts w:ascii="Consolas" w:eastAsia="Times New Roman" w:hAnsi="Consolas" w:cs="Times New Roman"/>
+          <w:color w:val="BBBEBF"/>
+          <w:sz w:val="21"/>
+          <w:szCs w:val="21"/>
+        </w:rPr>
+        <w:t xml:space="preserve"> </w:t>
+      </w:r>
+      <w:r>
+        <w:rPr>
+          <w:rFonts w:ascii="Consolas" w:eastAsia="Times New Roman" w:hAnsi="Consolas" w:cs="Times New Roman"/>
+          <w:color w:val="FFA657"/>
+          <w:sz w:val="21"/>
+          <w:szCs w:val="21"/>
+        </w:rPr>
+        <w:t>message</w:t>
+      </w:r>
+      <w:r>
+        <w:rPr>
+          <w:rFonts w:ascii="Consolas" w:eastAsia="Times New Roman" w:hAnsi="Consolas" w:cs="Times New Roman"/>
+          <w:color w:val="BBBEBF"/>
+          <w:sz w:val="21"/>
+          <w:szCs w:val="21"/>
+        </w:rPr>
+        <w:t>) {</w:t>
+      </w:r>
+    </w:p>
+    <w:p>
+      <w:pPr>
+        <w:shd w:val="clear" w:color="auto" w:fill="121314"/>
+        <w:spacing w:after="0" w:line="285" w:lineRule="atLeast"/>
+        <w:rPr>
+          <w:rFonts w:ascii="Consolas" w:eastAsia="Times New Roman" w:hAnsi="Consolas" w:cs="Times New Roman"/>
+          <w:color w:val="BBBEBF"/>
+          <w:sz w:val="21"/>
+          <w:szCs w:val="21"/>
+        </w:rPr>
+      </w:pPr>
+      <w:r>
+        <w:rPr>
+          <w:rFonts w:ascii="Consolas" w:eastAsia="Times New Roman" w:hAnsi="Consolas" w:cs="Times New Roman"/>
+          <w:color w:val="BBBEBF"/>
+          <w:sz w:val="21"/>
+          <w:szCs w:val="21"/>
+        </w:rPr>
+        <w:t xml:space="preserve">        </w:t>
+      </w:r>
+      <w:r>
+        <w:rPr>
+          <w:rFonts w:ascii="Consolas" w:eastAsia="Times New Roman" w:hAnsi="Consolas" w:cs="Times New Roman"/>
+          <w:color w:val="79C0FF"/>
+          <w:sz w:val="21"/>
+          <w:szCs w:val="21"/>
+        </w:rPr>
+        <w:t>super</w:t>
+      </w:r>
+      <w:r>
+        <w:rPr>
+          <w:rFonts w:ascii="Consolas" w:eastAsia="Times New Roman" w:hAnsi="Consolas" w:cs="Times New Roman"/>
+          <w:color w:val="BBBEBF"/>
+          <w:sz w:val="21"/>
+          <w:szCs w:val="21"/>
+        </w:rPr>
+        <w:t>(</w:t>
+      </w:r>
+      <w:r>
+        <w:rPr>
+          <w:rFonts w:ascii="Consolas" w:eastAsia="Times New Roman" w:hAnsi="Consolas" w:cs="Times New Roman"/>
+          <w:color w:val="FFA657"/>
+          <w:sz w:val="21"/>
+          <w:szCs w:val="21"/>
+        </w:rPr>
+        <w:t>message</w:t>
+      </w:r>
+      <w:r>
+        <w:rPr>
+          <w:rFonts w:ascii="Consolas" w:eastAsia="Times New Roman" w:hAnsi="Consolas" w:cs="Times New Roman"/>
+          <w:color w:val="BBBEBF"/>
+          <w:sz w:val="21"/>
+          <w:szCs w:val="21"/>
+        </w:rPr>
+        <w:t>);</w:t>
+      </w:r>
+    </w:p>
+    <w:p>
+      <w:pPr>
+        <w:shd w:val="clear" w:color="auto" w:fill="121314"/>
+        <w:spacing w:after="0" w:line="285" w:lineRule="atLeast"/>
+        <w:rPr>
+          <w:rFonts w:ascii="Consolas" w:eastAsia="Times New Roman" w:hAnsi="Consolas" w:cs="Times New Roman"/>
+          <w:color w:val="BBBEBF"/>
+          <w:sz w:val="21"/>
+          <w:szCs w:val="21"/>
+        </w:rPr>
+      </w:pPr>
+      <w:r>
+        <w:rPr>
+          <w:rFonts w:ascii="Consolas" w:eastAsia="Times New Roman" w:hAnsi="Consolas" w:cs="Times New Roman"/>
+          <w:color w:val="BBBEBF"/>
+          <w:sz w:val="21"/>
+          <w:szCs w:val="21"/>
+        </w:rPr>
+        <w:t>    }</w:t>
+      </w:r>
+    </w:p>
+    <w:p>
+      <w:pPr>
+        <w:shd w:val="clear" w:color="auto" w:fill="121314"/>
+        <w:spacing w:after="0" w:line="285" w:lineRule="atLeast"/>
+        <w:rPr>
+          <w:rFonts w:ascii="Consolas" w:eastAsia="Times New Roman" w:hAnsi="Consolas" w:cs="Times New Roman"/>
+          <w:color w:val="BBBEBF"/>
+          <w:sz w:val="21"/>
+          <w:szCs w:val="21"/>
+        </w:rPr>
+      </w:pPr>
+      <w:r>
+        <w:rPr>
+          <w:rFonts w:ascii="Consolas" w:eastAsia="Times New Roman" w:hAnsi="Consolas" w:cs="Times New Roman"/>
+          <w:color w:val="BBBEBF"/>
+          <w:sz w:val="21"/>
+          <w:szCs w:val="21"/>
+        </w:rPr>
+        <w:t>}</w:t>
+      </w:r>
+    </w:p>
+    <w:p>
+      <w:pPr>
+        <w:shd w:val="clear" w:color="auto" w:fill="121314"/>
+        <w:spacing w:after="0" w:line="285" w:lineRule="atLeast"/>
+        <w:rPr>
+          <w:rFonts w:ascii="Consolas" w:eastAsia="Times New Roman" w:hAnsi="Consolas" w:cs="Times New Roman"/>
+          <w:color w:val="BBBEBF"/>
+          <w:sz w:val="21"/>
+          <w:szCs w:val="21"/>
+        </w:rPr>
+      </w:pPr>
+    </w:p>
+    <w:p>
+      <w:pPr>
+        <w:shd w:val="clear" w:color="auto" w:fill="121314"/>
+        <w:spacing w:after="0" w:line="285" w:lineRule="atLeast"/>
+        <w:rPr>
+          <w:rFonts w:ascii="Consolas" w:eastAsia="Times New Roman" w:hAnsi="Consolas" w:cs="Times New Roman"/>
+          <w:color w:val="BBBEBF"/>
+          <w:sz w:val="21"/>
+          <w:szCs w:val="21"/>
+        </w:rPr>
+      </w:pPr>
+      <w:r>
+        <w:rPr>
+          <w:rFonts w:ascii="Consolas" w:eastAsia="Times New Roman" w:hAnsi="Consolas" w:cs="Times New Roman"/>
+          <w:color w:val="569CD6"/>
+          <w:sz w:val="21"/>
+          <w:szCs w:val="21"/>
+        </w:rPr>
+        <w:t>class</w:t>
+      </w:r>
+      <w:r>
+        <w:rPr>
+          <w:rFonts w:ascii="Consolas" w:eastAsia="Times New Roman" w:hAnsi="Consolas" w:cs="Times New Roman"/>
+          <w:color w:val="BBBEBF"/>
+          <w:sz w:val="21"/>
+          <w:szCs w:val="21"/>
+        </w:rPr>
+        <w:t xml:space="preserve"> </w:t>
+      </w:r>
+      <w:proofErr w:type="spellStart"/>
+      <w:r>
+        <w:rPr>
+          <w:rFonts w:ascii="Consolas" w:eastAsia="Times New Roman" w:hAnsi="Consolas" w:cs="Times New Roman"/>
+          <w:color w:val="4EC9B0"/>
+          <w:sz w:val="21"/>
+          <w:szCs w:val="21"/>
+        </w:rPr>
+        <w:t>WithdrawalAccount</w:t>
+      </w:r>
+      <w:proofErr w:type="spellEnd"/>
+      <w:r>
+        <w:rPr>
+          <w:rFonts w:ascii="Consolas" w:eastAsia="Times New Roman" w:hAnsi="Consolas" w:cs="Times New Roman"/>
+          <w:color w:val="BBBEBF"/>
+          <w:sz w:val="21"/>
+          <w:szCs w:val="21"/>
+        </w:rPr>
+        <w:t xml:space="preserve"> {</w:t>
+      </w:r>
+    </w:p>
+    <w:p>
+      <w:pPr>
+        <w:shd w:val="clear" w:color="auto" w:fill="121314"/>
+        <w:spacing w:after="0" w:line="285" w:lineRule="atLeast"/>
+        <w:rPr>
+          <w:rFonts w:ascii="Consolas" w:eastAsia="Times New Roman" w:hAnsi="Consolas" w:cs="Times New Roman"/>
+          <w:color w:val="BBBEBF"/>
+          <w:sz w:val="21"/>
+          <w:szCs w:val="21"/>
+        </w:rPr>
+      </w:pPr>
+      <w:r>
+        <w:rPr>
+          <w:rFonts w:ascii="Consolas" w:eastAsia="Times New Roman" w:hAnsi="Consolas" w:cs="Times New Roman"/>
+          <w:color w:val="BBBEBF"/>
+          <w:sz w:val="21"/>
+          <w:szCs w:val="21"/>
+        </w:rPr>
+        <w:t xml:space="preserve">    </w:t>
+      </w:r>
+      <w:r>
+        <w:rPr>
+          <w:rFonts w:ascii="Consolas" w:eastAsia="Times New Roman" w:hAnsi="Consolas" w:cs="Times New Roman"/>
+          <w:color w:val="4EC9B0"/>
+          <w:sz w:val="21"/>
+          <w:szCs w:val="21"/>
+        </w:rPr>
+        <w:t>double</w:t>
+      </w:r>
+      <w:r>
+        <w:rPr>
+          <w:rFonts w:ascii="Consolas" w:eastAsia="Times New Roman" w:hAnsi="Consolas" w:cs="Times New Roman"/>
+          <w:color w:val="FFA657"/>
+          <w:sz w:val="21"/>
+          <w:szCs w:val="21"/>
+        </w:rPr>
+        <w:t xml:space="preserve"> </w:t>
+      </w:r>
+      <w:r>
+        <w:rPr>
+          <w:rFonts w:ascii="Consolas" w:eastAsia="Times New Roman" w:hAnsi="Consolas" w:cs="Times New Roman"/>
+          <w:color w:val="C9D1D9"/>
+          <w:sz w:val="21"/>
+          <w:szCs w:val="21"/>
+        </w:rPr>
+        <w:t>balance</w:t>
+      </w:r>
+      <w:r>
+        <w:rPr>
+          <w:rFonts w:ascii="Consolas" w:eastAsia="Times New Roman" w:hAnsi="Consolas" w:cs="Times New Roman"/>
+          <w:color w:val="BBBEBF"/>
+          <w:sz w:val="21"/>
+          <w:szCs w:val="21"/>
+        </w:rPr>
+        <w:t>;</w:t>
+      </w:r>
+    </w:p>
+    <w:p>
+      <w:pPr>
+        <w:shd w:val="clear" w:color="auto" w:fill="121314"/>
+        <w:spacing w:after="0" w:line="285" w:lineRule="atLeast"/>
+        <w:rPr>
+          <w:rFonts w:ascii="Consolas" w:eastAsia="Times New Roman" w:hAnsi="Consolas" w:cs="Times New Roman"/>
+          <w:color w:val="BBBEBF"/>
+          <w:sz w:val="21"/>
+          <w:szCs w:val="21"/>
+        </w:rPr>
+      </w:pPr>
+    </w:p>
+    <w:p>
+      <w:pPr>
+        <w:shd w:val="clear" w:color="auto" w:fill="121314"/>
+        <w:spacing w:after="0" w:line="285" w:lineRule="atLeast"/>
+        <w:rPr>
+          <w:rFonts w:ascii="Consolas" w:eastAsia="Times New Roman" w:hAnsi="Consolas" w:cs="Times New Roman"/>
+          <w:color w:val="BBBEBF"/>
+          <w:sz w:val="21"/>
+          <w:szCs w:val="21"/>
+        </w:rPr>
+      </w:pPr>
+      <w:r>
+        <w:rPr>
+          <w:rFonts w:ascii="Consolas" w:eastAsia="Times New Roman" w:hAnsi="Consolas" w:cs="Times New Roman"/>
+          <w:color w:val="BBBEBF"/>
+          <w:sz w:val="21"/>
+          <w:szCs w:val="21"/>
+        </w:rPr>
+        <w:t xml:space="preserve">    </w:t>
+      </w:r>
+      <w:proofErr w:type="spellStart"/>
+      <w:r>
+        <w:rPr>
+          <w:rFonts w:ascii="Consolas" w:eastAsia="Times New Roman" w:hAnsi="Consolas" w:cs="Times New Roman"/>
+          <w:color w:val="D2A8FF"/>
+          <w:sz w:val="21"/>
+          <w:szCs w:val="21"/>
+        </w:rPr>
+        <w:t>WithdrawalAccount</w:t>
+      </w:r>
+      <w:proofErr w:type="spellEnd"/>
+      <w:r>
+        <w:rPr>
+          <w:rFonts w:ascii="Consolas" w:eastAsia="Times New Roman" w:hAnsi="Consolas" w:cs="Times New Roman"/>
+          <w:color w:val="BBBEBF"/>
+          <w:sz w:val="21"/>
+          <w:szCs w:val="21"/>
+        </w:rPr>
+        <w:t>(</w:t>
+      </w:r>
+      <w:r>
+        <w:rPr>
+          <w:rFonts w:ascii="Consolas" w:eastAsia="Times New Roman" w:hAnsi="Consolas" w:cs="Times New Roman"/>
+          <w:color w:val="4EC9B0"/>
+          <w:sz w:val="21"/>
+          <w:szCs w:val="21"/>
+        </w:rPr>
+        <w:t>double</w:t>
+      </w:r>
+      <w:r>
+        <w:rPr>
+          <w:rFonts w:ascii="Consolas" w:eastAsia="Times New Roman" w:hAnsi="Consolas" w:cs="Times New Roman"/>
+          <w:color w:val="BBBEBF"/>
+          <w:sz w:val="21"/>
+          <w:szCs w:val="21"/>
+        </w:rPr>
+        <w:t xml:space="preserve"> </w:t>
+      </w:r>
+      <w:r>
+        <w:rPr>
+          <w:rFonts w:ascii="Consolas" w:eastAsia="Times New Roman" w:hAnsi="Consolas" w:cs="Times New Roman"/>
+          <w:color w:val="FFA657"/>
+          <w:sz w:val="21"/>
+          <w:szCs w:val="21"/>
+        </w:rPr>
+        <w:t>balance</w:t>
+      </w:r>
+      <w:r>
+        <w:rPr>
+          <w:rFonts w:ascii="Consolas" w:eastAsia="Times New Roman" w:hAnsi="Consolas" w:cs="Times New Roman"/>
+          <w:color w:val="BBBEBF"/>
+          <w:sz w:val="21"/>
+          <w:szCs w:val="21"/>
+        </w:rPr>
+        <w:t>) {</w:t>
+      </w:r>
+    </w:p>
+    <w:p>
+      <w:pPr>
+        <w:shd w:val="clear" w:color="auto" w:fill="121314"/>
+        <w:spacing w:after="0" w:line="285" w:lineRule="atLeast"/>
+        <w:rPr>
+          <w:rFonts w:ascii="Consolas" w:eastAsia="Times New Roman" w:hAnsi="Consolas" w:cs="Times New Roman"/>
+          <w:color w:val="BBBEBF"/>
+          <w:sz w:val="21"/>
+          <w:szCs w:val="21"/>
+        </w:rPr>
+      </w:pPr>
+      <w:r>
+        <w:rPr>
+          <w:rFonts w:ascii="Consolas" w:eastAsia="Times New Roman" w:hAnsi="Consolas" w:cs="Times New Roman"/>
+          <w:color w:val="BBBEBF"/>
+          <w:sz w:val="21"/>
+          <w:szCs w:val="21"/>
+        </w:rPr>
+        <w:t xml:space="preserve">        </w:t>
+      </w:r>
+      <w:proofErr w:type="spellStart"/>
+      <w:r>
+        <w:rPr>
+          <w:rFonts w:ascii="Consolas" w:eastAsia="Times New Roman" w:hAnsi="Consolas" w:cs="Times New Roman"/>
+          <w:color w:val="79C0FF"/>
+          <w:sz w:val="21"/>
+          <w:szCs w:val="21"/>
+        </w:rPr>
+        <w:t>this</w:t>
+      </w:r>
+      <w:r>
+        <w:rPr>
+          <w:rFonts w:ascii="Consolas" w:eastAsia="Times New Roman" w:hAnsi="Consolas" w:cs="Times New Roman"/>
+          <w:color w:val="BBBEBF"/>
+          <w:sz w:val="21"/>
+          <w:szCs w:val="21"/>
+        </w:rPr>
+        <w:t>.</w:t>
+      </w:r>
+      <w:r>
+        <w:rPr>
+          <w:rFonts w:ascii="Consolas" w:eastAsia="Times New Roman" w:hAnsi="Consolas" w:cs="Times New Roman"/>
+          <w:color w:val="C9D1D9"/>
+          <w:sz w:val="21"/>
+          <w:szCs w:val="21"/>
+        </w:rPr>
+        <w:t>balance</w:t>
+      </w:r>
+      <w:proofErr w:type="spellEnd"/>
+      <w:r>
+        <w:rPr>
+          <w:rFonts w:ascii="Consolas" w:eastAsia="Times New Roman" w:hAnsi="Consolas" w:cs="Times New Roman"/>
+          <w:color w:val="BBBEBF"/>
+          <w:sz w:val="21"/>
+          <w:szCs w:val="21"/>
+        </w:rPr>
+        <w:t xml:space="preserve"> </w:t>
+      </w:r>
+      <w:r>
+        <w:rPr>
+          <w:rFonts w:ascii="Consolas" w:eastAsia="Times New Roman" w:hAnsi="Consolas" w:cs="Times New Roman"/>
+          <w:color w:val="D4D4D4"/>
+          <w:sz w:val="21"/>
+          <w:szCs w:val="21"/>
+        </w:rPr>
+        <w:t>=</w:t>
+      </w:r>
+      <w:r>
+        <w:rPr>
+          <w:rFonts w:ascii="Consolas" w:eastAsia="Times New Roman" w:hAnsi="Consolas" w:cs="Times New Roman"/>
+          <w:color w:val="BBBEBF"/>
+          <w:sz w:val="21"/>
+          <w:szCs w:val="21"/>
+        </w:rPr>
+        <w:t xml:space="preserve"> </w:t>
+      </w:r>
+      <w:r>
+        <w:rPr>
+          <w:rFonts w:ascii="Consolas" w:eastAsia="Times New Roman" w:hAnsi="Consolas" w:cs="Times New Roman"/>
+          <w:color w:val="FFA657"/>
+          <w:sz w:val="21"/>
+          <w:szCs w:val="21"/>
+        </w:rPr>
+        <w:t>balance</w:t>
+      </w:r>
+      <w:r>
+        <w:rPr>
+          <w:rFonts w:ascii="Consolas" w:eastAsia="Times New Roman" w:hAnsi="Consolas" w:cs="Times New Roman"/>
+          <w:color w:val="BBBEBF"/>
+          <w:sz w:val="21"/>
+          <w:szCs w:val="21"/>
+        </w:rPr>
+        <w:t>;</w:t>
+      </w:r>
+    </w:p>
+    <w:p>
+      <w:pPr>
+        <w:shd w:val="clear" w:color="auto" w:fill="121314"/>
+        <w:spacing w:after="0" w:line="285" w:lineRule="atLeast"/>
+        <w:rPr>
+          <w:rFonts w:ascii="Consolas" w:eastAsia="Times New Roman" w:hAnsi="Consolas" w:cs="Times New Roman"/>
+          <w:color w:val="BBBEBF"/>
+          <w:sz w:val="21"/>
+          <w:szCs w:val="21"/>
+        </w:rPr>
+      </w:pPr>
+      <w:r>
+        <w:rPr>
+          <w:rFonts w:ascii="Consolas" w:eastAsia="Times New Roman" w:hAnsi="Consolas" w:cs="Times New Roman"/>
+          <w:color w:val="BBBEBF"/>
+          <w:sz w:val="21"/>
+          <w:szCs w:val="21"/>
+        </w:rPr>
+        <w:t>    }</w:t>
+      </w:r>
+    </w:p>
+    <w:p>
+      <w:pPr>
+        <w:shd w:val="clear" w:color="auto" w:fill="121314"/>
+        <w:spacing w:after="0" w:line="285" w:lineRule="atLeast"/>
+        <w:rPr>
+          <w:rFonts w:ascii="Consolas" w:eastAsia="Times New Roman" w:hAnsi="Consolas" w:cs="Times New Roman"/>
+          <w:color w:val="BBBEBF"/>
+          <w:sz w:val="21"/>
+          <w:szCs w:val="21"/>
+        </w:rPr>
+      </w:pPr>
+    </w:p>
+    <w:p>
+      <w:pPr>
+        <w:shd w:val="clear" w:color="auto" w:fill="121314"/>
+        <w:spacing w:after="0" w:line="285" w:lineRule="atLeast"/>
+        <w:rPr>
+          <w:rFonts w:ascii="Consolas" w:eastAsia="Times New Roman" w:hAnsi="Consolas" w:cs="Times New Roman"/>
+          <w:color w:val="BBBEBF"/>
+          <w:sz w:val="21"/>
+          <w:szCs w:val="21"/>
+        </w:rPr>
+      </w:pPr>
+      <w:r>
+        <w:rPr>
+          <w:rFonts w:ascii="Consolas" w:eastAsia="Times New Roman" w:hAnsi="Consolas" w:cs="Times New Roman"/>
+          <w:color w:val="BBBEBF"/>
+          <w:sz w:val="21"/>
+          <w:szCs w:val="21"/>
+        </w:rPr>
+        <w:t xml:space="preserve">    </w:t>
+      </w:r>
+      <w:r>
+        <w:rPr>
+          <w:rFonts w:ascii="Consolas" w:eastAsia="Times New Roman" w:hAnsi="Consolas" w:cs="Times New Roman"/>
+          <w:color w:val="4EC9B0"/>
+          <w:sz w:val="21"/>
+          <w:szCs w:val="21"/>
+        </w:rPr>
+        <w:t>void</w:t>
+      </w:r>
+      <w:r>
+        <w:rPr>
+          <w:rFonts w:ascii="Consolas" w:eastAsia="Times New Roman" w:hAnsi="Consolas" w:cs="Times New Roman"/>
+          <w:color w:val="BBBEBF"/>
+          <w:sz w:val="21"/>
+          <w:szCs w:val="21"/>
+        </w:rPr>
+        <w:t xml:space="preserve"> </w:t>
+      </w:r>
+      <w:r>
+        <w:rPr>
+          <w:rFonts w:ascii="Consolas" w:eastAsia="Times New Roman" w:hAnsi="Consolas" w:cs="Times New Roman"/>
+          <w:color w:val="D2A8FF"/>
+          <w:sz w:val="21"/>
+          <w:szCs w:val="21"/>
+        </w:rPr>
+        <w:t>withdraw</w:t>
+      </w:r>
+      <w:r>
+        <w:rPr>
+          <w:rFonts w:ascii="Consolas" w:eastAsia="Times New Roman" w:hAnsi="Consolas" w:cs="Times New Roman"/>
+          <w:color w:val="BBBEBF"/>
+          <w:sz w:val="21"/>
+          <w:szCs w:val="21"/>
+        </w:rPr>
+        <w:t>(</w:t>
+      </w:r>
+      <w:r>
+        <w:rPr>
+          <w:rFonts w:ascii="Consolas" w:eastAsia="Times New Roman" w:hAnsi="Consolas" w:cs="Times New Roman"/>
+          <w:color w:val="4EC9B0"/>
+          <w:sz w:val="21"/>
+          <w:szCs w:val="21"/>
+        </w:rPr>
+        <w:t>double</w:t>
+      </w:r>
+      <w:r>
+        <w:rPr>
+          <w:rFonts w:ascii="Consolas" w:eastAsia="Times New Roman" w:hAnsi="Consolas" w:cs="Times New Roman"/>
+          <w:color w:val="BBBEBF"/>
+          <w:sz w:val="21"/>
+          <w:szCs w:val="21"/>
+        </w:rPr>
+        <w:t xml:space="preserve"> </w:t>
+      </w:r>
+      <w:r>
+        <w:rPr>
+          <w:rFonts w:ascii="Consolas" w:eastAsia="Times New Roman" w:hAnsi="Consolas" w:cs="Times New Roman"/>
+          <w:color w:val="FFA657"/>
+          <w:sz w:val="21"/>
+          <w:szCs w:val="21"/>
+        </w:rPr>
+        <w:t>amount</w:t>
+      </w:r>
+      <w:r>
+        <w:rPr>
+          <w:rFonts w:ascii="Consolas" w:eastAsia="Times New Roman" w:hAnsi="Consolas" w:cs="Times New Roman"/>
+          <w:color w:val="BBBEBF"/>
+          <w:sz w:val="21"/>
+          <w:szCs w:val="21"/>
+        </w:rPr>
+        <w:t xml:space="preserve">) </w:t>
+      </w:r>
+      <w:r>
+        <w:rPr>
+          <w:rFonts w:ascii="Consolas" w:eastAsia="Times New Roman" w:hAnsi="Consolas" w:cs="Times New Roman"/>
+          <w:color w:val="569CD6"/>
+          <w:sz w:val="21"/>
+          <w:szCs w:val="21"/>
+        </w:rPr>
+        <w:t>throws</w:t>
+      </w:r>
+      <w:r>
+        <w:rPr>
+          <w:rFonts w:ascii="Consolas" w:eastAsia="Times New Roman" w:hAnsi="Consolas" w:cs="Times New Roman"/>
+          <w:color w:val="BBBEBF"/>
+          <w:sz w:val="21"/>
+          <w:szCs w:val="21"/>
+        </w:rPr>
+        <w:t xml:space="preserve"> </w:t>
+      </w:r>
+      <w:proofErr w:type="spellStart"/>
+      <w:r>
+        <w:rPr>
+          <w:rFonts w:ascii="Consolas" w:eastAsia="Times New Roman" w:hAnsi="Consolas" w:cs="Times New Roman"/>
+          <w:color w:val="4EC9B0"/>
+          <w:sz w:val="21"/>
+          <w:szCs w:val="21"/>
+        </w:rPr>
+        <w:t>InsufficientFundsException</w:t>
+      </w:r>
+      <w:proofErr w:type="spellEnd"/>
+      <w:r>
+        <w:rPr>
+          <w:rFonts w:ascii="Consolas" w:eastAsia="Times New Roman" w:hAnsi="Consolas" w:cs="Times New Roman"/>
+          <w:color w:val="BBBEBF"/>
+          <w:sz w:val="21"/>
+          <w:szCs w:val="21"/>
+        </w:rPr>
+        <w:t xml:space="preserve"> {</w:t>
+      </w:r>
+    </w:p>
+    <w:p>
+      <w:pPr>
+        <w:shd w:val="clear" w:color="auto" w:fill="121314"/>
+        <w:spacing w:after="0" w:line="285" w:lineRule="atLeast"/>
+        <w:rPr>
+          <w:rFonts w:ascii="Consolas" w:eastAsia="Times New Roman" w:hAnsi="Consolas" w:cs="Times New Roman"/>
+          <w:color w:val="BBBEBF"/>
+          <w:sz w:val="21"/>
+          <w:szCs w:val="21"/>
+        </w:rPr>
+      </w:pPr>
+      <w:r>
+        <w:rPr>
+          <w:rFonts w:ascii="Consolas" w:eastAsia="Times New Roman" w:hAnsi="Consolas" w:cs="Times New Roman"/>
+          <w:color w:val="BBBEBF"/>
+          <w:sz w:val="21"/>
+          <w:szCs w:val="21"/>
+        </w:rPr>
+        <w:t xml:space="preserve">        </w:t>
+      </w:r>
+      <w:r>
+        <w:rPr>
+          <w:rFonts w:ascii="Consolas" w:eastAsia="Times New Roman" w:hAnsi="Consolas" w:cs="Times New Roman"/>
+          <w:color w:val="8B949E"/>
+          <w:sz w:val="21"/>
+          <w:szCs w:val="21"/>
+        </w:rPr>
+        <w:t>// Check if the withdrawal amount exceeds the current balance</w:t>
+      </w:r>
+    </w:p>
+    <w:p>
+      <w:pPr>
+        <w:shd w:val="clear" w:color="auto" w:fill="121314"/>
+        <w:spacing w:after="0" w:line="285" w:lineRule="atLeast"/>
+        <w:rPr>
+          <w:rFonts w:ascii="Consolas" w:eastAsia="Times New Roman" w:hAnsi="Consolas" w:cs="Times New Roman"/>
+          <w:color w:val="BBBEBF"/>
+          <w:sz w:val="21"/>
+          <w:szCs w:val="21"/>
+        </w:rPr>
+      </w:pPr>
+      <w:r>
+        <w:rPr>
+          <w:rFonts w:ascii="Consolas" w:eastAsia="Times New Roman" w:hAnsi="Consolas" w:cs="Times New Roman"/>
+          <w:color w:val="BBBEBF"/>
+          <w:sz w:val="21"/>
+          <w:szCs w:val="21"/>
+        </w:rPr>
+        <w:t xml:space="preserve">        </w:t>
+      </w:r>
+      <w:r>
+        <w:rPr>
+          <w:rFonts w:ascii="Consolas" w:eastAsia="Times New Roman" w:hAnsi="Consolas" w:cs="Times New Roman"/>
+          <w:color w:val="C586C0"/>
+          <w:sz w:val="21"/>
+          <w:szCs w:val="21"/>
+        </w:rPr>
+        <w:t>if</w:t>
+      </w:r>
+      <w:r>
+        <w:rPr>
+          <w:rFonts w:ascii="Consolas" w:eastAsia="Times New Roman" w:hAnsi="Consolas" w:cs="Times New Roman"/>
+          <w:color w:val="BBBEBF"/>
+          <w:sz w:val="21"/>
+          <w:szCs w:val="21"/>
+        </w:rPr>
+        <w:t xml:space="preserve"> (</w:t>
+      </w:r>
+      <w:r>
+        <w:rPr>
+          <w:rFonts w:ascii="Consolas" w:eastAsia="Times New Roman" w:hAnsi="Consolas" w:cs="Times New Roman"/>
+          <w:color w:val="FFA657"/>
+          <w:sz w:val="21"/>
+          <w:szCs w:val="21"/>
+        </w:rPr>
+        <w:t>amount</w:t>
+      </w:r>
+      <w:r>
+        <w:rPr>
+          <w:rFonts w:ascii="Consolas" w:eastAsia="Times New Roman" w:hAnsi="Consolas" w:cs="Times New Roman"/>
+          <w:color w:val="BBBEBF"/>
+          <w:sz w:val="21"/>
+          <w:szCs w:val="21"/>
+        </w:rPr>
+        <w:t xml:space="preserve"> </w:t>
+      </w:r>
+      <w:r>
+        <w:rPr>
+          <w:rFonts w:ascii="Consolas" w:eastAsia="Times New Roman" w:hAnsi="Consolas" w:cs="Times New Roman"/>
+          <w:color w:val="D4D4D4"/>
+          <w:sz w:val="21"/>
+          <w:szCs w:val="21"/>
+        </w:rPr>
+        <w:t>&gt;</w:t>
+      </w:r>
+      <w:r>
+        <w:rPr>
+          <w:rFonts w:ascii="Consolas" w:eastAsia="Times New Roman" w:hAnsi="Consolas" w:cs="Times New Roman"/>
+          <w:color w:val="BBBEBF"/>
+          <w:sz w:val="21"/>
+          <w:szCs w:val="21"/>
+        </w:rPr>
+        <w:t xml:space="preserve"> </w:t>
+      </w:r>
+      <w:r>
+        <w:rPr>
+          <w:rFonts w:ascii="Consolas" w:eastAsia="Times New Roman" w:hAnsi="Consolas" w:cs="Times New Roman"/>
+          <w:color w:val="C9D1D9"/>
+          <w:sz w:val="21"/>
+          <w:szCs w:val="21"/>
+        </w:rPr>
+        <w:t>balance</w:t>
+      </w:r>
+      <w:r>
+        <w:rPr>
+          <w:rFonts w:ascii="Consolas" w:eastAsia="Times New Roman" w:hAnsi="Consolas" w:cs="Times New Roman"/>
+          <w:color w:val="BBBEBF"/>
+          <w:sz w:val="21"/>
+          <w:szCs w:val="21"/>
+        </w:rPr>
+        <w:t>) {</w:t>
+      </w:r>
+    </w:p>
+    <w:p>
+      <w:pPr>
+        <w:shd w:val="clear" w:color="auto" w:fill="121314"/>
+        <w:spacing w:after="0" w:line="285" w:lineRule="atLeast"/>
+        <w:rPr>
+          <w:rFonts w:ascii="Consolas" w:eastAsia="Times New Roman" w:hAnsi="Consolas" w:cs="Times New Roman"/>
+          <w:color w:val="BBBEBF"/>
+          <w:sz w:val="21"/>
+          <w:szCs w:val="21"/>
+        </w:rPr>
+      </w:pPr>
+      <w:r>
+        <w:rPr>
+          <w:rFonts w:ascii="Consolas" w:eastAsia="Times New Roman" w:hAnsi="Consolas" w:cs="Times New Roman"/>
+          <w:color w:val="BBBEBF"/>
+          <w:sz w:val="21"/>
+          <w:szCs w:val="21"/>
+        </w:rPr>
+        <w:t xml:space="preserve">            </w:t>
+      </w:r>
+      <w:r>
+        <w:rPr>
+          <w:rFonts w:ascii="Consolas" w:eastAsia="Times New Roman" w:hAnsi="Consolas" w:cs="Times New Roman"/>
+          <w:color w:val="C586C0"/>
+          <w:sz w:val="21"/>
+          <w:szCs w:val="21"/>
+        </w:rPr>
+        <w:t>throw</w:t>
+      </w:r>
+      <w:r>
+        <w:rPr>
+          <w:rFonts w:ascii="Consolas" w:eastAsia="Times New Roman" w:hAnsi="Consolas" w:cs="Times New Roman"/>
+          <w:color w:val="BBBEBF"/>
+          <w:sz w:val="21"/>
+          <w:szCs w:val="21"/>
+        </w:rPr>
+        <w:t xml:space="preserve"> </w:t>
+      </w:r>
+      <w:r>
+        <w:rPr>
+          <w:rFonts w:ascii="Consolas" w:eastAsia="Times New Roman" w:hAnsi="Consolas" w:cs="Times New Roman"/>
+          <w:color w:val="C586C0"/>
+          <w:sz w:val="21"/>
+          <w:szCs w:val="21"/>
+        </w:rPr>
+        <w:t>new</w:t>
+      </w:r>
+      <w:r>
+        <w:rPr>
+          <w:rFonts w:ascii="Consolas" w:eastAsia="Times New Roman" w:hAnsi="Consolas" w:cs="Times New Roman"/>
+          <w:color w:val="BBBEBF"/>
+          <w:sz w:val="21"/>
+          <w:szCs w:val="21"/>
+        </w:rPr>
+        <w:t xml:space="preserve"> </w:t>
+      </w:r>
+      <w:proofErr w:type="spellStart"/>
+      <w:r>
+        <w:rPr>
+          <w:rFonts w:ascii="Consolas" w:eastAsia="Times New Roman" w:hAnsi="Consolas" w:cs="Times New Roman"/>
+          <w:color w:val="D2A8FF"/>
+          <w:sz w:val="21"/>
+          <w:szCs w:val="21"/>
+        </w:rPr>
+        <w:t>InsufficientFundsException</w:t>
+      </w:r>
+      <w:proofErr w:type="spellEnd"/>
+      <w:r>
+        <w:rPr>
+          <w:rFonts w:ascii="Consolas" w:eastAsia="Times New Roman" w:hAnsi="Consolas" w:cs="Times New Roman"/>
+          <w:color w:val="BBBEBF"/>
+          <w:sz w:val="21"/>
+          <w:szCs w:val="21"/>
+        </w:rPr>
+        <w:t>(</w:t>
+      </w:r>
+      <w:r>
+        <w:rPr>
+          <w:rFonts w:ascii="Consolas" w:eastAsia="Times New Roman" w:hAnsi="Consolas" w:cs="Times New Roman"/>
+          <w:color w:val="A5D6FF"/>
+          <w:sz w:val="21"/>
+          <w:szCs w:val="21"/>
+        </w:rPr>
+        <w:t>"Insufficient funds"</w:t>
+      </w:r>
+      <w:r>
+        <w:rPr>
+          <w:rFonts w:ascii="Consolas" w:eastAsia="Times New Roman" w:hAnsi="Consolas" w:cs="Times New Roman"/>
+          <w:color w:val="BBBEBF"/>
+          <w:sz w:val="21"/>
+          <w:szCs w:val="21"/>
+        </w:rPr>
+        <w:t>);</w:t>
+      </w:r>
+    </w:p>
+    <w:p>
+      <w:pPr>
+        <w:shd w:val="clear" w:color="auto" w:fill="121314"/>
+        <w:spacing w:after="0" w:line="285" w:lineRule="atLeast"/>
+        <w:rPr>
+          <w:rFonts w:ascii="Consolas" w:eastAsia="Times New Roman" w:hAnsi="Consolas" w:cs="Times New Roman"/>
+          <w:color w:val="BBBEBF"/>
+          <w:sz w:val="21"/>
+          <w:szCs w:val="21"/>
+        </w:rPr>
+      </w:pPr>
+      <w:r>
+        <w:rPr>
+          <w:rFonts w:ascii="Consolas" w:eastAsia="Times New Roman" w:hAnsi="Consolas" w:cs="Times New Roman"/>
+          <w:color w:val="BBBEBF"/>
+          <w:sz w:val="21"/>
+          <w:szCs w:val="21"/>
+        </w:rPr>
+        <w:t>        }</w:t>
+      </w:r>
+    </w:p>
+    <w:p>
+      <w:pPr>
+        <w:shd w:val="clear" w:color="auto" w:fill="121314"/>
+        <w:spacing w:after="0" w:line="285" w:lineRule="atLeast"/>
+        <w:rPr>
+          <w:rFonts w:ascii="Consolas" w:eastAsia="Times New Roman" w:hAnsi="Consolas" w:cs="Times New Roman"/>
+          <w:color w:val="BBBEBF"/>
+          <w:sz w:val="21"/>
+          <w:szCs w:val="21"/>
+        </w:rPr>
+      </w:pPr>
+      <w:r>
+        <w:rPr>
+          <w:rFonts w:ascii="Consolas" w:eastAsia="Times New Roman" w:hAnsi="Consolas" w:cs="Times New Roman"/>
+          <w:color w:val="BBBEBF"/>
+          <w:sz w:val="21"/>
+          <w:szCs w:val="21"/>
+        </w:rPr>
+        <w:t xml:space="preserve">        </w:t>
+      </w:r>
+      <w:r>
+        <w:rPr>
+          <w:rFonts w:ascii="Consolas" w:eastAsia="Times New Roman" w:hAnsi="Consolas" w:cs="Times New Roman"/>
+          <w:color w:val="C9D1D9"/>
+          <w:sz w:val="21"/>
+          <w:szCs w:val="21"/>
+        </w:rPr>
+        <w:t>balance</w:t>
+      </w:r>
+      <w:r>
+        <w:rPr>
+          <w:rFonts w:ascii="Consolas" w:eastAsia="Times New Roman" w:hAnsi="Consolas" w:cs="Times New Roman"/>
+          <w:color w:val="BBBEBF"/>
+          <w:sz w:val="21"/>
+          <w:szCs w:val="21"/>
+        </w:rPr>
+        <w:t xml:space="preserve"> </w:t>
+      </w:r>
+      <w:r>
+        <w:rPr>
+          <w:rFonts w:ascii="Consolas" w:eastAsia="Times New Roman" w:hAnsi="Consolas" w:cs="Times New Roman"/>
+          <w:color w:val="D4D4D4"/>
+          <w:sz w:val="21"/>
+          <w:szCs w:val="21"/>
+        </w:rPr>
+        <w:t>-=</w:t>
+      </w:r>
+      <w:r>
+        <w:rPr>
+          <w:rFonts w:ascii="Consolas" w:eastAsia="Times New Roman" w:hAnsi="Consolas" w:cs="Times New Roman"/>
+          <w:color w:val="BBBEBF"/>
+          <w:sz w:val="21"/>
+          <w:szCs w:val="21"/>
+        </w:rPr>
+        <w:t xml:space="preserve"> </w:t>
+      </w:r>
+      <w:r>
+        <w:rPr>
+          <w:rFonts w:ascii="Consolas" w:eastAsia="Times New Roman" w:hAnsi="Consolas" w:cs="Times New Roman"/>
+          <w:color w:val="FFA657"/>
+          <w:sz w:val="21"/>
+          <w:szCs w:val="21"/>
+        </w:rPr>
+        <w:t>amount</w:t>
+      </w:r>
+      <w:r>
+        <w:rPr>
+          <w:rFonts w:ascii="Consolas" w:eastAsia="Times New Roman" w:hAnsi="Consolas" w:cs="Times New Roman"/>
+          <w:color w:val="BBBEBF"/>
+          <w:sz w:val="21"/>
+          <w:szCs w:val="21"/>
+        </w:rPr>
+        <w:t>;</w:t>
+      </w:r>
+    </w:p>
+    <w:p>
+      <w:pPr>
+        <w:shd w:val="clear" w:color="auto" w:fill="121314"/>
+        <w:spacing w:after="0" w:line="285" w:lineRule="atLeast"/>
+        <w:rPr>
+          <w:rFonts w:ascii="Consolas" w:eastAsia="Times New Roman" w:hAnsi="Consolas" w:cs="Times New Roman"/>
+          <w:color w:val="BBBEBF"/>
+          <w:sz w:val="21"/>
+          <w:szCs w:val="21"/>
+        </w:rPr>
+      </w:pPr>
+      <w:r>
+        <w:rPr>
+          <w:rFonts w:ascii="Consolas" w:eastAsia="Times New Roman" w:hAnsi="Consolas" w:cs="Times New Roman"/>
+          <w:color w:val="BBBEBF"/>
+          <w:sz w:val="21"/>
+          <w:szCs w:val="21"/>
+        </w:rPr>
+        <w:t>    }</w:t>
+      </w:r>
+    </w:p>
+    <w:p>
+      <w:pPr>
+        <w:shd w:val="clear" w:color="auto" w:fill="121314"/>
+        <w:spacing w:after="0" w:line="285" w:lineRule="atLeast"/>
+        <w:rPr>
+          <w:rFonts w:ascii="Consolas" w:eastAsia="Times New Roman" w:hAnsi="Consolas" w:cs="Times New Roman"/>
+          <w:color w:val="BBBEBF"/>
+          <w:sz w:val="21"/>
+          <w:szCs w:val="21"/>
+        </w:rPr>
+      </w:pPr>
+      <w:r>
+        <w:rPr>
+          <w:rFonts w:ascii="Consolas" w:eastAsia="Times New Roman" w:hAnsi="Consolas" w:cs="Times New Roman"/>
+          <w:color w:val="BBBEBF"/>
+          <w:sz w:val="21"/>
+          <w:szCs w:val="21"/>
+        </w:rPr>
+        <w:t>}</w:t>
+      </w:r>
+    </w:p>
+    <w:p>
+      <w:pPr>
+        <w:shd w:val="clear" w:color="auto" w:fill="121314"/>
+        <w:spacing w:after="0" w:line="285" w:lineRule="atLeast"/>
+        <w:rPr>
+          <w:rFonts w:ascii="Consolas" w:eastAsia="Times New Roman" w:hAnsi="Consolas" w:cs="Times New Roman"/>
+          <w:color w:val="BBBEBF"/>
+          <w:sz w:val="21"/>
+          <w:szCs w:val="21"/>
+        </w:rPr>
+      </w:pPr>
+    </w:p>
+    <w:p>
+      <w:pPr>
+        <w:shd w:val="clear" w:color="auto" w:fill="121314"/>
+        <w:spacing w:after="0" w:line="285" w:lineRule="atLeast"/>
+        <w:rPr>
+          <w:rFonts w:ascii="Consolas" w:eastAsia="Times New Roman" w:hAnsi="Consolas" w:cs="Times New Roman"/>
+          <w:color w:val="BBBEBF"/>
+          <w:sz w:val="21"/>
+          <w:szCs w:val="21"/>
+        </w:rPr>
+      </w:pPr>
+      <w:r>
+        <w:rPr>
+          <w:rFonts w:ascii="Consolas" w:eastAsia="Times New Roman" w:hAnsi="Consolas" w:cs="Times New Roman"/>
+          <w:color w:val="569CD6"/>
+          <w:sz w:val="21"/>
+          <w:szCs w:val="21"/>
+        </w:rPr>
+        <w:t>public</w:t>
+      </w:r>
+      <w:r>
+        <w:rPr>
+          <w:rFonts w:ascii="Consolas" w:eastAsia="Times New Roman" w:hAnsi="Consolas" w:cs="Times New Roman"/>
+          <w:color w:val="BBBEBF"/>
+          <w:sz w:val="21"/>
+          <w:szCs w:val="21"/>
+        </w:rPr>
+        <w:t xml:space="preserve"> </w:t>
+      </w:r>
+      <w:r>
+        <w:rPr>
+          <w:rFonts w:ascii="Consolas" w:eastAsia="Times New Roman" w:hAnsi="Consolas" w:cs="Times New Roman"/>
+          <w:color w:val="569CD6"/>
+          <w:sz w:val="21"/>
+          <w:szCs w:val="21"/>
+        </w:rPr>
+        <w:t>class</w:t>
+      </w:r>
+      <w:r>
+        <w:rPr>
+          <w:rFonts w:ascii="Consolas" w:eastAsia="Times New Roman" w:hAnsi="Consolas" w:cs="Times New Roman"/>
+          <w:color w:val="BBBEBF"/>
+          <w:sz w:val="21"/>
+          <w:szCs w:val="21"/>
+        </w:rPr>
+        <w:t xml:space="preserve"> </w:t>
+      </w:r>
+      <w:r>
+        <w:rPr>
+          <w:rFonts w:ascii="Consolas" w:eastAsia="Times New Roman" w:hAnsi="Consolas" w:cs="Times New Roman"/>
+          <w:color w:val="4EC9B0"/>
+          <w:sz w:val="21"/>
+          <w:szCs w:val="21"/>
+        </w:rPr>
+        <w:t>Exercise4WithdrawException</w:t>
+      </w:r>
+      <w:r>
+        <w:rPr>
+          <w:rFonts w:ascii="Consolas" w:eastAsia="Times New Roman" w:hAnsi="Consolas" w:cs="Times New Roman"/>
+          <w:color w:val="BBBEBF"/>
+          <w:sz w:val="21"/>
+          <w:szCs w:val="21"/>
+        </w:rPr>
+        <w:t xml:space="preserve"> {</w:t>
+      </w:r>
+    </w:p>
+    <w:p>
+      <w:pPr>
+        <w:shd w:val="clear" w:color="auto" w:fill="121314"/>
+        <w:spacing w:after="0" w:line="285" w:lineRule="atLeast"/>
+        <w:rPr>
+          <w:rFonts w:ascii="Consolas" w:eastAsia="Times New Roman" w:hAnsi="Consolas" w:cs="Times New Roman"/>
+          <w:color w:val="BBBEBF"/>
+          <w:sz w:val="21"/>
+          <w:szCs w:val="21"/>
+        </w:rPr>
+      </w:pPr>
+      <w:r>
+        <w:rPr>
+          <w:rFonts w:ascii="Consolas" w:eastAsia="Times New Roman" w:hAnsi="Consolas" w:cs="Times New Roman"/>
+          <w:color w:val="BBBEBF"/>
+          <w:sz w:val="21"/>
+          <w:szCs w:val="21"/>
+        </w:rPr>
+        <w:t xml:space="preserve">    </w:t>
+      </w:r>
+      <w:r>
+        <w:rPr>
+          <w:rFonts w:ascii="Consolas" w:eastAsia="Times New Roman" w:hAnsi="Consolas" w:cs="Times New Roman"/>
+          <w:color w:val="569CD6"/>
+          <w:sz w:val="21"/>
+          <w:szCs w:val="21"/>
+        </w:rPr>
+        <w:t>public</w:t>
+      </w:r>
+      <w:r>
+        <w:rPr>
+          <w:rFonts w:ascii="Consolas" w:eastAsia="Times New Roman" w:hAnsi="Consolas" w:cs="Times New Roman"/>
+          <w:color w:val="BBBEBF"/>
+          <w:sz w:val="21"/>
+          <w:szCs w:val="21"/>
+        </w:rPr>
+        <w:t xml:space="preserve"> </w:t>
+      </w:r>
+      <w:r>
+        <w:rPr>
+          <w:rFonts w:ascii="Consolas" w:eastAsia="Times New Roman" w:hAnsi="Consolas" w:cs="Times New Roman"/>
+          <w:color w:val="569CD6"/>
+          <w:sz w:val="21"/>
+          <w:szCs w:val="21"/>
+        </w:rPr>
+        <w:t>static</w:t>
+      </w:r>
+      <w:r>
+        <w:rPr>
+          <w:rFonts w:ascii="Consolas" w:eastAsia="Times New Roman" w:hAnsi="Consolas" w:cs="Times New Roman"/>
+          <w:color w:val="BBBEBF"/>
+          <w:sz w:val="21"/>
+          <w:szCs w:val="21"/>
+        </w:rPr>
+        <w:t xml:space="preserve"> </w:t>
+      </w:r>
+      <w:r>
+        <w:rPr>
+          <w:rFonts w:ascii="Consolas" w:eastAsia="Times New Roman" w:hAnsi="Consolas" w:cs="Times New Roman"/>
+          <w:color w:val="4EC9B0"/>
+          <w:sz w:val="21"/>
+          <w:szCs w:val="21"/>
+        </w:rPr>
+        <w:t>void</w:t>
+      </w:r>
+      <w:r>
+        <w:rPr>
+          <w:rFonts w:ascii="Consolas" w:eastAsia="Times New Roman" w:hAnsi="Consolas" w:cs="Times New Roman"/>
+          <w:color w:val="BBBEBF"/>
+          <w:sz w:val="21"/>
+          <w:szCs w:val="21"/>
+        </w:rPr>
+        <w:t xml:space="preserve"> </w:t>
+      </w:r>
+      <w:r>
+        <w:rPr>
+          <w:rFonts w:ascii="Consolas" w:eastAsia="Times New Roman" w:hAnsi="Consolas" w:cs="Times New Roman"/>
+          <w:color w:val="D2A8FF"/>
+          <w:sz w:val="21"/>
+          <w:szCs w:val="21"/>
+        </w:rPr>
+        <w:t>main</w:t>
+      </w:r>
+      <w:r>
+        <w:rPr>
+          <w:rFonts w:ascii="Consolas" w:eastAsia="Times New Roman" w:hAnsi="Consolas" w:cs="Times New Roman"/>
+          <w:color w:val="BBBEBF"/>
+          <w:sz w:val="21"/>
+          <w:szCs w:val="21"/>
+        </w:rPr>
+        <w:t>(</w:t>
+      </w:r>
+      <w:r>
+        <w:rPr>
+          <w:rFonts w:ascii="Consolas" w:eastAsia="Times New Roman" w:hAnsi="Consolas" w:cs="Times New Roman"/>
+          <w:color w:val="4EC9B0"/>
+          <w:sz w:val="21"/>
+          <w:szCs w:val="21"/>
+        </w:rPr>
+        <w:t>String</w:t>
+      </w:r>
+      <w:r>
+        <w:rPr>
+          <w:rFonts w:ascii="Consolas" w:eastAsia="Times New Roman" w:hAnsi="Consolas" w:cs="Times New Roman"/>
+          <w:color w:val="BBBEBF"/>
+          <w:sz w:val="21"/>
+          <w:szCs w:val="21"/>
+        </w:rPr>
+        <w:t xml:space="preserve">[] </w:t>
+      </w:r>
+      <w:proofErr w:type="spellStart"/>
+      <w:r>
+        <w:rPr>
+          <w:rFonts w:ascii="Consolas" w:eastAsia="Times New Roman" w:hAnsi="Consolas" w:cs="Times New Roman"/>
+          <w:color w:val="FFA657"/>
+          <w:sz w:val="21"/>
+          <w:szCs w:val="21"/>
+        </w:rPr>
+        <w:t>args</w:t>
+      </w:r>
+      <w:proofErr w:type="spellEnd"/>
+      <w:r>
+        <w:rPr>
+          <w:rFonts w:ascii="Consolas" w:eastAsia="Times New Roman" w:hAnsi="Consolas" w:cs="Times New Roman"/>
+          <w:color w:val="BBBEBF"/>
+          <w:sz w:val="21"/>
+          <w:szCs w:val="21"/>
+        </w:rPr>
+        <w:t>) {</w:t>
+      </w:r>
+    </w:p>
+    <w:p>
+      <w:pPr>
+        <w:shd w:val="clear" w:color="auto" w:fill="121314"/>
+        <w:spacing w:after="0" w:line="285" w:lineRule="atLeast"/>
+        <w:rPr>
+          <w:rFonts w:ascii="Consolas" w:eastAsia="Times New Roman" w:hAnsi="Consolas" w:cs="Times New Roman"/>
+          <w:color w:val="BBBEBF"/>
+          <w:sz w:val="21"/>
+          <w:szCs w:val="21"/>
+        </w:rPr>
+      </w:pPr>
+      <w:r>
+        <w:rPr>
+          <w:rFonts w:ascii="Consolas" w:eastAsia="Times New Roman" w:hAnsi="Consolas" w:cs="Times New Roman"/>
+          <w:color w:val="BBBEBF"/>
+          <w:sz w:val="21"/>
+          <w:szCs w:val="21"/>
+        </w:rPr>
+        <w:t xml:space="preserve">        </w:t>
+      </w:r>
+      <w:proofErr w:type="spellStart"/>
+      <w:r>
+        <w:rPr>
+          <w:rFonts w:ascii="Consolas" w:eastAsia="Times New Roman" w:hAnsi="Consolas" w:cs="Times New Roman"/>
+          <w:color w:val="4EC9B0"/>
+          <w:sz w:val="21"/>
+          <w:szCs w:val="21"/>
+        </w:rPr>
+        <w:t>WithdrawalAccount</w:t>
+      </w:r>
+      <w:proofErr w:type="spellEnd"/>
+      <w:r>
+        <w:rPr>
+          <w:rFonts w:ascii="Consolas" w:eastAsia="Times New Roman" w:hAnsi="Consolas" w:cs="Times New Roman"/>
+          <w:color w:val="FFA657"/>
+          <w:sz w:val="21"/>
+          <w:szCs w:val="21"/>
+        </w:rPr>
+        <w:t xml:space="preserve"> </w:t>
+      </w:r>
+      <w:r>
+        <w:rPr>
+          <w:rFonts w:ascii="Consolas" w:eastAsia="Times New Roman" w:hAnsi="Consolas" w:cs="Times New Roman"/>
+          <w:color w:val="C9D1D9"/>
+          <w:sz w:val="21"/>
+          <w:szCs w:val="21"/>
+        </w:rPr>
+        <w:t>account</w:t>
+      </w:r>
+      <w:r>
+        <w:rPr>
+          <w:rFonts w:ascii="Consolas" w:eastAsia="Times New Roman" w:hAnsi="Consolas" w:cs="Times New Roman"/>
+          <w:color w:val="FFA657"/>
+          <w:sz w:val="21"/>
+          <w:szCs w:val="21"/>
+        </w:rPr>
+        <w:t xml:space="preserve"> </w:t>
+      </w:r>
+      <w:r>
+        <w:rPr>
+          <w:rFonts w:ascii="Consolas" w:eastAsia="Times New Roman" w:hAnsi="Consolas" w:cs="Times New Roman"/>
+          <w:color w:val="D4D4D4"/>
+          <w:sz w:val="21"/>
+          <w:szCs w:val="21"/>
+        </w:rPr>
+        <w:t>=</w:t>
+      </w:r>
+      <w:r>
+        <w:rPr>
+          <w:rFonts w:ascii="Consolas" w:eastAsia="Times New Roman" w:hAnsi="Consolas" w:cs="Times New Roman"/>
+          <w:color w:val="BBBEBF"/>
+          <w:sz w:val="21"/>
+          <w:szCs w:val="21"/>
+        </w:rPr>
+        <w:t xml:space="preserve"> </w:t>
+      </w:r>
+      <w:r>
+        <w:rPr>
+          <w:rFonts w:ascii="Consolas" w:eastAsia="Times New Roman" w:hAnsi="Consolas" w:cs="Times New Roman"/>
+          <w:color w:val="C586C0"/>
+          <w:sz w:val="21"/>
+          <w:szCs w:val="21"/>
+        </w:rPr>
+        <w:t>new</w:t>
+      </w:r>
+      <w:r>
+        <w:rPr>
+          <w:rFonts w:ascii="Consolas" w:eastAsia="Times New Roman" w:hAnsi="Consolas" w:cs="Times New Roman"/>
+          <w:color w:val="BBBEBF"/>
+          <w:sz w:val="21"/>
+          <w:szCs w:val="21"/>
+        </w:rPr>
+        <w:t xml:space="preserve"> </w:t>
+      </w:r>
+      <w:proofErr w:type="spellStart"/>
+      <w:r>
+        <w:rPr>
+          <w:rFonts w:ascii="Consolas" w:eastAsia="Times New Roman" w:hAnsi="Consolas" w:cs="Times New Roman"/>
+          <w:color w:val="D2A8FF"/>
+          <w:sz w:val="21"/>
+          <w:szCs w:val="21"/>
+        </w:rPr>
+        <w:t>WithdrawalAccount</w:t>
+      </w:r>
+      <w:proofErr w:type="spellEnd"/>
+      <w:r>
+        <w:rPr>
+          <w:rFonts w:ascii="Consolas" w:eastAsia="Times New Roman" w:hAnsi="Consolas" w:cs="Times New Roman"/>
+          <w:color w:val="BBBEBF"/>
+          <w:sz w:val="21"/>
+          <w:szCs w:val="21"/>
+        </w:rPr>
+        <w:t>(</w:t>
+      </w:r>
+      <w:r>
+        <w:rPr>
+          <w:rFonts w:ascii="Consolas" w:eastAsia="Times New Roman" w:hAnsi="Consolas" w:cs="Times New Roman"/>
+          <w:color w:val="B5CEA8"/>
+          <w:sz w:val="21"/>
+          <w:szCs w:val="21"/>
+        </w:rPr>
+        <w:t>100</w:t>
+      </w:r>
+      <w:r>
+        <w:rPr>
+          <w:rFonts w:ascii="Consolas" w:eastAsia="Times New Roman" w:hAnsi="Consolas" w:cs="Times New Roman"/>
+          <w:color w:val="BBBEBF"/>
+          <w:sz w:val="21"/>
+          <w:szCs w:val="21"/>
+        </w:rPr>
+        <w:t>);</w:t>
+      </w:r>
+    </w:p>
+    <w:p>
+      <w:pPr>
+        <w:shd w:val="clear" w:color="auto" w:fill="121314"/>
+        <w:spacing w:after="0" w:line="285" w:lineRule="atLeast"/>
+        <w:rPr>
+          <w:rFonts w:ascii="Consolas" w:eastAsia="Times New Roman" w:hAnsi="Consolas" w:cs="Times New Roman"/>
+          <w:color w:val="BBBEBF"/>
+          <w:sz w:val="21"/>
+          <w:szCs w:val="21"/>
+        </w:rPr>
+      </w:pPr>
+      <w:r>
+        <w:rPr>
+          <w:rFonts w:ascii="Consolas" w:eastAsia="Times New Roman" w:hAnsi="Consolas" w:cs="Times New Roman"/>
+          <w:color w:val="BBBEBF"/>
+          <w:sz w:val="21"/>
+          <w:szCs w:val="21"/>
+        </w:rPr>
+        <w:t xml:space="preserve">        </w:t>
+      </w:r>
+      <w:r>
+        <w:rPr>
+          <w:rFonts w:ascii="Consolas" w:eastAsia="Times New Roman" w:hAnsi="Consolas" w:cs="Times New Roman"/>
+          <w:color w:val="C586C0"/>
+          <w:sz w:val="21"/>
+          <w:szCs w:val="21"/>
+        </w:rPr>
+        <w:t>try</w:t>
+      </w:r>
+      <w:r>
+        <w:rPr>
+          <w:rFonts w:ascii="Consolas" w:eastAsia="Times New Roman" w:hAnsi="Consolas" w:cs="Times New Roman"/>
+          <w:color w:val="BBBEBF"/>
+          <w:sz w:val="21"/>
+          <w:szCs w:val="21"/>
+        </w:rPr>
+        <w:t xml:space="preserve"> {</w:t>
+      </w:r>
+    </w:p>
+    <w:p>
+      <w:pPr>
+        <w:shd w:val="clear" w:color="auto" w:fill="121314"/>
+        <w:spacing w:after="0" w:line="285" w:lineRule="atLeast"/>
+        <w:rPr>
+          <w:rFonts w:ascii="Consolas" w:eastAsia="Times New Roman" w:hAnsi="Consolas" w:cs="Times New Roman"/>
+          <w:color w:val="BBBEBF"/>
+          <w:sz w:val="21"/>
+          <w:szCs w:val="21"/>
+        </w:rPr>
+      </w:pPr>
+      <w:r>
+        <w:rPr>
+          <w:rFonts w:ascii="Consolas" w:eastAsia="Times New Roman" w:hAnsi="Consolas" w:cs="Times New Roman"/>
+          <w:color w:val="BBBEBF"/>
+          <w:sz w:val="21"/>
+          <w:szCs w:val="21"/>
+        </w:rPr>
+        <w:t xml:space="preserve">            </w:t>
+      </w:r>
+      <w:proofErr w:type="spellStart"/>
+      <w:r>
+        <w:rPr>
+          <w:rFonts w:ascii="Consolas" w:eastAsia="Times New Roman" w:hAnsi="Consolas" w:cs="Times New Roman"/>
+          <w:color w:val="C9D1D9"/>
+          <w:sz w:val="21"/>
+          <w:szCs w:val="21"/>
+        </w:rPr>
+        <w:t>account</w:t>
+      </w:r>
+      <w:r>
+        <w:rPr>
+          <w:rFonts w:ascii="Consolas" w:eastAsia="Times New Roman" w:hAnsi="Consolas" w:cs="Times New Roman"/>
+          <w:color w:val="BBBEBF"/>
+          <w:sz w:val="21"/>
+          <w:szCs w:val="21"/>
+        </w:rPr>
+        <w:t>.</w:t>
+      </w:r>
+      <w:r>
+        <w:rPr>
+          <w:rFonts w:ascii="Consolas" w:eastAsia="Times New Roman" w:hAnsi="Consolas" w:cs="Times New Roman"/>
+          <w:color w:val="D2A8FF"/>
+          <w:sz w:val="21"/>
+          <w:szCs w:val="21"/>
+        </w:rPr>
+        <w:t>withdraw</w:t>
+      </w:r>
+      <w:proofErr w:type="spellEnd"/>
+      <w:r>
+        <w:rPr>
+          <w:rFonts w:ascii="Consolas" w:eastAsia="Times New Roman" w:hAnsi="Consolas" w:cs="Times New Roman"/>
+          <w:color w:val="BBBEBF"/>
+          <w:sz w:val="21"/>
+          <w:szCs w:val="21"/>
+        </w:rPr>
+        <w:t>(</w:t>
+      </w:r>
+      <w:r>
+        <w:rPr>
+          <w:rFonts w:ascii="Consolas" w:eastAsia="Times New Roman" w:hAnsi="Consolas" w:cs="Times New Roman"/>
+          <w:color w:val="B5CEA8"/>
+          <w:sz w:val="21"/>
+          <w:szCs w:val="21"/>
+        </w:rPr>
+        <w:t>150</w:t>
+      </w:r>
+      <w:r>
+        <w:rPr>
+          <w:rFonts w:ascii="Consolas" w:eastAsia="Times New Roman" w:hAnsi="Consolas" w:cs="Times New Roman"/>
+          <w:color w:val="BBBEBF"/>
+          <w:sz w:val="21"/>
+          <w:szCs w:val="21"/>
+        </w:rPr>
+        <w:t>);</w:t>
+      </w:r>
+    </w:p>
+    <w:p>
+      <w:pPr>
+        <w:shd w:val="clear" w:color="auto" w:fill="121314"/>
+        <w:spacing w:after="0" w:line="285" w:lineRule="atLeast"/>
+        <w:rPr>
+          <w:rFonts w:ascii="Consolas" w:eastAsia="Times New Roman" w:hAnsi="Consolas" w:cs="Times New Roman"/>
+          <w:color w:val="BBBEBF"/>
+          <w:sz w:val="21"/>
+          <w:szCs w:val="21"/>
+        </w:rPr>
+      </w:pPr>
+      <w:r>
+        <w:rPr>
+          <w:rFonts w:ascii="Consolas" w:eastAsia="Times New Roman" w:hAnsi="Consolas" w:cs="Times New Roman"/>
+          <w:color w:val="BBBEBF"/>
+          <w:sz w:val="21"/>
+          <w:szCs w:val="21"/>
+        </w:rPr>
+        <w:t xml:space="preserve">        } </w:t>
+      </w:r>
+      <w:r>
+        <w:rPr>
+          <w:rFonts w:ascii="Consolas" w:eastAsia="Times New Roman" w:hAnsi="Consolas" w:cs="Times New Roman"/>
+          <w:color w:val="C586C0"/>
+          <w:sz w:val="21"/>
+          <w:szCs w:val="21"/>
+        </w:rPr>
+        <w:t>catch</w:t>
+      </w:r>
+      <w:r>
+        <w:rPr>
+          <w:rFonts w:ascii="Consolas" w:eastAsia="Times New Roman" w:hAnsi="Consolas" w:cs="Times New Roman"/>
+          <w:color w:val="BBBEBF"/>
+          <w:sz w:val="21"/>
+          <w:szCs w:val="21"/>
+        </w:rPr>
+        <w:t xml:space="preserve"> (</w:t>
+      </w:r>
+      <w:proofErr w:type="spellStart"/>
+      <w:r>
+        <w:rPr>
+          <w:rFonts w:ascii="Consolas" w:eastAsia="Times New Roman" w:hAnsi="Consolas" w:cs="Times New Roman"/>
+          <w:color w:val="4EC9B0"/>
+          <w:sz w:val="21"/>
+          <w:szCs w:val="21"/>
+        </w:rPr>
+        <w:t>InsufficientFundsException</w:t>
+      </w:r>
+      <w:proofErr w:type="spellEnd"/>
+      <w:r>
+        <w:rPr>
+          <w:rFonts w:ascii="Consolas" w:eastAsia="Times New Roman" w:hAnsi="Consolas" w:cs="Times New Roman"/>
+          <w:color w:val="BBBEBF"/>
+          <w:sz w:val="21"/>
+          <w:szCs w:val="21"/>
+        </w:rPr>
+        <w:t xml:space="preserve"> </w:t>
+      </w:r>
+      <w:r>
+        <w:rPr>
+          <w:rFonts w:ascii="Consolas" w:eastAsia="Times New Roman" w:hAnsi="Consolas" w:cs="Times New Roman"/>
+          <w:color w:val="C9D1D9"/>
+          <w:sz w:val="21"/>
+          <w:szCs w:val="21"/>
+        </w:rPr>
+        <w:t>e</w:t>
+      </w:r>
+      <w:r>
+        <w:rPr>
+          <w:rFonts w:ascii="Consolas" w:eastAsia="Times New Roman" w:hAnsi="Consolas" w:cs="Times New Roman"/>
+          <w:color w:val="BBBEBF"/>
+          <w:sz w:val="21"/>
+          <w:szCs w:val="21"/>
+        </w:rPr>
+        <w:t>) {</w:t>
+      </w:r>
+    </w:p>
+    <w:p>
+      <w:pPr>
+        <w:shd w:val="clear" w:color="auto" w:fill="121314"/>
+        <w:spacing w:after="0" w:line="285" w:lineRule="atLeast"/>
+        <w:rPr>
+          <w:rFonts w:ascii="Consolas" w:eastAsia="Times New Roman" w:hAnsi="Consolas" w:cs="Times New Roman"/>
+          <w:color w:val="BBBEBF"/>
+          <w:sz w:val="21"/>
+          <w:szCs w:val="21"/>
+        </w:rPr>
+      </w:pPr>
+      <w:r>
+        <w:rPr>
+          <w:rFonts w:ascii="Consolas" w:eastAsia="Times New Roman" w:hAnsi="Consolas" w:cs="Times New Roman"/>
+          <w:color w:val="BBBEBF"/>
+          <w:sz w:val="21"/>
+          <w:szCs w:val="21"/>
+        </w:rPr>
+        <w:t xml:space="preserve">            </w:t>
+      </w:r>
+      <w:proofErr w:type="spellStart"/>
+      <w:r>
+        <w:rPr>
+          <w:rFonts w:ascii="Consolas" w:eastAsia="Times New Roman" w:hAnsi="Consolas" w:cs="Times New Roman"/>
+          <w:color w:val="4EC9B0"/>
+          <w:sz w:val="21"/>
+          <w:szCs w:val="21"/>
+        </w:rPr>
+        <w:t>System</w:t>
+      </w:r>
+      <w:r>
+        <w:rPr>
+          <w:rFonts w:ascii="Consolas" w:eastAsia="Times New Roman" w:hAnsi="Consolas" w:cs="Times New Roman"/>
+          <w:color w:val="BBBEBF"/>
+          <w:sz w:val="21"/>
+          <w:szCs w:val="21"/>
+        </w:rPr>
+        <w:t>.</w:t>
+      </w:r>
+      <w:r>
+        <w:rPr>
+          <w:rFonts w:ascii="Consolas" w:eastAsia="Times New Roman" w:hAnsi="Consolas" w:cs="Times New Roman"/>
+          <w:color w:val="79C0FF"/>
+          <w:sz w:val="21"/>
+          <w:szCs w:val="21"/>
+        </w:rPr>
+        <w:t>out</w:t>
+      </w:r>
+      <w:r>
+        <w:rPr>
+          <w:rFonts w:ascii="Consolas" w:eastAsia="Times New Roman" w:hAnsi="Consolas" w:cs="Times New Roman"/>
+          <w:color w:val="BBBEBF"/>
+          <w:sz w:val="21"/>
+          <w:szCs w:val="21"/>
+        </w:rPr>
+        <w:t>.</w:t>
+      </w:r>
+      <w:r>
+        <w:rPr>
+          <w:rFonts w:ascii="Consolas" w:eastAsia="Times New Roman" w:hAnsi="Consolas" w:cs="Times New Roman"/>
+          <w:color w:val="D2A8FF"/>
+          <w:sz w:val="21"/>
+          <w:szCs w:val="21"/>
+        </w:rPr>
+        <w:t>println</w:t>
+      </w:r>
+      <w:proofErr w:type="spellEnd"/>
+      <w:r>
+        <w:rPr>
+          <w:rFonts w:ascii="Consolas" w:eastAsia="Times New Roman" w:hAnsi="Consolas" w:cs="Times New Roman"/>
+          <w:color w:val="BBBEBF"/>
+          <w:sz w:val="21"/>
+          <w:szCs w:val="21"/>
+        </w:rPr>
+        <w:t>(</w:t>
+      </w:r>
+      <w:proofErr w:type="spellStart"/>
+      <w:r>
+        <w:rPr>
+          <w:rFonts w:ascii="Consolas" w:eastAsia="Times New Roman" w:hAnsi="Consolas" w:cs="Times New Roman"/>
+          <w:color w:val="C9D1D9"/>
+          <w:sz w:val="21"/>
+          <w:szCs w:val="21"/>
+        </w:rPr>
+        <w:t>e</w:t>
+      </w:r>
+      <w:r>
+        <w:rPr>
+          <w:rFonts w:ascii="Consolas" w:eastAsia="Times New Roman" w:hAnsi="Consolas" w:cs="Times New Roman"/>
+          <w:color w:val="BBBEBF"/>
+          <w:sz w:val="21"/>
+          <w:szCs w:val="21"/>
+        </w:rPr>
+        <w:t>.</w:t>
+      </w:r>
+      <w:r>
+        <w:rPr>
+          <w:rFonts w:ascii="Consolas" w:eastAsia="Times New Roman" w:hAnsi="Consolas" w:cs="Times New Roman"/>
+          <w:color w:val="D2A8FF"/>
+          <w:sz w:val="21"/>
+          <w:szCs w:val="21"/>
+        </w:rPr>
+        <w:t>getMessage</w:t>
+      </w:r>
+      <w:proofErr w:type="spellEnd"/>
+      <w:r>
+        <w:rPr>
+          <w:rFonts w:ascii="Consolas" w:eastAsia="Times New Roman" w:hAnsi="Consolas" w:cs="Times New Roman"/>
+          <w:color w:val="BBBEBF"/>
+          <w:sz w:val="21"/>
+          <w:szCs w:val="21"/>
+        </w:rPr>
+        <w:t>());</w:t>
+      </w:r>
+    </w:p>
+    <w:p>
+      <w:pPr>
+        <w:shd w:val="clear" w:color="auto" w:fill="121314"/>
+        <w:spacing w:after="0" w:line="285" w:lineRule="atLeast"/>
+        <w:rPr>
+          <w:rFonts w:ascii="Consolas" w:eastAsia="Times New Roman" w:hAnsi="Consolas" w:cs="Times New Roman"/>
+          <w:color w:val="BBBEBF"/>
+          <w:sz w:val="21"/>
+          <w:szCs w:val="21"/>
+        </w:rPr>
+      </w:pPr>
+      <w:r>
+        <w:rPr>
+          <w:rFonts w:ascii="Consolas" w:eastAsia="Times New Roman" w:hAnsi="Consolas" w:cs="Times New Roman"/>
+          <w:color w:val="BBBEBF"/>
+          <w:sz w:val="21"/>
+          <w:szCs w:val="21"/>
+        </w:rPr>
+        <w:t>        }</w:t>
+      </w:r>
+    </w:p>
+    <w:p>
+      <w:pPr>
+        <w:shd w:val="clear" w:color="auto" w:fill="121314"/>
+        <w:spacing w:after="0" w:line="285" w:lineRule="atLeast"/>
+        <w:rPr>
+          <w:rFonts w:ascii="Consolas" w:eastAsia="Times New Roman" w:hAnsi="Consolas" w:cs="Times New Roman"/>
+          <w:color w:val="BBBEBF"/>
+          <w:sz w:val="21"/>
+          <w:szCs w:val="21"/>
+        </w:rPr>
+      </w:pPr>
+      <w:r>
+        <w:rPr>
+          <w:rFonts w:ascii="Consolas" w:eastAsia="Times New Roman" w:hAnsi="Consolas" w:cs="Times New Roman"/>
+          <w:color w:val="BBBEBF"/>
+          <w:sz w:val="21"/>
+          <w:szCs w:val="21"/>
+        </w:rPr>
+        <w:t xml:space="preserve">        </w:t>
+      </w:r>
+      <w:r>
+        <w:rPr>
+          <w:rFonts w:ascii="Consolas" w:eastAsia="Times New Roman" w:hAnsi="Consolas" w:cs="Times New Roman"/>
+          <w:color w:val="8B949E"/>
+          <w:sz w:val="21"/>
+          <w:szCs w:val="21"/>
+        </w:rPr>
+        <w:t>// A rejected withdrawal leaves the balance unchanged.</w:t>
+      </w:r>
+    </w:p>
+    <w:p>
+      <w:pPr>
+        <w:shd w:val="clear" w:color="auto" w:fill="121314"/>
+        <w:spacing w:after="0" w:line="285" w:lineRule="atLeast"/>
+        <w:rPr>
+          <w:rFonts w:ascii="Consolas" w:eastAsia="Times New Roman" w:hAnsi="Consolas" w:cs="Times New Roman"/>
+          <w:color w:val="BBBEBF"/>
+          <w:sz w:val="21"/>
+          <w:szCs w:val="21"/>
+        </w:rPr>
+      </w:pPr>
+      <w:r>
+        <w:rPr>
+          <w:rFonts w:ascii="Consolas" w:eastAsia="Times New Roman" w:hAnsi="Consolas" w:cs="Times New Roman"/>
+          <w:color w:val="BBBEBF"/>
+          <w:sz w:val="21"/>
+          <w:szCs w:val="21"/>
+        </w:rPr>
+        <w:t xml:space="preserve">        </w:t>
+      </w:r>
+      <w:proofErr w:type="spellStart"/>
+      <w:r>
+        <w:rPr>
+          <w:rFonts w:ascii="Consolas" w:eastAsia="Times New Roman" w:hAnsi="Consolas" w:cs="Times New Roman"/>
+          <w:color w:val="4EC9B0"/>
+          <w:sz w:val="21"/>
+          <w:szCs w:val="21"/>
+        </w:rPr>
+        <w:t>System</w:t>
+      </w:r>
+      <w:r>
+        <w:rPr>
+          <w:rFonts w:ascii="Consolas" w:eastAsia="Times New Roman" w:hAnsi="Consolas" w:cs="Times New Roman"/>
+          <w:color w:val="BBBEBF"/>
+          <w:sz w:val="21"/>
+          <w:szCs w:val="21"/>
+        </w:rPr>
+        <w:t>.</w:t>
+      </w:r>
+      <w:r>
+        <w:rPr>
+          <w:rFonts w:ascii="Consolas" w:eastAsia="Times New Roman" w:hAnsi="Consolas" w:cs="Times New Roman"/>
+          <w:color w:val="79C0FF"/>
+          <w:sz w:val="21"/>
+          <w:szCs w:val="21"/>
+        </w:rPr>
+        <w:t>out</w:t>
+      </w:r>
+      <w:r>
+        <w:rPr>
+          <w:rFonts w:ascii="Consolas" w:eastAsia="Times New Roman" w:hAnsi="Consolas" w:cs="Times New Roman"/>
+          <w:color w:val="BBBEBF"/>
+          <w:sz w:val="21"/>
+          <w:szCs w:val="21"/>
+        </w:rPr>
+        <w:t>.</w:t>
+      </w:r>
+      <w:r>
+        <w:rPr>
+          <w:rFonts w:ascii="Consolas" w:eastAsia="Times New Roman" w:hAnsi="Consolas" w:cs="Times New Roman"/>
+          <w:color w:val="D2A8FF"/>
+          <w:sz w:val="21"/>
+          <w:szCs w:val="21"/>
+        </w:rPr>
+        <w:t>println</w:t>
+      </w:r>
+      <w:proofErr w:type="spellEnd"/>
+      <w:r>
+        <w:rPr>
+          <w:rFonts w:ascii="Consolas" w:eastAsia="Times New Roman" w:hAnsi="Consolas" w:cs="Times New Roman"/>
+          <w:color w:val="BBBEBF"/>
+          <w:sz w:val="21"/>
+          <w:szCs w:val="21"/>
+        </w:rPr>
+        <w:t>(</w:t>
+      </w:r>
+      <w:r>
+        <w:rPr>
+          <w:rFonts w:ascii="Consolas" w:eastAsia="Times New Roman" w:hAnsi="Consolas" w:cs="Times New Roman"/>
+          <w:color w:val="A5D6FF"/>
+          <w:sz w:val="21"/>
+          <w:szCs w:val="21"/>
+        </w:rPr>
+        <w:t>"Balance: "</w:t>
+      </w:r>
+      <w:r>
+        <w:rPr>
+          <w:rFonts w:ascii="Consolas" w:eastAsia="Times New Roman" w:hAnsi="Consolas" w:cs="Times New Roman"/>
+          <w:color w:val="BBBEBF"/>
+          <w:sz w:val="21"/>
+          <w:szCs w:val="21"/>
+        </w:rPr>
+        <w:t xml:space="preserve"> </w:t>
+      </w:r>
+      <w:r>
+        <w:rPr>
+          <w:rFonts w:ascii="Consolas" w:eastAsia="Times New Roman" w:hAnsi="Consolas" w:cs="Times New Roman"/>
+          <w:color w:val="D4D4D4"/>
+          <w:sz w:val="21"/>
+          <w:szCs w:val="21"/>
+        </w:rPr>
+        <w:t>+</w:t>
+      </w:r>
+      <w:r>
+        <w:rPr>
+          <w:rFonts w:ascii="Consolas" w:eastAsia="Times New Roman" w:hAnsi="Consolas" w:cs="Times New Roman"/>
+          <w:color w:val="BBBEBF"/>
+          <w:sz w:val="21"/>
+          <w:szCs w:val="21"/>
+        </w:rPr>
+        <w:t xml:space="preserve"> </w:t>
+      </w:r>
+      <w:proofErr w:type="spellStart"/>
+      <w:r>
+        <w:rPr>
+          <w:rFonts w:ascii="Consolas" w:eastAsia="Times New Roman" w:hAnsi="Consolas" w:cs="Times New Roman"/>
+          <w:color w:val="C9D1D9"/>
+          <w:sz w:val="21"/>
+          <w:szCs w:val="21"/>
+        </w:rPr>
+        <w:t>account</w:t>
+      </w:r>
+      <w:r>
+        <w:rPr>
+          <w:rFonts w:ascii="Consolas" w:eastAsia="Times New Roman" w:hAnsi="Consolas" w:cs="Times New Roman"/>
+          <w:color w:val="BBBEBF"/>
+          <w:sz w:val="21"/>
+          <w:szCs w:val="21"/>
+        </w:rPr>
+        <w:t>.</w:t>
+      </w:r>
+      <w:r>
+        <w:rPr>
+          <w:rFonts w:ascii="Consolas" w:eastAsia="Times New Roman" w:hAnsi="Consolas" w:cs="Times New Roman"/>
+          <w:color w:val="C9D1D9"/>
+          <w:sz w:val="21"/>
+          <w:szCs w:val="21"/>
+        </w:rPr>
+        <w:t>balance</w:t>
+      </w:r>
+      <w:proofErr w:type="spellEnd"/>
+      <w:r>
+        <w:rPr>
+          <w:rFonts w:ascii="Consolas" w:eastAsia="Times New Roman" w:hAnsi="Consolas" w:cs="Times New Roman"/>
+          <w:color w:val="BBBEBF"/>
+          <w:sz w:val="21"/>
+          <w:szCs w:val="21"/>
+        </w:rPr>
+        <w:t>);</w:t>
+      </w:r>
+    </w:p>
+    <w:p>
+      <w:pPr>
+        <w:shd w:val="clear" w:color="auto" w:fill="121314"/>
+        <w:spacing w:after="0" w:line="285" w:lineRule="atLeast"/>
+        <w:rPr>
+          <w:rFonts w:ascii="Consolas" w:eastAsia="Times New Roman" w:hAnsi="Consolas" w:cs="Times New Roman"/>
+          <w:color w:val="BBBEBF"/>
+          <w:sz w:val="21"/>
+          <w:szCs w:val="21"/>
+        </w:rPr>
+      </w:pPr>
+      <w:r>
+        <w:rPr>
+          <w:rFonts w:ascii="Consolas" w:eastAsia="Times New Roman" w:hAnsi="Consolas" w:cs="Times New Roman"/>
+          <w:color w:val="BBBEBF"/>
+          <w:sz w:val="21"/>
+          <w:szCs w:val="21"/>
+        </w:rPr>
+        <w:t>    }</w:t>
+      </w:r>
+    </w:p>
+    <w:p>
+      <w:pPr>
+        <w:shd w:val="clear" w:color="auto" w:fill="121314"/>
+        <w:spacing w:after="0" w:line="285" w:lineRule="atLeast"/>
+        <w:rPr>
+          <w:rFonts w:ascii="Consolas" w:eastAsia="Times New Roman" w:hAnsi="Consolas" w:cs="Times New Roman"/>
+          <w:color w:val="BBBEBF"/>
+          <w:sz w:val="21"/>
+          <w:szCs w:val="21"/>
+        </w:rPr>
+      </w:pPr>
+      <w:r>
+        <w:rPr>
+          <w:rFonts w:ascii="Consolas" w:eastAsia="Times New Roman" w:hAnsi="Consolas" w:cs="Times New Roman"/>
+          <w:color w:val="BBBEBF"/>
+          <w:sz w:val="21"/>
+          <w:szCs w:val="21"/>
+        </w:rPr>
+        <w:t>}</w:t>
+      </w:r>
+    </w:p>
+    <w:p>
+      <w:pPr>
+        <w:shd w:val="clear" w:color="auto" w:fill="121314"/>
+        <w:spacing w:after="0" w:line="285" w:lineRule="atLeast"/>
+        <w:rPr>
+          <w:rFonts w:ascii="Consolas" w:eastAsia="Times New Roman" w:hAnsi="Consolas" w:cs="Times New Roman"/>
+          <w:color w:val="BBBEBF"/>
+          <w:sz w:val="21"/>
+          <w:szCs w:val="21"/>
+        </w:rPr>
+      </w:pPr>
+    </w:p>
+    <w:p>
+      <w:r>
+        <w:t>Expected output (sample):</w:t>
+      </w:r>
+    </w:p>
+    <w:p>
       <w:r>
         <w:rPr>
           <w:rFonts w:ascii="Consolas" w:hAnsi="Consolas"/>
           <w:sz w:val="16"/>
         </w:rPr>
-        <w:t>public class Exercise4WithdrawException {</w:t>
+        <w:drawing>
+          <wp:inline distT="0" distB="0" distL="0" distR="0" wp14:anchorId="44123075" wp14:editId="584B7FC2">
+            <wp:extent cx="5486400" cy="991235"/>
+            <wp:effectExtent l="0" t="0" r="0" b="0"/>
+            <wp:docPr id="92557791" name="Picture 1"/>
+            <wp:cNvGraphicFramePr>
+              <a:graphicFrameLocks xmlns:a="http://schemas.openxmlformats.org/drawingml/2006/main" noChangeAspect="1"/>
+            </wp:cNvGraphicFramePr>
+            <a:graphic xmlns:a="http://schemas.openxmlformats.org/drawingml/2006/main">
+              <a:graphicData uri="http://schemas.openxmlformats.org/drawingml/2006/picture">
+                <pic:pic xmlns:pic="http://schemas.openxmlformats.org/drawingml/2006/picture">
+                  <pic:nvPicPr>
+                    <pic:cNvPr id="92557791" name=""/>
+                    <pic:cNvPicPr/>
+                  </pic:nvPicPr>
+                  <pic:blipFill>
+                    <a:blip r:embed="rId9"/>
+                    <a:stretch>
+                      <a:fillRect/>
+                    </a:stretch>
+                  </pic:blipFill>
+                  <pic:spPr>
+                    <a:xfrm>
+                      <a:off x="0" y="0"/>
+                      <a:ext cx="5486400" cy="991235"/>
+                    </a:xfrm>
+                    <a:prstGeom prst="rect">
+                      <a:avLst/>
+                    </a:prstGeom>
+                  </pic:spPr>
+                </pic:pic>
+              </a:graphicData>
+            </a:graphic>
+          </wp:inline>
+        </w:drawing>
+      </w:r>
+      <w:r>
+        <w:t>Explanation: An exception gives the caller a clear reason for failure. A boolean return is simpler but carries less detail.</w:t>
       </w:r>
     </w:p>
     <w:p>
       <w:pPr>
+        <w:pStyle w:val="Heading1"/>
+      </w:pPr>
+      <w:r>
+        <w:t>Exercise 5</w:t>
+      </w:r>
+    </w:p>
+    <w:p>
+      <w:r>
+        <w:t>Question: Predict a return in try with a print statement in finally.</w:t>
+      </w:r>
+    </w:p>
+    <w:p>
+      <w:r>
+        <w:t>Java source code:</w:t>
+      </w:r>
+    </w:p>
+    <w:p>
+      <w:pPr>
         <w:spacing w:after="0"/>
       </w:pPr>
       <w:r>
@@ -4359,7 +6407,7 @@
           <w:rFonts w:ascii="Consolas" w:hAnsi="Consolas"/>
           <w:sz w:val="16"/>
         </w:rPr>
-        <w:t xml:space="preserve">    static class InsufficientFundsException extends Exception { InsufficientFundsException(String message){super(message);} }</w:t>
+        <w:t>public class Exercise5FinallyReturn {</w:t>
       </w:r>
     </w:p>
     <w:p>
@@ -4371,7 +6419,7 @@
           <w:rFonts w:ascii="Consolas" w:hAnsi="Consolas"/>
           <w:sz w:val="16"/>
         </w:rPr>
-        <w:t xml:space="preserve">    static class BankAccount { double balance; BankAccount(double b){balance=b;} void withdraw(double amount) throws InsufficientFundsException { if(amount&gt;balance) throw new InsufficientFundsException("Insufficient funds"); balance-=amount; } }</w:t>
+        <w:t xml:space="preserve">    static int example() { try { System.out.println("Inside try"); return 5; } finally { System.out.println("Inside finally"); } }</w:t>
       </w:r>
     </w:p>
     <w:p>
@@ -4383,7 +6431,7 @@
           <w:rFonts w:ascii="Consolas" w:hAnsi="Consolas"/>
           <w:sz w:val="16"/>
         </w:rPr>
-        <w:t xml:space="preserve">    public static void main(String[] args) { BankAccount a=new BankAccount(100); try { a.withdraw(150); } catch(InsufficientFundsException e) { System.out.println(e.getMessage()); } System.out.println("Balance: "+a.balance); }</w:t>
+        <w:t xml:space="preserve">    public static void main(String[] args) { System.out.println("Returned: "+example()); }</w:t>
       </w:r>
     </w:p>
     <w:p>
@@ -4412,7 +6460,7 @@
           <w:rFonts w:ascii="Consolas" w:hAnsi="Consolas"/>
           <w:sz w:val="16"/>
         </w:rPr>
-        <w:t>Insufficient funds</w:t>
+        <w:t>Inside try</w:t>
       </w:r>
     </w:p>
     <w:p>
@@ -4424,140 +6472,27 @@
           <w:rFonts w:ascii="Consolas" w:hAnsi="Consolas"/>
           <w:sz w:val="16"/>
         </w:rPr>
-        <w:t>Balance: 100.0</w:t>
+        <w:t>Inside finally</w:t>
       </w:r>
     </w:p>
     <w:p>
-      <w:r>
-        <w:t>Explanation: An exception gives the caller a clear reason for failure. A boolean return is simpler but carries less detail.</w:t>
+      <w:pPr>
+        <w:spacing w:after="0"/>
+      </w:pPr>
+      <w:r>
+        <w:rPr>
+          <w:rFonts w:ascii="Consolas" w:hAnsi="Consolas"/>
+          <w:sz w:val="16"/>
+        </w:rPr>
+        <w:t>Returned: 5</w:t>
       </w:r>
     </w:p>
     <w:p>
-      <w:pPr>
-        <w:pStyle w:val="Heading1"/>
-      </w:pPr>
-      <w:r>
-        <w:t>Exercise 5</w:t>
+      <w:r>
+        <w:t>Explanation: finally executes before the method returns, so its message prints before the caller prints the returned value.</w:t>
       </w:r>
     </w:p>
-    <w:p>
-      <w:r>
-        <w:t>Question: Predict a return in try with a print statement in finally.</w:t>
-      </w:r>
-    </w:p>
-    <w:p>
-      <w:r>
-        <w:t>Java source code:</w:t>
-      </w:r>
-    </w:p>
-    <w:p>
-      <w:pPr>
-        <w:spacing w:after="0"/>
-      </w:pPr>
-      <w:r>
-        <w:rPr>
-          <w:rFonts w:ascii="Consolas" w:hAnsi="Consolas"/>
-          <w:sz w:val="16"/>
-        </w:rPr>
-        <w:t>public class Exercise5FinallyReturn {</w:t>
-      </w:r>
-    </w:p>
-    <w:p>
-      <w:pPr>
-        <w:spacing w:after="0"/>
-      </w:pPr>
-      <w:r>
-        <w:rPr>
-          <w:rFonts w:ascii="Consolas" w:hAnsi="Consolas"/>
-          <w:sz w:val="16"/>
-        </w:rPr>
-        <w:t xml:space="preserve">    static int example() { try { System.out.println("Inside try"); return 5; } finally { System.out.println("Inside finally"); } }</w:t>
-      </w:r>
-    </w:p>
-    <w:p>
-      <w:pPr>
-        <w:spacing w:after="0"/>
-      </w:pPr>
-      <w:r>
-        <w:rPr>
-          <w:rFonts w:ascii="Consolas" w:hAnsi="Consolas"/>
-          <w:sz w:val="16"/>
-        </w:rPr>
-        <w:lastRenderedPageBreak/>
-        <w:t xml:space="preserve">    public static void main(String[] args) { System.out.println("Returned: "+example()); }</w:t>
-      </w:r>
-    </w:p>
-    <w:p>
-      <w:pPr>
-        <w:spacing w:after="0"/>
-      </w:pPr>
-      <w:r>
-        <w:rPr>
-          <w:rFonts w:ascii="Consolas" w:hAnsi="Consolas"/>
-          <w:sz w:val="16"/>
-        </w:rPr>
-        <w:t>}</w:t>
-      </w:r>
-    </w:p>
-    <w:p>
-      <w:r>
-        <w:t>Expected output (sample):</w:t>
-      </w:r>
-    </w:p>
-    <w:p>
-      <w:pPr>
-        <w:spacing w:after="0"/>
-      </w:pPr>
-      <w:r>
-        <w:rPr>
-          <w:rFonts w:ascii="Consolas" w:hAnsi="Consolas"/>
-          <w:sz w:val="16"/>
-        </w:rPr>
-        <w:t>Inside try</w:t>
-      </w:r>
-    </w:p>
-    <w:p>
-      <w:pPr>
-        <w:spacing w:after="0"/>
-      </w:pPr>
-      <w:r>
-        <w:rPr>
-          <w:rFonts w:ascii="Consolas" w:hAnsi="Consolas"/>
-          <w:sz w:val="16"/>
-        </w:rPr>
-        <w:t>Inside finally</w:t>
-      </w:r>
-    </w:p>
-    <w:p>
-      <w:pPr>
-        <w:spacing w:after="0"/>
-      </w:pPr>
-      <w:r>
-        <w:rPr>
-          <w:rFonts w:ascii="Consolas" w:hAnsi="Consolas"/>
-          <w:sz w:val="16"/>
-        </w:rPr>
-        <w:t>Returned: 5</w:t>
-      </w:r>
-    </w:p>
-    <w:p>
-      <w:r>
-        <w:t>Explanation: finally executes before the method returns, so its message prints before the caller prints the returned value.</w:t>
-      </w:r>
-    </w:p>
-    <w:p>
-      <w:pPr>
-        <w:pStyle w:val="Heading1"/>
-      </w:pPr>
-      <w:r>
-        <w:t>How to run</w:t>
-      </w:r>
-    </w:p>
-    <w:p>
-      <w:r>
-        <w:t>Open the Java_Files folder in IntelliJ IDEA. Open the exercise file and run its main() method. Alternatively, open a terminal in Java_Files and run: javac ExerciseFile.java, then java ExerciseClassName. JDK 17 or later is recommended.</w:t>
-      </w:r>
-    </w:p>
+    <w:p/>
     <w:sectPr>
       <w:pgSz w:w="12240" w:h="15840"/>
       <w:pgMar w:top="936" w:right="1800" w:bottom="936" w:left="1800" w:header="720" w:footer="720" w:gutter="0"/>

</xml_diff>

<commit_message>
refactor: add comments to clarify try-finally behavior in Exercise5FinallyReturn
</commit_message>
<xml_diff>
--- a/Lab_07/LAB Exercises report  (7).docx
+++ b/Lab_07/LAB Exercises report  (7).docx
@@ -58,7 +58,6 @@
         </w:rPr>
         <w:t xml:space="preserve"> </w:t>
       </w:r>
-      <w:proofErr w:type="spellStart"/>
       <w:r>
         <w:rPr>
           <w:rFonts w:ascii="Consolas" w:eastAsia="Times New Roman" w:hAnsi="Consolas" w:cs="Times New Roman"/>
@@ -86,7 +85,6 @@
         </w:rPr>
         <w:t>util</w:t>
       </w:r>
-      <w:proofErr w:type="spellEnd"/>
       <w:r>
         <w:rPr>
           <w:rFonts w:ascii="Consolas" w:eastAsia="Times New Roman" w:hAnsi="Consolas" w:cs="Times New Roman"/>
@@ -315,7 +313,6 @@
         </w:rPr>
         <w:t xml:space="preserve">[] </w:t>
       </w:r>
-      <w:proofErr w:type="spellStart"/>
       <w:r>
         <w:rPr>
           <w:rFonts w:ascii="Consolas" w:eastAsia="Times New Roman" w:hAnsi="Consolas" w:cs="Times New Roman"/>
@@ -325,7 +322,6 @@
         </w:rPr>
         <w:t>args</w:t>
       </w:r>
-      <w:proofErr w:type="spellEnd"/>
       <w:r>
         <w:rPr>
           <w:rFonts w:ascii="Consolas" w:eastAsia="Times New Roman" w:hAnsi="Consolas" w:cs="Times New Roman"/>
@@ -392,7 +388,6 @@
         </w:rPr>
         <w:t xml:space="preserve"> </w:t>
       </w:r>
-      <w:proofErr w:type="spellStart"/>
       <w:r>
         <w:rPr>
           <w:rFonts w:ascii="Consolas" w:eastAsia="Times New Roman" w:hAnsi="Consolas" w:cs="Times New Roman"/>
@@ -402,7 +397,6 @@
         </w:rPr>
         <w:t>scanner</w:t>
       </w:r>
-      <w:proofErr w:type="spellEnd"/>
       <w:r>
         <w:rPr>
           <w:rFonts w:ascii="Consolas" w:eastAsia="Times New Roman" w:hAnsi="Consolas" w:cs="Times New Roman"/>
@@ -553,7 +547,6 @@
         </w:rPr>
         <w:t xml:space="preserve">            </w:t>
       </w:r>
-      <w:proofErr w:type="spellStart"/>
       <w:r>
         <w:rPr>
           <w:rFonts w:ascii="Consolas" w:eastAsia="Times New Roman" w:hAnsi="Consolas" w:cs="Times New Roman"/>
@@ -599,7 +592,6 @@
         </w:rPr>
         <w:t>print</w:t>
       </w:r>
-      <w:proofErr w:type="spellEnd"/>
       <w:r>
         <w:rPr>
           <w:rFonts w:ascii="Consolas" w:eastAsia="Times New Roman" w:hAnsi="Consolas" w:cs="Times New Roman"/>
@@ -702,7 +694,6 @@
         </w:rPr>
         <w:t xml:space="preserve"> </w:t>
       </w:r>
-      <w:proofErr w:type="spellStart"/>
       <w:r>
         <w:rPr>
           <w:rFonts w:ascii="Consolas" w:eastAsia="Times New Roman" w:hAnsi="Consolas" w:cs="Times New Roman"/>
@@ -730,7 +721,6 @@
         </w:rPr>
         <w:t>nextInt</w:t>
       </w:r>
-      <w:proofErr w:type="spellEnd"/>
       <w:r>
         <w:rPr>
           <w:rFonts w:ascii="Consolas" w:eastAsia="Times New Roman" w:hAnsi="Consolas" w:cs="Times New Roman"/>
@@ -761,7 +751,6 @@
         </w:rPr>
         <w:t xml:space="preserve">            </w:t>
       </w:r>
-      <w:proofErr w:type="spellStart"/>
       <w:r>
         <w:rPr>
           <w:rFonts w:ascii="Consolas" w:eastAsia="Times New Roman" w:hAnsi="Consolas" w:cs="Times New Roman"/>
@@ -807,7 +796,6 @@
         </w:rPr>
         <w:t>print</w:t>
       </w:r>
-      <w:proofErr w:type="spellEnd"/>
       <w:r>
         <w:rPr>
           <w:rFonts w:ascii="Consolas" w:eastAsia="Times New Roman" w:hAnsi="Consolas" w:cs="Times New Roman"/>
@@ -910,7 +898,6 @@
         </w:rPr>
         <w:t xml:space="preserve"> </w:t>
       </w:r>
-      <w:proofErr w:type="spellStart"/>
       <w:r>
         <w:rPr>
           <w:rFonts w:ascii="Consolas" w:eastAsia="Times New Roman" w:hAnsi="Consolas" w:cs="Times New Roman"/>
@@ -938,7 +925,6 @@
         </w:rPr>
         <w:t>nextInt</w:t>
       </w:r>
-      <w:proofErr w:type="spellEnd"/>
       <w:r>
         <w:rPr>
           <w:rFonts w:ascii="Consolas" w:eastAsia="Times New Roman" w:hAnsi="Consolas" w:cs="Times New Roman"/>
@@ -999,7 +985,6 @@
         </w:rPr>
         <w:t xml:space="preserve">            </w:t>
       </w:r>
-      <w:proofErr w:type="spellStart"/>
       <w:r>
         <w:rPr>
           <w:rFonts w:ascii="Consolas" w:eastAsia="Times New Roman" w:hAnsi="Consolas" w:cs="Times New Roman"/>
@@ -1045,7 +1030,6 @@
         </w:rPr>
         <w:t>println</w:t>
       </w:r>
-      <w:proofErr w:type="spellEnd"/>
       <w:r>
         <w:rPr>
           <w:rFonts w:ascii="Consolas" w:eastAsia="Times New Roman" w:hAnsi="Consolas" w:cs="Times New Roman"/>
@@ -1214,7 +1198,6 @@
         </w:rPr>
         <w:t xml:space="preserve"> (</w:t>
       </w:r>
-      <w:proofErr w:type="spellStart"/>
       <w:r>
         <w:rPr>
           <w:rFonts w:ascii="Consolas" w:eastAsia="Times New Roman" w:hAnsi="Consolas" w:cs="Times New Roman"/>
@@ -1224,7 +1207,6 @@
         </w:rPr>
         <w:t>InputMismatchException</w:t>
       </w:r>
-      <w:proofErr w:type="spellEnd"/>
       <w:r>
         <w:rPr>
           <w:rFonts w:ascii="Consolas" w:eastAsia="Times New Roman" w:hAnsi="Consolas" w:cs="Times New Roman"/>
@@ -1273,7 +1255,6 @@
         </w:rPr>
         <w:t xml:space="preserve">            </w:t>
       </w:r>
-      <w:proofErr w:type="spellStart"/>
       <w:r>
         <w:rPr>
           <w:rFonts w:ascii="Consolas" w:eastAsia="Times New Roman" w:hAnsi="Consolas" w:cs="Times New Roman"/>
@@ -1319,7 +1300,6 @@
         </w:rPr>
         <w:t>println</w:t>
       </w:r>
-      <w:proofErr w:type="spellEnd"/>
       <w:r>
         <w:rPr>
           <w:rFonts w:ascii="Consolas" w:eastAsia="Times New Roman" w:hAnsi="Consolas" w:cs="Times New Roman"/>
@@ -1386,7 +1366,6 @@
         </w:rPr>
         <w:t xml:space="preserve"> (</w:t>
       </w:r>
-      <w:proofErr w:type="spellStart"/>
       <w:r>
         <w:rPr>
           <w:rFonts w:ascii="Consolas" w:eastAsia="Times New Roman" w:hAnsi="Consolas" w:cs="Times New Roman"/>
@@ -1396,7 +1375,6 @@
         </w:rPr>
         <w:t>ArithmeticException</w:t>
       </w:r>
-      <w:proofErr w:type="spellEnd"/>
       <w:r>
         <w:rPr>
           <w:rFonts w:ascii="Consolas" w:eastAsia="Times New Roman" w:hAnsi="Consolas" w:cs="Times New Roman"/>
@@ -1475,7 +1453,6 @@
         </w:rPr>
         <w:t xml:space="preserve">            </w:t>
       </w:r>
-      <w:proofErr w:type="spellStart"/>
       <w:r>
         <w:rPr>
           <w:rFonts w:ascii="Consolas" w:eastAsia="Times New Roman" w:hAnsi="Consolas" w:cs="Times New Roman"/>
@@ -1521,7 +1498,6 @@
         </w:rPr>
         <w:t>println</w:t>
       </w:r>
-      <w:proofErr w:type="spellEnd"/>
       <w:r>
         <w:rPr>
           <w:rFonts w:ascii="Consolas" w:eastAsia="Times New Roman" w:hAnsi="Consolas" w:cs="Times New Roman"/>
@@ -1839,7 +1815,6 @@
         </w:rPr>
         <w:t xml:space="preserve"> </w:t>
       </w:r>
-      <w:proofErr w:type="spellStart"/>
       <w:r>
         <w:rPr>
           <w:rFonts w:ascii="Consolas" w:eastAsia="Times New Roman" w:hAnsi="Consolas" w:cs="Times New Roman"/>
@@ -1849,7 +1824,6 @@
         </w:rPr>
         <w:t>printElement</w:t>
       </w:r>
-      <w:proofErr w:type="spellEnd"/>
       <w:r>
         <w:rPr>
           <w:rFonts w:ascii="Consolas" w:eastAsia="Times New Roman" w:hAnsi="Consolas" w:cs="Times New Roman"/>
@@ -2021,7 +1995,6 @@
         </w:rPr>
         <w:t xml:space="preserve">            </w:t>
       </w:r>
-      <w:proofErr w:type="spellStart"/>
       <w:r>
         <w:rPr>
           <w:rFonts w:ascii="Consolas" w:eastAsia="Times New Roman" w:hAnsi="Consolas" w:cs="Times New Roman"/>
@@ -2067,7 +2040,6 @@
         </w:rPr>
         <w:t>println</w:t>
       </w:r>
-      <w:proofErr w:type="spellEnd"/>
       <w:r>
         <w:rPr>
           <w:rFonts w:ascii="Consolas" w:eastAsia="Times New Roman" w:hAnsi="Consolas" w:cs="Times New Roman"/>
@@ -2152,7 +2124,6 @@
         </w:rPr>
         <w:t xml:space="preserve"> (</w:t>
       </w:r>
-      <w:proofErr w:type="spellStart"/>
       <w:r>
         <w:rPr>
           <w:rFonts w:ascii="Consolas" w:eastAsia="Times New Roman" w:hAnsi="Consolas" w:cs="Times New Roman"/>
@@ -2162,7 +2133,6 @@
         </w:rPr>
         <w:t>ArrayIndexOutOfBoundsException</w:t>
       </w:r>
-      <w:proofErr w:type="spellEnd"/>
       <w:r>
         <w:rPr>
           <w:rFonts w:ascii="Consolas" w:eastAsia="Times New Roman" w:hAnsi="Consolas" w:cs="Times New Roman"/>
@@ -2211,7 +2181,6 @@
         </w:rPr>
         <w:t xml:space="preserve">            </w:t>
       </w:r>
-      <w:proofErr w:type="spellStart"/>
       <w:r>
         <w:rPr>
           <w:rFonts w:ascii="Consolas" w:eastAsia="Times New Roman" w:hAnsi="Consolas" w:cs="Times New Roman"/>
@@ -2257,7 +2226,6 @@
         </w:rPr>
         <w:t>println</w:t>
       </w:r>
-      <w:proofErr w:type="spellEnd"/>
       <w:r>
         <w:rPr>
           <w:rFonts w:ascii="Consolas" w:eastAsia="Times New Roman" w:hAnsi="Consolas" w:cs="Times New Roman"/>
@@ -2450,7 +2418,6 @@
         </w:rPr>
         <w:t xml:space="preserve">[] </w:t>
       </w:r>
-      <w:proofErr w:type="spellStart"/>
       <w:r>
         <w:rPr>
           <w:rFonts w:ascii="Consolas" w:eastAsia="Times New Roman" w:hAnsi="Consolas" w:cs="Times New Roman"/>
@@ -2460,7 +2427,6 @@
         </w:rPr>
         <w:t>args</w:t>
       </w:r>
-      <w:proofErr w:type="spellEnd"/>
       <w:r>
         <w:rPr>
           <w:rFonts w:ascii="Consolas" w:eastAsia="Times New Roman" w:hAnsi="Consolas" w:cs="Times New Roman"/>
@@ -2650,7 +2616,6 @@
         </w:rPr>
         <w:t xml:space="preserve">        </w:t>
       </w:r>
-      <w:proofErr w:type="spellStart"/>
       <w:r>
         <w:rPr>
           <w:rFonts w:ascii="Consolas" w:eastAsia="Times New Roman" w:hAnsi="Consolas" w:cs="Times New Roman"/>
@@ -2660,7 +2625,6 @@
         </w:rPr>
         <w:t>printElement</w:t>
       </w:r>
-      <w:proofErr w:type="spellEnd"/>
       <w:r>
         <w:rPr>
           <w:rFonts w:ascii="Consolas" w:eastAsia="Times New Roman" w:hAnsi="Consolas" w:cs="Times New Roman"/>
@@ -2727,7 +2691,6 @@
         </w:rPr>
         <w:t xml:space="preserve">        </w:t>
       </w:r>
-      <w:proofErr w:type="spellStart"/>
       <w:r>
         <w:rPr>
           <w:rFonts w:ascii="Consolas" w:eastAsia="Times New Roman" w:hAnsi="Consolas" w:cs="Times New Roman"/>
@@ -2737,7 +2700,6 @@
         </w:rPr>
         <w:t>printElement</w:t>
       </w:r>
-      <w:proofErr w:type="spellEnd"/>
       <w:r>
         <w:rPr>
           <w:rFonts w:ascii="Consolas" w:eastAsia="Times New Roman" w:hAnsi="Consolas" w:cs="Times New Roman"/>
@@ -2936,7 +2898,6 @@
         </w:rPr>
         <w:t xml:space="preserve"> </w:t>
       </w:r>
-      <w:proofErr w:type="spellStart"/>
       <w:r>
         <w:rPr>
           <w:rFonts w:ascii="Consolas" w:eastAsia="Times New Roman" w:hAnsi="Consolas" w:cs="Times New Roman"/>
@@ -2946,7 +2907,6 @@
         </w:rPr>
         <w:t>InvalidAgeException</w:t>
       </w:r>
-      <w:proofErr w:type="spellEnd"/>
       <w:r>
         <w:rPr>
           <w:rFonts w:ascii="Consolas" w:eastAsia="Times New Roman" w:hAnsi="Consolas" w:cs="Times New Roman"/>
@@ -3013,7 +2973,6 @@
         </w:rPr>
         <w:t xml:space="preserve">    </w:t>
       </w:r>
-      <w:proofErr w:type="spellStart"/>
       <w:r>
         <w:rPr>
           <w:rFonts w:ascii="Consolas" w:eastAsia="Times New Roman" w:hAnsi="Consolas" w:cs="Times New Roman"/>
@@ -3023,7 +2982,6 @@
         </w:rPr>
         <w:t>InvalidAgeException</w:t>
       </w:r>
-      <w:proofErr w:type="spellEnd"/>
       <w:r>
         <w:rPr>
           <w:rFonts w:ascii="Consolas" w:eastAsia="Times New Roman" w:hAnsi="Consolas" w:cs="Times New Roman"/>
@@ -3303,7 +3261,6 @@
         </w:rPr>
         <w:t xml:space="preserve"> </w:t>
       </w:r>
-      <w:proofErr w:type="spellStart"/>
       <w:r>
         <w:rPr>
           <w:rFonts w:ascii="Consolas" w:eastAsia="Times New Roman" w:hAnsi="Consolas" w:cs="Times New Roman"/>
@@ -3313,7 +3270,6 @@
         </w:rPr>
         <w:t>validateAge</w:t>
       </w:r>
-      <w:proofErr w:type="spellEnd"/>
       <w:r>
         <w:rPr>
           <w:rFonts w:ascii="Consolas" w:eastAsia="Times New Roman" w:hAnsi="Consolas" w:cs="Times New Roman"/>
@@ -3377,7 +3333,6 @@
         </w:rPr>
         <w:t xml:space="preserve"> </w:t>
       </w:r>
-      <w:proofErr w:type="spellStart"/>
       <w:r>
         <w:rPr>
           <w:rFonts w:ascii="Consolas" w:eastAsia="Times New Roman" w:hAnsi="Consolas" w:cs="Times New Roman"/>
@@ -3387,7 +3342,6 @@
         </w:rPr>
         <w:t>InvalidAgeException</w:t>
       </w:r>
-      <w:proofErr w:type="spellEnd"/>
       <w:r>
         <w:rPr>
           <w:rFonts w:ascii="Consolas" w:eastAsia="Times New Roman" w:hAnsi="Consolas" w:cs="Times New Roman"/>
@@ -3649,7 +3603,6 @@
         </w:rPr>
         <w:t xml:space="preserve"> </w:t>
       </w:r>
-      <w:proofErr w:type="spellStart"/>
       <w:r>
         <w:rPr>
           <w:rFonts w:ascii="Consolas" w:eastAsia="Times New Roman" w:hAnsi="Consolas" w:cs="Times New Roman"/>
@@ -3659,7 +3612,6 @@
         </w:rPr>
         <w:t>InvalidAgeException</w:t>
       </w:r>
-      <w:proofErr w:type="spellEnd"/>
       <w:r>
         <w:rPr>
           <w:rFonts w:ascii="Consolas" w:eastAsia="Times New Roman" w:hAnsi="Consolas" w:cs="Times New Roman"/>
@@ -3853,7 +3805,6 @@
         </w:rPr>
         <w:t xml:space="preserve">[] </w:t>
       </w:r>
-      <w:proofErr w:type="spellStart"/>
       <w:r>
         <w:rPr>
           <w:rFonts w:ascii="Consolas" w:eastAsia="Times New Roman" w:hAnsi="Consolas" w:cs="Times New Roman"/>
@@ -3863,7 +3814,6 @@
         </w:rPr>
         <w:t>args</w:t>
       </w:r>
-      <w:proofErr w:type="spellEnd"/>
       <w:r>
         <w:rPr>
           <w:rFonts w:ascii="Consolas" w:eastAsia="Times New Roman" w:hAnsi="Consolas" w:cs="Times New Roman"/>
@@ -3933,7 +3883,6 @@
         </w:rPr>
         <w:t xml:space="preserve">            </w:t>
       </w:r>
-      <w:proofErr w:type="spellStart"/>
       <w:r>
         <w:rPr>
           <w:rFonts w:ascii="Consolas" w:eastAsia="Times New Roman" w:hAnsi="Consolas" w:cs="Times New Roman"/>
@@ -3943,7 +3892,6 @@
         </w:rPr>
         <w:t>validateAge</w:t>
       </w:r>
-      <w:proofErr w:type="spellEnd"/>
       <w:r>
         <w:rPr>
           <w:rFonts w:ascii="Consolas" w:eastAsia="Times New Roman" w:hAnsi="Consolas" w:cs="Times New Roman"/>
@@ -4010,7 +3958,6 @@
         </w:rPr>
         <w:t xml:space="preserve"> (</w:t>
       </w:r>
-      <w:proofErr w:type="spellStart"/>
       <w:r>
         <w:rPr>
           <w:rFonts w:ascii="Consolas" w:eastAsia="Times New Roman" w:hAnsi="Consolas" w:cs="Times New Roman"/>
@@ -4020,7 +3967,6 @@
         </w:rPr>
         <w:t>InvalidAgeException</w:t>
       </w:r>
-      <w:proofErr w:type="spellEnd"/>
       <w:r>
         <w:rPr>
           <w:rFonts w:ascii="Consolas" w:eastAsia="Times New Roman" w:hAnsi="Consolas" w:cs="Times New Roman"/>
@@ -4099,7 +4045,6 @@
         </w:rPr>
         <w:t xml:space="preserve">            </w:t>
       </w:r>
-      <w:proofErr w:type="spellStart"/>
       <w:r>
         <w:rPr>
           <w:rFonts w:ascii="Consolas" w:eastAsia="Times New Roman" w:hAnsi="Consolas" w:cs="Times New Roman"/>
@@ -4145,7 +4090,6 @@
         </w:rPr>
         <w:t>println</w:t>
       </w:r>
-      <w:proofErr w:type="spellEnd"/>
       <w:r>
         <w:rPr>
           <w:rFonts w:ascii="Consolas" w:eastAsia="Times New Roman" w:hAnsi="Consolas" w:cs="Times New Roman"/>
@@ -4155,7 +4099,6 @@
         </w:rPr>
         <w:t>(</w:t>
       </w:r>
-      <w:proofErr w:type="spellStart"/>
       <w:r>
         <w:rPr>
           <w:rFonts w:ascii="Consolas" w:eastAsia="Times New Roman" w:hAnsi="Consolas" w:cs="Times New Roman"/>
@@ -4183,7 +4126,6 @@
         </w:rPr>
         <w:t>getMessage</w:t>
       </w:r>
-      <w:proofErr w:type="spellEnd"/>
       <w:r>
         <w:rPr>
           <w:rFonts w:ascii="Consolas" w:eastAsia="Times New Roman" w:hAnsi="Consolas" w:cs="Times New Roman"/>
@@ -4367,7 +4309,6 @@
         </w:rPr>
         <w:t xml:space="preserve"> </w:t>
       </w:r>
-      <w:proofErr w:type="spellStart"/>
       <w:r>
         <w:rPr>
           <w:rFonts w:ascii="Consolas" w:eastAsia="Times New Roman" w:hAnsi="Consolas" w:cs="Times New Roman"/>
@@ -4377,7 +4318,6 @@
         </w:rPr>
         <w:t>InsufficientFundsException</w:t>
       </w:r>
-      <w:proofErr w:type="spellEnd"/>
       <w:r>
         <w:rPr>
           <w:rFonts w:ascii="Consolas" w:eastAsia="Times New Roman" w:hAnsi="Consolas" w:cs="Times New Roman"/>
@@ -4444,7 +4384,6 @@
         </w:rPr>
         <w:t xml:space="preserve">    </w:t>
       </w:r>
-      <w:proofErr w:type="spellStart"/>
       <w:r>
         <w:rPr>
           <w:rFonts w:ascii="Consolas" w:eastAsia="Times New Roman" w:hAnsi="Consolas" w:cs="Times New Roman"/>
@@ -4454,7 +4393,6 @@
         </w:rPr>
         <w:t>InsufficientFundsException</w:t>
       </w:r>
-      <w:proofErr w:type="spellEnd"/>
       <w:r>
         <w:rPr>
           <w:rFonts w:ascii="Consolas" w:eastAsia="Times New Roman" w:hAnsi="Consolas" w:cs="Times New Roman"/>
@@ -4641,7 +4579,6 @@
         </w:rPr>
         <w:t xml:space="preserve"> </w:t>
       </w:r>
-      <w:proofErr w:type="spellStart"/>
       <w:r>
         <w:rPr>
           <w:rFonts w:ascii="Consolas" w:eastAsia="Times New Roman" w:hAnsi="Consolas" w:cs="Times New Roman"/>
@@ -4651,7 +4588,6 @@
         </w:rPr>
         <w:t>WithdrawalAccount</w:t>
       </w:r>
-      <w:proofErr w:type="spellEnd"/>
       <w:r>
         <w:rPr>
           <w:rFonts w:ascii="Consolas" w:eastAsia="Times New Roman" w:hAnsi="Consolas" w:cs="Times New Roman"/>
@@ -4751,7 +4687,6 @@
         </w:rPr>
         <w:t xml:space="preserve">    </w:t>
       </w:r>
-      <w:proofErr w:type="spellStart"/>
       <w:r>
         <w:rPr>
           <w:rFonts w:ascii="Consolas" w:eastAsia="Times New Roman" w:hAnsi="Consolas" w:cs="Times New Roman"/>
@@ -4761,7 +4696,6 @@
         </w:rPr>
         <w:t>WithdrawalAccount</w:t>
       </w:r>
-      <w:proofErr w:type="spellEnd"/>
       <w:r>
         <w:rPr>
           <w:rFonts w:ascii="Consolas" w:eastAsia="Times New Roman" w:hAnsi="Consolas" w:cs="Times New Roman"/>
@@ -4828,7 +4762,6 @@
         </w:rPr>
         <w:t xml:space="preserve">        </w:t>
       </w:r>
-      <w:proofErr w:type="spellStart"/>
       <w:r>
         <w:rPr>
           <w:rFonts w:ascii="Consolas" w:eastAsia="Times New Roman" w:hAnsi="Consolas" w:cs="Times New Roman"/>
@@ -4856,7 +4789,6 @@
         </w:rPr>
         <w:t>balance</w:t>
       </w:r>
-      <w:proofErr w:type="spellEnd"/>
       <w:r>
         <w:rPr>
           <w:rFonts w:ascii="Consolas" w:eastAsia="Times New Roman" w:hAnsi="Consolas" w:cs="Times New Roman"/>
@@ -5046,7 +4978,6 @@
         </w:rPr>
         <w:t xml:space="preserve"> </w:t>
       </w:r>
-      <w:proofErr w:type="spellStart"/>
       <w:r>
         <w:rPr>
           <w:rFonts w:ascii="Consolas" w:eastAsia="Times New Roman" w:hAnsi="Consolas" w:cs="Times New Roman"/>
@@ -5056,7 +4987,6 @@
         </w:rPr>
         <w:t>InsufficientFundsException</w:t>
       </w:r>
-      <w:proofErr w:type="spellEnd"/>
       <w:r>
         <w:rPr>
           <w:rFonts w:ascii="Consolas" w:eastAsia="Times New Roman" w:hAnsi="Consolas" w:cs="Times New Roman"/>
@@ -5246,7 +5176,6 @@
         </w:rPr>
         <w:t xml:space="preserve"> </w:t>
       </w:r>
-      <w:proofErr w:type="spellStart"/>
       <w:r>
         <w:rPr>
           <w:rFonts w:ascii="Consolas" w:eastAsia="Times New Roman" w:hAnsi="Consolas" w:cs="Times New Roman"/>
@@ -5256,7 +5185,6 @@
         </w:rPr>
         <w:t>InsufficientFundsException</w:t>
       </w:r>
-      <w:proofErr w:type="spellEnd"/>
       <w:r>
         <w:rPr>
           <w:rFonts w:ascii="Consolas" w:eastAsia="Times New Roman" w:hAnsi="Consolas" w:cs="Times New Roman"/>
@@ -5611,7 +5539,6 @@
         </w:rPr>
         <w:t xml:space="preserve">[] </w:t>
       </w:r>
-      <w:proofErr w:type="spellStart"/>
       <w:r>
         <w:rPr>
           <w:rFonts w:ascii="Consolas" w:eastAsia="Times New Roman" w:hAnsi="Consolas" w:cs="Times New Roman"/>
@@ -5621,7 +5548,6 @@
         </w:rPr>
         <w:t>args</w:t>
       </w:r>
-      <w:proofErr w:type="spellEnd"/>
       <w:r>
         <w:rPr>
           <w:rFonts w:ascii="Consolas" w:eastAsia="Times New Roman" w:hAnsi="Consolas" w:cs="Times New Roman"/>
@@ -5652,7 +5578,6 @@
         </w:rPr>
         <w:t xml:space="preserve">        </w:t>
       </w:r>
-      <w:proofErr w:type="spellStart"/>
       <w:r>
         <w:rPr>
           <w:rFonts w:ascii="Consolas" w:eastAsia="Times New Roman" w:hAnsi="Consolas" w:cs="Times New Roman"/>
@@ -5662,7 +5587,6 @@
         </w:rPr>
         <w:t>WithdrawalAccount</w:t>
       </w:r>
-      <w:proofErr w:type="spellEnd"/>
       <w:r>
         <w:rPr>
           <w:rFonts w:ascii="Consolas" w:eastAsia="Times New Roman" w:hAnsi="Consolas" w:cs="Times New Roman"/>
@@ -5726,7 +5650,6 @@
         </w:rPr>
         <w:t xml:space="preserve"> </w:t>
       </w:r>
-      <w:proofErr w:type="spellStart"/>
       <w:r>
         <w:rPr>
           <w:rFonts w:ascii="Consolas" w:eastAsia="Times New Roman" w:hAnsi="Consolas" w:cs="Times New Roman"/>
@@ -5736,7 +5659,6 @@
         </w:rPr>
         <w:t>WithdrawalAccount</w:t>
       </w:r>
-      <w:proofErr w:type="spellEnd"/>
       <w:r>
         <w:rPr>
           <w:rFonts w:ascii="Consolas" w:eastAsia="Times New Roman" w:hAnsi="Consolas" w:cs="Times New Roman"/>
@@ -5824,7 +5746,6 @@
         </w:rPr>
         <w:t xml:space="preserve">            </w:t>
       </w:r>
-      <w:proofErr w:type="spellStart"/>
       <w:r>
         <w:rPr>
           <w:rFonts w:ascii="Consolas" w:eastAsia="Times New Roman" w:hAnsi="Consolas" w:cs="Times New Roman"/>
@@ -5852,7 +5773,6 @@
         </w:rPr>
         <w:t>withdraw</w:t>
       </w:r>
-      <w:proofErr w:type="spellEnd"/>
       <w:r>
         <w:rPr>
           <w:rFonts w:ascii="Consolas" w:eastAsia="Times New Roman" w:hAnsi="Consolas" w:cs="Times New Roman"/>
@@ -5919,7 +5839,6 @@
         </w:rPr>
         <w:t xml:space="preserve"> (</w:t>
       </w:r>
-      <w:proofErr w:type="spellStart"/>
       <w:r>
         <w:rPr>
           <w:rFonts w:ascii="Consolas" w:eastAsia="Times New Roman" w:hAnsi="Consolas" w:cs="Times New Roman"/>
@@ -5929,7 +5848,6 @@
         </w:rPr>
         <w:t>InsufficientFundsException</w:t>
       </w:r>
-      <w:proofErr w:type="spellEnd"/>
       <w:r>
         <w:rPr>
           <w:rFonts w:ascii="Consolas" w:eastAsia="Times New Roman" w:hAnsi="Consolas" w:cs="Times New Roman"/>
@@ -5978,7 +5896,6 @@
         </w:rPr>
         <w:t xml:space="preserve">            </w:t>
       </w:r>
-      <w:proofErr w:type="spellStart"/>
       <w:r>
         <w:rPr>
           <w:rFonts w:ascii="Consolas" w:eastAsia="Times New Roman" w:hAnsi="Consolas" w:cs="Times New Roman"/>
@@ -6024,7 +5941,6 @@
         </w:rPr>
         <w:t>println</w:t>
       </w:r>
-      <w:proofErr w:type="spellEnd"/>
       <w:r>
         <w:rPr>
           <w:rFonts w:ascii="Consolas" w:eastAsia="Times New Roman" w:hAnsi="Consolas" w:cs="Times New Roman"/>
@@ -6034,7 +5950,6 @@
         </w:rPr>
         <w:t>(</w:t>
       </w:r>
-      <w:proofErr w:type="spellStart"/>
       <w:r>
         <w:rPr>
           <w:rFonts w:ascii="Consolas" w:eastAsia="Times New Roman" w:hAnsi="Consolas" w:cs="Times New Roman"/>
@@ -6062,7 +5977,6 @@
         </w:rPr>
         <w:t>getMessage</w:t>
       </w:r>
-      <w:proofErr w:type="spellEnd"/>
       <w:r>
         <w:rPr>
           <w:rFonts w:ascii="Consolas" w:eastAsia="Times New Roman" w:hAnsi="Consolas" w:cs="Times New Roman"/>
@@ -6144,7 +6058,6 @@
         </w:rPr>
         <w:t xml:space="preserve">        </w:t>
       </w:r>
-      <w:proofErr w:type="spellStart"/>
       <w:r>
         <w:rPr>
           <w:rFonts w:ascii="Consolas" w:eastAsia="Times New Roman" w:hAnsi="Consolas" w:cs="Times New Roman"/>
@@ -6190,7 +6103,6 @@
         </w:rPr>
         <w:t>println</w:t>
       </w:r>
-      <w:proofErr w:type="spellEnd"/>
       <w:r>
         <w:rPr>
           <w:rFonts w:ascii="Consolas" w:eastAsia="Times New Roman" w:hAnsi="Consolas" w:cs="Times New Roman"/>
@@ -6236,7 +6148,6 @@
         </w:rPr>
         <w:t xml:space="preserve"> </w:t>
       </w:r>
-      <w:proofErr w:type="spellStart"/>
       <w:r>
         <w:rPr>
           <w:rFonts w:ascii="Consolas" w:eastAsia="Times New Roman" w:hAnsi="Consolas" w:cs="Times New Roman"/>
@@ -6264,7 +6175,6 @@
         </w:rPr>
         <w:t>balance</w:t>
       </w:r>
-      <w:proofErr w:type="spellEnd"/>
       <w:r>
         <w:rPr>
           <w:rFonts w:ascii="Consolas" w:eastAsia="Times New Roman" w:hAnsi="Consolas" w:cs="Times New Roman"/>
@@ -6400,94 +6310,940 @@
     </w:p>
     <w:p>
       <w:pPr>
-        <w:spacing w:after="0"/>
-      </w:pPr>
+        <w:shd w:val="clear" w:color="auto" w:fill="121314"/>
+        <w:spacing w:after="0" w:line="285" w:lineRule="atLeast"/>
+        <w:rPr>
+          <w:rFonts w:ascii="Consolas" w:eastAsia="Times New Roman" w:hAnsi="Consolas" w:cs="Times New Roman"/>
+          <w:color w:val="BBBEBF"/>
+          <w:sz w:val="21"/>
+          <w:szCs w:val="21"/>
+        </w:rPr>
+      </w:pPr>
+      <w:r>
+        <w:rPr>
+          <w:rFonts w:ascii="Consolas" w:eastAsia="Times New Roman" w:hAnsi="Consolas" w:cs="Times New Roman"/>
+          <w:color w:val="569CD6"/>
+          <w:sz w:val="21"/>
+          <w:szCs w:val="21"/>
+        </w:rPr>
+        <w:t>public</w:t>
+      </w:r>
+      <w:r>
+        <w:rPr>
+          <w:rFonts w:ascii="Consolas" w:eastAsia="Times New Roman" w:hAnsi="Consolas" w:cs="Times New Roman"/>
+          <w:color w:val="BBBEBF"/>
+          <w:sz w:val="21"/>
+          <w:szCs w:val="21"/>
+        </w:rPr>
+        <w:t xml:space="preserve"> </w:t>
+      </w:r>
+      <w:r>
+        <w:rPr>
+          <w:rFonts w:ascii="Consolas" w:eastAsia="Times New Roman" w:hAnsi="Consolas" w:cs="Times New Roman"/>
+          <w:color w:val="569CD6"/>
+          <w:sz w:val="21"/>
+          <w:szCs w:val="21"/>
+        </w:rPr>
+        <w:t>class</w:t>
+      </w:r>
+      <w:r>
+        <w:rPr>
+          <w:rFonts w:ascii="Consolas" w:eastAsia="Times New Roman" w:hAnsi="Consolas" w:cs="Times New Roman"/>
+          <w:color w:val="BBBEBF"/>
+          <w:sz w:val="21"/>
+          <w:szCs w:val="21"/>
+        </w:rPr>
+        <w:t xml:space="preserve"> </w:t>
+      </w:r>
+      <w:r>
+        <w:rPr>
+          <w:rFonts w:ascii="Consolas" w:eastAsia="Times New Roman" w:hAnsi="Consolas" w:cs="Times New Roman"/>
+          <w:color w:val="4EC9B0"/>
+          <w:sz w:val="21"/>
+          <w:szCs w:val="21"/>
+        </w:rPr>
+        <w:t>Exercise5FinallyReturn</w:t>
+      </w:r>
+      <w:r>
+        <w:rPr>
+          <w:rFonts w:ascii="Consolas" w:eastAsia="Times New Roman" w:hAnsi="Consolas" w:cs="Times New Roman"/>
+          <w:color w:val="BBBEBF"/>
+          <w:sz w:val="21"/>
+          <w:szCs w:val="21"/>
+        </w:rPr>
+        <w:t xml:space="preserve"> {</w:t>
+      </w:r>
+    </w:p>
+    <w:p>
+      <w:pPr>
+        <w:shd w:val="clear" w:color="auto" w:fill="121314"/>
+        <w:spacing w:after="0" w:line="285" w:lineRule="atLeast"/>
+        <w:rPr>
+          <w:rFonts w:ascii="Consolas" w:eastAsia="Times New Roman" w:hAnsi="Consolas" w:cs="Times New Roman"/>
+          <w:color w:val="BBBEBF"/>
+          <w:sz w:val="21"/>
+          <w:szCs w:val="21"/>
+        </w:rPr>
+      </w:pPr>
+      <w:r>
+        <w:rPr>
+          <w:rFonts w:ascii="Consolas" w:eastAsia="Times New Roman" w:hAnsi="Consolas" w:cs="Times New Roman"/>
+          <w:color w:val="BBBEBF"/>
+          <w:sz w:val="21"/>
+          <w:szCs w:val="21"/>
+        </w:rPr>
+        <w:t xml:space="preserve">    </w:t>
+      </w:r>
+      <w:r>
+        <w:rPr>
+          <w:rFonts w:ascii="Consolas" w:eastAsia="Times New Roman" w:hAnsi="Consolas" w:cs="Times New Roman"/>
+          <w:color w:val="569CD6"/>
+          <w:sz w:val="21"/>
+          <w:szCs w:val="21"/>
+        </w:rPr>
+        <w:t>static</w:t>
+      </w:r>
+      <w:r>
+        <w:rPr>
+          <w:rFonts w:ascii="Consolas" w:eastAsia="Times New Roman" w:hAnsi="Consolas" w:cs="Times New Roman"/>
+          <w:color w:val="BBBEBF"/>
+          <w:sz w:val="21"/>
+          <w:szCs w:val="21"/>
+        </w:rPr>
+        <w:t xml:space="preserve"> </w:t>
+      </w:r>
+      <w:r>
+        <w:rPr>
+          <w:rFonts w:ascii="Consolas" w:eastAsia="Times New Roman" w:hAnsi="Consolas" w:cs="Times New Roman"/>
+          <w:color w:val="4EC9B0"/>
+          <w:sz w:val="21"/>
+          <w:szCs w:val="21"/>
+        </w:rPr>
+        <w:t>int</w:t>
+      </w:r>
+      <w:r>
+        <w:rPr>
+          <w:rFonts w:ascii="Consolas" w:eastAsia="Times New Roman" w:hAnsi="Consolas" w:cs="Times New Roman"/>
+          <w:color w:val="BBBEBF"/>
+          <w:sz w:val="21"/>
+          <w:szCs w:val="21"/>
+        </w:rPr>
+        <w:t xml:space="preserve"> </w:t>
+      </w:r>
+      <w:r>
+        <w:rPr>
+          <w:rFonts w:ascii="Consolas" w:eastAsia="Times New Roman" w:hAnsi="Consolas" w:cs="Times New Roman"/>
+          <w:color w:val="D2A8FF"/>
+          <w:sz w:val="21"/>
+          <w:szCs w:val="21"/>
+        </w:rPr>
+        <w:t>example</w:t>
+      </w:r>
+      <w:r>
+        <w:rPr>
+          <w:rFonts w:ascii="Consolas" w:eastAsia="Times New Roman" w:hAnsi="Consolas" w:cs="Times New Roman"/>
+          <w:color w:val="BBBEBF"/>
+          <w:sz w:val="21"/>
+          <w:szCs w:val="21"/>
+        </w:rPr>
+        <w:t>() {</w:t>
+      </w:r>
+    </w:p>
+    <w:p>
+      <w:pPr>
+        <w:shd w:val="clear" w:color="auto" w:fill="121314"/>
+        <w:spacing w:after="0" w:line="285" w:lineRule="atLeast"/>
+        <w:rPr>
+          <w:rFonts w:ascii="Consolas" w:eastAsia="Times New Roman" w:hAnsi="Consolas" w:cs="Times New Roman"/>
+          <w:color w:val="BBBEBF"/>
+          <w:sz w:val="21"/>
+          <w:szCs w:val="21"/>
+        </w:rPr>
+      </w:pPr>
+      <w:r>
+        <w:rPr>
+          <w:rFonts w:ascii="Consolas" w:eastAsia="Times New Roman" w:hAnsi="Consolas" w:cs="Times New Roman"/>
+          <w:color w:val="BBBEBF"/>
+          <w:sz w:val="21"/>
+          <w:szCs w:val="21"/>
+        </w:rPr>
+        <w:t xml:space="preserve">        </w:t>
+      </w:r>
+      <w:r>
+        <w:rPr>
+          <w:rFonts w:ascii="Consolas" w:eastAsia="Times New Roman" w:hAnsi="Consolas" w:cs="Times New Roman"/>
+          <w:color w:val="C586C0"/>
+          <w:sz w:val="21"/>
+          <w:szCs w:val="21"/>
+        </w:rPr>
+        <w:t>try</w:t>
+      </w:r>
+      <w:r>
+        <w:rPr>
+          <w:rFonts w:ascii="Consolas" w:eastAsia="Times New Roman" w:hAnsi="Consolas" w:cs="Times New Roman"/>
+          <w:color w:val="BBBEBF"/>
+          <w:sz w:val="21"/>
+          <w:szCs w:val="21"/>
+        </w:rPr>
+        <w:t xml:space="preserve"> {</w:t>
+      </w:r>
+    </w:p>
+    <w:p>
+      <w:pPr>
+        <w:shd w:val="clear" w:color="auto" w:fill="121314"/>
+        <w:spacing w:after="0" w:line="285" w:lineRule="atLeast"/>
+        <w:rPr>
+          <w:rFonts w:ascii="Consolas" w:eastAsia="Times New Roman" w:hAnsi="Consolas" w:cs="Times New Roman"/>
+          <w:color w:val="BBBEBF"/>
+          <w:sz w:val="21"/>
+          <w:szCs w:val="21"/>
+        </w:rPr>
+      </w:pPr>
+      <w:r>
+        <w:rPr>
+          <w:rFonts w:ascii="Consolas" w:eastAsia="Times New Roman" w:hAnsi="Consolas" w:cs="Times New Roman"/>
+          <w:color w:val="BBBEBF"/>
+          <w:sz w:val="21"/>
+          <w:szCs w:val="21"/>
+        </w:rPr>
+        <w:t xml:space="preserve">            </w:t>
+      </w:r>
+      <w:r>
+        <w:rPr>
+          <w:rFonts w:ascii="Consolas" w:eastAsia="Times New Roman" w:hAnsi="Consolas" w:cs="Times New Roman"/>
+          <w:color w:val="8B949E"/>
+          <w:sz w:val="21"/>
+          <w:szCs w:val="21"/>
+        </w:rPr>
+        <w:t>// The try block executes and returns a value, but the finally block will execute before the return completes.</w:t>
+      </w:r>
+    </w:p>
+    <w:p>
+      <w:pPr>
+        <w:shd w:val="clear" w:color="auto" w:fill="121314"/>
+        <w:spacing w:after="0" w:line="285" w:lineRule="atLeast"/>
+        <w:rPr>
+          <w:rFonts w:ascii="Consolas" w:eastAsia="Times New Roman" w:hAnsi="Consolas" w:cs="Times New Roman"/>
+          <w:color w:val="BBBEBF"/>
+          <w:sz w:val="21"/>
+          <w:szCs w:val="21"/>
+        </w:rPr>
+      </w:pPr>
+      <w:r>
+        <w:rPr>
+          <w:rFonts w:ascii="Consolas" w:eastAsia="Times New Roman" w:hAnsi="Consolas" w:cs="Times New Roman"/>
+          <w:color w:val="BBBEBF"/>
+          <w:sz w:val="21"/>
+          <w:szCs w:val="21"/>
+        </w:rPr>
+        <w:t xml:space="preserve">            </w:t>
+      </w:r>
+      <w:r>
+        <w:rPr>
+          <w:rFonts w:ascii="Consolas" w:eastAsia="Times New Roman" w:hAnsi="Consolas" w:cs="Times New Roman"/>
+          <w:color w:val="4EC9B0"/>
+          <w:sz w:val="21"/>
+          <w:szCs w:val="21"/>
+        </w:rPr>
+        <w:t>System</w:t>
+      </w:r>
+      <w:r>
+        <w:rPr>
+          <w:rFonts w:ascii="Consolas" w:eastAsia="Times New Roman" w:hAnsi="Consolas" w:cs="Times New Roman"/>
+          <w:color w:val="BBBEBF"/>
+          <w:sz w:val="21"/>
+          <w:szCs w:val="21"/>
+        </w:rPr>
+        <w:t>.</w:t>
+      </w:r>
+      <w:r>
+        <w:rPr>
+          <w:rFonts w:ascii="Consolas" w:eastAsia="Times New Roman" w:hAnsi="Consolas" w:cs="Times New Roman"/>
+          <w:color w:val="79C0FF"/>
+          <w:sz w:val="21"/>
+          <w:szCs w:val="21"/>
+        </w:rPr>
+        <w:t>out</w:t>
+      </w:r>
+      <w:r>
+        <w:rPr>
+          <w:rFonts w:ascii="Consolas" w:eastAsia="Times New Roman" w:hAnsi="Consolas" w:cs="Times New Roman"/>
+          <w:color w:val="BBBEBF"/>
+          <w:sz w:val="21"/>
+          <w:szCs w:val="21"/>
+        </w:rPr>
+        <w:t>.</w:t>
+      </w:r>
+      <w:r>
+        <w:rPr>
+          <w:rFonts w:ascii="Consolas" w:eastAsia="Times New Roman" w:hAnsi="Consolas" w:cs="Times New Roman"/>
+          <w:color w:val="D2A8FF"/>
+          <w:sz w:val="21"/>
+          <w:szCs w:val="21"/>
+        </w:rPr>
+        <w:t>println</w:t>
+      </w:r>
+      <w:r>
+        <w:rPr>
+          <w:rFonts w:ascii="Consolas" w:eastAsia="Times New Roman" w:hAnsi="Consolas" w:cs="Times New Roman"/>
+          <w:color w:val="BBBEBF"/>
+          <w:sz w:val="21"/>
+          <w:szCs w:val="21"/>
+        </w:rPr>
+        <w:t>(</w:t>
+      </w:r>
+      <w:r>
+        <w:rPr>
+          <w:rFonts w:ascii="Consolas" w:eastAsia="Times New Roman" w:hAnsi="Consolas" w:cs="Times New Roman"/>
+          <w:color w:val="A5D6FF"/>
+          <w:sz w:val="21"/>
+          <w:szCs w:val="21"/>
+        </w:rPr>
+        <w:t>"Inside try"</w:t>
+      </w:r>
+      <w:r>
+        <w:rPr>
+          <w:rFonts w:ascii="Consolas" w:eastAsia="Times New Roman" w:hAnsi="Consolas" w:cs="Times New Roman"/>
+          <w:color w:val="BBBEBF"/>
+          <w:sz w:val="21"/>
+          <w:szCs w:val="21"/>
+        </w:rPr>
+        <w:t>);</w:t>
+      </w:r>
+    </w:p>
+    <w:p>
+      <w:pPr>
+        <w:shd w:val="clear" w:color="auto" w:fill="121314"/>
+        <w:spacing w:after="0" w:line="285" w:lineRule="atLeast"/>
+        <w:rPr>
+          <w:rFonts w:ascii="Consolas" w:eastAsia="Times New Roman" w:hAnsi="Consolas" w:cs="Times New Roman"/>
+          <w:color w:val="BBBEBF"/>
+          <w:sz w:val="21"/>
+          <w:szCs w:val="21"/>
+        </w:rPr>
+      </w:pPr>
+      <w:r>
+        <w:rPr>
+          <w:rFonts w:ascii="Consolas" w:eastAsia="Times New Roman" w:hAnsi="Consolas" w:cs="Times New Roman"/>
+          <w:color w:val="BBBEBF"/>
+          <w:sz w:val="21"/>
+          <w:szCs w:val="21"/>
+        </w:rPr>
+        <w:t xml:space="preserve">            </w:t>
+      </w:r>
+      <w:r>
+        <w:rPr>
+          <w:rFonts w:ascii="Consolas" w:eastAsia="Times New Roman" w:hAnsi="Consolas" w:cs="Times New Roman"/>
+          <w:color w:val="C586C0"/>
+          <w:sz w:val="21"/>
+          <w:szCs w:val="21"/>
+        </w:rPr>
+        <w:t>return</w:t>
+      </w:r>
+      <w:r>
+        <w:rPr>
+          <w:rFonts w:ascii="Consolas" w:eastAsia="Times New Roman" w:hAnsi="Consolas" w:cs="Times New Roman"/>
+          <w:color w:val="BBBEBF"/>
+          <w:sz w:val="21"/>
+          <w:szCs w:val="21"/>
+        </w:rPr>
+        <w:t xml:space="preserve"> </w:t>
+      </w:r>
+      <w:r>
+        <w:rPr>
+          <w:rFonts w:ascii="Consolas" w:eastAsia="Times New Roman" w:hAnsi="Consolas" w:cs="Times New Roman"/>
+          <w:color w:val="B5CEA8"/>
+          <w:sz w:val="21"/>
+          <w:szCs w:val="21"/>
+        </w:rPr>
+        <w:t>5</w:t>
+      </w:r>
+      <w:r>
+        <w:rPr>
+          <w:rFonts w:ascii="Consolas" w:eastAsia="Times New Roman" w:hAnsi="Consolas" w:cs="Times New Roman"/>
+          <w:color w:val="BBBEBF"/>
+          <w:sz w:val="21"/>
+          <w:szCs w:val="21"/>
+        </w:rPr>
+        <w:t>;</w:t>
+      </w:r>
+    </w:p>
+    <w:p>
+      <w:pPr>
+        <w:shd w:val="clear" w:color="auto" w:fill="121314"/>
+        <w:spacing w:after="0" w:line="285" w:lineRule="atLeast"/>
+        <w:rPr>
+          <w:rFonts w:ascii="Consolas" w:eastAsia="Times New Roman" w:hAnsi="Consolas" w:cs="Times New Roman"/>
+          <w:color w:val="BBBEBF"/>
+          <w:sz w:val="21"/>
+          <w:szCs w:val="21"/>
+        </w:rPr>
+      </w:pPr>
+      <w:r>
+        <w:rPr>
+          <w:rFonts w:ascii="Consolas" w:eastAsia="Times New Roman" w:hAnsi="Consolas" w:cs="Times New Roman"/>
+          <w:color w:val="BBBEBF"/>
+          <w:sz w:val="21"/>
+          <w:szCs w:val="21"/>
+        </w:rPr>
+        <w:t xml:space="preserve">        } </w:t>
+      </w:r>
+      <w:r>
+        <w:rPr>
+          <w:rFonts w:ascii="Consolas" w:eastAsia="Times New Roman" w:hAnsi="Consolas" w:cs="Times New Roman"/>
+          <w:color w:val="C586C0"/>
+          <w:sz w:val="21"/>
+          <w:szCs w:val="21"/>
+        </w:rPr>
+        <w:t>finally</w:t>
+      </w:r>
+      <w:r>
+        <w:rPr>
+          <w:rFonts w:ascii="Consolas" w:eastAsia="Times New Roman" w:hAnsi="Consolas" w:cs="Times New Roman"/>
+          <w:color w:val="BBBEBF"/>
+          <w:sz w:val="21"/>
+          <w:szCs w:val="21"/>
+        </w:rPr>
+        <w:t xml:space="preserve"> {</w:t>
+      </w:r>
+    </w:p>
+    <w:p>
+      <w:pPr>
+        <w:shd w:val="clear" w:color="auto" w:fill="121314"/>
+        <w:spacing w:after="0" w:line="285" w:lineRule="atLeast"/>
+        <w:rPr>
+          <w:rFonts w:ascii="Consolas" w:eastAsia="Times New Roman" w:hAnsi="Consolas" w:cs="Times New Roman"/>
+          <w:color w:val="BBBEBF"/>
+          <w:sz w:val="21"/>
+          <w:szCs w:val="21"/>
+        </w:rPr>
+      </w:pPr>
+      <w:r>
+        <w:rPr>
+          <w:rFonts w:ascii="Consolas" w:eastAsia="Times New Roman" w:hAnsi="Consolas" w:cs="Times New Roman"/>
+          <w:color w:val="BBBEBF"/>
+          <w:sz w:val="21"/>
+          <w:szCs w:val="21"/>
+        </w:rPr>
+        <w:t xml:space="preserve">            </w:t>
+      </w:r>
+      <w:r>
+        <w:rPr>
+          <w:rFonts w:ascii="Consolas" w:eastAsia="Times New Roman" w:hAnsi="Consolas" w:cs="Times New Roman"/>
+          <w:color w:val="4EC9B0"/>
+          <w:sz w:val="21"/>
+          <w:szCs w:val="21"/>
+        </w:rPr>
+        <w:t>System</w:t>
+      </w:r>
+      <w:r>
+        <w:rPr>
+          <w:rFonts w:ascii="Consolas" w:eastAsia="Times New Roman" w:hAnsi="Consolas" w:cs="Times New Roman"/>
+          <w:color w:val="BBBEBF"/>
+          <w:sz w:val="21"/>
+          <w:szCs w:val="21"/>
+        </w:rPr>
+        <w:t>.</w:t>
+      </w:r>
+      <w:r>
+        <w:rPr>
+          <w:rFonts w:ascii="Consolas" w:eastAsia="Times New Roman" w:hAnsi="Consolas" w:cs="Times New Roman"/>
+          <w:color w:val="79C0FF"/>
+          <w:sz w:val="21"/>
+          <w:szCs w:val="21"/>
+        </w:rPr>
+        <w:t>out</w:t>
+      </w:r>
+      <w:r>
+        <w:rPr>
+          <w:rFonts w:ascii="Consolas" w:eastAsia="Times New Roman" w:hAnsi="Consolas" w:cs="Times New Roman"/>
+          <w:color w:val="BBBEBF"/>
+          <w:sz w:val="21"/>
+          <w:szCs w:val="21"/>
+        </w:rPr>
+        <w:t>.</w:t>
+      </w:r>
+      <w:r>
+        <w:rPr>
+          <w:rFonts w:ascii="Consolas" w:eastAsia="Times New Roman" w:hAnsi="Consolas" w:cs="Times New Roman"/>
+          <w:color w:val="D2A8FF"/>
+          <w:sz w:val="21"/>
+          <w:szCs w:val="21"/>
+        </w:rPr>
+        <w:t>println</w:t>
+      </w:r>
+      <w:r>
+        <w:rPr>
+          <w:rFonts w:ascii="Consolas" w:eastAsia="Times New Roman" w:hAnsi="Consolas" w:cs="Times New Roman"/>
+          <w:color w:val="BBBEBF"/>
+          <w:sz w:val="21"/>
+          <w:szCs w:val="21"/>
+        </w:rPr>
+        <w:t>(</w:t>
+      </w:r>
+      <w:r>
+        <w:rPr>
+          <w:rFonts w:ascii="Consolas" w:eastAsia="Times New Roman" w:hAnsi="Consolas" w:cs="Times New Roman"/>
+          <w:color w:val="A5D6FF"/>
+          <w:sz w:val="21"/>
+          <w:szCs w:val="21"/>
+        </w:rPr>
+        <w:t>"Inside finally"</w:t>
+      </w:r>
+      <w:r>
+        <w:rPr>
+          <w:rFonts w:ascii="Consolas" w:eastAsia="Times New Roman" w:hAnsi="Consolas" w:cs="Times New Roman"/>
+          <w:color w:val="BBBEBF"/>
+          <w:sz w:val="21"/>
+          <w:szCs w:val="21"/>
+        </w:rPr>
+        <w:t>);</w:t>
+      </w:r>
+    </w:p>
+    <w:p>
+      <w:pPr>
+        <w:shd w:val="clear" w:color="auto" w:fill="121314"/>
+        <w:spacing w:after="0" w:line="285" w:lineRule="atLeast"/>
+        <w:rPr>
+          <w:rFonts w:ascii="Consolas" w:eastAsia="Times New Roman" w:hAnsi="Consolas" w:cs="Times New Roman"/>
+          <w:color w:val="BBBEBF"/>
+          <w:sz w:val="21"/>
+          <w:szCs w:val="21"/>
+        </w:rPr>
+      </w:pPr>
+      <w:r>
+        <w:rPr>
+          <w:rFonts w:ascii="Consolas" w:eastAsia="Times New Roman" w:hAnsi="Consolas" w:cs="Times New Roman"/>
+          <w:color w:val="BBBEBF"/>
+          <w:sz w:val="21"/>
+          <w:szCs w:val="21"/>
+        </w:rPr>
+        <w:t>        }</w:t>
+      </w:r>
+    </w:p>
+    <w:p>
+      <w:pPr>
+        <w:shd w:val="clear" w:color="auto" w:fill="121314"/>
+        <w:spacing w:after="0" w:line="285" w:lineRule="atLeast"/>
+        <w:rPr>
+          <w:rFonts w:ascii="Consolas" w:eastAsia="Times New Roman" w:hAnsi="Consolas" w:cs="Times New Roman"/>
+          <w:color w:val="BBBEBF"/>
+          <w:sz w:val="21"/>
+          <w:szCs w:val="21"/>
+        </w:rPr>
+      </w:pPr>
+      <w:r>
+        <w:rPr>
+          <w:rFonts w:ascii="Consolas" w:eastAsia="Times New Roman" w:hAnsi="Consolas" w:cs="Times New Roman"/>
+          <w:color w:val="BBBEBF"/>
+          <w:sz w:val="21"/>
+          <w:szCs w:val="21"/>
+        </w:rPr>
+        <w:t>    }</w:t>
+      </w:r>
+    </w:p>
+    <w:p>
+      <w:pPr>
+        <w:shd w:val="clear" w:color="auto" w:fill="121314"/>
+        <w:spacing w:after="0" w:line="285" w:lineRule="atLeast"/>
+        <w:rPr>
+          <w:rFonts w:ascii="Consolas" w:eastAsia="Times New Roman" w:hAnsi="Consolas" w:cs="Times New Roman"/>
+          <w:color w:val="BBBEBF"/>
+          <w:sz w:val="21"/>
+          <w:szCs w:val="21"/>
+        </w:rPr>
+      </w:pPr>
+    </w:p>
+    <w:p>
+      <w:pPr>
+        <w:shd w:val="clear" w:color="auto" w:fill="121314"/>
+        <w:spacing w:after="0" w:line="285" w:lineRule="atLeast"/>
+        <w:rPr>
+          <w:rFonts w:ascii="Consolas" w:eastAsia="Times New Roman" w:hAnsi="Consolas" w:cs="Times New Roman"/>
+          <w:color w:val="BBBEBF"/>
+          <w:sz w:val="21"/>
+          <w:szCs w:val="21"/>
+        </w:rPr>
+      </w:pPr>
+      <w:r>
+        <w:rPr>
+          <w:rFonts w:ascii="Consolas" w:eastAsia="Times New Roman" w:hAnsi="Consolas" w:cs="Times New Roman"/>
+          <w:color w:val="BBBEBF"/>
+          <w:sz w:val="21"/>
+          <w:szCs w:val="21"/>
+        </w:rPr>
+        <w:t xml:space="preserve">    </w:t>
+      </w:r>
+      <w:r>
+        <w:rPr>
+          <w:rFonts w:ascii="Consolas" w:eastAsia="Times New Roman" w:hAnsi="Consolas" w:cs="Times New Roman"/>
+          <w:color w:val="569CD6"/>
+          <w:sz w:val="21"/>
+          <w:szCs w:val="21"/>
+        </w:rPr>
+        <w:t>public</w:t>
+      </w:r>
+      <w:r>
+        <w:rPr>
+          <w:rFonts w:ascii="Consolas" w:eastAsia="Times New Roman" w:hAnsi="Consolas" w:cs="Times New Roman"/>
+          <w:color w:val="BBBEBF"/>
+          <w:sz w:val="21"/>
+          <w:szCs w:val="21"/>
+        </w:rPr>
+        <w:t xml:space="preserve"> </w:t>
+      </w:r>
+      <w:r>
+        <w:rPr>
+          <w:rFonts w:ascii="Consolas" w:eastAsia="Times New Roman" w:hAnsi="Consolas" w:cs="Times New Roman"/>
+          <w:color w:val="569CD6"/>
+          <w:sz w:val="21"/>
+          <w:szCs w:val="21"/>
+        </w:rPr>
+        <w:t>static</w:t>
+      </w:r>
+      <w:r>
+        <w:rPr>
+          <w:rFonts w:ascii="Consolas" w:eastAsia="Times New Roman" w:hAnsi="Consolas" w:cs="Times New Roman"/>
+          <w:color w:val="BBBEBF"/>
+          <w:sz w:val="21"/>
+          <w:szCs w:val="21"/>
+        </w:rPr>
+        <w:t xml:space="preserve"> </w:t>
+      </w:r>
+      <w:r>
+        <w:rPr>
+          <w:rFonts w:ascii="Consolas" w:eastAsia="Times New Roman" w:hAnsi="Consolas" w:cs="Times New Roman"/>
+          <w:color w:val="4EC9B0"/>
+          <w:sz w:val="21"/>
+          <w:szCs w:val="21"/>
+        </w:rPr>
+        <w:t>void</w:t>
+      </w:r>
+      <w:r>
+        <w:rPr>
+          <w:rFonts w:ascii="Consolas" w:eastAsia="Times New Roman" w:hAnsi="Consolas" w:cs="Times New Roman"/>
+          <w:color w:val="BBBEBF"/>
+          <w:sz w:val="21"/>
+          <w:szCs w:val="21"/>
+        </w:rPr>
+        <w:t xml:space="preserve"> </w:t>
+      </w:r>
+      <w:r>
+        <w:rPr>
+          <w:rFonts w:ascii="Consolas" w:eastAsia="Times New Roman" w:hAnsi="Consolas" w:cs="Times New Roman"/>
+          <w:color w:val="D2A8FF"/>
+          <w:sz w:val="21"/>
+          <w:szCs w:val="21"/>
+        </w:rPr>
+        <w:t>main</w:t>
+      </w:r>
+      <w:r>
+        <w:rPr>
+          <w:rFonts w:ascii="Consolas" w:eastAsia="Times New Roman" w:hAnsi="Consolas" w:cs="Times New Roman"/>
+          <w:color w:val="BBBEBF"/>
+          <w:sz w:val="21"/>
+          <w:szCs w:val="21"/>
+        </w:rPr>
+        <w:t>(</w:t>
+      </w:r>
+      <w:r>
+        <w:rPr>
+          <w:rFonts w:ascii="Consolas" w:eastAsia="Times New Roman" w:hAnsi="Consolas" w:cs="Times New Roman"/>
+          <w:color w:val="4EC9B0"/>
+          <w:sz w:val="21"/>
+          <w:szCs w:val="21"/>
+        </w:rPr>
+        <w:t>String</w:t>
+      </w:r>
+      <w:r>
+        <w:rPr>
+          <w:rFonts w:ascii="Consolas" w:eastAsia="Times New Roman" w:hAnsi="Consolas" w:cs="Times New Roman"/>
+          <w:color w:val="BBBEBF"/>
+          <w:sz w:val="21"/>
+          <w:szCs w:val="21"/>
+        </w:rPr>
+        <w:t xml:space="preserve">[] </w:t>
+      </w:r>
+      <w:r>
+        <w:rPr>
+          <w:rFonts w:ascii="Consolas" w:eastAsia="Times New Roman" w:hAnsi="Consolas" w:cs="Times New Roman"/>
+          <w:color w:val="FFA657"/>
+          <w:sz w:val="21"/>
+          <w:szCs w:val="21"/>
+        </w:rPr>
+        <w:t>args</w:t>
+      </w:r>
+      <w:r>
+        <w:rPr>
+          <w:rFonts w:ascii="Consolas" w:eastAsia="Times New Roman" w:hAnsi="Consolas" w:cs="Times New Roman"/>
+          <w:color w:val="BBBEBF"/>
+          <w:sz w:val="21"/>
+          <w:szCs w:val="21"/>
+        </w:rPr>
+        <w:t>) {</w:t>
+      </w:r>
+    </w:p>
+    <w:p>
+      <w:pPr>
+        <w:shd w:val="clear" w:color="auto" w:fill="121314"/>
+        <w:spacing w:after="0" w:line="285" w:lineRule="atLeast"/>
+        <w:rPr>
+          <w:rFonts w:ascii="Consolas" w:eastAsia="Times New Roman" w:hAnsi="Consolas" w:cs="Times New Roman"/>
+          <w:color w:val="BBBEBF"/>
+          <w:sz w:val="21"/>
+          <w:szCs w:val="21"/>
+        </w:rPr>
+      </w:pPr>
+      <w:r>
+        <w:rPr>
+          <w:rFonts w:ascii="Consolas" w:eastAsia="Times New Roman" w:hAnsi="Consolas" w:cs="Times New Roman"/>
+          <w:color w:val="BBBEBF"/>
+          <w:sz w:val="21"/>
+          <w:szCs w:val="21"/>
+        </w:rPr>
+        <w:t xml:space="preserve">        </w:t>
+      </w:r>
+      <w:r>
+        <w:rPr>
+          <w:rFonts w:ascii="Consolas" w:eastAsia="Times New Roman" w:hAnsi="Consolas" w:cs="Times New Roman"/>
+          <w:color w:val="8B949E"/>
+          <w:sz w:val="21"/>
+          <w:szCs w:val="21"/>
+        </w:rPr>
+        <w:t>// The finally block runs before the pending return completes.</w:t>
+      </w:r>
+    </w:p>
+    <w:p>
+      <w:pPr>
+        <w:shd w:val="clear" w:color="auto" w:fill="121314"/>
+        <w:spacing w:after="0" w:line="285" w:lineRule="atLeast"/>
+        <w:rPr>
+          <w:rFonts w:ascii="Consolas" w:eastAsia="Times New Roman" w:hAnsi="Consolas" w:cs="Times New Roman"/>
+          <w:color w:val="BBBEBF"/>
+          <w:sz w:val="21"/>
+          <w:szCs w:val="21"/>
+        </w:rPr>
+      </w:pPr>
+      <w:r>
+        <w:rPr>
+          <w:rFonts w:ascii="Consolas" w:eastAsia="Times New Roman" w:hAnsi="Consolas" w:cs="Times New Roman"/>
+          <w:color w:val="BBBEBF"/>
+          <w:sz w:val="21"/>
+          <w:szCs w:val="21"/>
+        </w:rPr>
+        <w:t xml:space="preserve">        </w:t>
+      </w:r>
+      <w:r>
+        <w:rPr>
+          <w:rFonts w:ascii="Consolas" w:eastAsia="Times New Roman" w:hAnsi="Consolas" w:cs="Times New Roman"/>
+          <w:color w:val="4EC9B0"/>
+          <w:sz w:val="21"/>
+          <w:szCs w:val="21"/>
+        </w:rPr>
+        <w:t>System</w:t>
+      </w:r>
+      <w:r>
+        <w:rPr>
+          <w:rFonts w:ascii="Consolas" w:eastAsia="Times New Roman" w:hAnsi="Consolas" w:cs="Times New Roman"/>
+          <w:color w:val="BBBEBF"/>
+          <w:sz w:val="21"/>
+          <w:szCs w:val="21"/>
+        </w:rPr>
+        <w:t>.</w:t>
+      </w:r>
+      <w:r>
+        <w:rPr>
+          <w:rFonts w:ascii="Consolas" w:eastAsia="Times New Roman" w:hAnsi="Consolas" w:cs="Times New Roman"/>
+          <w:color w:val="79C0FF"/>
+          <w:sz w:val="21"/>
+          <w:szCs w:val="21"/>
+        </w:rPr>
+        <w:t>out</w:t>
+      </w:r>
+      <w:r>
+        <w:rPr>
+          <w:rFonts w:ascii="Consolas" w:eastAsia="Times New Roman" w:hAnsi="Consolas" w:cs="Times New Roman"/>
+          <w:color w:val="BBBEBF"/>
+          <w:sz w:val="21"/>
+          <w:szCs w:val="21"/>
+        </w:rPr>
+        <w:t>.</w:t>
+      </w:r>
+      <w:r>
+        <w:rPr>
+          <w:rFonts w:ascii="Consolas" w:eastAsia="Times New Roman" w:hAnsi="Consolas" w:cs="Times New Roman"/>
+          <w:color w:val="D2A8FF"/>
+          <w:sz w:val="21"/>
+          <w:szCs w:val="21"/>
+        </w:rPr>
+        <w:t>println</w:t>
+      </w:r>
+      <w:r>
+        <w:rPr>
+          <w:rFonts w:ascii="Consolas" w:eastAsia="Times New Roman" w:hAnsi="Consolas" w:cs="Times New Roman"/>
+          <w:color w:val="BBBEBF"/>
+          <w:sz w:val="21"/>
+          <w:szCs w:val="21"/>
+        </w:rPr>
+        <w:t>(</w:t>
+      </w:r>
+      <w:r>
+        <w:rPr>
+          <w:rFonts w:ascii="Consolas" w:eastAsia="Times New Roman" w:hAnsi="Consolas" w:cs="Times New Roman"/>
+          <w:color w:val="A5D6FF"/>
+          <w:sz w:val="21"/>
+          <w:szCs w:val="21"/>
+        </w:rPr>
+        <w:t>"Returned: "</w:t>
+      </w:r>
+      <w:r>
+        <w:rPr>
+          <w:rFonts w:ascii="Consolas" w:eastAsia="Times New Roman" w:hAnsi="Consolas" w:cs="Times New Roman"/>
+          <w:color w:val="BBBEBF"/>
+          <w:sz w:val="21"/>
+          <w:szCs w:val="21"/>
+        </w:rPr>
+        <w:t xml:space="preserve"> </w:t>
+      </w:r>
+      <w:r>
+        <w:rPr>
+          <w:rFonts w:ascii="Consolas" w:eastAsia="Times New Roman" w:hAnsi="Consolas" w:cs="Times New Roman"/>
+          <w:color w:val="D4D4D4"/>
+          <w:sz w:val="21"/>
+          <w:szCs w:val="21"/>
+        </w:rPr>
+        <w:t>+</w:t>
+      </w:r>
+      <w:r>
+        <w:rPr>
+          <w:rFonts w:ascii="Consolas" w:eastAsia="Times New Roman" w:hAnsi="Consolas" w:cs="Times New Roman"/>
+          <w:color w:val="BBBEBF"/>
+          <w:sz w:val="21"/>
+          <w:szCs w:val="21"/>
+        </w:rPr>
+        <w:t xml:space="preserve"> </w:t>
+      </w:r>
+      <w:r>
+        <w:rPr>
+          <w:rFonts w:ascii="Consolas" w:eastAsia="Times New Roman" w:hAnsi="Consolas" w:cs="Times New Roman"/>
+          <w:color w:val="D2A8FF"/>
+          <w:sz w:val="21"/>
+          <w:szCs w:val="21"/>
+        </w:rPr>
+        <w:t>example</w:t>
+      </w:r>
+      <w:r>
+        <w:rPr>
+          <w:rFonts w:ascii="Consolas" w:eastAsia="Times New Roman" w:hAnsi="Consolas" w:cs="Times New Roman"/>
+          <w:color w:val="BBBEBF"/>
+          <w:sz w:val="21"/>
+          <w:szCs w:val="21"/>
+        </w:rPr>
+        <w:t>());</w:t>
+      </w:r>
+    </w:p>
+    <w:p>
+      <w:pPr>
+        <w:shd w:val="clear" w:color="auto" w:fill="121314"/>
+        <w:spacing w:after="0" w:line="285" w:lineRule="atLeast"/>
+        <w:rPr>
+          <w:rFonts w:ascii="Consolas" w:eastAsia="Times New Roman" w:hAnsi="Consolas" w:cs="Times New Roman"/>
+          <w:color w:val="BBBEBF"/>
+          <w:sz w:val="21"/>
+          <w:szCs w:val="21"/>
+        </w:rPr>
+      </w:pPr>
+      <w:r>
+        <w:rPr>
+          <w:rFonts w:ascii="Consolas" w:eastAsia="Times New Roman" w:hAnsi="Consolas" w:cs="Times New Roman"/>
+          <w:color w:val="BBBEBF"/>
+          <w:sz w:val="21"/>
+          <w:szCs w:val="21"/>
+        </w:rPr>
+        <w:t>    }</w:t>
+      </w:r>
+    </w:p>
+    <w:p>
+      <w:pPr>
+        <w:shd w:val="clear" w:color="auto" w:fill="121314"/>
+        <w:spacing w:after="0" w:line="285" w:lineRule="atLeast"/>
+        <w:rPr>
+          <w:rFonts w:ascii="Consolas" w:eastAsia="Times New Roman" w:hAnsi="Consolas" w:cs="Times New Roman"/>
+          <w:color w:val="BBBEBF"/>
+          <w:sz w:val="21"/>
+          <w:szCs w:val="21"/>
+        </w:rPr>
+      </w:pPr>
+      <w:r>
+        <w:rPr>
+          <w:rFonts w:ascii="Consolas" w:eastAsia="Times New Roman" w:hAnsi="Consolas" w:cs="Times New Roman"/>
+          <w:color w:val="BBBEBF"/>
+          <w:sz w:val="21"/>
+          <w:szCs w:val="21"/>
+        </w:rPr>
+        <w:t>}</w:t>
+      </w:r>
+    </w:p>
+    <w:p>
+      <w:pPr>
+        <w:shd w:val="clear" w:color="auto" w:fill="121314"/>
+        <w:spacing w:after="0" w:line="285" w:lineRule="atLeast"/>
+        <w:rPr>
+          <w:rFonts w:ascii="Consolas" w:eastAsia="Times New Roman" w:hAnsi="Consolas" w:cs="Times New Roman"/>
+          <w:color w:val="BBBEBF"/>
+          <w:sz w:val="21"/>
+          <w:szCs w:val="21"/>
+        </w:rPr>
+      </w:pPr>
+    </w:p>
+    <w:p>
+      <w:r>
+        <w:t>Expected output (sample):</w:t>
+      </w:r>
+    </w:p>
+    <w:p>
       <w:r>
         <w:rPr>
           <w:rFonts w:ascii="Consolas" w:hAnsi="Consolas"/>
           <w:sz w:val="16"/>
         </w:rPr>
-        <w:t>public class Exercise5FinallyReturn {</w:t>
-      </w:r>
-    </w:p>
-    <w:p>
-      <w:pPr>
-        <w:spacing w:after="0"/>
-      </w:pPr>
-      <w:r>
-        <w:rPr>
-          <w:rFonts w:ascii="Consolas" w:hAnsi="Consolas"/>
-          <w:sz w:val="16"/>
-        </w:rPr>
-        <w:t xml:space="preserve">    static int example() { try { System.out.println("Inside try"); return 5; } finally { System.out.println("Inside finally"); } }</w:t>
-      </w:r>
-    </w:p>
-    <w:p>
-      <w:pPr>
-        <w:spacing w:after="0"/>
-      </w:pPr>
-      <w:r>
-        <w:rPr>
-          <w:rFonts w:ascii="Consolas" w:hAnsi="Consolas"/>
-          <w:sz w:val="16"/>
-        </w:rPr>
-        <w:t xml:space="preserve">    public static void main(String[] args) { System.out.println("Returned: "+example()); }</w:t>
-      </w:r>
-    </w:p>
-    <w:p>
-      <w:pPr>
-        <w:spacing w:after="0"/>
-      </w:pPr>
-      <w:r>
-        <w:rPr>
-          <w:rFonts w:ascii="Consolas" w:hAnsi="Consolas"/>
-          <w:sz w:val="16"/>
-        </w:rPr>
-        <w:t>}</w:t>
-      </w:r>
-    </w:p>
-    <w:p>
-      <w:r>
-        <w:t>Expected output (sample):</w:t>
-      </w:r>
-    </w:p>
-    <w:p>
-      <w:pPr>
-        <w:spacing w:after="0"/>
-      </w:pPr>
-      <w:r>
-        <w:rPr>
-          <w:rFonts w:ascii="Consolas" w:hAnsi="Consolas"/>
-          <w:sz w:val="16"/>
-        </w:rPr>
-        <w:t>Inside try</w:t>
-      </w:r>
-    </w:p>
-    <w:p>
-      <w:pPr>
-        <w:spacing w:after="0"/>
-      </w:pPr>
-      <w:r>
-        <w:rPr>
-          <w:rFonts w:ascii="Consolas" w:hAnsi="Consolas"/>
-          <w:sz w:val="16"/>
-        </w:rPr>
-        <w:t>Inside finally</w:t>
-      </w:r>
-    </w:p>
-    <w:p>
-      <w:pPr>
-        <w:spacing w:after="0"/>
-      </w:pPr>
-      <w:r>
-        <w:rPr>
-          <w:rFonts w:ascii="Consolas" w:hAnsi="Consolas"/>
-          <w:sz w:val="16"/>
-        </w:rPr>
-        <w:t>Returned: 5</w:t>
-      </w:r>
-    </w:p>
-    <w:p>
+        <w:lastRenderedPageBreak/>
+        <w:drawing>
+          <wp:inline distT="0" distB="0" distL="0" distR="0" wp14:anchorId="191D918C" wp14:editId="4DA28E98">
+            <wp:extent cx="5486400" cy="1131570"/>
+            <wp:effectExtent l="0" t="0" r="0" b="0"/>
+            <wp:docPr id="7007524" name="Picture 1"/>
+            <wp:cNvGraphicFramePr>
+              <a:graphicFrameLocks xmlns:a="http://schemas.openxmlformats.org/drawingml/2006/main" noChangeAspect="1"/>
+            </wp:cNvGraphicFramePr>
+            <a:graphic xmlns:a="http://schemas.openxmlformats.org/drawingml/2006/main">
+              <a:graphicData uri="http://schemas.openxmlformats.org/drawingml/2006/picture">
+                <pic:pic xmlns:pic="http://schemas.openxmlformats.org/drawingml/2006/picture">
+                  <pic:nvPicPr>
+                    <pic:cNvPr id="7007524" name=""/>
+                    <pic:cNvPicPr/>
+                  </pic:nvPicPr>
+                  <pic:blipFill>
+                    <a:blip r:embed="rId10"/>
+                    <a:stretch>
+                      <a:fillRect/>
+                    </a:stretch>
+                  </pic:blipFill>
+                  <pic:spPr>
+                    <a:xfrm>
+                      <a:off x="0" y="0"/>
+                      <a:ext cx="5486400" cy="1131570"/>
+                    </a:xfrm>
+                    <a:prstGeom prst="rect">
+                      <a:avLst/>
+                    </a:prstGeom>
+                  </pic:spPr>
+                </pic:pic>
+              </a:graphicData>
+            </a:graphic>
+          </wp:inline>
+        </w:drawing>
+      </w:r>
       <w:r>
         <w:t>Explanation: finally executes before the method returns, so its message prints before the caller prints the returned value.</w:t>
       </w:r>

</xml_diff>